<commit_message>
Add Stage 4 (Qwen2.5-7B) results and update note and cover letter
Co-Authored-By: Claude Sonnet 5.5 <noreply@anthropic.com>
Claude-Session: https://claude.ai/code/session_014FRGRi7axQM37FZZhPBo12
</commit_message>
<xml_diff>
--- a/ISR_Effective_Decision_Temperature_Research_Note_revised.docx
+++ b/ISR_Effective_Decision_Temperature_Research_Note_revised.docx
@@ -185,7 +185,7 @@
           <w:sz w:val="22"/>
           <w:szCs w:val="22"/>
         </w:rPr>
-        <w:t xml:space="preserve">On synthetic logits, Teff separates from nominal temperature under pressure. On SmolLM2-135M-Instruct, pressure lifts Teff far above a nominal T = 0.15 and no inverted-U appears. On Qwen2.5-3B-Instruct, which solves the task, a planted off-path letter of intermediate strength produces an inverted-U peaking near T = 2, a weak one does not, and contamination has no measurable effect. A dashboard reporting only the decoding parameter misreads the agent’s decision state.</w:t>
+        <w:t xml:space="preserve">On synthetic logits, Teff separates from nominal temperature under pressure. On SmolLM2-135M-Instruct, pressure lifts Teff far above a nominal T = 0.15 and no inverted-U appears. On Qwen2.5-3B-Instruct and 7B-Instruct, which solve the task, a planted off-path letter of intermediate strength produces an inverted-U peaking near T = 2 to 2.5, a weak one does not, and contamination has no clear effect. A dashboard reporting only the decoding parameter misreads the agent’s decision state.</w:t>
       </w:r>
     </w:p>
     <w:p>
@@ -339,7 +339,7 @@
           <w:sz w:val="22"/>
           <w:szCs w:val="22"/>
         </w:rPr>
-        <w:t xml:space="preserve">The note makes three contributions. First, it brings the agent’s decision state into the governance of agentic IS artifacts, locating that state in a quantity, effective decision temperature, which is latent in human choice but can be estimated for an LLM once a clean-context reference is fixed. Second, it separates what the correspondence predicts from what it does not. Pressure and contamination should lift Teff above the nominal temperature, whereas an interior performance band in nominal temperature is a special case rather than a default, and we state the attractor condition at the outset. Third, it shows that the indicators can be computed both on the theory’s own choice rule and on the next-token log-probabilities of two pretrained open-weight models (135M and 3B parameters), and it reports where the predictions hold and where they fail. Network contagion, circuit breakers, and state-contingent delegation are design implications of observable states. They form an agenda, not findings.</w:t>
+        <w:t xml:space="preserve">The note makes three contributions. First, it brings the agent’s decision state into the governance of agentic IS artifacts, locating that state in a quantity, effective decision temperature, which is latent in human choice but can be estimated for an LLM once a clean-context reference is fixed. Second, it separates what the correspondence predicts from what it does not. Pressure and contamination should lift Teff above the nominal temperature, whereas an interior performance band in nominal temperature is a special case rather than a default, and we state the attractor condition at the outset. Third, it shows that the indicators can be computed both on the theory’s own choice rule and on the next-token log-probabilities of three pretrained open-weight models (135M, 3B, and 7B parameters), and it reports where the predictions hold and where they fail. Network contagion, circuit breakers, and state-contingent delegation are design implications of observable states. They form an agenda, not findings.</w:t>
       </w:r>
     </w:p>
     <w:p>
@@ -2800,7 +2800,7 @@
           <w:sz w:val="22"/>
           <w:szCs w:val="22"/>
         </w:rPr>
-        <w:t xml:space="preserve">The identity between softmax sampling and the logit rule makes the constructs computable, but it does not turn a synthetic agent into a test of the theory. We report three stages. Stage 1 implements the choice rule on logits we specify ourselves, so that the indicators can be read off a known process. Stage 2 applies the same measurement rule to HuggingFaceTB/SmolLM2-135M-Instruct, run in full precision on a CPU machine with no GPU and 1.9 GB of RAM, which ruled out larger models. Stage 3 repeats the test on Qwen2.5-3B-Instruct, run in bfloat16 on a different CPU machine with 15 GB of RAM, on a task that this model solves, to see whether the inverted-U of Proposition 2 appears when the agent starts on-path. Stage 1 shows that the indicators register distortions built into the logits. Stage 2 shows that they can be computed from real log-probabilities and that they separate under pressure, and that no inverted-U appears on the small model. Stage 3 shows an inverted-U on the larger model for attractors of intermediate strength. None of the stages confirms the propositions as general claims.</w:t>
+        <w:t xml:space="preserve">The identity between softmax sampling and the logit rule makes the constructs computable, but it does not turn a synthetic agent into a test of the theory. We report four stages. Stage 1 implements the choice rule on logits we specify ourselves, so that the indicators can be read off a known process. Stage 2 applies the same measurement rule to HuggingFaceTB/SmolLM2-135M-Instruct, run in full precision on a CPU machine with no GPU and 1.9 GB of RAM, which ruled out larger models. Stage 3 repeats the test on Qwen2.5-3B-Instruct, run in bfloat16 on a different CPU machine with 15 GB of RAM, on a task that this model solves, to see whether the inverted-U of Proposition 2 appears when the agent starts on-path. Stage 1 shows that the indicators register distortions built into the logits. Stage 2 shows that they can be computed from real log-probabilities and that they separate under pressure, and that no inverted-U appears on the small model. Stage 3 shows an inverted-U on the larger model for attractors of intermediate strength. Stage 4 repeats Stage 3 on a 7B model with a different inference stack. None of the stages confirms the propositions as general claims.</w:t>
       </w:r>
     </w:p>
     <w:p>
@@ -13302,7 +13302,7 @@
           <w:sz w:val="24"/>
           <w:szCs w:val="24"/>
         </w:rPr>
-        <w:t xml:space="preserve">4.4 What the illustration identifies</w:t>
+        <w:t xml:space="preserve">4.4 Stage 4: replication on a 7B model</w:t>
       </w:r>
     </w:p>
     <w:p>
@@ -13322,7 +13322,1674 @@
           <w:sz w:val="22"/>
           <w:szCs w:val="22"/>
         </w:rPr>
-        <w:t xml:space="preserve">Four statements are supported as measurement claims. First, Teff, entropy, repetition, and lock-in can be computed from synthetic choice probabilities and from the next-token log-probabilities of open-weight models, provided the reference is a clean context and not the sampling logits. Second, pressure lifts Teff above nominal T on a task the model can solve, and the lift is largest at low T, where Teff − T is about 2 on the 3B model. Third, on the 3B model an accuracy inverted-U in nominal temperature appears for planted attractors of intermediate strength (m = 3, 4, 6) and not for a weak attractor or for none, which is the pattern Proposition 2 describes. Fourth, the separation of Teff from nominal T is large on alphabet continuation and only partial on the unsolvable order policy.</w:t>
+        <w:t xml:space="preserve">Stage 4 repeats Stage 3 on Qwen2.5-7B-Instruct, run as an 8-bit quantized GGUF (Q8_0) in llama.cpp on the same CPU machine, with the same task, prompts, and measures. The change of inference stack and the quantization mean that differences from the 3B model should not be attributed to model size alone. The 7B model holds on to the planted letter more strongly, so that m = 2 already locks the agent at low T, and we therefore use m = 1, 2, 3, and 4. Cells use 60 trajectories for T ≤ 2.0 and 40 above (Table 9), and 30 in the unplanted condition, where accuracy is 1.00 at T = 0.15, 1.2, and 3.0.</w:t>
+      </w:r>
+    </w:p>
+    <w:p>
+      <w:pPr>
+        <w:spacing w:after="80" w:before="160"/>
+      </w:pPr>
+      <w:r>
+        <w:rPr>
+          <w:rFonts w:ascii="Times New Roman" w:cs="Times New Roman" w:eastAsia="Times New Roman" w:hAnsi="Times New Roman"/>
+          <w:b w:val="false"/>
+          <w:bCs w:val="false"/>
+          <w:i/>
+          <w:iCs/>
+          <w:smallCaps w:val="false"/>
+          <w:color w:val="000000"/>
+          <w:sz w:val="20"/>
+          <w:szCs w:val="20"/>
+        </w:rPr>
+        <w:t xml:space="preserve">Table 9. Stage 4, Qwen2.5-7B-Instruct (Q8_0), clean prompt: locally correct accuracy by nominal T and attractor strength m (60 trajectories per cell for T ≤ 2.0, 40 for T ≥ 2.5).</w:t>
+      </w:r>
+    </w:p>
+    <w:tbl>
+      <w:tblPr>
+        <w:tblW w:type="dxa" w:w="9360"/>
+        <w:tblBorders>
+          <w:top w:val="single" w:color="auto" w:sz="4"/>
+          <w:left w:val="single" w:color="auto" w:sz="4"/>
+          <w:bottom w:val="single" w:color="auto" w:sz="4"/>
+          <w:right w:val="single" w:color="auto" w:sz="4"/>
+          <w:insideH w:val="single" w:color="auto" w:sz="4"/>
+          <w:insideV w:val="single" w:color="auto" w:sz="4"/>
+        </w:tblBorders>
+      </w:tblPr>
+      <w:tblGrid>
+        <w:gridCol w:w="1800"/>
+        <w:gridCol w:w="1890"/>
+        <w:gridCol w:w="1890"/>
+        <w:gridCol w:w="1890"/>
+        <w:gridCol w:w="1890"/>
+      </w:tblGrid>
+      <w:tr>
+        <w:trPr>
+          <w:cantSplit/>
+          <w:tblHeader/>
+        </w:trPr>
+        <w:tc>
+          <w:tcPr>
+            <w:tcW w:type="dxa" w:w="1800"/>
+            <w:tcBorders>
+              <w:top w:val="single" w:color="BFBFBF" w:sz="4"/>
+              <w:left w:val="single" w:color="BFBFBF" w:sz="4"/>
+              <w:bottom w:val="single" w:color="BFBFBF" w:sz="4"/>
+              <w:right w:val="single" w:color="BFBFBF" w:sz="4"/>
+            </w:tcBorders>
+            <w:shd w:fill="E7EEF5" w:val="clear"/>
+            <w:tcMar>
+              <w:top w:type="dxa" w:w="50"/>
+              <w:left w:type="dxa" w:w="70"/>
+              <w:bottom w:type="dxa" w:w="50"/>
+              <w:right w:type="dxa" w:w="70"/>
+            </w:tcMar>
+            <w:vAlign w:val="center"/>
+          </w:tcPr>
+          <w:p>
+            <w:pPr>
+              <w:spacing w:after="0" w:before="0"/>
+              <w:jc w:val="left"/>
+            </w:pPr>
+            <w:r>
+              <w:rPr>
+                <w:rFonts w:ascii="Times New Roman" w:cs="Times New Roman" w:eastAsia="Times New Roman" w:hAnsi="Times New Roman"/>
+                <w:b/>
+                <w:bCs/>
+                <w:i w:val="false"/>
+                <w:iCs w:val="false"/>
+                <w:smallCaps w:val="false"/>
+                <w:color w:val="000000"/>
+                <w:sz w:val="17"/>
+                <w:szCs w:val="17"/>
+              </w:rPr>
+              <w:t xml:space="preserve">Nominal T</w:t>
+            </w:r>
+          </w:p>
+        </w:tc>
+        <w:tc>
+          <w:tcPr>
+            <w:tcW w:type="dxa" w:w="1890"/>
+            <w:tcBorders>
+              <w:top w:val="single" w:color="BFBFBF" w:sz="4"/>
+              <w:left w:val="single" w:color="BFBFBF" w:sz="4"/>
+              <w:bottom w:val="single" w:color="BFBFBF" w:sz="4"/>
+              <w:right w:val="single" w:color="BFBFBF" w:sz="4"/>
+            </w:tcBorders>
+            <w:shd w:fill="E7EEF5" w:val="clear"/>
+            <w:tcMar>
+              <w:top w:type="dxa" w:w="50"/>
+              <w:left w:type="dxa" w:w="70"/>
+              <w:bottom w:type="dxa" w:w="50"/>
+              <w:right w:type="dxa" w:w="70"/>
+            </w:tcMar>
+            <w:vAlign w:val="center"/>
+          </w:tcPr>
+          <w:p>
+            <w:pPr>
+              <w:spacing w:after="0" w:before="0"/>
+              <w:jc w:val="left"/>
+            </w:pPr>
+            <w:r>
+              <w:rPr>
+                <w:rFonts w:ascii="Times New Roman" w:cs="Times New Roman" w:eastAsia="Times New Roman" w:hAnsi="Times New Roman"/>
+                <w:b/>
+                <w:bCs/>
+                <w:i w:val="false"/>
+                <w:iCs w:val="false"/>
+                <w:smallCaps w:val="false"/>
+                <w:color w:val="000000"/>
+                <w:sz w:val="17"/>
+                <w:szCs w:val="17"/>
+              </w:rPr>
+              <w:t xml:space="preserve">m = 1</w:t>
+            </w:r>
+          </w:p>
+        </w:tc>
+        <w:tc>
+          <w:tcPr>
+            <w:tcW w:type="dxa" w:w="1890"/>
+            <w:tcBorders>
+              <w:top w:val="single" w:color="BFBFBF" w:sz="4"/>
+              <w:left w:val="single" w:color="BFBFBF" w:sz="4"/>
+              <w:bottom w:val="single" w:color="BFBFBF" w:sz="4"/>
+              <w:right w:val="single" w:color="BFBFBF" w:sz="4"/>
+            </w:tcBorders>
+            <w:shd w:fill="E7EEF5" w:val="clear"/>
+            <w:tcMar>
+              <w:top w:type="dxa" w:w="50"/>
+              <w:left w:type="dxa" w:w="70"/>
+              <w:bottom w:type="dxa" w:w="50"/>
+              <w:right w:type="dxa" w:w="70"/>
+            </w:tcMar>
+            <w:vAlign w:val="center"/>
+          </w:tcPr>
+          <w:p>
+            <w:pPr>
+              <w:spacing w:after="0" w:before="0"/>
+              <w:jc w:val="left"/>
+            </w:pPr>
+            <w:r>
+              <w:rPr>
+                <w:rFonts w:ascii="Times New Roman" w:cs="Times New Roman" w:eastAsia="Times New Roman" w:hAnsi="Times New Roman"/>
+                <w:b/>
+                <w:bCs/>
+                <w:i w:val="false"/>
+                <w:iCs w:val="false"/>
+                <w:smallCaps w:val="false"/>
+                <w:color w:val="000000"/>
+                <w:sz w:val="17"/>
+                <w:szCs w:val="17"/>
+              </w:rPr>
+              <w:t xml:space="preserve">m = 2</w:t>
+            </w:r>
+          </w:p>
+        </w:tc>
+        <w:tc>
+          <w:tcPr>
+            <w:tcW w:type="dxa" w:w="1890"/>
+            <w:tcBorders>
+              <w:top w:val="single" w:color="BFBFBF" w:sz="4"/>
+              <w:left w:val="single" w:color="BFBFBF" w:sz="4"/>
+              <w:bottom w:val="single" w:color="BFBFBF" w:sz="4"/>
+              <w:right w:val="single" w:color="BFBFBF" w:sz="4"/>
+            </w:tcBorders>
+            <w:shd w:fill="E7EEF5" w:val="clear"/>
+            <w:tcMar>
+              <w:top w:type="dxa" w:w="50"/>
+              <w:left w:type="dxa" w:w="70"/>
+              <w:bottom w:type="dxa" w:w="50"/>
+              <w:right w:type="dxa" w:w="70"/>
+            </w:tcMar>
+            <w:vAlign w:val="center"/>
+          </w:tcPr>
+          <w:p>
+            <w:pPr>
+              <w:spacing w:after="0" w:before="0"/>
+              <w:jc w:val="left"/>
+            </w:pPr>
+            <w:r>
+              <w:rPr>
+                <w:rFonts w:ascii="Times New Roman" w:cs="Times New Roman" w:eastAsia="Times New Roman" w:hAnsi="Times New Roman"/>
+                <w:b/>
+                <w:bCs/>
+                <w:i w:val="false"/>
+                <w:iCs w:val="false"/>
+                <w:smallCaps w:val="false"/>
+                <w:color w:val="000000"/>
+                <w:sz w:val="17"/>
+                <w:szCs w:val="17"/>
+              </w:rPr>
+              <w:t xml:space="preserve">m = 3</w:t>
+            </w:r>
+          </w:p>
+        </w:tc>
+        <w:tc>
+          <w:tcPr>
+            <w:tcW w:type="dxa" w:w="1890"/>
+            <w:tcBorders>
+              <w:top w:val="single" w:color="BFBFBF" w:sz="4"/>
+              <w:left w:val="single" w:color="BFBFBF" w:sz="4"/>
+              <w:bottom w:val="single" w:color="BFBFBF" w:sz="4"/>
+              <w:right w:val="single" w:color="BFBFBF" w:sz="4"/>
+            </w:tcBorders>
+            <w:shd w:fill="E7EEF5" w:val="clear"/>
+            <w:tcMar>
+              <w:top w:type="dxa" w:w="50"/>
+              <w:left w:type="dxa" w:w="70"/>
+              <w:bottom w:type="dxa" w:w="50"/>
+              <w:right w:type="dxa" w:w="70"/>
+            </w:tcMar>
+            <w:vAlign w:val="center"/>
+          </w:tcPr>
+          <w:p>
+            <w:pPr>
+              <w:spacing w:after="0" w:before="0"/>
+              <w:jc w:val="left"/>
+            </w:pPr>
+            <w:r>
+              <w:rPr>
+                <w:rFonts w:ascii="Times New Roman" w:cs="Times New Roman" w:eastAsia="Times New Roman" w:hAnsi="Times New Roman"/>
+                <w:b/>
+                <w:bCs/>
+                <w:i w:val="false"/>
+                <w:iCs w:val="false"/>
+                <w:smallCaps w:val="false"/>
+                <w:color w:val="000000"/>
+                <w:sz w:val="17"/>
+                <w:szCs w:val="17"/>
+              </w:rPr>
+              <w:t xml:space="preserve">m = 4</w:t>
+            </w:r>
+          </w:p>
+        </w:tc>
+      </w:tr>
+      <w:tr>
+        <w:trPr>
+          <w:cantSplit/>
+          <w:tblHeader w:val="false"/>
+        </w:trPr>
+        <w:tc>
+          <w:tcPr>
+            <w:tcW w:type="dxa" w:w="1800"/>
+            <w:tcBorders>
+              <w:top w:val="single" w:color="BFBFBF" w:sz="4"/>
+              <w:left w:val="single" w:color="BFBFBF" w:sz="4"/>
+              <w:bottom w:val="single" w:color="BFBFBF" w:sz="4"/>
+              <w:right w:val="single" w:color="BFBFBF" w:sz="4"/>
+            </w:tcBorders>
+            <w:shd w:fill="FFFFFF" w:val="clear"/>
+            <w:tcMar>
+              <w:top w:type="dxa" w:w="50"/>
+              <w:left w:type="dxa" w:w="70"/>
+              <w:bottom w:type="dxa" w:w="50"/>
+              <w:right w:type="dxa" w:w="70"/>
+            </w:tcMar>
+            <w:vAlign w:val="center"/>
+          </w:tcPr>
+          <w:p>
+            <w:pPr>
+              <w:spacing w:after="0" w:before="0"/>
+              <w:jc w:val="left"/>
+            </w:pPr>
+            <w:r>
+              <w:rPr>
+                <w:rFonts w:ascii="Times New Roman" w:cs="Times New Roman" w:eastAsia="Times New Roman" w:hAnsi="Times New Roman"/>
+                <w:b w:val="false"/>
+                <w:bCs w:val="false"/>
+                <w:i w:val="false"/>
+                <w:iCs w:val="false"/>
+                <w:smallCaps w:val="false"/>
+                <w:color w:val="000000"/>
+                <w:sz w:val="17"/>
+                <w:szCs w:val="17"/>
+              </w:rPr>
+              <w:t xml:space="preserve">0.15</w:t>
+            </w:r>
+          </w:p>
+        </w:tc>
+        <w:tc>
+          <w:tcPr>
+            <w:tcW w:type="dxa" w:w="1890"/>
+            <w:tcBorders>
+              <w:top w:val="single" w:color="BFBFBF" w:sz="4"/>
+              <w:left w:val="single" w:color="BFBFBF" w:sz="4"/>
+              <w:bottom w:val="single" w:color="BFBFBF" w:sz="4"/>
+              <w:right w:val="single" w:color="BFBFBF" w:sz="4"/>
+            </w:tcBorders>
+            <w:shd w:fill="FFFFFF" w:val="clear"/>
+            <w:tcMar>
+              <w:top w:type="dxa" w:w="50"/>
+              <w:left w:type="dxa" w:w="70"/>
+              <w:bottom w:type="dxa" w:w="50"/>
+              <w:right w:type="dxa" w:w="70"/>
+            </w:tcMar>
+            <w:vAlign w:val="center"/>
+          </w:tcPr>
+          <w:p>
+            <w:pPr>
+              <w:spacing w:after="0" w:before="0"/>
+              <w:jc w:val="left"/>
+            </w:pPr>
+            <w:r>
+              <w:rPr>
+                <w:rFonts w:ascii="Times New Roman" w:cs="Times New Roman" w:eastAsia="Times New Roman" w:hAnsi="Times New Roman"/>
+                <w:b w:val="false"/>
+                <w:bCs w:val="false"/>
+                <w:i w:val="false"/>
+                <w:iCs w:val="false"/>
+                <w:smallCaps w:val="false"/>
+                <w:color w:val="000000"/>
+                <w:sz w:val="17"/>
+                <w:szCs w:val="17"/>
+              </w:rPr>
+              <w:t xml:space="preserve">1.00</w:t>
+            </w:r>
+          </w:p>
+        </w:tc>
+        <w:tc>
+          <w:tcPr>
+            <w:tcW w:type="dxa" w:w="1890"/>
+            <w:tcBorders>
+              <w:top w:val="single" w:color="BFBFBF" w:sz="4"/>
+              <w:left w:val="single" w:color="BFBFBF" w:sz="4"/>
+              <w:bottom w:val="single" w:color="BFBFBF" w:sz="4"/>
+              <w:right w:val="single" w:color="BFBFBF" w:sz="4"/>
+            </w:tcBorders>
+            <w:shd w:fill="FFFFFF" w:val="clear"/>
+            <w:tcMar>
+              <w:top w:type="dxa" w:w="50"/>
+              <w:left w:type="dxa" w:w="70"/>
+              <w:bottom w:type="dxa" w:w="50"/>
+              <w:right w:type="dxa" w:w="70"/>
+            </w:tcMar>
+            <w:vAlign w:val="center"/>
+          </w:tcPr>
+          <w:p>
+            <w:pPr>
+              <w:spacing w:after="0" w:before="0"/>
+              <w:jc w:val="left"/>
+            </w:pPr>
+            <w:r>
+              <w:rPr>
+                <w:rFonts w:ascii="Times New Roman" w:cs="Times New Roman" w:eastAsia="Times New Roman" w:hAnsi="Times New Roman"/>
+                <w:b w:val="false"/>
+                <w:bCs w:val="false"/>
+                <w:i w:val="false"/>
+                <w:iCs w:val="false"/>
+                <w:smallCaps w:val="false"/>
+                <w:color w:val="000000"/>
+                <w:sz w:val="17"/>
+                <w:szCs w:val="17"/>
+              </w:rPr>
+              <w:t xml:space="preserve">0.00</w:t>
+            </w:r>
+          </w:p>
+        </w:tc>
+        <w:tc>
+          <w:tcPr>
+            <w:tcW w:type="dxa" w:w="1890"/>
+            <w:tcBorders>
+              <w:top w:val="single" w:color="BFBFBF" w:sz="4"/>
+              <w:left w:val="single" w:color="BFBFBF" w:sz="4"/>
+              <w:bottom w:val="single" w:color="BFBFBF" w:sz="4"/>
+              <w:right w:val="single" w:color="BFBFBF" w:sz="4"/>
+            </w:tcBorders>
+            <w:shd w:fill="FFFFFF" w:val="clear"/>
+            <w:tcMar>
+              <w:top w:type="dxa" w:w="50"/>
+              <w:left w:type="dxa" w:w="70"/>
+              <w:bottom w:type="dxa" w:w="50"/>
+              <w:right w:type="dxa" w:w="70"/>
+            </w:tcMar>
+            <w:vAlign w:val="center"/>
+          </w:tcPr>
+          <w:p>
+            <w:pPr>
+              <w:spacing w:after="0" w:before="0"/>
+              <w:jc w:val="left"/>
+            </w:pPr>
+            <w:r>
+              <w:rPr>
+                <w:rFonts w:ascii="Times New Roman" w:cs="Times New Roman" w:eastAsia="Times New Roman" w:hAnsi="Times New Roman"/>
+                <w:b w:val="false"/>
+                <w:bCs w:val="false"/>
+                <w:i w:val="false"/>
+                <w:iCs w:val="false"/>
+                <w:smallCaps w:val="false"/>
+                <w:color w:val="000000"/>
+                <w:sz w:val="17"/>
+                <w:szCs w:val="17"/>
+              </w:rPr>
+              <w:t xml:space="preserve">0.00</w:t>
+            </w:r>
+          </w:p>
+        </w:tc>
+        <w:tc>
+          <w:tcPr>
+            <w:tcW w:type="dxa" w:w="1890"/>
+            <w:tcBorders>
+              <w:top w:val="single" w:color="BFBFBF" w:sz="4"/>
+              <w:left w:val="single" w:color="BFBFBF" w:sz="4"/>
+              <w:bottom w:val="single" w:color="BFBFBF" w:sz="4"/>
+              <w:right w:val="single" w:color="BFBFBF" w:sz="4"/>
+            </w:tcBorders>
+            <w:shd w:fill="FFFFFF" w:val="clear"/>
+            <w:tcMar>
+              <w:top w:type="dxa" w:w="50"/>
+              <w:left w:type="dxa" w:w="70"/>
+              <w:bottom w:type="dxa" w:w="50"/>
+              <w:right w:type="dxa" w:w="70"/>
+            </w:tcMar>
+            <w:vAlign w:val="center"/>
+          </w:tcPr>
+          <w:p>
+            <w:pPr>
+              <w:spacing w:after="0" w:before="0"/>
+              <w:jc w:val="left"/>
+            </w:pPr>
+            <w:r>
+              <w:rPr>
+                <w:rFonts w:ascii="Times New Roman" w:cs="Times New Roman" w:eastAsia="Times New Roman" w:hAnsi="Times New Roman"/>
+                <w:b w:val="false"/>
+                <w:bCs w:val="false"/>
+                <w:i w:val="false"/>
+                <w:iCs w:val="false"/>
+                <w:smallCaps w:val="false"/>
+                <w:color w:val="000000"/>
+                <w:sz w:val="17"/>
+                <w:szCs w:val="17"/>
+              </w:rPr>
+              <w:t xml:space="preserve">0.00</w:t>
+            </w:r>
+          </w:p>
+        </w:tc>
+      </w:tr>
+      <w:tr>
+        <w:trPr>
+          <w:cantSplit/>
+          <w:tblHeader w:val="false"/>
+        </w:trPr>
+        <w:tc>
+          <w:tcPr>
+            <w:tcW w:type="dxa" w:w="1800"/>
+            <w:tcBorders>
+              <w:top w:val="single" w:color="BFBFBF" w:sz="4"/>
+              <w:left w:val="single" w:color="BFBFBF" w:sz="4"/>
+              <w:bottom w:val="single" w:color="BFBFBF" w:sz="4"/>
+              <w:right w:val="single" w:color="BFBFBF" w:sz="4"/>
+            </w:tcBorders>
+            <w:shd w:fill="FFFFFF" w:val="clear"/>
+            <w:tcMar>
+              <w:top w:type="dxa" w:w="50"/>
+              <w:left w:type="dxa" w:w="70"/>
+              <w:bottom w:type="dxa" w:w="50"/>
+              <w:right w:type="dxa" w:w="70"/>
+            </w:tcMar>
+            <w:vAlign w:val="center"/>
+          </w:tcPr>
+          <w:p>
+            <w:pPr>
+              <w:spacing w:after="0" w:before="0"/>
+              <w:jc w:val="left"/>
+            </w:pPr>
+            <w:r>
+              <w:rPr>
+                <w:rFonts w:ascii="Times New Roman" w:cs="Times New Roman" w:eastAsia="Times New Roman" w:hAnsi="Times New Roman"/>
+                <w:b w:val="false"/>
+                <w:bCs w:val="false"/>
+                <w:i w:val="false"/>
+                <w:iCs w:val="false"/>
+                <w:smallCaps w:val="false"/>
+                <w:color w:val="000000"/>
+                <w:sz w:val="17"/>
+                <w:szCs w:val="17"/>
+              </w:rPr>
+              <w:t xml:space="preserve">0.8</w:t>
+            </w:r>
+          </w:p>
+        </w:tc>
+        <w:tc>
+          <w:tcPr>
+            <w:tcW w:type="dxa" w:w="1890"/>
+            <w:tcBorders>
+              <w:top w:val="single" w:color="BFBFBF" w:sz="4"/>
+              <w:left w:val="single" w:color="BFBFBF" w:sz="4"/>
+              <w:bottom w:val="single" w:color="BFBFBF" w:sz="4"/>
+              <w:right w:val="single" w:color="BFBFBF" w:sz="4"/>
+            </w:tcBorders>
+            <w:shd w:fill="FFFFFF" w:val="clear"/>
+            <w:tcMar>
+              <w:top w:type="dxa" w:w="50"/>
+              <w:left w:type="dxa" w:w="70"/>
+              <w:bottom w:type="dxa" w:w="50"/>
+              <w:right w:type="dxa" w:w="70"/>
+            </w:tcMar>
+            <w:vAlign w:val="center"/>
+          </w:tcPr>
+          <w:p>
+            <w:pPr>
+              <w:spacing w:after="0" w:before="0"/>
+              <w:jc w:val="left"/>
+            </w:pPr>
+            <w:r>
+              <w:rPr>
+                <w:rFonts w:ascii="Times New Roman" w:cs="Times New Roman" w:eastAsia="Times New Roman" w:hAnsi="Times New Roman"/>
+                <w:b w:val="false"/>
+                <w:bCs w:val="false"/>
+                <w:i w:val="false"/>
+                <w:iCs w:val="false"/>
+                <w:smallCaps w:val="false"/>
+                <w:color w:val="000000"/>
+                <w:sz w:val="17"/>
+                <w:szCs w:val="17"/>
+              </w:rPr>
+              <w:t xml:space="preserve">1.00</w:t>
+            </w:r>
+          </w:p>
+        </w:tc>
+        <w:tc>
+          <w:tcPr>
+            <w:tcW w:type="dxa" w:w="1890"/>
+            <w:tcBorders>
+              <w:top w:val="single" w:color="BFBFBF" w:sz="4"/>
+              <w:left w:val="single" w:color="BFBFBF" w:sz="4"/>
+              <w:bottom w:val="single" w:color="BFBFBF" w:sz="4"/>
+              <w:right w:val="single" w:color="BFBFBF" w:sz="4"/>
+            </w:tcBorders>
+            <w:shd w:fill="FFFFFF" w:val="clear"/>
+            <w:tcMar>
+              <w:top w:type="dxa" w:w="50"/>
+              <w:left w:type="dxa" w:w="70"/>
+              <w:bottom w:type="dxa" w:w="50"/>
+              <w:right w:type="dxa" w:w="70"/>
+            </w:tcMar>
+            <w:vAlign w:val="center"/>
+          </w:tcPr>
+          <w:p>
+            <w:pPr>
+              <w:spacing w:after="0" w:before="0"/>
+              <w:jc w:val="left"/>
+            </w:pPr>
+            <w:r>
+              <w:rPr>
+                <w:rFonts w:ascii="Times New Roman" w:cs="Times New Roman" w:eastAsia="Times New Roman" w:hAnsi="Times New Roman"/>
+                <w:b w:val="false"/>
+                <w:bCs w:val="false"/>
+                <w:i w:val="false"/>
+                <w:iCs w:val="false"/>
+                <w:smallCaps w:val="false"/>
+                <w:color w:val="000000"/>
+                <w:sz w:val="17"/>
+                <w:szCs w:val="17"/>
+              </w:rPr>
+              <w:t xml:space="preserve">0.01</w:t>
+            </w:r>
+          </w:p>
+        </w:tc>
+        <w:tc>
+          <w:tcPr>
+            <w:tcW w:type="dxa" w:w="1890"/>
+            <w:tcBorders>
+              <w:top w:val="single" w:color="BFBFBF" w:sz="4"/>
+              <w:left w:val="single" w:color="BFBFBF" w:sz="4"/>
+              <w:bottom w:val="single" w:color="BFBFBF" w:sz="4"/>
+              <w:right w:val="single" w:color="BFBFBF" w:sz="4"/>
+            </w:tcBorders>
+            <w:shd w:fill="FFFFFF" w:val="clear"/>
+            <w:tcMar>
+              <w:top w:type="dxa" w:w="50"/>
+              <w:left w:type="dxa" w:w="70"/>
+              <w:bottom w:type="dxa" w:w="50"/>
+              <w:right w:type="dxa" w:w="70"/>
+            </w:tcMar>
+            <w:vAlign w:val="center"/>
+          </w:tcPr>
+          <w:p>
+            <w:pPr>
+              <w:spacing w:after="0" w:before="0"/>
+              <w:jc w:val="left"/>
+            </w:pPr>
+            <w:r>
+              <w:rPr>
+                <w:rFonts w:ascii="Times New Roman" w:cs="Times New Roman" w:eastAsia="Times New Roman" w:hAnsi="Times New Roman"/>
+                <w:b w:val="false"/>
+                <w:bCs w:val="false"/>
+                <w:i w:val="false"/>
+                <w:iCs w:val="false"/>
+                <w:smallCaps w:val="false"/>
+                <w:color w:val="000000"/>
+                <w:sz w:val="17"/>
+                <w:szCs w:val="17"/>
+              </w:rPr>
+              <w:t xml:space="preserve">0.00</w:t>
+            </w:r>
+          </w:p>
+        </w:tc>
+        <w:tc>
+          <w:tcPr>
+            <w:tcW w:type="dxa" w:w="1890"/>
+            <w:tcBorders>
+              <w:top w:val="single" w:color="BFBFBF" w:sz="4"/>
+              <w:left w:val="single" w:color="BFBFBF" w:sz="4"/>
+              <w:bottom w:val="single" w:color="BFBFBF" w:sz="4"/>
+              <w:right w:val="single" w:color="BFBFBF" w:sz="4"/>
+            </w:tcBorders>
+            <w:shd w:fill="FFFFFF" w:val="clear"/>
+            <w:tcMar>
+              <w:top w:type="dxa" w:w="50"/>
+              <w:left w:type="dxa" w:w="70"/>
+              <w:bottom w:type="dxa" w:w="50"/>
+              <w:right w:type="dxa" w:w="70"/>
+            </w:tcMar>
+            <w:vAlign w:val="center"/>
+          </w:tcPr>
+          <w:p>
+            <w:pPr>
+              <w:spacing w:after="0" w:before="0"/>
+              <w:jc w:val="left"/>
+            </w:pPr>
+            <w:r>
+              <w:rPr>
+                <w:rFonts w:ascii="Times New Roman" w:cs="Times New Roman" w:eastAsia="Times New Roman" w:hAnsi="Times New Roman"/>
+                <w:b w:val="false"/>
+                <w:bCs w:val="false"/>
+                <w:i w:val="false"/>
+                <w:iCs w:val="false"/>
+                <w:smallCaps w:val="false"/>
+                <w:color w:val="000000"/>
+                <w:sz w:val="17"/>
+                <w:szCs w:val="17"/>
+              </w:rPr>
+              <w:t xml:space="preserve">0.00</w:t>
+            </w:r>
+          </w:p>
+        </w:tc>
+      </w:tr>
+      <w:tr>
+        <w:trPr>
+          <w:cantSplit/>
+          <w:tblHeader w:val="false"/>
+        </w:trPr>
+        <w:tc>
+          <w:tcPr>
+            <w:tcW w:type="dxa" w:w="1800"/>
+            <w:tcBorders>
+              <w:top w:val="single" w:color="BFBFBF" w:sz="4"/>
+              <w:left w:val="single" w:color="BFBFBF" w:sz="4"/>
+              <w:bottom w:val="single" w:color="BFBFBF" w:sz="4"/>
+              <w:right w:val="single" w:color="BFBFBF" w:sz="4"/>
+            </w:tcBorders>
+            <w:shd w:fill="FFFFFF" w:val="clear"/>
+            <w:tcMar>
+              <w:top w:type="dxa" w:w="50"/>
+              <w:left w:type="dxa" w:w="70"/>
+              <w:bottom w:type="dxa" w:w="50"/>
+              <w:right w:type="dxa" w:w="70"/>
+            </w:tcMar>
+            <w:vAlign w:val="center"/>
+          </w:tcPr>
+          <w:p>
+            <w:pPr>
+              <w:spacing w:after="0" w:before="0"/>
+              <w:jc w:val="left"/>
+            </w:pPr>
+            <w:r>
+              <w:rPr>
+                <w:rFonts w:ascii="Times New Roman" w:cs="Times New Roman" w:eastAsia="Times New Roman" w:hAnsi="Times New Roman"/>
+                <w:b w:val="false"/>
+                <w:bCs w:val="false"/>
+                <w:i w:val="false"/>
+                <w:iCs w:val="false"/>
+                <w:smallCaps w:val="false"/>
+                <w:color w:val="000000"/>
+                <w:sz w:val="17"/>
+                <w:szCs w:val="17"/>
+              </w:rPr>
+              <w:t xml:space="preserve">1.2</w:t>
+            </w:r>
+          </w:p>
+        </w:tc>
+        <w:tc>
+          <w:tcPr>
+            <w:tcW w:type="dxa" w:w="1890"/>
+            <w:tcBorders>
+              <w:top w:val="single" w:color="BFBFBF" w:sz="4"/>
+              <w:left w:val="single" w:color="BFBFBF" w:sz="4"/>
+              <w:bottom w:val="single" w:color="BFBFBF" w:sz="4"/>
+              <w:right w:val="single" w:color="BFBFBF" w:sz="4"/>
+            </w:tcBorders>
+            <w:shd w:fill="FFFFFF" w:val="clear"/>
+            <w:tcMar>
+              <w:top w:type="dxa" w:w="50"/>
+              <w:left w:type="dxa" w:w="70"/>
+              <w:bottom w:type="dxa" w:w="50"/>
+              <w:right w:type="dxa" w:w="70"/>
+            </w:tcMar>
+            <w:vAlign w:val="center"/>
+          </w:tcPr>
+          <w:p>
+            <w:pPr>
+              <w:spacing w:after="0" w:before="0"/>
+              <w:jc w:val="left"/>
+            </w:pPr>
+            <w:r>
+              <w:rPr>
+                <w:rFonts w:ascii="Times New Roman" w:cs="Times New Roman" w:eastAsia="Times New Roman" w:hAnsi="Times New Roman"/>
+                <w:b w:val="false"/>
+                <w:bCs w:val="false"/>
+                <w:i w:val="false"/>
+                <w:iCs w:val="false"/>
+                <w:smallCaps w:val="false"/>
+                <w:color w:val="000000"/>
+                <w:sz w:val="17"/>
+                <w:szCs w:val="17"/>
+              </w:rPr>
+              <w:t xml:space="preserve">0.99</w:t>
+            </w:r>
+          </w:p>
+        </w:tc>
+        <w:tc>
+          <w:tcPr>
+            <w:tcW w:type="dxa" w:w="1890"/>
+            <w:tcBorders>
+              <w:top w:val="single" w:color="BFBFBF" w:sz="4"/>
+              <w:left w:val="single" w:color="BFBFBF" w:sz="4"/>
+              <w:bottom w:val="single" w:color="BFBFBF" w:sz="4"/>
+              <w:right w:val="single" w:color="BFBFBF" w:sz="4"/>
+            </w:tcBorders>
+            <w:shd w:fill="FFFFFF" w:val="clear"/>
+            <w:tcMar>
+              <w:top w:type="dxa" w:w="50"/>
+              <w:left w:type="dxa" w:w="70"/>
+              <w:bottom w:type="dxa" w:w="50"/>
+              <w:right w:type="dxa" w:w="70"/>
+            </w:tcMar>
+            <w:vAlign w:val="center"/>
+          </w:tcPr>
+          <w:p>
+            <w:pPr>
+              <w:spacing w:after="0" w:before="0"/>
+              <w:jc w:val="left"/>
+            </w:pPr>
+            <w:r>
+              <w:rPr>
+                <w:rFonts w:ascii="Times New Roman" w:cs="Times New Roman" w:eastAsia="Times New Roman" w:hAnsi="Times New Roman"/>
+                <w:b w:val="false"/>
+                <w:bCs w:val="false"/>
+                <w:i w:val="false"/>
+                <w:iCs w:val="false"/>
+                <w:smallCaps w:val="false"/>
+                <w:color w:val="000000"/>
+                <w:sz w:val="17"/>
+                <w:szCs w:val="17"/>
+              </w:rPr>
+              <w:t xml:space="preserve">0.16</w:t>
+            </w:r>
+          </w:p>
+        </w:tc>
+        <w:tc>
+          <w:tcPr>
+            <w:tcW w:type="dxa" w:w="1890"/>
+            <w:tcBorders>
+              <w:top w:val="single" w:color="BFBFBF" w:sz="4"/>
+              <w:left w:val="single" w:color="BFBFBF" w:sz="4"/>
+              <w:bottom w:val="single" w:color="BFBFBF" w:sz="4"/>
+              <w:right w:val="single" w:color="BFBFBF" w:sz="4"/>
+            </w:tcBorders>
+            <w:shd w:fill="FFFFFF" w:val="clear"/>
+            <w:tcMar>
+              <w:top w:type="dxa" w:w="50"/>
+              <w:left w:type="dxa" w:w="70"/>
+              <w:bottom w:type="dxa" w:w="50"/>
+              <w:right w:type="dxa" w:w="70"/>
+            </w:tcMar>
+            <w:vAlign w:val="center"/>
+          </w:tcPr>
+          <w:p>
+            <w:pPr>
+              <w:spacing w:after="0" w:before="0"/>
+              <w:jc w:val="left"/>
+            </w:pPr>
+            <w:r>
+              <w:rPr>
+                <w:rFonts w:ascii="Times New Roman" w:cs="Times New Roman" w:eastAsia="Times New Roman" w:hAnsi="Times New Roman"/>
+                <w:b w:val="false"/>
+                <w:bCs w:val="false"/>
+                <w:i w:val="false"/>
+                <w:iCs w:val="false"/>
+                <w:smallCaps w:val="false"/>
+                <w:color w:val="000000"/>
+                <w:sz w:val="17"/>
+                <w:szCs w:val="17"/>
+              </w:rPr>
+              <w:t xml:space="preserve">0.07</w:t>
+            </w:r>
+          </w:p>
+        </w:tc>
+        <w:tc>
+          <w:tcPr>
+            <w:tcW w:type="dxa" w:w="1890"/>
+            <w:tcBorders>
+              <w:top w:val="single" w:color="BFBFBF" w:sz="4"/>
+              <w:left w:val="single" w:color="BFBFBF" w:sz="4"/>
+              <w:bottom w:val="single" w:color="BFBFBF" w:sz="4"/>
+              <w:right w:val="single" w:color="BFBFBF" w:sz="4"/>
+            </w:tcBorders>
+            <w:shd w:fill="FFFFFF" w:val="clear"/>
+            <w:tcMar>
+              <w:top w:type="dxa" w:w="50"/>
+              <w:left w:type="dxa" w:w="70"/>
+              <w:bottom w:type="dxa" w:w="50"/>
+              <w:right w:type="dxa" w:w="70"/>
+            </w:tcMar>
+            <w:vAlign w:val="center"/>
+          </w:tcPr>
+          <w:p>
+            <w:pPr>
+              <w:spacing w:after="0" w:before="0"/>
+              <w:jc w:val="left"/>
+            </w:pPr>
+            <w:r>
+              <w:rPr>
+                <w:rFonts w:ascii="Times New Roman" w:cs="Times New Roman" w:eastAsia="Times New Roman" w:hAnsi="Times New Roman"/>
+                <w:b w:val="false"/>
+                <w:bCs w:val="false"/>
+                <w:i w:val="false"/>
+                <w:iCs w:val="false"/>
+                <w:smallCaps w:val="false"/>
+                <w:color w:val="000000"/>
+                <w:sz w:val="17"/>
+                <w:szCs w:val="17"/>
+              </w:rPr>
+              <w:t xml:space="preserve">0.01</w:t>
+            </w:r>
+          </w:p>
+        </w:tc>
+      </w:tr>
+      <w:tr>
+        <w:trPr>
+          <w:cantSplit/>
+          <w:tblHeader w:val="false"/>
+        </w:trPr>
+        <w:tc>
+          <w:tcPr>
+            <w:tcW w:type="dxa" w:w="1800"/>
+            <w:tcBorders>
+              <w:top w:val="single" w:color="BFBFBF" w:sz="4"/>
+              <w:left w:val="single" w:color="BFBFBF" w:sz="4"/>
+              <w:bottom w:val="single" w:color="BFBFBF" w:sz="4"/>
+              <w:right w:val="single" w:color="BFBFBF" w:sz="4"/>
+            </w:tcBorders>
+            <w:shd w:fill="FFFFFF" w:val="clear"/>
+            <w:tcMar>
+              <w:top w:type="dxa" w:w="50"/>
+              <w:left w:type="dxa" w:w="70"/>
+              <w:bottom w:type="dxa" w:w="50"/>
+              <w:right w:type="dxa" w:w="70"/>
+            </w:tcMar>
+            <w:vAlign w:val="center"/>
+          </w:tcPr>
+          <w:p>
+            <w:pPr>
+              <w:spacing w:after="0" w:before="0"/>
+              <w:jc w:val="left"/>
+            </w:pPr>
+            <w:r>
+              <w:rPr>
+                <w:rFonts w:ascii="Times New Roman" w:cs="Times New Roman" w:eastAsia="Times New Roman" w:hAnsi="Times New Roman"/>
+                <w:b w:val="false"/>
+                <w:bCs w:val="false"/>
+                <w:i w:val="false"/>
+                <w:iCs w:val="false"/>
+                <w:smallCaps w:val="false"/>
+                <w:color w:val="000000"/>
+                <w:sz w:val="17"/>
+                <w:szCs w:val="17"/>
+              </w:rPr>
+              <w:t xml:space="preserve">2</w:t>
+            </w:r>
+          </w:p>
+        </w:tc>
+        <w:tc>
+          <w:tcPr>
+            <w:tcW w:type="dxa" w:w="1890"/>
+            <w:tcBorders>
+              <w:top w:val="single" w:color="BFBFBF" w:sz="4"/>
+              <w:left w:val="single" w:color="BFBFBF" w:sz="4"/>
+              <w:bottom w:val="single" w:color="BFBFBF" w:sz="4"/>
+              <w:right w:val="single" w:color="BFBFBF" w:sz="4"/>
+            </w:tcBorders>
+            <w:shd w:fill="FFFFFF" w:val="clear"/>
+            <w:tcMar>
+              <w:top w:type="dxa" w:w="50"/>
+              <w:left w:type="dxa" w:w="70"/>
+              <w:bottom w:type="dxa" w:w="50"/>
+              <w:right w:type="dxa" w:w="70"/>
+            </w:tcMar>
+            <w:vAlign w:val="center"/>
+          </w:tcPr>
+          <w:p>
+            <w:pPr>
+              <w:spacing w:after="0" w:before="0"/>
+              <w:jc w:val="left"/>
+            </w:pPr>
+            <w:r>
+              <w:rPr>
+                <w:rFonts w:ascii="Times New Roman" w:cs="Times New Roman" w:eastAsia="Times New Roman" w:hAnsi="Times New Roman"/>
+                <w:b w:val="false"/>
+                <w:bCs w:val="false"/>
+                <w:i w:val="false"/>
+                <w:iCs w:val="false"/>
+                <w:smallCaps w:val="false"/>
+                <w:color w:val="000000"/>
+                <w:sz w:val="17"/>
+                <w:szCs w:val="17"/>
+              </w:rPr>
+              <w:t xml:space="preserve">0.87</w:t>
+            </w:r>
+          </w:p>
+        </w:tc>
+        <w:tc>
+          <w:tcPr>
+            <w:tcW w:type="dxa" w:w="1890"/>
+            <w:tcBorders>
+              <w:top w:val="single" w:color="BFBFBF" w:sz="4"/>
+              <w:left w:val="single" w:color="BFBFBF" w:sz="4"/>
+              <w:bottom w:val="single" w:color="BFBFBF" w:sz="4"/>
+              <w:right w:val="single" w:color="BFBFBF" w:sz="4"/>
+            </w:tcBorders>
+            <w:shd w:fill="FFFFFF" w:val="clear"/>
+            <w:tcMar>
+              <w:top w:type="dxa" w:w="50"/>
+              <w:left w:type="dxa" w:w="70"/>
+              <w:bottom w:type="dxa" w:w="50"/>
+              <w:right w:type="dxa" w:w="70"/>
+            </w:tcMar>
+            <w:vAlign w:val="center"/>
+          </w:tcPr>
+          <w:p>
+            <w:pPr>
+              <w:spacing w:after="0" w:before="0"/>
+              <w:jc w:val="left"/>
+            </w:pPr>
+            <w:r>
+              <w:rPr>
+                <w:rFonts w:ascii="Times New Roman" w:cs="Times New Roman" w:eastAsia="Times New Roman" w:hAnsi="Times New Roman"/>
+                <w:b w:val="false"/>
+                <w:bCs w:val="false"/>
+                <w:i w:val="false"/>
+                <w:iCs w:val="false"/>
+                <w:smallCaps w:val="false"/>
+                <w:color w:val="000000"/>
+                <w:sz w:val="17"/>
+                <w:szCs w:val="17"/>
+              </w:rPr>
+              <w:t xml:space="preserve">0.47</w:t>
+            </w:r>
+          </w:p>
+        </w:tc>
+        <w:tc>
+          <w:tcPr>
+            <w:tcW w:type="dxa" w:w="1890"/>
+            <w:tcBorders>
+              <w:top w:val="single" w:color="BFBFBF" w:sz="4"/>
+              <w:left w:val="single" w:color="BFBFBF" w:sz="4"/>
+              <w:bottom w:val="single" w:color="BFBFBF" w:sz="4"/>
+              <w:right w:val="single" w:color="BFBFBF" w:sz="4"/>
+            </w:tcBorders>
+            <w:shd w:fill="FFFFFF" w:val="clear"/>
+            <w:tcMar>
+              <w:top w:type="dxa" w:w="50"/>
+              <w:left w:type="dxa" w:w="70"/>
+              <w:bottom w:type="dxa" w:w="50"/>
+              <w:right w:type="dxa" w:w="70"/>
+            </w:tcMar>
+            <w:vAlign w:val="center"/>
+          </w:tcPr>
+          <w:p>
+            <w:pPr>
+              <w:spacing w:after="0" w:before="0"/>
+              <w:jc w:val="left"/>
+            </w:pPr>
+            <w:r>
+              <w:rPr>
+                <w:rFonts w:ascii="Times New Roman" w:cs="Times New Roman" w:eastAsia="Times New Roman" w:hAnsi="Times New Roman"/>
+                <w:b w:val="false"/>
+                <w:bCs w:val="false"/>
+                <w:i w:val="false"/>
+                <w:iCs w:val="false"/>
+                <w:smallCaps w:val="false"/>
+                <w:color w:val="000000"/>
+                <w:sz w:val="17"/>
+                <w:szCs w:val="17"/>
+              </w:rPr>
+              <w:t xml:space="preserve">0.23</w:t>
+            </w:r>
+          </w:p>
+        </w:tc>
+        <w:tc>
+          <w:tcPr>
+            <w:tcW w:type="dxa" w:w="1890"/>
+            <w:tcBorders>
+              <w:top w:val="single" w:color="BFBFBF" w:sz="4"/>
+              <w:left w:val="single" w:color="BFBFBF" w:sz="4"/>
+              <w:bottom w:val="single" w:color="BFBFBF" w:sz="4"/>
+              <w:right w:val="single" w:color="BFBFBF" w:sz="4"/>
+            </w:tcBorders>
+            <w:shd w:fill="FFFFFF" w:val="clear"/>
+            <w:tcMar>
+              <w:top w:type="dxa" w:w="50"/>
+              <w:left w:type="dxa" w:w="70"/>
+              <w:bottom w:type="dxa" w:w="50"/>
+              <w:right w:type="dxa" w:w="70"/>
+            </w:tcMar>
+            <w:vAlign w:val="center"/>
+          </w:tcPr>
+          <w:p>
+            <w:pPr>
+              <w:spacing w:after="0" w:before="0"/>
+              <w:jc w:val="left"/>
+            </w:pPr>
+            <w:r>
+              <w:rPr>
+                <w:rFonts w:ascii="Times New Roman" w:cs="Times New Roman" w:eastAsia="Times New Roman" w:hAnsi="Times New Roman"/>
+                <w:b w:val="false"/>
+                <w:bCs w:val="false"/>
+                <w:i w:val="false"/>
+                <w:iCs w:val="false"/>
+                <w:smallCaps w:val="false"/>
+                <w:color w:val="000000"/>
+                <w:sz w:val="17"/>
+                <w:szCs w:val="17"/>
+              </w:rPr>
+              <w:t xml:space="preserve">0.18</w:t>
+            </w:r>
+          </w:p>
+        </w:tc>
+      </w:tr>
+      <w:tr>
+        <w:trPr>
+          <w:cantSplit/>
+          <w:tblHeader w:val="false"/>
+        </w:trPr>
+        <w:tc>
+          <w:tcPr>
+            <w:tcW w:type="dxa" w:w="1800"/>
+            <w:tcBorders>
+              <w:top w:val="single" w:color="BFBFBF" w:sz="4"/>
+              <w:left w:val="single" w:color="BFBFBF" w:sz="4"/>
+              <w:bottom w:val="single" w:color="BFBFBF" w:sz="4"/>
+              <w:right w:val="single" w:color="BFBFBF" w:sz="4"/>
+            </w:tcBorders>
+            <w:shd w:fill="FFFFFF" w:val="clear"/>
+            <w:tcMar>
+              <w:top w:type="dxa" w:w="50"/>
+              <w:left w:type="dxa" w:w="70"/>
+              <w:bottom w:type="dxa" w:w="50"/>
+              <w:right w:type="dxa" w:w="70"/>
+            </w:tcMar>
+            <w:vAlign w:val="center"/>
+          </w:tcPr>
+          <w:p>
+            <w:pPr>
+              <w:spacing w:after="0" w:before="0"/>
+              <w:jc w:val="left"/>
+            </w:pPr>
+            <w:r>
+              <w:rPr>
+                <w:rFonts w:ascii="Times New Roman" w:cs="Times New Roman" w:eastAsia="Times New Roman" w:hAnsi="Times New Roman"/>
+                <w:b w:val="false"/>
+                <w:bCs w:val="false"/>
+                <w:i w:val="false"/>
+                <w:iCs w:val="false"/>
+                <w:smallCaps w:val="false"/>
+                <w:color w:val="000000"/>
+                <w:sz w:val="17"/>
+                <w:szCs w:val="17"/>
+              </w:rPr>
+              <w:t xml:space="preserve">2.5</w:t>
+            </w:r>
+          </w:p>
+        </w:tc>
+        <w:tc>
+          <w:tcPr>
+            <w:tcW w:type="dxa" w:w="1890"/>
+            <w:tcBorders>
+              <w:top w:val="single" w:color="BFBFBF" w:sz="4"/>
+              <w:left w:val="single" w:color="BFBFBF" w:sz="4"/>
+              <w:bottom w:val="single" w:color="BFBFBF" w:sz="4"/>
+              <w:right w:val="single" w:color="BFBFBF" w:sz="4"/>
+            </w:tcBorders>
+            <w:shd w:fill="FFFFFF" w:val="clear"/>
+            <w:tcMar>
+              <w:top w:type="dxa" w:w="50"/>
+              <w:left w:type="dxa" w:w="70"/>
+              <w:bottom w:type="dxa" w:w="50"/>
+              <w:right w:type="dxa" w:w="70"/>
+            </w:tcMar>
+            <w:vAlign w:val="center"/>
+          </w:tcPr>
+          <w:p>
+            <w:pPr>
+              <w:spacing w:after="0" w:before="0"/>
+              <w:jc w:val="left"/>
+            </w:pPr>
+            <w:r>
+              <w:rPr>
+                <w:rFonts w:ascii="Times New Roman" w:cs="Times New Roman" w:eastAsia="Times New Roman" w:hAnsi="Times New Roman"/>
+                <w:b w:val="false"/>
+                <w:bCs w:val="false"/>
+                <w:i w:val="false"/>
+                <w:iCs w:val="false"/>
+                <w:smallCaps w:val="false"/>
+                <w:color w:val="000000"/>
+                <w:sz w:val="17"/>
+                <w:szCs w:val="17"/>
+              </w:rPr>
+              <w:t xml:space="preserve">0.80</w:t>
+            </w:r>
+          </w:p>
+        </w:tc>
+        <w:tc>
+          <w:tcPr>
+            <w:tcW w:type="dxa" w:w="1890"/>
+            <w:tcBorders>
+              <w:top w:val="single" w:color="BFBFBF" w:sz="4"/>
+              <w:left w:val="single" w:color="BFBFBF" w:sz="4"/>
+              <w:bottom w:val="single" w:color="BFBFBF" w:sz="4"/>
+              <w:right w:val="single" w:color="BFBFBF" w:sz="4"/>
+            </w:tcBorders>
+            <w:shd w:fill="FFFFFF" w:val="clear"/>
+            <w:tcMar>
+              <w:top w:type="dxa" w:w="50"/>
+              <w:left w:type="dxa" w:w="70"/>
+              <w:bottom w:type="dxa" w:w="50"/>
+              <w:right w:type="dxa" w:w="70"/>
+            </w:tcMar>
+            <w:vAlign w:val="center"/>
+          </w:tcPr>
+          <w:p>
+            <w:pPr>
+              <w:spacing w:after="0" w:before="0"/>
+              <w:jc w:val="left"/>
+            </w:pPr>
+            <w:r>
+              <w:rPr>
+                <w:rFonts w:ascii="Times New Roman" w:cs="Times New Roman" w:eastAsia="Times New Roman" w:hAnsi="Times New Roman"/>
+                <w:b w:val="false"/>
+                <w:bCs w:val="false"/>
+                <w:i w:val="false"/>
+                <w:iCs w:val="false"/>
+                <w:smallCaps w:val="false"/>
+                <w:color w:val="000000"/>
+                <w:sz w:val="17"/>
+                <w:szCs w:val="17"/>
+              </w:rPr>
+              <w:t xml:space="preserve">0.48</w:t>
+            </w:r>
+          </w:p>
+        </w:tc>
+        <w:tc>
+          <w:tcPr>
+            <w:tcW w:type="dxa" w:w="1890"/>
+            <w:tcBorders>
+              <w:top w:val="single" w:color="BFBFBF" w:sz="4"/>
+              <w:left w:val="single" w:color="BFBFBF" w:sz="4"/>
+              <w:bottom w:val="single" w:color="BFBFBF" w:sz="4"/>
+              <w:right w:val="single" w:color="BFBFBF" w:sz="4"/>
+            </w:tcBorders>
+            <w:shd w:fill="FFFFFF" w:val="clear"/>
+            <w:tcMar>
+              <w:top w:type="dxa" w:w="50"/>
+              <w:left w:type="dxa" w:w="70"/>
+              <w:bottom w:type="dxa" w:w="50"/>
+              <w:right w:type="dxa" w:w="70"/>
+            </w:tcMar>
+            <w:vAlign w:val="center"/>
+          </w:tcPr>
+          <w:p>
+            <w:pPr>
+              <w:spacing w:after="0" w:before="0"/>
+              <w:jc w:val="left"/>
+            </w:pPr>
+            <w:r>
+              <w:rPr>
+                <w:rFonts w:ascii="Times New Roman" w:cs="Times New Roman" w:eastAsia="Times New Roman" w:hAnsi="Times New Roman"/>
+                <w:b w:val="false"/>
+                <w:bCs w:val="false"/>
+                <w:i w:val="false"/>
+                <w:iCs w:val="false"/>
+                <w:smallCaps w:val="false"/>
+                <w:color w:val="000000"/>
+                <w:sz w:val="17"/>
+                <w:szCs w:val="17"/>
+              </w:rPr>
+              <w:t xml:space="preserve">0.39</w:t>
+            </w:r>
+          </w:p>
+        </w:tc>
+        <w:tc>
+          <w:tcPr>
+            <w:tcW w:type="dxa" w:w="1890"/>
+            <w:tcBorders>
+              <w:top w:val="single" w:color="BFBFBF" w:sz="4"/>
+              <w:left w:val="single" w:color="BFBFBF" w:sz="4"/>
+              <w:bottom w:val="single" w:color="BFBFBF" w:sz="4"/>
+              <w:right w:val="single" w:color="BFBFBF" w:sz="4"/>
+            </w:tcBorders>
+            <w:shd w:fill="FFFFFF" w:val="clear"/>
+            <w:tcMar>
+              <w:top w:type="dxa" w:w="50"/>
+              <w:left w:type="dxa" w:w="70"/>
+              <w:bottom w:type="dxa" w:w="50"/>
+              <w:right w:type="dxa" w:w="70"/>
+            </w:tcMar>
+            <w:vAlign w:val="center"/>
+          </w:tcPr>
+          <w:p>
+            <w:pPr>
+              <w:spacing w:after="0" w:before="0"/>
+              <w:jc w:val="left"/>
+            </w:pPr>
+            <w:r>
+              <w:rPr>
+                <w:rFonts w:ascii="Times New Roman" w:cs="Times New Roman" w:eastAsia="Times New Roman" w:hAnsi="Times New Roman"/>
+                <w:b w:val="false"/>
+                <w:bCs w:val="false"/>
+                <w:i w:val="false"/>
+                <w:iCs w:val="false"/>
+                <w:smallCaps w:val="false"/>
+                <w:color w:val="000000"/>
+                <w:sz w:val="17"/>
+                <w:szCs w:val="17"/>
+              </w:rPr>
+              <w:t xml:space="preserve">0.17</w:t>
+            </w:r>
+          </w:p>
+        </w:tc>
+      </w:tr>
+      <w:tr>
+        <w:trPr>
+          <w:cantSplit/>
+          <w:tblHeader w:val="false"/>
+        </w:trPr>
+        <w:tc>
+          <w:tcPr>
+            <w:tcW w:type="dxa" w:w="1800"/>
+            <w:tcBorders>
+              <w:top w:val="single" w:color="BFBFBF" w:sz="4"/>
+              <w:left w:val="single" w:color="BFBFBF" w:sz="4"/>
+              <w:bottom w:val="single" w:color="BFBFBF" w:sz="4"/>
+              <w:right w:val="single" w:color="BFBFBF" w:sz="4"/>
+            </w:tcBorders>
+            <w:shd w:fill="FFFFFF" w:val="clear"/>
+            <w:tcMar>
+              <w:top w:type="dxa" w:w="50"/>
+              <w:left w:type="dxa" w:w="70"/>
+              <w:bottom w:type="dxa" w:w="50"/>
+              <w:right w:type="dxa" w:w="70"/>
+            </w:tcMar>
+            <w:vAlign w:val="center"/>
+          </w:tcPr>
+          <w:p>
+            <w:pPr>
+              <w:spacing w:after="0" w:before="0"/>
+              <w:jc w:val="left"/>
+            </w:pPr>
+            <w:r>
+              <w:rPr>
+                <w:rFonts w:ascii="Times New Roman" w:cs="Times New Roman" w:eastAsia="Times New Roman" w:hAnsi="Times New Roman"/>
+                <w:b w:val="false"/>
+                <w:bCs w:val="false"/>
+                <w:i w:val="false"/>
+                <w:iCs w:val="false"/>
+                <w:smallCaps w:val="false"/>
+                <w:color w:val="000000"/>
+                <w:sz w:val="17"/>
+                <w:szCs w:val="17"/>
+              </w:rPr>
+              <w:t xml:space="preserve">3</w:t>
+            </w:r>
+          </w:p>
+        </w:tc>
+        <w:tc>
+          <w:tcPr>
+            <w:tcW w:type="dxa" w:w="1890"/>
+            <w:tcBorders>
+              <w:top w:val="single" w:color="BFBFBF" w:sz="4"/>
+              <w:left w:val="single" w:color="BFBFBF" w:sz="4"/>
+              <w:bottom w:val="single" w:color="BFBFBF" w:sz="4"/>
+              <w:right w:val="single" w:color="BFBFBF" w:sz="4"/>
+            </w:tcBorders>
+            <w:shd w:fill="FFFFFF" w:val="clear"/>
+            <w:tcMar>
+              <w:top w:type="dxa" w:w="50"/>
+              <w:left w:type="dxa" w:w="70"/>
+              <w:bottom w:type="dxa" w:w="50"/>
+              <w:right w:type="dxa" w:w="70"/>
+            </w:tcMar>
+            <w:vAlign w:val="center"/>
+          </w:tcPr>
+          <w:p>
+            <w:pPr>
+              <w:spacing w:after="0" w:before="0"/>
+              <w:jc w:val="left"/>
+            </w:pPr>
+            <w:r>
+              <w:rPr>
+                <w:rFonts w:ascii="Times New Roman" w:cs="Times New Roman" w:eastAsia="Times New Roman" w:hAnsi="Times New Roman"/>
+                <w:b w:val="false"/>
+                <w:bCs w:val="false"/>
+                <w:i w:val="false"/>
+                <w:iCs w:val="false"/>
+                <w:smallCaps w:val="false"/>
+                <w:color w:val="000000"/>
+                <w:sz w:val="17"/>
+                <w:szCs w:val="17"/>
+              </w:rPr>
+              <w:t xml:space="preserve">0.61</w:t>
+            </w:r>
+          </w:p>
+        </w:tc>
+        <w:tc>
+          <w:tcPr>
+            <w:tcW w:type="dxa" w:w="1890"/>
+            <w:tcBorders>
+              <w:top w:val="single" w:color="BFBFBF" w:sz="4"/>
+              <w:left w:val="single" w:color="BFBFBF" w:sz="4"/>
+              <w:bottom w:val="single" w:color="BFBFBF" w:sz="4"/>
+              <w:right w:val="single" w:color="BFBFBF" w:sz="4"/>
+            </w:tcBorders>
+            <w:shd w:fill="FFFFFF" w:val="clear"/>
+            <w:tcMar>
+              <w:top w:type="dxa" w:w="50"/>
+              <w:left w:type="dxa" w:w="70"/>
+              <w:bottom w:type="dxa" w:w="50"/>
+              <w:right w:type="dxa" w:w="70"/>
+            </w:tcMar>
+            <w:vAlign w:val="center"/>
+          </w:tcPr>
+          <w:p>
+            <w:pPr>
+              <w:spacing w:after="0" w:before="0"/>
+              <w:jc w:val="left"/>
+            </w:pPr>
+            <w:r>
+              <w:rPr>
+                <w:rFonts w:ascii="Times New Roman" w:cs="Times New Roman" w:eastAsia="Times New Roman" w:hAnsi="Times New Roman"/>
+                <w:b w:val="false"/>
+                <w:bCs w:val="false"/>
+                <w:i w:val="false"/>
+                <w:iCs w:val="false"/>
+                <w:smallCaps w:val="false"/>
+                <w:color w:val="000000"/>
+                <w:sz w:val="17"/>
+                <w:szCs w:val="17"/>
+              </w:rPr>
+              <w:t xml:space="preserve">0.37</w:t>
+            </w:r>
+          </w:p>
+        </w:tc>
+        <w:tc>
+          <w:tcPr>
+            <w:tcW w:type="dxa" w:w="1890"/>
+            <w:tcBorders>
+              <w:top w:val="single" w:color="BFBFBF" w:sz="4"/>
+              <w:left w:val="single" w:color="BFBFBF" w:sz="4"/>
+              <w:bottom w:val="single" w:color="BFBFBF" w:sz="4"/>
+              <w:right w:val="single" w:color="BFBFBF" w:sz="4"/>
+            </w:tcBorders>
+            <w:shd w:fill="FFFFFF" w:val="clear"/>
+            <w:tcMar>
+              <w:top w:type="dxa" w:w="50"/>
+              <w:left w:type="dxa" w:w="70"/>
+              <w:bottom w:type="dxa" w:w="50"/>
+              <w:right w:type="dxa" w:w="70"/>
+            </w:tcMar>
+            <w:vAlign w:val="center"/>
+          </w:tcPr>
+          <w:p>
+            <w:pPr>
+              <w:spacing w:after="0" w:before="0"/>
+              <w:jc w:val="left"/>
+            </w:pPr>
+            <w:r>
+              <w:rPr>
+                <w:rFonts w:ascii="Times New Roman" w:cs="Times New Roman" w:eastAsia="Times New Roman" w:hAnsi="Times New Roman"/>
+                <w:b w:val="false"/>
+                <w:bCs w:val="false"/>
+                <w:i w:val="false"/>
+                <w:iCs w:val="false"/>
+                <w:smallCaps w:val="false"/>
+                <w:color w:val="000000"/>
+                <w:sz w:val="17"/>
+                <w:szCs w:val="17"/>
+              </w:rPr>
+              <w:t xml:space="preserve">0.31</w:t>
+            </w:r>
+          </w:p>
+        </w:tc>
+        <w:tc>
+          <w:tcPr>
+            <w:tcW w:type="dxa" w:w="1890"/>
+            <w:tcBorders>
+              <w:top w:val="single" w:color="BFBFBF" w:sz="4"/>
+              <w:left w:val="single" w:color="BFBFBF" w:sz="4"/>
+              <w:bottom w:val="single" w:color="BFBFBF" w:sz="4"/>
+              <w:right w:val="single" w:color="BFBFBF" w:sz="4"/>
+            </w:tcBorders>
+            <w:shd w:fill="FFFFFF" w:val="clear"/>
+            <w:tcMar>
+              <w:top w:type="dxa" w:w="50"/>
+              <w:left w:type="dxa" w:w="70"/>
+              <w:bottom w:type="dxa" w:w="50"/>
+              <w:right w:type="dxa" w:w="70"/>
+            </w:tcMar>
+            <w:vAlign w:val="center"/>
+          </w:tcPr>
+          <w:p>
+            <w:pPr>
+              <w:spacing w:after="0" w:before="0"/>
+              <w:jc w:val="left"/>
+            </w:pPr>
+            <w:r>
+              <w:rPr>
+                <w:rFonts w:ascii="Times New Roman" w:cs="Times New Roman" w:eastAsia="Times New Roman" w:hAnsi="Times New Roman"/>
+                <w:b w:val="false"/>
+                <w:bCs w:val="false"/>
+                <w:i w:val="false"/>
+                <w:iCs w:val="false"/>
+                <w:smallCaps w:val="false"/>
+                <w:color w:val="000000"/>
+                <w:sz w:val="17"/>
+                <w:szCs w:val="17"/>
+              </w:rPr>
+              <w:t xml:space="preserve">0.19</w:t>
+            </w:r>
+          </w:p>
+        </w:tc>
+      </w:tr>
+      <w:tr>
+        <w:trPr>
+          <w:cantSplit/>
+          <w:tblHeader w:val="false"/>
+        </w:trPr>
+        <w:tc>
+          <w:tcPr>
+            <w:tcW w:type="dxa" w:w="1800"/>
+            <w:tcBorders>
+              <w:top w:val="single" w:color="BFBFBF" w:sz="4"/>
+              <w:left w:val="single" w:color="BFBFBF" w:sz="4"/>
+              <w:bottom w:val="single" w:color="BFBFBF" w:sz="4"/>
+              <w:right w:val="single" w:color="BFBFBF" w:sz="4"/>
+            </w:tcBorders>
+            <w:shd w:fill="FFFFFF" w:val="clear"/>
+            <w:tcMar>
+              <w:top w:type="dxa" w:w="50"/>
+              <w:left w:type="dxa" w:w="70"/>
+              <w:bottom w:type="dxa" w:w="50"/>
+              <w:right w:type="dxa" w:w="70"/>
+            </w:tcMar>
+            <w:vAlign w:val="center"/>
+          </w:tcPr>
+          <w:p>
+            <w:pPr>
+              <w:spacing w:after="0" w:before="0"/>
+              <w:jc w:val="left"/>
+            </w:pPr>
+            <w:r>
+              <w:rPr>
+                <w:rFonts w:ascii="Times New Roman" w:cs="Times New Roman" w:eastAsia="Times New Roman" w:hAnsi="Times New Roman"/>
+                <w:b w:val="false"/>
+                <w:bCs w:val="false"/>
+                <w:i w:val="false"/>
+                <w:iCs w:val="false"/>
+                <w:smallCaps w:val="false"/>
+                <w:color w:val="000000"/>
+                <w:sz w:val="17"/>
+                <w:szCs w:val="17"/>
+              </w:rPr>
+              <w:t xml:space="preserve">5</w:t>
+            </w:r>
+          </w:p>
+        </w:tc>
+        <w:tc>
+          <w:tcPr>
+            <w:tcW w:type="dxa" w:w="1890"/>
+            <w:tcBorders>
+              <w:top w:val="single" w:color="BFBFBF" w:sz="4"/>
+              <w:left w:val="single" w:color="BFBFBF" w:sz="4"/>
+              <w:bottom w:val="single" w:color="BFBFBF" w:sz="4"/>
+              <w:right w:val="single" w:color="BFBFBF" w:sz="4"/>
+            </w:tcBorders>
+            <w:shd w:fill="FFFFFF" w:val="clear"/>
+            <w:tcMar>
+              <w:top w:type="dxa" w:w="50"/>
+              <w:left w:type="dxa" w:w="70"/>
+              <w:bottom w:type="dxa" w:w="50"/>
+              <w:right w:type="dxa" w:w="70"/>
+            </w:tcMar>
+            <w:vAlign w:val="center"/>
+          </w:tcPr>
+          <w:p>
+            <w:pPr>
+              <w:spacing w:after="0" w:before="0"/>
+              <w:jc w:val="left"/>
+            </w:pPr>
+            <w:r>
+              <w:rPr>
+                <w:rFonts w:ascii="Times New Roman" w:cs="Times New Roman" w:eastAsia="Times New Roman" w:hAnsi="Times New Roman"/>
+                <w:b w:val="false"/>
+                <w:bCs w:val="false"/>
+                <w:i w:val="false"/>
+                <w:iCs w:val="false"/>
+                <w:smallCaps w:val="false"/>
+                <w:color w:val="000000"/>
+                <w:sz w:val="17"/>
+                <w:szCs w:val="17"/>
+              </w:rPr>
+              <w:t xml:space="preserve">0.28</w:t>
+            </w:r>
+          </w:p>
+        </w:tc>
+        <w:tc>
+          <w:tcPr>
+            <w:tcW w:type="dxa" w:w="1890"/>
+            <w:tcBorders>
+              <w:top w:val="single" w:color="BFBFBF" w:sz="4"/>
+              <w:left w:val="single" w:color="BFBFBF" w:sz="4"/>
+              <w:bottom w:val="single" w:color="BFBFBF" w:sz="4"/>
+              <w:right w:val="single" w:color="BFBFBF" w:sz="4"/>
+            </w:tcBorders>
+            <w:shd w:fill="FFFFFF" w:val="clear"/>
+            <w:tcMar>
+              <w:top w:type="dxa" w:w="50"/>
+              <w:left w:type="dxa" w:w="70"/>
+              <w:bottom w:type="dxa" w:w="50"/>
+              <w:right w:type="dxa" w:w="70"/>
+            </w:tcMar>
+            <w:vAlign w:val="center"/>
+          </w:tcPr>
+          <w:p>
+            <w:pPr>
+              <w:spacing w:after="0" w:before="0"/>
+              <w:jc w:val="left"/>
+            </w:pPr>
+            <w:r>
+              <w:rPr>
+                <w:rFonts w:ascii="Times New Roman" w:cs="Times New Roman" w:eastAsia="Times New Roman" w:hAnsi="Times New Roman"/>
+                <w:b w:val="false"/>
+                <w:bCs w:val="false"/>
+                <w:i w:val="false"/>
+                <w:iCs w:val="false"/>
+                <w:smallCaps w:val="false"/>
+                <w:color w:val="000000"/>
+                <w:sz w:val="17"/>
+                <w:szCs w:val="17"/>
+              </w:rPr>
+              <w:t xml:space="preserve">0.13</w:t>
+            </w:r>
+          </w:p>
+        </w:tc>
+        <w:tc>
+          <w:tcPr>
+            <w:tcW w:type="dxa" w:w="1890"/>
+            <w:tcBorders>
+              <w:top w:val="single" w:color="BFBFBF" w:sz="4"/>
+              <w:left w:val="single" w:color="BFBFBF" w:sz="4"/>
+              <w:bottom w:val="single" w:color="BFBFBF" w:sz="4"/>
+              <w:right w:val="single" w:color="BFBFBF" w:sz="4"/>
+            </w:tcBorders>
+            <w:shd w:fill="FFFFFF" w:val="clear"/>
+            <w:tcMar>
+              <w:top w:type="dxa" w:w="50"/>
+              <w:left w:type="dxa" w:w="70"/>
+              <w:bottom w:type="dxa" w:w="50"/>
+              <w:right w:type="dxa" w:w="70"/>
+            </w:tcMar>
+            <w:vAlign w:val="center"/>
+          </w:tcPr>
+          <w:p>
+            <w:pPr>
+              <w:spacing w:after="0" w:before="0"/>
+              <w:jc w:val="left"/>
+            </w:pPr>
+            <w:r>
+              <w:rPr>
+                <w:rFonts w:ascii="Times New Roman" w:cs="Times New Roman" w:eastAsia="Times New Roman" w:hAnsi="Times New Roman"/>
+                <w:b w:val="false"/>
+                <w:bCs w:val="false"/>
+                <w:i w:val="false"/>
+                <w:iCs w:val="false"/>
+                <w:smallCaps w:val="false"/>
+                <w:color w:val="000000"/>
+                <w:sz w:val="17"/>
+                <w:szCs w:val="17"/>
+              </w:rPr>
+              <w:t xml:space="preserve">0.18</w:t>
+            </w:r>
+          </w:p>
+        </w:tc>
+        <w:tc>
+          <w:tcPr>
+            <w:tcW w:type="dxa" w:w="1890"/>
+            <w:tcBorders>
+              <w:top w:val="single" w:color="BFBFBF" w:sz="4"/>
+              <w:left w:val="single" w:color="BFBFBF" w:sz="4"/>
+              <w:bottom w:val="single" w:color="BFBFBF" w:sz="4"/>
+              <w:right w:val="single" w:color="BFBFBF" w:sz="4"/>
+            </w:tcBorders>
+            <w:shd w:fill="FFFFFF" w:val="clear"/>
+            <w:tcMar>
+              <w:top w:type="dxa" w:w="50"/>
+              <w:left w:type="dxa" w:w="70"/>
+              <w:bottom w:type="dxa" w:w="50"/>
+              <w:right w:type="dxa" w:w="70"/>
+            </w:tcMar>
+            <w:vAlign w:val="center"/>
+          </w:tcPr>
+          <w:p>
+            <w:pPr>
+              <w:spacing w:after="0" w:before="0"/>
+              <w:jc w:val="left"/>
+            </w:pPr>
+            <w:r>
+              <w:rPr>
+                <w:rFonts w:ascii="Times New Roman" w:cs="Times New Roman" w:eastAsia="Times New Roman" w:hAnsi="Times New Roman"/>
+                <w:b w:val="false"/>
+                <w:bCs w:val="false"/>
+                <w:i w:val="false"/>
+                <w:iCs w:val="false"/>
+                <w:smallCaps w:val="false"/>
+                <w:color w:val="000000"/>
+                <w:sz w:val="17"/>
+                <w:szCs w:val="17"/>
+              </w:rPr>
+              <w:t xml:space="preserve">0.16</w:t>
+            </w:r>
+          </w:p>
+        </w:tc>
+      </w:tr>
+    </w:tbl>
+    <w:p>
+      <w:pPr>
+        <w:spacing w:after="160" w:before="0" w:line="276"/>
+        <w:jc w:val="both"/>
+      </w:pPr>
+      <w:r>
+        <w:rPr>
+          <w:rFonts w:ascii="Times New Roman" w:cs="Times New Roman" w:eastAsia="Times New Roman" w:hAnsi="Times New Roman"/>
+          <w:b w:val="false"/>
+          <w:bCs w:val="false"/>
+          <w:i w:val="false"/>
+          <w:iCs w:val="false"/>
+          <w:smallCaps w:val="false"/>
+          <w:color w:val="000000"/>
+          <w:sz w:val="22"/>
+          <w:szCs w:val="22"/>
+        </w:rPr>
+        <w:t xml:space="preserve">The same regimes appear one step lower in m. With m = 1 the error is absorbed at low T, and accuracy declines monotonically from 1.00 to 0.28 at T = 5.0. With m = 2 and m = 3 the agent locks in at low T (accuracy 0.00 at T = 0.15), accuracy rises to 0.48 and 0.39 at T = 2.5, and it falls to 0.13 and 0.18 at T = 5.0, which is an inverted-U. The peak exceeds the T = 0.15 cell by more than six standard errors for both, and the T = 5.0 cell by about five (m = 2) and three (m = 3), without adjustment for choosing the peak after the fact. With m = 4 the lock is too strong for the sampled range: accuracy stays between 0.16 and 0.19 from T = 2.0 to T = 5.0 and shows no interior peak. Strict recovery for m ≥ 2 never exceeds 0.20. The 7B model therefore reproduces the weak, sticky-and-escapable, and too-strong rows of Table 2 within a single model, and the peak again lies at T ≈ 2 to 2.5, above the range we had expected.</w:t>
       </w:r>
     </w:p>
     <w:p>
@@ -13342,7 +15009,2595 @@
           <w:sz w:val="22"/>
           <w:szCs w:val="22"/>
         </w:rPr>
-        <w:t xml:space="preserve">Two statements are not supported. Proposition 3 receives no support, because contamination changes neither Teff nor lock-in on the 3B model. And the inverted-U is a conditional result: it is absent from the three 135M experiments, where the attractor was too weak or too strong, and its peak on the 3B model sits at T ≈ 2 to 2.5, well above the usual decoding range. Accuracy at the peak is below 0.50 and strict recovery below 0.20, so no practitioner would choose such a temperature to repair a locked agent. The result supports the structure of the prediction, not a prescription. Teff is also weakly identified when the reference is saturated, which includes the clean cells at low T. The estimate then sits at the lower edge of the search grid, and the small clean values reported for the 135M model at T = 0.15 may reflect the same limit.</w:t>
+        <w:t xml:space="preserve">Table 10 gives the pressure and contamination cells at m = 2 (30 trajectories each). Pressure lifts Teff to 3.4 at T = 0.8 and 3.6 at T = 2.0, which is 2.6 and 1.6 above nominal T, as on the 3B model. It also removes the lock-in (0.07 and 0.17 against 0.98 and 0.43 in the clean cells) without producing recovery: strict recovery is 0.07 and 0.00, and the agent cycles through earlier letters (repetition 0.51 and 0.35). Contamination alone leaves Teff at nominal T (−0.04 and −0.33 above it) and does not change the lock at T = 0.8 (0.93), but at T = 2.0 it makes the lock stickier (lock-in 0.72 against 0.43, accuracy 0.24 against 0.47). That is one cell of 30 trajectories, and the contaminated text is diffuse sentiment, so we do not read it as support for Proposition 3. Pressure with contamination behaves like pressure alone at T = 0.8 (Teff − T = +2.44), and at T = 2.0 gives Teff − T = +1.74 with strict recovery of 0.00.</w:t>
+      </w:r>
+    </w:p>
+    <w:p>
+      <w:pPr>
+        <w:spacing w:after="80" w:before="160"/>
+      </w:pPr>
+      <w:r>
+        <w:rPr>
+          <w:rFonts w:ascii="Times New Roman" w:cs="Times New Roman" w:eastAsia="Times New Roman" w:hAnsi="Times New Roman"/>
+          <w:b w:val="false"/>
+          <w:bCs w:val="false"/>
+          <w:i/>
+          <w:iCs/>
+          <w:smallCaps w:val="false"/>
+          <w:color w:val="000000"/>
+          <w:sz w:val="20"/>
+          <w:szCs w:val="20"/>
+        </w:rPr>
+        <w:t xml:space="preserve">Table 10. Stage 4, planted attractor m = 2, by prompt condition (clean cells: 60 trajectories; others: 30).</w:t>
+      </w:r>
+    </w:p>
+    <w:tbl>
+      <w:tblPr>
+        <w:tblW w:type="dxa" w:w="9360"/>
+        <w:tblBorders>
+          <w:top w:val="single" w:color="auto" w:sz="4"/>
+          <w:left w:val="single" w:color="auto" w:sz="4"/>
+          <w:bottom w:val="single" w:color="auto" w:sz="4"/>
+          <w:right w:val="single" w:color="auto" w:sz="4"/>
+          <w:insideH w:val="single" w:color="auto" w:sz="4"/>
+          <w:insideV w:val="single" w:color="auto" w:sz="4"/>
+        </w:tblBorders>
+      </w:tblPr>
+      <w:tblGrid>
+        <w:gridCol w:w="2760"/>
+        <w:gridCol w:w="1100"/>
+        <w:gridCol w:w="1100"/>
+        <w:gridCol w:w="1100"/>
+        <w:gridCol w:w="1100"/>
+        <w:gridCol w:w="1100"/>
+        <w:gridCol w:w="1100"/>
+      </w:tblGrid>
+      <w:tr>
+        <w:trPr>
+          <w:cantSplit/>
+          <w:tblHeader/>
+        </w:trPr>
+        <w:tc>
+          <w:tcPr>
+            <w:tcW w:type="dxa" w:w="2760"/>
+            <w:tcBorders>
+              <w:top w:val="single" w:color="BFBFBF" w:sz="4"/>
+              <w:left w:val="single" w:color="BFBFBF" w:sz="4"/>
+              <w:bottom w:val="single" w:color="BFBFBF" w:sz="4"/>
+              <w:right w:val="single" w:color="BFBFBF" w:sz="4"/>
+            </w:tcBorders>
+            <w:shd w:fill="E7EEF5" w:val="clear"/>
+            <w:tcMar>
+              <w:top w:type="dxa" w:w="50"/>
+              <w:left w:type="dxa" w:w="70"/>
+              <w:bottom w:type="dxa" w:w="50"/>
+              <w:right w:type="dxa" w:w="70"/>
+            </w:tcMar>
+            <w:vAlign w:val="center"/>
+          </w:tcPr>
+          <w:p>
+            <w:pPr>
+              <w:spacing w:after="0" w:before="0"/>
+              <w:jc w:val="left"/>
+            </w:pPr>
+            <w:r>
+              <w:rPr>
+                <w:rFonts w:ascii="Times New Roman" w:cs="Times New Roman" w:eastAsia="Times New Roman" w:hAnsi="Times New Roman"/>
+                <w:b/>
+                <w:bCs/>
+                <w:i w:val="false"/>
+                <w:iCs w:val="false"/>
+                <w:smallCaps w:val="false"/>
+                <w:color w:val="000000"/>
+                <w:sz w:val="17"/>
+                <w:szCs w:val="17"/>
+              </w:rPr>
+              <w:t xml:space="preserve">Condition</w:t>
+            </w:r>
+          </w:p>
+        </w:tc>
+        <w:tc>
+          <w:tcPr>
+            <w:tcW w:type="dxa" w:w="1100"/>
+            <w:tcBorders>
+              <w:top w:val="single" w:color="BFBFBF" w:sz="4"/>
+              <w:left w:val="single" w:color="BFBFBF" w:sz="4"/>
+              <w:bottom w:val="single" w:color="BFBFBF" w:sz="4"/>
+              <w:right w:val="single" w:color="BFBFBF" w:sz="4"/>
+            </w:tcBorders>
+            <w:shd w:fill="E7EEF5" w:val="clear"/>
+            <w:tcMar>
+              <w:top w:type="dxa" w:w="50"/>
+              <w:left w:type="dxa" w:w="70"/>
+              <w:bottom w:type="dxa" w:w="50"/>
+              <w:right w:type="dxa" w:w="70"/>
+            </w:tcMar>
+            <w:vAlign w:val="center"/>
+          </w:tcPr>
+          <w:p>
+            <w:pPr>
+              <w:spacing w:after="0" w:before="0"/>
+              <w:jc w:val="left"/>
+            </w:pPr>
+            <w:r>
+              <w:rPr>
+                <w:rFonts w:ascii="Times New Roman" w:cs="Times New Roman" w:eastAsia="Times New Roman" w:hAnsi="Times New Roman"/>
+                <w:b/>
+                <w:bCs/>
+                <w:i w:val="false"/>
+                <w:iCs w:val="false"/>
+                <w:smallCaps w:val="false"/>
+                <w:color w:val="000000"/>
+                <w:sz w:val="17"/>
+                <w:szCs w:val="17"/>
+              </w:rPr>
+              <w:t xml:space="preserve">Acc.</w:t>
+            </w:r>
+          </w:p>
+        </w:tc>
+        <w:tc>
+          <w:tcPr>
+            <w:tcW w:type="dxa" w:w="1100"/>
+            <w:tcBorders>
+              <w:top w:val="single" w:color="BFBFBF" w:sz="4"/>
+              <w:left w:val="single" w:color="BFBFBF" w:sz="4"/>
+              <w:bottom w:val="single" w:color="BFBFBF" w:sz="4"/>
+              <w:right w:val="single" w:color="BFBFBF" w:sz="4"/>
+            </w:tcBorders>
+            <w:shd w:fill="E7EEF5" w:val="clear"/>
+            <w:tcMar>
+              <w:top w:type="dxa" w:w="50"/>
+              <w:left w:type="dxa" w:w="70"/>
+              <w:bottom w:type="dxa" w:w="50"/>
+              <w:right w:type="dxa" w:w="70"/>
+            </w:tcMar>
+            <w:vAlign w:val="center"/>
+          </w:tcPr>
+          <w:p>
+            <w:pPr>
+              <w:spacing w:after="0" w:before="0"/>
+              <w:jc w:val="left"/>
+            </w:pPr>
+            <w:r>
+              <w:rPr>
+                <w:rFonts w:ascii="Times New Roman" w:cs="Times New Roman" w:eastAsia="Times New Roman" w:hAnsi="Times New Roman"/>
+                <w:b/>
+                <w:bCs/>
+                <w:i w:val="false"/>
+                <w:iCs w:val="false"/>
+                <w:smallCaps w:val="false"/>
+                <w:color w:val="000000"/>
+                <w:sz w:val="17"/>
+                <w:szCs w:val="17"/>
+              </w:rPr>
+              <w:t xml:space="preserve">Strict</w:t>
+            </w:r>
+          </w:p>
+        </w:tc>
+        <w:tc>
+          <w:tcPr>
+            <w:tcW w:type="dxa" w:w="1100"/>
+            <w:tcBorders>
+              <w:top w:val="single" w:color="BFBFBF" w:sz="4"/>
+              <w:left w:val="single" w:color="BFBFBF" w:sz="4"/>
+              <w:bottom w:val="single" w:color="BFBFBF" w:sz="4"/>
+              <w:right w:val="single" w:color="BFBFBF" w:sz="4"/>
+            </w:tcBorders>
+            <w:shd w:fill="E7EEF5" w:val="clear"/>
+            <w:tcMar>
+              <w:top w:type="dxa" w:w="50"/>
+              <w:left w:type="dxa" w:w="70"/>
+              <w:bottom w:type="dxa" w:w="50"/>
+              <w:right w:type="dxa" w:w="70"/>
+            </w:tcMar>
+            <w:vAlign w:val="center"/>
+          </w:tcPr>
+          <w:p>
+            <w:pPr>
+              <w:spacing w:after="0" w:before="0"/>
+              <w:jc w:val="left"/>
+            </w:pPr>
+            <w:r>
+              <w:rPr>
+                <w:rFonts w:ascii="Times New Roman" w:cs="Times New Roman" w:eastAsia="Times New Roman" w:hAnsi="Times New Roman"/>
+                <w:b/>
+                <w:bCs/>
+                <w:i w:val="false"/>
+                <w:iCs w:val="false"/>
+                <w:smallCaps w:val="false"/>
+                <w:color w:val="000000"/>
+                <w:sz w:val="17"/>
+                <w:szCs w:val="17"/>
+              </w:rPr>
+              <w:t xml:space="preserve">Lock-in</w:t>
+            </w:r>
+          </w:p>
+        </w:tc>
+        <w:tc>
+          <w:tcPr>
+            <w:tcW w:type="dxa" w:w="1100"/>
+            <w:tcBorders>
+              <w:top w:val="single" w:color="BFBFBF" w:sz="4"/>
+              <w:left w:val="single" w:color="BFBFBF" w:sz="4"/>
+              <w:bottom w:val="single" w:color="BFBFBF" w:sz="4"/>
+              <w:right w:val="single" w:color="BFBFBF" w:sz="4"/>
+            </w:tcBorders>
+            <w:shd w:fill="E7EEF5" w:val="clear"/>
+            <w:tcMar>
+              <w:top w:type="dxa" w:w="50"/>
+              <w:left w:type="dxa" w:w="70"/>
+              <w:bottom w:type="dxa" w:w="50"/>
+              <w:right w:type="dxa" w:w="70"/>
+            </w:tcMar>
+            <w:vAlign w:val="center"/>
+          </w:tcPr>
+          <w:p>
+            <w:pPr>
+              <w:spacing w:after="0" w:before="0"/>
+              <w:jc w:val="left"/>
+            </w:pPr>
+            <w:r>
+              <w:rPr>
+                <w:rFonts w:ascii="Times New Roman" w:cs="Times New Roman" w:eastAsia="Times New Roman" w:hAnsi="Times New Roman"/>
+                <w:b/>
+                <w:bCs/>
+                <w:i w:val="false"/>
+                <w:iCs w:val="false"/>
+                <w:smallCaps w:val="false"/>
+                <w:color w:val="000000"/>
+                <w:sz w:val="17"/>
+                <w:szCs w:val="17"/>
+              </w:rPr>
+              <w:t xml:space="preserve">Repetition</w:t>
+            </w:r>
+          </w:p>
+        </w:tc>
+        <w:tc>
+          <w:tcPr>
+            <w:tcW w:type="dxa" w:w="1100"/>
+            <w:tcBorders>
+              <w:top w:val="single" w:color="BFBFBF" w:sz="4"/>
+              <w:left w:val="single" w:color="BFBFBF" w:sz="4"/>
+              <w:bottom w:val="single" w:color="BFBFBF" w:sz="4"/>
+              <w:right w:val="single" w:color="BFBFBF" w:sz="4"/>
+            </w:tcBorders>
+            <w:shd w:fill="E7EEF5" w:val="clear"/>
+            <w:tcMar>
+              <w:top w:type="dxa" w:w="50"/>
+              <w:left w:type="dxa" w:w="70"/>
+              <w:bottom w:type="dxa" w:w="50"/>
+              <w:right w:type="dxa" w:w="70"/>
+            </w:tcMar>
+            <w:vAlign w:val="center"/>
+          </w:tcPr>
+          <w:p>
+            <w:pPr>
+              <w:spacing w:after="0" w:before="0"/>
+              <w:jc w:val="left"/>
+            </w:pPr>
+            <w:r>
+              <w:rPr>
+                <w:rFonts w:ascii="Times New Roman" w:cs="Times New Roman" w:eastAsia="Times New Roman" w:hAnsi="Times New Roman"/>
+                <w:b/>
+                <w:bCs/>
+                <w:i w:val="false"/>
+                <w:iCs w:val="false"/>
+                <w:smallCaps w:val="false"/>
+                <w:color w:val="000000"/>
+                <w:sz w:val="17"/>
+                <w:szCs w:val="17"/>
+              </w:rPr>
+              <w:t xml:space="preserve">Teff</w:t>
+            </w:r>
+          </w:p>
+        </w:tc>
+        <w:tc>
+          <w:tcPr>
+            <w:tcW w:type="dxa" w:w="1100"/>
+            <w:tcBorders>
+              <w:top w:val="single" w:color="BFBFBF" w:sz="4"/>
+              <w:left w:val="single" w:color="BFBFBF" w:sz="4"/>
+              <w:bottom w:val="single" w:color="BFBFBF" w:sz="4"/>
+              <w:right w:val="single" w:color="BFBFBF" w:sz="4"/>
+            </w:tcBorders>
+            <w:shd w:fill="E7EEF5" w:val="clear"/>
+            <w:tcMar>
+              <w:top w:type="dxa" w:w="50"/>
+              <w:left w:type="dxa" w:w="70"/>
+              <w:bottom w:type="dxa" w:w="50"/>
+              <w:right w:type="dxa" w:w="70"/>
+            </w:tcMar>
+            <w:vAlign w:val="center"/>
+          </w:tcPr>
+          <w:p>
+            <w:pPr>
+              <w:spacing w:after="0" w:before="0"/>
+              <w:jc w:val="left"/>
+            </w:pPr>
+            <w:r>
+              <w:rPr>
+                <w:rFonts w:ascii="Times New Roman" w:cs="Times New Roman" w:eastAsia="Times New Roman" w:hAnsi="Times New Roman"/>
+                <w:b/>
+                <w:bCs/>
+                <w:i w:val="false"/>
+                <w:iCs w:val="false"/>
+                <w:smallCaps w:val="false"/>
+                <w:color w:val="000000"/>
+                <w:sz w:val="17"/>
+                <w:szCs w:val="17"/>
+              </w:rPr>
+              <w:t xml:space="preserve">Teff − T</w:t>
+            </w:r>
+          </w:p>
+        </w:tc>
+      </w:tr>
+      <w:tr>
+        <w:trPr>
+          <w:cantSplit/>
+          <w:tblHeader w:val="false"/>
+        </w:trPr>
+        <w:tc>
+          <w:tcPr>
+            <w:tcW w:type="dxa" w:w="2760"/>
+            <w:tcBorders>
+              <w:top w:val="single" w:color="BFBFBF" w:sz="4"/>
+              <w:left w:val="single" w:color="BFBFBF" w:sz="4"/>
+              <w:bottom w:val="single" w:color="BFBFBF" w:sz="4"/>
+              <w:right w:val="single" w:color="BFBFBF" w:sz="4"/>
+            </w:tcBorders>
+            <w:shd w:fill="FFFFFF" w:val="clear"/>
+            <w:tcMar>
+              <w:top w:type="dxa" w:w="50"/>
+              <w:left w:type="dxa" w:w="70"/>
+              <w:bottom w:type="dxa" w:w="50"/>
+              <w:right w:type="dxa" w:w="70"/>
+            </w:tcMar>
+            <w:vAlign w:val="center"/>
+          </w:tcPr>
+          <w:p>
+            <w:pPr>
+              <w:spacing w:after="0" w:before="0"/>
+              <w:jc w:val="left"/>
+            </w:pPr>
+            <w:r>
+              <w:rPr>
+                <w:rFonts w:ascii="Times New Roman" w:cs="Times New Roman" w:eastAsia="Times New Roman" w:hAnsi="Times New Roman"/>
+                <w:b w:val="false"/>
+                <w:bCs w:val="false"/>
+                <w:i w:val="false"/>
+                <w:iCs w:val="false"/>
+                <w:smallCaps w:val="false"/>
+                <w:color w:val="000000"/>
+                <w:sz w:val="17"/>
+                <w:szCs w:val="17"/>
+              </w:rPr>
+              <w:t xml:space="preserve">T = 0.8, clean</w:t>
+            </w:r>
+          </w:p>
+        </w:tc>
+        <w:tc>
+          <w:tcPr>
+            <w:tcW w:type="dxa" w:w="1100"/>
+            <w:tcBorders>
+              <w:top w:val="single" w:color="BFBFBF" w:sz="4"/>
+              <w:left w:val="single" w:color="BFBFBF" w:sz="4"/>
+              <w:bottom w:val="single" w:color="BFBFBF" w:sz="4"/>
+              <w:right w:val="single" w:color="BFBFBF" w:sz="4"/>
+            </w:tcBorders>
+            <w:shd w:fill="FFFFFF" w:val="clear"/>
+            <w:tcMar>
+              <w:top w:type="dxa" w:w="50"/>
+              <w:left w:type="dxa" w:w="70"/>
+              <w:bottom w:type="dxa" w:w="50"/>
+              <w:right w:type="dxa" w:w="70"/>
+            </w:tcMar>
+            <w:vAlign w:val="center"/>
+          </w:tcPr>
+          <w:p>
+            <w:pPr>
+              <w:spacing w:after="0" w:before="0"/>
+              <w:jc w:val="left"/>
+            </w:pPr>
+            <w:r>
+              <w:rPr>
+                <w:rFonts w:ascii="Times New Roman" w:cs="Times New Roman" w:eastAsia="Times New Roman" w:hAnsi="Times New Roman"/>
+                <w:b w:val="false"/>
+                <w:bCs w:val="false"/>
+                <w:i w:val="false"/>
+                <w:iCs w:val="false"/>
+                <w:smallCaps w:val="false"/>
+                <w:color w:val="000000"/>
+                <w:sz w:val="17"/>
+                <w:szCs w:val="17"/>
+              </w:rPr>
+              <w:t xml:space="preserve">0.01</w:t>
+            </w:r>
+          </w:p>
+        </w:tc>
+        <w:tc>
+          <w:tcPr>
+            <w:tcW w:type="dxa" w:w="1100"/>
+            <w:tcBorders>
+              <w:top w:val="single" w:color="BFBFBF" w:sz="4"/>
+              <w:left w:val="single" w:color="BFBFBF" w:sz="4"/>
+              <w:bottom w:val="single" w:color="BFBFBF" w:sz="4"/>
+              <w:right w:val="single" w:color="BFBFBF" w:sz="4"/>
+            </w:tcBorders>
+            <w:shd w:fill="FFFFFF" w:val="clear"/>
+            <w:tcMar>
+              <w:top w:type="dxa" w:w="50"/>
+              <w:left w:type="dxa" w:w="70"/>
+              <w:bottom w:type="dxa" w:w="50"/>
+              <w:right w:type="dxa" w:w="70"/>
+            </w:tcMar>
+            <w:vAlign w:val="center"/>
+          </w:tcPr>
+          <w:p>
+            <w:pPr>
+              <w:spacing w:after="0" w:before="0"/>
+              <w:jc w:val="left"/>
+            </w:pPr>
+            <w:r>
+              <w:rPr>
+                <w:rFonts w:ascii="Times New Roman" w:cs="Times New Roman" w:eastAsia="Times New Roman" w:hAnsi="Times New Roman"/>
+                <w:b w:val="false"/>
+                <w:bCs w:val="false"/>
+                <w:i w:val="false"/>
+                <w:iCs w:val="false"/>
+                <w:smallCaps w:val="false"/>
+                <w:color w:val="000000"/>
+                <w:sz w:val="17"/>
+                <w:szCs w:val="17"/>
+              </w:rPr>
+              <w:t xml:space="preserve">0.00</w:t>
+            </w:r>
+          </w:p>
+        </w:tc>
+        <w:tc>
+          <w:tcPr>
+            <w:tcW w:type="dxa" w:w="1100"/>
+            <w:tcBorders>
+              <w:top w:val="single" w:color="BFBFBF" w:sz="4"/>
+              <w:left w:val="single" w:color="BFBFBF" w:sz="4"/>
+              <w:bottom w:val="single" w:color="BFBFBF" w:sz="4"/>
+              <w:right w:val="single" w:color="BFBFBF" w:sz="4"/>
+            </w:tcBorders>
+            <w:shd w:fill="FFFFFF" w:val="clear"/>
+            <w:tcMar>
+              <w:top w:type="dxa" w:w="50"/>
+              <w:left w:type="dxa" w:w="70"/>
+              <w:bottom w:type="dxa" w:w="50"/>
+              <w:right w:type="dxa" w:w="70"/>
+            </w:tcMar>
+            <w:vAlign w:val="center"/>
+          </w:tcPr>
+          <w:p>
+            <w:pPr>
+              <w:spacing w:after="0" w:before="0"/>
+              <w:jc w:val="left"/>
+            </w:pPr>
+            <w:r>
+              <w:rPr>
+                <w:rFonts w:ascii="Times New Roman" w:cs="Times New Roman" w:eastAsia="Times New Roman" w:hAnsi="Times New Roman"/>
+                <w:b w:val="false"/>
+                <w:bCs w:val="false"/>
+                <w:i w:val="false"/>
+                <w:iCs w:val="false"/>
+                <w:smallCaps w:val="false"/>
+                <w:color w:val="000000"/>
+                <w:sz w:val="17"/>
+                <w:szCs w:val="17"/>
+              </w:rPr>
+              <w:t xml:space="preserve">0.98</w:t>
+            </w:r>
+          </w:p>
+        </w:tc>
+        <w:tc>
+          <w:tcPr>
+            <w:tcW w:type="dxa" w:w="1100"/>
+            <w:tcBorders>
+              <w:top w:val="single" w:color="BFBFBF" w:sz="4"/>
+              <w:left w:val="single" w:color="BFBFBF" w:sz="4"/>
+              <w:bottom w:val="single" w:color="BFBFBF" w:sz="4"/>
+              <w:right w:val="single" w:color="BFBFBF" w:sz="4"/>
+            </w:tcBorders>
+            <w:shd w:fill="FFFFFF" w:val="clear"/>
+            <w:tcMar>
+              <w:top w:type="dxa" w:w="50"/>
+              <w:left w:type="dxa" w:w="70"/>
+              <w:bottom w:type="dxa" w:w="50"/>
+              <w:right w:type="dxa" w:w="70"/>
+            </w:tcMar>
+            <w:vAlign w:val="center"/>
+          </w:tcPr>
+          <w:p>
+            <w:pPr>
+              <w:spacing w:after="0" w:before="0"/>
+              <w:jc w:val="left"/>
+            </w:pPr>
+            <w:r>
+              <w:rPr>
+                <w:rFonts w:ascii="Times New Roman" w:cs="Times New Roman" w:eastAsia="Times New Roman" w:hAnsi="Times New Roman"/>
+                <w:b w:val="false"/>
+                <w:bCs w:val="false"/>
+                <w:i w:val="false"/>
+                <w:iCs w:val="false"/>
+                <w:smallCaps w:val="false"/>
+                <w:color w:val="000000"/>
+                <w:sz w:val="17"/>
+                <w:szCs w:val="17"/>
+              </w:rPr>
+              <w:t xml:space="preserve">0.98</w:t>
+            </w:r>
+          </w:p>
+        </w:tc>
+        <w:tc>
+          <w:tcPr>
+            <w:tcW w:type="dxa" w:w="1100"/>
+            <w:tcBorders>
+              <w:top w:val="single" w:color="BFBFBF" w:sz="4"/>
+              <w:left w:val="single" w:color="BFBFBF" w:sz="4"/>
+              <w:bottom w:val="single" w:color="BFBFBF" w:sz="4"/>
+              <w:right w:val="single" w:color="BFBFBF" w:sz="4"/>
+            </w:tcBorders>
+            <w:shd w:fill="FFFFFF" w:val="clear"/>
+            <w:tcMar>
+              <w:top w:type="dxa" w:w="50"/>
+              <w:left w:type="dxa" w:w="70"/>
+              <w:bottom w:type="dxa" w:w="50"/>
+              <w:right w:type="dxa" w:w="70"/>
+            </w:tcMar>
+            <w:vAlign w:val="center"/>
+          </w:tcPr>
+          <w:p>
+            <w:pPr>
+              <w:spacing w:after="0" w:before="0"/>
+              <w:jc w:val="left"/>
+            </w:pPr>
+            <w:r>
+              <w:rPr>
+                <w:rFonts w:ascii="Times New Roman" w:cs="Times New Roman" w:eastAsia="Times New Roman" w:hAnsi="Times New Roman"/>
+                <w:b w:val="false"/>
+                <w:bCs w:val="false"/>
+                <w:i w:val="false"/>
+                <w:iCs w:val="false"/>
+                <w:smallCaps w:val="false"/>
+                <w:color w:val="000000"/>
+                <w:sz w:val="17"/>
+                <w:szCs w:val="17"/>
+              </w:rPr>
+              <w:t xml:space="preserve">0.56</w:t>
+            </w:r>
+          </w:p>
+        </w:tc>
+        <w:tc>
+          <w:tcPr>
+            <w:tcW w:type="dxa" w:w="1100"/>
+            <w:tcBorders>
+              <w:top w:val="single" w:color="BFBFBF" w:sz="4"/>
+              <w:left w:val="single" w:color="BFBFBF" w:sz="4"/>
+              <w:bottom w:val="single" w:color="BFBFBF" w:sz="4"/>
+              <w:right w:val="single" w:color="BFBFBF" w:sz="4"/>
+            </w:tcBorders>
+            <w:shd w:fill="FFFFFF" w:val="clear"/>
+            <w:tcMar>
+              <w:top w:type="dxa" w:w="50"/>
+              <w:left w:type="dxa" w:w="70"/>
+              <w:bottom w:type="dxa" w:w="50"/>
+              <w:right w:type="dxa" w:w="70"/>
+            </w:tcMar>
+            <w:vAlign w:val="center"/>
+          </w:tcPr>
+          <w:p>
+            <w:pPr>
+              <w:spacing w:after="0" w:before="0"/>
+              <w:jc w:val="left"/>
+            </w:pPr>
+            <w:r>
+              <w:rPr>
+                <w:rFonts w:ascii="Times New Roman" w:cs="Times New Roman" w:eastAsia="Times New Roman" w:hAnsi="Times New Roman"/>
+                <w:b w:val="false"/>
+                <w:bCs w:val="false"/>
+                <w:i w:val="false"/>
+                <w:iCs w:val="false"/>
+                <w:smallCaps w:val="false"/>
+                <w:color w:val="000000"/>
+                <w:sz w:val="17"/>
+                <w:szCs w:val="17"/>
+              </w:rPr>
+              <w:t xml:space="preserve">−0.24</w:t>
+            </w:r>
+          </w:p>
+        </w:tc>
+      </w:tr>
+      <w:tr>
+        <w:trPr>
+          <w:cantSplit/>
+          <w:tblHeader w:val="false"/>
+        </w:trPr>
+        <w:tc>
+          <w:tcPr>
+            <w:tcW w:type="dxa" w:w="2760"/>
+            <w:tcBorders>
+              <w:top w:val="single" w:color="BFBFBF" w:sz="4"/>
+              <w:left w:val="single" w:color="BFBFBF" w:sz="4"/>
+              <w:bottom w:val="single" w:color="BFBFBF" w:sz="4"/>
+              <w:right w:val="single" w:color="BFBFBF" w:sz="4"/>
+            </w:tcBorders>
+            <w:shd w:fill="FFFFFF" w:val="clear"/>
+            <w:tcMar>
+              <w:top w:type="dxa" w:w="50"/>
+              <w:left w:type="dxa" w:w="70"/>
+              <w:bottom w:type="dxa" w:w="50"/>
+              <w:right w:type="dxa" w:w="70"/>
+            </w:tcMar>
+            <w:vAlign w:val="center"/>
+          </w:tcPr>
+          <w:p>
+            <w:pPr>
+              <w:spacing w:after="0" w:before="0"/>
+              <w:jc w:val="left"/>
+            </w:pPr>
+            <w:r>
+              <w:rPr>
+                <w:rFonts w:ascii="Times New Roman" w:cs="Times New Roman" w:eastAsia="Times New Roman" w:hAnsi="Times New Roman"/>
+                <w:b w:val="false"/>
+                <w:bCs w:val="false"/>
+                <w:i w:val="false"/>
+                <w:iCs w:val="false"/>
+                <w:smallCaps w:val="false"/>
+                <w:color w:val="000000"/>
+                <w:sz w:val="17"/>
+                <w:szCs w:val="17"/>
+              </w:rPr>
+              <w:t xml:space="preserve">T = 0.8, pressure</w:t>
+            </w:r>
+          </w:p>
+        </w:tc>
+        <w:tc>
+          <w:tcPr>
+            <w:tcW w:type="dxa" w:w="1100"/>
+            <w:tcBorders>
+              <w:top w:val="single" w:color="BFBFBF" w:sz="4"/>
+              <w:left w:val="single" w:color="BFBFBF" w:sz="4"/>
+              <w:bottom w:val="single" w:color="BFBFBF" w:sz="4"/>
+              <w:right w:val="single" w:color="BFBFBF" w:sz="4"/>
+            </w:tcBorders>
+            <w:shd w:fill="FFFFFF" w:val="clear"/>
+            <w:tcMar>
+              <w:top w:type="dxa" w:w="50"/>
+              <w:left w:type="dxa" w:w="70"/>
+              <w:bottom w:type="dxa" w:w="50"/>
+              <w:right w:type="dxa" w:w="70"/>
+            </w:tcMar>
+            <w:vAlign w:val="center"/>
+          </w:tcPr>
+          <w:p>
+            <w:pPr>
+              <w:spacing w:after="0" w:before="0"/>
+              <w:jc w:val="left"/>
+            </w:pPr>
+            <w:r>
+              <w:rPr>
+                <w:rFonts w:ascii="Times New Roman" w:cs="Times New Roman" w:eastAsia="Times New Roman" w:hAnsi="Times New Roman"/>
+                <w:b w:val="false"/>
+                <w:bCs w:val="false"/>
+                <w:i w:val="false"/>
+                <w:iCs w:val="false"/>
+                <w:smallCaps w:val="false"/>
+                <w:color w:val="000000"/>
+                <w:sz w:val="17"/>
+                <w:szCs w:val="17"/>
+              </w:rPr>
+              <w:t xml:space="preserve">0.32</w:t>
+            </w:r>
+          </w:p>
+        </w:tc>
+        <w:tc>
+          <w:tcPr>
+            <w:tcW w:type="dxa" w:w="1100"/>
+            <w:tcBorders>
+              <w:top w:val="single" w:color="BFBFBF" w:sz="4"/>
+              <w:left w:val="single" w:color="BFBFBF" w:sz="4"/>
+              <w:bottom w:val="single" w:color="BFBFBF" w:sz="4"/>
+              <w:right w:val="single" w:color="BFBFBF" w:sz="4"/>
+            </w:tcBorders>
+            <w:shd w:fill="FFFFFF" w:val="clear"/>
+            <w:tcMar>
+              <w:top w:type="dxa" w:w="50"/>
+              <w:left w:type="dxa" w:w="70"/>
+              <w:bottom w:type="dxa" w:w="50"/>
+              <w:right w:type="dxa" w:w="70"/>
+            </w:tcMar>
+            <w:vAlign w:val="center"/>
+          </w:tcPr>
+          <w:p>
+            <w:pPr>
+              <w:spacing w:after="0" w:before="0"/>
+              <w:jc w:val="left"/>
+            </w:pPr>
+            <w:r>
+              <w:rPr>
+                <w:rFonts w:ascii="Times New Roman" w:cs="Times New Roman" w:eastAsia="Times New Roman" w:hAnsi="Times New Roman"/>
+                <w:b w:val="false"/>
+                <w:bCs w:val="false"/>
+                <w:i w:val="false"/>
+                <w:iCs w:val="false"/>
+                <w:smallCaps w:val="false"/>
+                <w:color w:val="000000"/>
+                <w:sz w:val="17"/>
+                <w:szCs w:val="17"/>
+              </w:rPr>
+              <w:t xml:space="preserve">0.07</w:t>
+            </w:r>
+          </w:p>
+        </w:tc>
+        <w:tc>
+          <w:tcPr>
+            <w:tcW w:type="dxa" w:w="1100"/>
+            <w:tcBorders>
+              <w:top w:val="single" w:color="BFBFBF" w:sz="4"/>
+              <w:left w:val="single" w:color="BFBFBF" w:sz="4"/>
+              <w:bottom w:val="single" w:color="BFBFBF" w:sz="4"/>
+              <w:right w:val="single" w:color="BFBFBF" w:sz="4"/>
+            </w:tcBorders>
+            <w:shd w:fill="FFFFFF" w:val="clear"/>
+            <w:tcMar>
+              <w:top w:type="dxa" w:w="50"/>
+              <w:left w:type="dxa" w:w="70"/>
+              <w:bottom w:type="dxa" w:w="50"/>
+              <w:right w:type="dxa" w:w="70"/>
+            </w:tcMar>
+            <w:vAlign w:val="center"/>
+          </w:tcPr>
+          <w:p>
+            <w:pPr>
+              <w:spacing w:after="0" w:before="0"/>
+              <w:jc w:val="left"/>
+            </w:pPr>
+            <w:r>
+              <w:rPr>
+                <w:rFonts w:ascii="Times New Roman" w:cs="Times New Roman" w:eastAsia="Times New Roman" w:hAnsi="Times New Roman"/>
+                <w:b w:val="false"/>
+                <w:bCs w:val="false"/>
+                <w:i w:val="false"/>
+                <w:iCs w:val="false"/>
+                <w:smallCaps w:val="false"/>
+                <w:color w:val="000000"/>
+                <w:sz w:val="17"/>
+                <w:szCs w:val="17"/>
+              </w:rPr>
+              <w:t xml:space="preserve">0.07</w:t>
+            </w:r>
+          </w:p>
+        </w:tc>
+        <w:tc>
+          <w:tcPr>
+            <w:tcW w:type="dxa" w:w="1100"/>
+            <w:tcBorders>
+              <w:top w:val="single" w:color="BFBFBF" w:sz="4"/>
+              <w:left w:val="single" w:color="BFBFBF" w:sz="4"/>
+              <w:bottom w:val="single" w:color="BFBFBF" w:sz="4"/>
+              <w:right w:val="single" w:color="BFBFBF" w:sz="4"/>
+            </w:tcBorders>
+            <w:shd w:fill="FFFFFF" w:val="clear"/>
+            <w:tcMar>
+              <w:top w:type="dxa" w:w="50"/>
+              <w:left w:type="dxa" w:w="70"/>
+              <w:bottom w:type="dxa" w:w="50"/>
+              <w:right w:type="dxa" w:w="70"/>
+            </w:tcMar>
+            <w:vAlign w:val="center"/>
+          </w:tcPr>
+          <w:p>
+            <w:pPr>
+              <w:spacing w:after="0" w:before="0"/>
+              <w:jc w:val="left"/>
+            </w:pPr>
+            <w:r>
+              <w:rPr>
+                <w:rFonts w:ascii="Times New Roman" w:cs="Times New Roman" w:eastAsia="Times New Roman" w:hAnsi="Times New Roman"/>
+                <w:b w:val="false"/>
+                <w:bCs w:val="false"/>
+                <w:i w:val="false"/>
+                <w:iCs w:val="false"/>
+                <w:smallCaps w:val="false"/>
+                <w:color w:val="000000"/>
+                <w:sz w:val="17"/>
+                <w:szCs w:val="17"/>
+              </w:rPr>
+              <w:t xml:space="preserve">0.51</w:t>
+            </w:r>
+          </w:p>
+        </w:tc>
+        <w:tc>
+          <w:tcPr>
+            <w:tcW w:type="dxa" w:w="1100"/>
+            <w:tcBorders>
+              <w:top w:val="single" w:color="BFBFBF" w:sz="4"/>
+              <w:left w:val="single" w:color="BFBFBF" w:sz="4"/>
+              <w:bottom w:val="single" w:color="BFBFBF" w:sz="4"/>
+              <w:right w:val="single" w:color="BFBFBF" w:sz="4"/>
+            </w:tcBorders>
+            <w:shd w:fill="FFFFFF" w:val="clear"/>
+            <w:tcMar>
+              <w:top w:type="dxa" w:w="50"/>
+              <w:left w:type="dxa" w:w="70"/>
+              <w:bottom w:type="dxa" w:w="50"/>
+              <w:right w:type="dxa" w:w="70"/>
+            </w:tcMar>
+            <w:vAlign w:val="center"/>
+          </w:tcPr>
+          <w:p>
+            <w:pPr>
+              <w:spacing w:after="0" w:before="0"/>
+              <w:jc w:val="left"/>
+            </w:pPr>
+            <w:r>
+              <w:rPr>
+                <w:rFonts w:ascii="Times New Roman" w:cs="Times New Roman" w:eastAsia="Times New Roman" w:hAnsi="Times New Roman"/>
+                <w:b w:val="false"/>
+                <w:bCs w:val="false"/>
+                <w:i w:val="false"/>
+                <w:iCs w:val="false"/>
+                <w:smallCaps w:val="false"/>
+                <w:color w:val="000000"/>
+                <w:sz w:val="17"/>
+                <w:szCs w:val="17"/>
+              </w:rPr>
+              <w:t xml:space="preserve">3.43</w:t>
+            </w:r>
+          </w:p>
+        </w:tc>
+        <w:tc>
+          <w:tcPr>
+            <w:tcW w:type="dxa" w:w="1100"/>
+            <w:tcBorders>
+              <w:top w:val="single" w:color="BFBFBF" w:sz="4"/>
+              <w:left w:val="single" w:color="BFBFBF" w:sz="4"/>
+              <w:bottom w:val="single" w:color="BFBFBF" w:sz="4"/>
+              <w:right w:val="single" w:color="BFBFBF" w:sz="4"/>
+            </w:tcBorders>
+            <w:shd w:fill="FFFFFF" w:val="clear"/>
+            <w:tcMar>
+              <w:top w:type="dxa" w:w="50"/>
+              <w:left w:type="dxa" w:w="70"/>
+              <w:bottom w:type="dxa" w:w="50"/>
+              <w:right w:type="dxa" w:w="70"/>
+            </w:tcMar>
+            <w:vAlign w:val="center"/>
+          </w:tcPr>
+          <w:p>
+            <w:pPr>
+              <w:spacing w:after="0" w:before="0"/>
+              <w:jc w:val="left"/>
+            </w:pPr>
+            <w:r>
+              <w:rPr>
+                <w:rFonts w:ascii="Times New Roman" w:cs="Times New Roman" w:eastAsia="Times New Roman" w:hAnsi="Times New Roman"/>
+                <w:b w:val="false"/>
+                <w:bCs w:val="false"/>
+                <w:i w:val="false"/>
+                <w:iCs w:val="false"/>
+                <w:smallCaps w:val="false"/>
+                <w:color w:val="000000"/>
+                <w:sz w:val="17"/>
+                <w:szCs w:val="17"/>
+              </w:rPr>
+              <w:t xml:space="preserve">+2.63</w:t>
+            </w:r>
+          </w:p>
+        </w:tc>
+      </w:tr>
+      <w:tr>
+        <w:trPr>
+          <w:cantSplit/>
+          <w:tblHeader w:val="false"/>
+        </w:trPr>
+        <w:tc>
+          <w:tcPr>
+            <w:tcW w:type="dxa" w:w="2760"/>
+            <w:tcBorders>
+              <w:top w:val="single" w:color="BFBFBF" w:sz="4"/>
+              <w:left w:val="single" w:color="BFBFBF" w:sz="4"/>
+              <w:bottom w:val="single" w:color="BFBFBF" w:sz="4"/>
+              <w:right w:val="single" w:color="BFBFBF" w:sz="4"/>
+            </w:tcBorders>
+            <w:shd w:fill="FFFFFF" w:val="clear"/>
+            <w:tcMar>
+              <w:top w:type="dxa" w:w="50"/>
+              <w:left w:type="dxa" w:w="70"/>
+              <w:bottom w:type="dxa" w:w="50"/>
+              <w:right w:type="dxa" w:w="70"/>
+            </w:tcMar>
+            <w:vAlign w:val="center"/>
+          </w:tcPr>
+          <w:p>
+            <w:pPr>
+              <w:spacing w:after="0" w:before="0"/>
+              <w:jc w:val="left"/>
+            </w:pPr>
+            <w:r>
+              <w:rPr>
+                <w:rFonts w:ascii="Times New Roman" w:cs="Times New Roman" w:eastAsia="Times New Roman" w:hAnsi="Times New Roman"/>
+                <w:b w:val="false"/>
+                <w:bCs w:val="false"/>
+                <w:i w:val="false"/>
+                <w:iCs w:val="false"/>
+                <w:smallCaps w:val="false"/>
+                <w:color w:val="000000"/>
+                <w:sz w:val="17"/>
+                <w:szCs w:val="17"/>
+              </w:rPr>
+              <w:t xml:space="preserve">T = 0.8, contamination</w:t>
+            </w:r>
+          </w:p>
+        </w:tc>
+        <w:tc>
+          <w:tcPr>
+            <w:tcW w:type="dxa" w:w="1100"/>
+            <w:tcBorders>
+              <w:top w:val="single" w:color="BFBFBF" w:sz="4"/>
+              <w:left w:val="single" w:color="BFBFBF" w:sz="4"/>
+              <w:bottom w:val="single" w:color="BFBFBF" w:sz="4"/>
+              <w:right w:val="single" w:color="BFBFBF" w:sz="4"/>
+            </w:tcBorders>
+            <w:shd w:fill="FFFFFF" w:val="clear"/>
+            <w:tcMar>
+              <w:top w:type="dxa" w:w="50"/>
+              <w:left w:type="dxa" w:w="70"/>
+              <w:bottom w:type="dxa" w:w="50"/>
+              <w:right w:type="dxa" w:w="70"/>
+            </w:tcMar>
+            <w:vAlign w:val="center"/>
+          </w:tcPr>
+          <w:p>
+            <w:pPr>
+              <w:spacing w:after="0" w:before="0"/>
+              <w:jc w:val="left"/>
+            </w:pPr>
+            <w:r>
+              <w:rPr>
+                <w:rFonts w:ascii="Times New Roman" w:cs="Times New Roman" w:eastAsia="Times New Roman" w:hAnsi="Times New Roman"/>
+                <w:b w:val="false"/>
+                <w:bCs w:val="false"/>
+                <w:i w:val="false"/>
+                <w:iCs w:val="false"/>
+                <w:smallCaps w:val="false"/>
+                <w:color w:val="000000"/>
+                <w:sz w:val="17"/>
+                <w:szCs w:val="17"/>
+              </w:rPr>
+              <w:t xml:space="preserve">0.07</w:t>
+            </w:r>
+          </w:p>
+        </w:tc>
+        <w:tc>
+          <w:tcPr>
+            <w:tcW w:type="dxa" w:w="1100"/>
+            <w:tcBorders>
+              <w:top w:val="single" w:color="BFBFBF" w:sz="4"/>
+              <w:left w:val="single" w:color="BFBFBF" w:sz="4"/>
+              <w:bottom w:val="single" w:color="BFBFBF" w:sz="4"/>
+              <w:right w:val="single" w:color="BFBFBF" w:sz="4"/>
+            </w:tcBorders>
+            <w:shd w:fill="FFFFFF" w:val="clear"/>
+            <w:tcMar>
+              <w:top w:type="dxa" w:w="50"/>
+              <w:left w:type="dxa" w:w="70"/>
+              <w:bottom w:type="dxa" w:w="50"/>
+              <w:right w:type="dxa" w:w="70"/>
+            </w:tcMar>
+            <w:vAlign w:val="center"/>
+          </w:tcPr>
+          <w:p>
+            <w:pPr>
+              <w:spacing w:after="0" w:before="0"/>
+              <w:jc w:val="left"/>
+            </w:pPr>
+            <w:r>
+              <w:rPr>
+                <w:rFonts w:ascii="Times New Roman" w:cs="Times New Roman" w:eastAsia="Times New Roman" w:hAnsi="Times New Roman"/>
+                <w:b w:val="false"/>
+                <w:bCs w:val="false"/>
+                <w:i w:val="false"/>
+                <w:iCs w:val="false"/>
+                <w:smallCaps w:val="false"/>
+                <w:color w:val="000000"/>
+                <w:sz w:val="17"/>
+                <w:szCs w:val="17"/>
+              </w:rPr>
+              <w:t xml:space="preserve">0.07</w:t>
+            </w:r>
+          </w:p>
+        </w:tc>
+        <w:tc>
+          <w:tcPr>
+            <w:tcW w:type="dxa" w:w="1100"/>
+            <w:tcBorders>
+              <w:top w:val="single" w:color="BFBFBF" w:sz="4"/>
+              <w:left w:val="single" w:color="BFBFBF" w:sz="4"/>
+              <w:bottom w:val="single" w:color="BFBFBF" w:sz="4"/>
+              <w:right w:val="single" w:color="BFBFBF" w:sz="4"/>
+            </w:tcBorders>
+            <w:shd w:fill="FFFFFF" w:val="clear"/>
+            <w:tcMar>
+              <w:top w:type="dxa" w:w="50"/>
+              <w:left w:type="dxa" w:w="70"/>
+              <w:bottom w:type="dxa" w:w="50"/>
+              <w:right w:type="dxa" w:w="70"/>
+            </w:tcMar>
+            <w:vAlign w:val="center"/>
+          </w:tcPr>
+          <w:p>
+            <w:pPr>
+              <w:spacing w:after="0" w:before="0"/>
+              <w:jc w:val="left"/>
+            </w:pPr>
+            <w:r>
+              <w:rPr>
+                <w:rFonts w:ascii="Times New Roman" w:cs="Times New Roman" w:eastAsia="Times New Roman" w:hAnsi="Times New Roman"/>
+                <w:b w:val="false"/>
+                <w:bCs w:val="false"/>
+                <w:i w:val="false"/>
+                <w:iCs w:val="false"/>
+                <w:smallCaps w:val="false"/>
+                <w:color w:val="000000"/>
+                <w:sz w:val="17"/>
+                <w:szCs w:val="17"/>
+              </w:rPr>
+              <w:t xml:space="preserve">0.93</w:t>
+            </w:r>
+          </w:p>
+        </w:tc>
+        <w:tc>
+          <w:tcPr>
+            <w:tcW w:type="dxa" w:w="1100"/>
+            <w:tcBorders>
+              <w:top w:val="single" w:color="BFBFBF" w:sz="4"/>
+              <w:left w:val="single" w:color="BFBFBF" w:sz="4"/>
+              <w:bottom w:val="single" w:color="BFBFBF" w:sz="4"/>
+              <w:right w:val="single" w:color="BFBFBF" w:sz="4"/>
+            </w:tcBorders>
+            <w:shd w:fill="FFFFFF" w:val="clear"/>
+            <w:tcMar>
+              <w:top w:type="dxa" w:w="50"/>
+              <w:left w:type="dxa" w:w="70"/>
+              <w:bottom w:type="dxa" w:w="50"/>
+              <w:right w:type="dxa" w:w="70"/>
+            </w:tcMar>
+            <w:vAlign w:val="center"/>
+          </w:tcPr>
+          <w:p>
+            <w:pPr>
+              <w:spacing w:after="0" w:before="0"/>
+              <w:jc w:val="left"/>
+            </w:pPr>
+            <w:r>
+              <w:rPr>
+                <w:rFonts w:ascii="Times New Roman" w:cs="Times New Roman" w:eastAsia="Times New Roman" w:hAnsi="Times New Roman"/>
+                <w:b w:val="false"/>
+                <w:bCs w:val="false"/>
+                <w:i w:val="false"/>
+                <w:iCs w:val="false"/>
+                <w:smallCaps w:val="false"/>
+                <w:color w:val="000000"/>
+                <w:sz w:val="17"/>
+                <w:szCs w:val="17"/>
+              </w:rPr>
+              <w:t xml:space="preserve">0.93</w:t>
+            </w:r>
+          </w:p>
+        </w:tc>
+        <w:tc>
+          <w:tcPr>
+            <w:tcW w:type="dxa" w:w="1100"/>
+            <w:tcBorders>
+              <w:top w:val="single" w:color="BFBFBF" w:sz="4"/>
+              <w:left w:val="single" w:color="BFBFBF" w:sz="4"/>
+              <w:bottom w:val="single" w:color="BFBFBF" w:sz="4"/>
+              <w:right w:val="single" w:color="BFBFBF" w:sz="4"/>
+            </w:tcBorders>
+            <w:shd w:fill="FFFFFF" w:val="clear"/>
+            <w:tcMar>
+              <w:top w:type="dxa" w:w="50"/>
+              <w:left w:type="dxa" w:w="70"/>
+              <w:bottom w:type="dxa" w:w="50"/>
+              <w:right w:type="dxa" w:w="70"/>
+            </w:tcMar>
+            <w:vAlign w:val="center"/>
+          </w:tcPr>
+          <w:p>
+            <w:pPr>
+              <w:spacing w:after="0" w:before="0"/>
+              <w:jc w:val="left"/>
+            </w:pPr>
+            <w:r>
+              <w:rPr>
+                <w:rFonts w:ascii="Times New Roman" w:cs="Times New Roman" w:eastAsia="Times New Roman" w:hAnsi="Times New Roman"/>
+                <w:b w:val="false"/>
+                <w:bCs w:val="false"/>
+                <w:i w:val="false"/>
+                <w:iCs w:val="false"/>
+                <w:smallCaps w:val="false"/>
+                <w:color w:val="000000"/>
+                <w:sz w:val="17"/>
+                <w:szCs w:val="17"/>
+              </w:rPr>
+              <w:t xml:space="preserve">0.76</w:t>
+            </w:r>
+          </w:p>
+        </w:tc>
+        <w:tc>
+          <w:tcPr>
+            <w:tcW w:type="dxa" w:w="1100"/>
+            <w:tcBorders>
+              <w:top w:val="single" w:color="BFBFBF" w:sz="4"/>
+              <w:left w:val="single" w:color="BFBFBF" w:sz="4"/>
+              <w:bottom w:val="single" w:color="BFBFBF" w:sz="4"/>
+              <w:right w:val="single" w:color="BFBFBF" w:sz="4"/>
+            </w:tcBorders>
+            <w:shd w:fill="FFFFFF" w:val="clear"/>
+            <w:tcMar>
+              <w:top w:type="dxa" w:w="50"/>
+              <w:left w:type="dxa" w:w="70"/>
+              <w:bottom w:type="dxa" w:w="50"/>
+              <w:right w:type="dxa" w:w="70"/>
+            </w:tcMar>
+            <w:vAlign w:val="center"/>
+          </w:tcPr>
+          <w:p>
+            <w:pPr>
+              <w:spacing w:after="0" w:before="0"/>
+              <w:jc w:val="left"/>
+            </w:pPr>
+            <w:r>
+              <w:rPr>
+                <w:rFonts w:ascii="Times New Roman" w:cs="Times New Roman" w:eastAsia="Times New Roman" w:hAnsi="Times New Roman"/>
+                <w:b w:val="false"/>
+                <w:bCs w:val="false"/>
+                <w:i w:val="false"/>
+                <w:iCs w:val="false"/>
+                <w:smallCaps w:val="false"/>
+                <w:color w:val="000000"/>
+                <w:sz w:val="17"/>
+                <w:szCs w:val="17"/>
+              </w:rPr>
+              <w:t xml:space="preserve">−0.04</w:t>
+            </w:r>
+          </w:p>
+        </w:tc>
+      </w:tr>
+      <w:tr>
+        <w:trPr>
+          <w:cantSplit/>
+          <w:tblHeader w:val="false"/>
+        </w:trPr>
+        <w:tc>
+          <w:tcPr>
+            <w:tcW w:type="dxa" w:w="2760"/>
+            <w:tcBorders>
+              <w:top w:val="single" w:color="BFBFBF" w:sz="4"/>
+              <w:left w:val="single" w:color="BFBFBF" w:sz="4"/>
+              <w:bottom w:val="single" w:color="BFBFBF" w:sz="4"/>
+              <w:right w:val="single" w:color="BFBFBF" w:sz="4"/>
+            </w:tcBorders>
+            <w:shd w:fill="FFFFFF" w:val="clear"/>
+            <w:tcMar>
+              <w:top w:type="dxa" w:w="50"/>
+              <w:left w:type="dxa" w:w="70"/>
+              <w:bottom w:type="dxa" w:w="50"/>
+              <w:right w:type="dxa" w:w="70"/>
+            </w:tcMar>
+            <w:vAlign w:val="center"/>
+          </w:tcPr>
+          <w:p>
+            <w:pPr>
+              <w:spacing w:after="0" w:before="0"/>
+              <w:jc w:val="left"/>
+            </w:pPr>
+            <w:r>
+              <w:rPr>
+                <w:rFonts w:ascii="Times New Roman" w:cs="Times New Roman" w:eastAsia="Times New Roman" w:hAnsi="Times New Roman"/>
+                <w:b w:val="false"/>
+                <w:bCs w:val="false"/>
+                <w:i w:val="false"/>
+                <w:iCs w:val="false"/>
+                <w:smallCaps w:val="false"/>
+                <w:color w:val="000000"/>
+                <w:sz w:val="17"/>
+                <w:szCs w:val="17"/>
+              </w:rPr>
+              <w:t xml:space="preserve">T = 0.8, pressure + contamination</w:t>
+            </w:r>
+          </w:p>
+        </w:tc>
+        <w:tc>
+          <w:tcPr>
+            <w:tcW w:type="dxa" w:w="1100"/>
+            <w:tcBorders>
+              <w:top w:val="single" w:color="BFBFBF" w:sz="4"/>
+              <w:left w:val="single" w:color="BFBFBF" w:sz="4"/>
+              <w:bottom w:val="single" w:color="BFBFBF" w:sz="4"/>
+              <w:right w:val="single" w:color="BFBFBF" w:sz="4"/>
+            </w:tcBorders>
+            <w:shd w:fill="FFFFFF" w:val="clear"/>
+            <w:tcMar>
+              <w:top w:type="dxa" w:w="50"/>
+              <w:left w:type="dxa" w:w="70"/>
+              <w:bottom w:type="dxa" w:w="50"/>
+              <w:right w:type="dxa" w:w="70"/>
+            </w:tcMar>
+            <w:vAlign w:val="center"/>
+          </w:tcPr>
+          <w:p>
+            <w:pPr>
+              <w:spacing w:after="0" w:before="0"/>
+              <w:jc w:val="left"/>
+            </w:pPr>
+            <w:r>
+              <w:rPr>
+                <w:rFonts w:ascii="Times New Roman" w:cs="Times New Roman" w:eastAsia="Times New Roman" w:hAnsi="Times New Roman"/>
+                <w:b w:val="false"/>
+                <w:bCs w:val="false"/>
+                <w:i w:val="false"/>
+                <w:iCs w:val="false"/>
+                <w:smallCaps w:val="false"/>
+                <w:color w:val="000000"/>
+                <w:sz w:val="17"/>
+                <w:szCs w:val="17"/>
+              </w:rPr>
+              <w:t xml:space="preserve">0.25</w:t>
+            </w:r>
+          </w:p>
+        </w:tc>
+        <w:tc>
+          <w:tcPr>
+            <w:tcW w:type="dxa" w:w="1100"/>
+            <w:tcBorders>
+              <w:top w:val="single" w:color="BFBFBF" w:sz="4"/>
+              <w:left w:val="single" w:color="BFBFBF" w:sz="4"/>
+              <w:bottom w:val="single" w:color="BFBFBF" w:sz="4"/>
+              <w:right w:val="single" w:color="BFBFBF" w:sz="4"/>
+            </w:tcBorders>
+            <w:shd w:fill="FFFFFF" w:val="clear"/>
+            <w:tcMar>
+              <w:top w:type="dxa" w:w="50"/>
+              <w:left w:type="dxa" w:w="70"/>
+              <w:bottom w:type="dxa" w:w="50"/>
+              <w:right w:type="dxa" w:w="70"/>
+            </w:tcMar>
+            <w:vAlign w:val="center"/>
+          </w:tcPr>
+          <w:p>
+            <w:pPr>
+              <w:spacing w:after="0" w:before="0"/>
+              <w:jc w:val="left"/>
+            </w:pPr>
+            <w:r>
+              <w:rPr>
+                <w:rFonts w:ascii="Times New Roman" w:cs="Times New Roman" w:eastAsia="Times New Roman" w:hAnsi="Times New Roman"/>
+                <w:b w:val="false"/>
+                <w:bCs w:val="false"/>
+                <w:i w:val="false"/>
+                <w:iCs w:val="false"/>
+                <w:smallCaps w:val="false"/>
+                <w:color w:val="000000"/>
+                <w:sz w:val="17"/>
+                <w:szCs w:val="17"/>
+              </w:rPr>
+              <w:t xml:space="preserve">0.07</w:t>
+            </w:r>
+          </w:p>
+        </w:tc>
+        <w:tc>
+          <w:tcPr>
+            <w:tcW w:type="dxa" w:w="1100"/>
+            <w:tcBorders>
+              <w:top w:val="single" w:color="BFBFBF" w:sz="4"/>
+              <w:left w:val="single" w:color="BFBFBF" w:sz="4"/>
+              <w:bottom w:val="single" w:color="BFBFBF" w:sz="4"/>
+              <w:right w:val="single" w:color="BFBFBF" w:sz="4"/>
+            </w:tcBorders>
+            <w:shd w:fill="FFFFFF" w:val="clear"/>
+            <w:tcMar>
+              <w:top w:type="dxa" w:w="50"/>
+              <w:left w:type="dxa" w:w="70"/>
+              <w:bottom w:type="dxa" w:w="50"/>
+              <w:right w:type="dxa" w:w="70"/>
+            </w:tcMar>
+            <w:vAlign w:val="center"/>
+          </w:tcPr>
+          <w:p>
+            <w:pPr>
+              <w:spacing w:after="0" w:before="0"/>
+              <w:jc w:val="left"/>
+            </w:pPr>
+            <w:r>
+              <w:rPr>
+                <w:rFonts w:ascii="Times New Roman" w:cs="Times New Roman" w:eastAsia="Times New Roman" w:hAnsi="Times New Roman"/>
+                <w:b w:val="false"/>
+                <w:bCs w:val="false"/>
+                <w:i w:val="false"/>
+                <w:iCs w:val="false"/>
+                <w:smallCaps w:val="false"/>
+                <w:color w:val="000000"/>
+                <w:sz w:val="17"/>
+                <w:szCs w:val="17"/>
+              </w:rPr>
+              <w:t xml:space="preserve">0.24</w:t>
+            </w:r>
+          </w:p>
+        </w:tc>
+        <w:tc>
+          <w:tcPr>
+            <w:tcW w:type="dxa" w:w="1100"/>
+            <w:tcBorders>
+              <w:top w:val="single" w:color="BFBFBF" w:sz="4"/>
+              <w:left w:val="single" w:color="BFBFBF" w:sz="4"/>
+              <w:bottom w:val="single" w:color="BFBFBF" w:sz="4"/>
+              <w:right w:val="single" w:color="BFBFBF" w:sz="4"/>
+            </w:tcBorders>
+            <w:shd w:fill="FFFFFF" w:val="clear"/>
+            <w:tcMar>
+              <w:top w:type="dxa" w:w="50"/>
+              <w:left w:type="dxa" w:w="70"/>
+              <w:bottom w:type="dxa" w:w="50"/>
+              <w:right w:type="dxa" w:w="70"/>
+            </w:tcMar>
+            <w:vAlign w:val="center"/>
+          </w:tcPr>
+          <w:p>
+            <w:pPr>
+              <w:spacing w:after="0" w:before="0"/>
+              <w:jc w:val="left"/>
+            </w:pPr>
+            <w:r>
+              <w:rPr>
+                <w:rFonts w:ascii="Times New Roman" w:cs="Times New Roman" w:eastAsia="Times New Roman" w:hAnsi="Times New Roman"/>
+                <w:b w:val="false"/>
+                <w:bCs w:val="false"/>
+                <w:i w:val="false"/>
+                <w:iCs w:val="false"/>
+                <w:smallCaps w:val="false"/>
+                <w:color w:val="000000"/>
+                <w:sz w:val="17"/>
+                <w:szCs w:val="17"/>
+              </w:rPr>
+              <w:t xml:space="preserve">0.53</w:t>
+            </w:r>
+          </w:p>
+        </w:tc>
+        <w:tc>
+          <w:tcPr>
+            <w:tcW w:type="dxa" w:w="1100"/>
+            <w:tcBorders>
+              <w:top w:val="single" w:color="BFBFBF" w:sz="4"/>
+              <w:left w:val="single" w:color="BFBFBF" w:sz="4"/>
+              <w:bottom w:val="single" w:color="BFBFBF" w:sz="4"/>
+              <w:right w:val="single" w:color="BFBFBF" w:sz="4"/>
+            </w:tcBorders>
+            <w:shd w:fill="FFFFFF" w:val="clear"/>
+            <w:tcMar>
+              <w:top w:type="dxa" w:w="50"/>
+              <w:left w:type="dxa" w:w="70"/>
+              <w:bottom w:type="dxa" w:w="50"/>
+              <w:right w:type="dxa" w:w="70"/>
+            </w:tcMar>
+            <w:vAlign w:val="center"/>
+          </w:tcPr>
+          <w:p>
+            <w:pPr>
+              <w:spacing w:after="0" w:before="0"/>
+              <w:jc w:val="left"/>
+            </w:pPr>
+            <w:r>
+              <w:rPr>
+                <w:rFonts w:ascii="Times New Roman" w:cs="Times New Roman" w:eastAsia="Times New Roman" w:hAnsi="Times New Roman"/>
+                <w:b w:val="false"/>
+                <w:bCs w:val="false"/>
+                <w:i w:val="false"/>
+                <w:iCs w:val="false"/>
+                <w:smallCaps w:val="false"/>
+                <w:color w:val="000000"/>
+                <w:sz w:val="17"/>
+                <w:szCs w:val="17"/>
+              </w:rPr>
+              <w:t xml:space="preserve">3.24</w:t>
+            </w:r>
+          </w:p>
+        </w:tc>
+        <w:tc>
+          <w:tcPr>
+            <w:tcW w:type="dxa" w:w="1100"/>
+            <w:tcBorders>
+              <w:top w:val="single" w:color="BFBFBF" w:sz="4"/>
+              <w:left w:val="single" w:color="BFBFBF" w:sz="4"/>
+              <w:bottom w:val="single" w:color="BFBFBF" w:sz="4"/>
+              <w:right w:val="single" w:color="BFBFBF" w:sz="4"/>
+            </w:tcBorders>
+            <w:shd w:fill="FFFFFF" w:val="clear"/>
+            <w:tcMar>
+              <w:top w:type="dxa" w:w="50"/>
+              <w:left w:type="dxa" w:w="70"/>
+              <w:bottom w:type="dxa" w:w="50"/>
+              <w:right w:type="dxa" w:w="70"/>
+            </w:tcMar>
+            <w:vAlign w:val="center"/>
+          </w:tcPr>
+          <w:p>
+            <w:pPr>
+              <w:spacing w:after="0" w:before="0"/>
+              <w:jc w:val="left"/>
+            </w:pPr>
+            <w:r>
+              <w:rPr>
+                <w:rFonts w:ascii="Times New Roman" w:cs="Times New Roman" w:eastAsia="Times New Roman" w:hAnsi="Times New Roman"/>
+                <w:b w:val="false"/>
+                <w:bCs w:val="false"/>
+                <w:i w:val="false"/>
+                <w:iCs w:val="false"/>
+                <w:smallCaps w:val="false"/>
+                <w:color w:val="000000"/>
+                <w:sz w:val="17"/>
+                <w:szCs w:val="17"/>
+              </w:rPr>
+              <w:t xml:space="preserve">+2.44</w:t>
+            </w:r>
+          </w:p>
+        </w:tc>
+      </w:tr>
+      <w:tr>
+        <w:trPr>
+          <w:cantSplit/>
+          <w:tblHeader w:val="false"/>
+        </w:trPr>
+        <w:tc>
+          <w:tcPr>
+            <w:tcW w:type="dxa" w:w="2760"/>
+            <w:tcBorders>
+              <w:top w:val="single" w:color="BFBFBF" w:sz="4"/>
+              <w:left w:val="single" w:color="BFBFBF" w:sz="4"/>
+              <w:bottom w:val="single" w:color="BFBFBF" w:sz="4"/>
+              <w:right w:val="single" w:color="BFBFBF" w:sz="4"/>
+            </w:tcBorders>
+            <w:shd w:fill="FFFFFF" w:val="clear"/>
+            <w:tcMar>
+              <w:top w:type="dxa" w:w="50"/>
+              <w:left w:type="dxa" w:w="70"/>
+              <w:bottom w:type="dxa" w:w="50"/>
+              <w:right w:type="dxa" w:w="70"/>
+            </w:tcMar>
+            <w:vAlign w:val="center"/>
+          </w:tcPr>
+          <w:p>
+            <w:pPr>
+              <w:spacing w:after="0" w:before="0"/>
+              <w:jc w:val="left"/>
+            </w:pPr>
+            <w:r>
+              <w:rPr>
+                <w:rFonts w:ascii="Times New Roman" w:cs="Times New Roman" w:eastAsia="Times New Roman" w:hAnsi="Times New Roman"/>
+                <w:b w:val="false"/>
+                <w:bCs w:val="false"/>
+                <w:i w:val="false"/>
+                <w:iCs w:val="false"/>
+                <w:smallCaps w:val="false"/>
+                <w:color w:val="000000"/>
+                <w:sz w:val="17"/>
+                <w:szCs w:val="17"/>
+              </w:rPr>
+              <w:t xml:space="preserve">T = 2, clean</w:t>
+            </w:r>
+          </w:p>
+        </w:tc>
+        <w:tc>
+          <w:tcPr>
+            <w:tcW w:type="dxa" w:w="1100"/>
+            <w:tcBorders>
+              <w:top w:val="single" w:color="BFBFBF" w:sz="4"/>
+              <w:left w:val="single" w:color="BFBFBF" w:sz="4"/>
+              <w:bottom w:val="single" w:color="BFBFBF" w:sz="4"/>
+              <w:right w:val="single" w:color="BFBFBF" w:sz="4"/>
+            </w:tcBorders>
+            <w:shd w:fill="FFFFFF" w:val="clear"/>
+            <w:tcMar>
+              <w:top w:type="dxa" w:w="50"/>
+              <w:left w:type="dxa" w:w="70"/>
+              <w:bottom w:type="dxa" w:w="50"/>
+              <w:right w:type="dxa" w:w="70"/>
+            </w:tcMar>
+            <w:vAlign w:val="center"/>
+          </w:tcPr>
+          <w:p>
+            <w:pPr>
+              <w:spacing w:after="0" w:before="0"/>
+              <w:jc w:val="left"/>
+            </w:pPr>
+            <w:r>
+              <w:rPr>
+                <w:rFonts w:ascii="Times New Roman" w:cs="Times New Roman" w:eastAsia="Times New Roman" w:hAnsi="Times New Roman"/>
+                <w:b w:val="false"/>
+                <w:bCs w:val="false"/>
+                <w:i w:val="false"/>
+                <w:iCs w:val="false"/>
+                <w:smallCaps w:val="false"/>
+                <w:color w:val="000000"/>
+                <w:sz w:val="17"/>
+                <w:szCs w:val="17"/>
+              </w:rPr>
+              <w:t xml:space="preserve">0.47</w:t>
+            </w:r>
+          </w:p>
+        </w:tc>
+        <w:tc>
+          <w:tcPr>
+            <w:tcW w:type="dxa" w:w="1100"/>
+            <w:tcBorders>
+              <w:top w:val="single" w:color="BFBFBF" w:sz="4"/>
+              <w:left w:val="single" w:color="BFBFBF" w:sz="4"/>
+              <w:bottom w:val="single" w:color="BFBFBF" w:sz="4"/>
+              <w:right w:val="single" w:color="BFBFBF" w:sz="4"/>
+            </w:tcBorders>
+            <w:shd w:fill="FFFFFF" w:val="clear"/>
+            <w:tcMar>
+              <w:top w:type="dxa" w:w="50"/>
+              <w:left w:type="dxa" w:w="70"/>
+              <w:bottom w:type="dxa" w:w="50"/>
+              <w:right w:type="dxa" w:w="70"/>
+            </w:tcMar>
+            <w:vAlign w:val="center"/>
+          </w:tcPr>
+          <w:p>
+            <w:pPr>
+              <w:spacing w:after="0" w:before="0"/>
+              <w:jc w:val="left"/>
+            </w:pPr>
+            <w:r>
+              <w:rPr>
+                <w:rFonts w:ascii="Times New Roman" w:cs="Times New Roman" w:eastAsia="Times New Roman" w:hAnsi="Times New Roman"/>
+                <w:b w:val="false"/>
+                <w:bCs w:val="false"/>
+                <w:i w:val="false"/>
+                <w:iCs w:val="false"/>
+                <w:smallCaps w:val="false"/>
+                <w:color w:val="000000"/>
+                <w:sz w:val="17"/>
+                <w:szCs w:val="17"/>
+              </w:rPr>
+              <w:t xml:space="preserve">0.20</w:t>
+            </w:r>
+          </w:p>
+        </w:tc>
+        <w:tc>
+          <w:tcPr>
+            <w:tcW w:type="dxa" w:w="1100"/>
+            <w:tcBorders>
+              <w:top w:val="single" w:color="BFBFBF" w:sz="4"/>
+              <w:left w:val="single" w:color="BFBFBF" w:sz="4"/>
+              <w:bottom w:val="single" w:color="BFBFBF" w:sz="4"/>
+              <w:right w:val="single" w:color="BFBFBF" w:sz="4"/>
+            </w:tcBorders>
+            <w:shd w:fill="FFFFFF" w:val="clear"/>
+            <w:tcMar>
+              <w:top w:type="dxa" w:w="50"/>
+              <w:left w:type="dxa" w:w="70"/>
+              <w:bottom w:type="dxa" w:w="50"/>
+              <w:right w:type="dxa" w:w="70"/>
+            </w:tcMar>
+            <w:vAlign w:val="center"/>
+          </w:tcPr>
+          <w:p>
+            <w:pPr>
+              <w:spacing w:after="0" w:before="0"/>
+              <w:jc w:val="left"/>
+            </w:pPr>
+            <w:r>
+              <w:rPr>
+                <w:rFonts w:ascii="Times New Roman" w:cs="Times New Roman" w:eastAsia="Times New Roman" w:hAnsi="Times New Roman"/>
+                <w:b w:val="false"/>
+                <w:bCs w:val="false"/>
+                <w:i w:val="false"/>
+                <w:iCs w:val="false"/>
+                <w:smallCaps w:val="false"/>
+                <w:color w:val="000000"/>
+                <w:sz w:val="17"/>
+                <w:szCs w:val="17"/>
+              </w:rPr>
+              <w:t xml:space="preserve">0.43</w:t>
+            </w:r>
+          </w:p>
+        </w:tc>
+        <w:tc>
+          <w:tcPr>
+            <w:tcW w:type="dxa" w:w="1100"/>
+            <w:tcBorders>
+              <w:top w:val="single" w:color="BFBFBF" w:sz="4"/>
+              <w:left w:val="single" w:color="BFBFBF" w:sz="4"/>
+              <w:bottom w:val="single" w:color="BFBFBF" w:sz="4"/>
+              <w:right w:val="single" w:color="BFBFBF" w:sz="4"/>
+            </w:tcBorders>
+            <w:shd w:fill="FFFFFF" w:val="clear"/>
+            <w:tcMar>
+              <w:top w:type="dxa" w:w="50"/>
+              <w:left w:type="dxa" w:w="70"/>
+              <w:bottom w:type="dxa" w:w="50"/>
+              <w:right w:type="dxa" w:w="70"/>
+            </w:tcMar>
+            <w:vAlign w:val="center"/>
+          </w:tcPr>
+          <w:p>
+            <w:pPr>
+              <w:spacing w:after="0" w:before="0"/>
+              <w:jc w:val="left"/>
+            </w:pPr>
+            <w:r>
+              <w:rPr>
+                <w:rFonts w:ascii="Times New Roman" w:cs="Times New Roman" w:eastAsia="Times New Roman" w:hAnsi="Times New Roman"/>
+                <w:b w:val="false"/>
+                <w:bCs w:val="false"/>
+                <w:i w:val="false"/>
+                <w:iCs w:val="false"/>
+                <w:smallCaps w:val="false"/>
+                <w:color w:val="000000"/>
+                <w:sz w:val="17"/>
+                <w:szCs w:val="17"/>
+              </w:rPr>
+              <w:t xml:space="preserve">0.45</w:t>
+            </w:r>
+          </w:p>
+        </w:tc>
+        <w:tc>
+          <w:tcPr>
+            <w:tcW w:type="dxa" w:w="1100"/>
+            <w:tcBorders>
+              <w:top w:val="single" w:color="BFBFBF" w:sz="4"/>
+              <w:left w:val="single" w:color="BFBFBF" w:sz="4"/>
+              <w:bottom w:val="single" w:color="BFBFBF" w:sz="4"/>
+              <w:right w:val="single" w:color="BFBFBF" w:sz="4"/>
+            </w:tcBorders>
+            <w:shd w:fill="FFFFFF" w:val="clear"/>
+            <w:tcMar>
+              <w:top w:type="dxa" w:w="50"/>
+              <w:left w:type="dxa" w:w="70"/>
+              <w:bottom w:type="dxa" w:w="50"/>
+              <w:right w:type="dxa" w:w="70"/>
+            </w:tcMar>
+            <w:vAlign w:val="center"/>
+          </w:tcPr>
+          <w:p>
+            <w:pPr>
+              <w:spacing w:after="0" w:before="0"/>
+              <w:jc w:val="left"/>
+            </w:pPr>
+            <w:r>
+              <w:rPr>
+                <w:rFonts w:ascii="Times New Roman" w:cs="Times New Roman" w:eastAsia="Times New Roman" w:hAnsi="Times New Roman"/>
+                <w:b w:val="false"/>
+                <w:bCs w:val="false"/>
+                <w:i w:val="false"/>
+                <w:iCs w:val="false"/>
+                <w:smallCaps w:val="false"/>
+                <w:color w:val="000000"/>
+                <w:sz w:val="17"/>
+                <w:szCs w:val="17"/>
+              </w:rPr>
+              <w:t xml:space="preserve">2.04</w:t>
+            </w:r>
+          </w:p>
+        </w:tc>
+        <w:tc>
+          <w:tcPr>
+            <w:tcW w:type="dxa" w:w="1100"/>
+            <w:tcBorders>
+              <w:top w:val="single" w:color="BFBFBF" w:sz="4"/>
+              <w:left w:val="single" w:color="BFBFBF" w:sz="4"/>
+              <w:bottom w:val="single" w:color="BFBFBF" w:sz="4"/>
+              <w:right w:val="single" w:color="BFBFBF" w:sz="4"/>
+            </w:tcBorders>
+            <w:shd w:fill="FFFFFF" w:val="clear"/>
+            <w:tcMar>
+              <w:top w:type="dxa" w:w="50"/>
+              <w:left w:type="dxa" w:w="70"/>
+              <w:bottom w:type="dxa" w:w="50"/>
+              <w:right w:type="dxa" w:w="70"/>
+            </w:tcMar>
+            <w:vAlign w:val="center"/>
+          </w:tcPr>
+          <w:p>
+            <w:pPr>
+              <w:spacing w:after="0" w:before="0"/>
+              <w:jc w:val="left"/>
+            </w:pPr>
+            <w:r>
+              <w:rPr>
+                <w:rFonts w:ascii="Times New Roman" w:cs="Times New Roman" w:eastAsia="Times New Roman" w:hAnsi="Times New Roman"/>
+                <w:b w:val="false"/>
+                <w:bCs w:val="false"/>
+                <w:i w:val="false"/>
+                <w:iCs w:val="false"/>
+                <w:smallCaps w:val="false"/>
+                <w:color w:val="000000"/>
+                <w:sz w:val="17"/>
+                <w:szCs w:val="17"/>
+              </w:rPr>
+              <w:t xml:space="preserve">+0.04</w:t>
+            </w:r>
+          </w:p>
+        </w:tc>
+      </w:tr>
+      <w:tr>
+        <w:trPr>
+          <w:cantSplit/>
+          <w:tblHeader w:val="false"/>
+        </w:trPr>
+        <w:tc>
+          <w:tcPr>
+            <w:tcW w:type="dxa" w:w="2760"/>
+            <w:tcBorders>
+              <w:top w:val="single" w:color="BFBFBF" w:sz="4"/>
+              <w:left w:val="single" w:color="BFBFBF" w:sz="4"/>
+              <w:bottom w:val="single" w:color="BFBFBF" w:sz="4"/>
+              <w:right w:val="single" w:color="BFBFBF" w:sz="4"/>
+            </w:tcBorders>
+            <w:shd w:fill="FFFFFF" w:val="clear"/>
+            <w:tcMar>
+              <w:top w:type="dxa" w:w="50"/>
+              <w:left w:type="dxa" w:w="70"/>
+              <w:bottom w:type="dxa" w:w="50"/>
+              <w:right w:type="dxa" w:w="70"/>
+            </w:tcMar>
+            <w:vAlign w:val="center"/>
+          </w:tcPr>
+          <w:p>
+            <w:pPr>
+              <w:spacing w:after="0" w:before="0"/>
+              <w:jc w:val="left"/>
+            </w:pPr>
+            <w:r>
+              <w:rPr>
+                <w:rFonts w:ascii="Times New Roman" w:cs="Times New Roman" w:eastAsia="Times New Roman" w:hAnsi="Times New Roman"/>
+                <w:b w:val="false"/>
+                <w:bCs w:val="false"/>
+                <w:i w:val="false"/>
+                <w:iCs w:val="false"/>
+                <w:smallCaps w:val="false"/>
+                <w:color w:val="000000"/>
+                <w:sz w:val="17"/>
+                <w:szCs w:val="17"/>
+              </w:rPr>
+              <w:t xml:space="preserve">T = 2, pressure</w:t>
+            </w:r>
+          </w:p>
+        </w:tc>
+        <w:tc>
+          <w:tcPr>
+            <w:tcW w:type="dxa" w:w="1100"/>
+            <w:tcBorders>
+              <w:top w:val="single" w:color="BFBFBF" w:sz="4"/>
+              <w:left w:val="single" w:color="BFBFBF" w:sz="4"/>
+              <w:bottom w:val="single" w:color="BFBFBF" w:sz="4"/>
+              <w:right w:val="single" w:color="BFBFBF" w:sz="4"/>
+            </w:tcBorders>
+            <w:shd w:fill="FFFFFF" w:val="clear"/>
+            <w:tcMar>
+              <w:top w:type="dxa" w:w="50"/>
+              <w:left w:type="dxa" w:w="70"/>
+              <w:bottom w:type="dxa" w:w="50"/>
+              <w:right w:type="dxa" w:w="70"/>
+            </w:tcMar>
+            <w:vAlign w:val="center"/>
+          </w:tcPr>
+          <w:p>
+            <w:pPr>
+              <w:spacing w:after="0" w:before="0"/>
+              <w:jc w:val="left"/>
+            </w:pPr>
+            <w:r>
+              <w:rPr>
+                <w:rFonts w:ascii="Times New Roman" w:cs="Times New Roman" w:eastAsia="Times New Roman" w:hAnsi="Times New Roman"/>
+                <w:b w:val="false"/>
+                <w:bCs w:val="false"/>
+                <w:i w:val="false"/>
+                <w:iCs w:val="false"/>
+                <w:smallCaps w:val="false"/>
+                <w:color w:val="000000"/>
+                <w:sz w:val="17"/>
+                <w:szCs w:val="17"/>
+              </w:rPr>
+              <w:t xml:space="preserve">0.32</w:t>
+            </w:r>
+          </w:p>
+        </w:tc>
+        <w:tc>
+          <w:tcPr>
+            <w:tcW w:type="dxa" w:w="1100"/>
+            <w:tcBorders>
+              <w:top w:val="single" w:color="BFBFBF" w:sz="4"/>
+              <w:left w:val="single" w:color="BFBFBF" w:sz="4"/>
+              <w:bottom w:val="single" w:color="BFBFBF" w:sz="4"/>
+              <w:right w:val="single" w:color="BFBFBF" w:sz="4"/>
+            </w:tcBorders>
+            <w:shd w:fill="FFFFFF" w:val="clear"/>
+            <w:tcMar>
+              <w:top w:type="dxa" w:w="50"/>
+              <w:left w:type="dxa" w:w="70"/>
+              <w:bottom w:type="dxa" w:w="50"/>
+              <w:right w:type="dxa" w:w="70"/>
+            </w:tcMar>
+            <w:vAlign w:val="center"/>
+          </w:tcPr>
+          <w:p>
+            <w:pPr>
+              <w:spacing w:after="0" w:before="0"/>
+              <w:jc w:val="left"/>
+            </w:pPr>
+            <w:r>
+              <w:rPr>
+                <w:rFonts w:ascii="Times New Roman" w:cs="Times New Roman" w:eastAsia="Times New Roman" w:hAnsi="Times New Roman"/>
+                <w:b w:val="false"/>
+                <w:bCs w:val="false"/>
+                <w:i w:val="false"/>
+                <w:iCs w:val="false"/>
+                <w:smallCaps w:val="false"/>
+                <w:color w:val="000000"/>
+                <w:sz w:val="17"/>
+                <w:szCs w:val="17"/>
+              </w:rPr>
+              <w:t xml:space="preserve">0.00</w:t>
+            </w:r>
+          </w:p>
+        </w:tc>
+        <w:tc>
+          <w:tcPr>
+            <w:tcW w:type="dxa" w:w="1100"/>
+            <w:tcBorders>
+              <w:top w:val="single" w:color="BFBFBF" w:sz="4"/>
+              <w:left w:val="single" w:color="BFBFBF" w:sz="4"/>
+              <w:bottom w:val="single" w:color="BFBFBF" w:sz="4"/>
+              <w:right w:val="single" w:color="BFBFBF" w:sz="4"/>
+            </w:tcBorders>
+            <w:shd w:fill="FFFFFF" w:val="clear"/>
+            <w:tcMar>
+              <w:top w:type="dxa" w:w="50"/>
+              <w:left w:type="dxa" w:w="70"/>
+              <w:bottom w:type="dxa" w:w="50"/>
+              <w:right w:type="dxa" w:w="70"/>
+            </w:tcMar>
+            <w:vAlign w:val="center"/>
+          </w:tcPr>
+          <w:p>
+            <w:pPr>
+              <w:spacing w:after="0" w:before="0"/>
+              <w:jc w:val="left"/>
+            </w:pPr>
+            <w:r>
+              <w:rPr>
+                <w:rFonts w:ascii="Times New Roman" w:cs="Times New Roman" w:eastAsia="Times New Roman" w:hAnsi="Times New Roman"/>
+                <w:b w:val="false"/>
+                <w:bCs w:val="false"/>
+                <w:i w:val="false"/>
+                <w:iCs w:val="false"/>
+                <w:smallCaps w:val="false"/>
+                <w:color w:val="000000"/>
+                <w:sz w:val="17"/>
+                <w:szCs w:val="17"/>
+              </w:rPr>
+              <w:t xml:space="preserve">0.17</w:t>
+            </w:r>
+          </w:p>
+        </w:tc>
+        <w:tc>
+          <w:tcPr>
+            <w:tcW w:type="dxa" w:w="1100"/>
+            <w:tcBorders>
+              <w:top w:val="single" w:color="BFBFBF" w:sz="4"/>
+              <w:left w:val="single" w:color="BFBFBF" w:sz="4"/>
+              <w:bottom w:val="single" w:color="BFBFBF" w:sz="4"/>
+              <w:right w:val="single" w:color="BFBFBF" w:sz="4"/>
+            </w:tcBorders>
+            <w:shd w:fill="FFFFFF" w:val="clear"/>
+            <w:tcMar>
+              <w:top w:type="dxa" w:w="50"/>
+              <w:left w:type="dxa" w:w="70"/>
+              <w:bottom w:type="dxa" w:w="50"/>
+              <w:right w:type="dxa" w:w="70"/>
+            </w:tcMar>
+            <w:vAlign w:val="center"/>
+          </w:tcPr>
+          <w:p>
+            <w:pPr>
+              <w:spacing w:after="0" w:before="0"/>
+              <w:jc w:val="left"/>
+            </w:pPr>
+            <w:r>
+              <w:rPr>
+                <w:rFonts w:ascii="Times New Roman" w:cs="Times New Roman" w:eastAsia="Times New Roman" w:hAnsi="Times New Roman"/>
+                <w:b w:val="false"/>
+                <w:bCs w:val="false"/>
+                <w:i w:val="false"/>
+                <w:iCs w:val="false"/>
+                <w:smallCaps w:val="false"/>
+                <w:color w:val="000000"/>
+                <w:sz w:val="17"/>
+                <w:szCs w:val="17"/>
+              </w:rPr>
+              <w:t xml:space="preserve">0.35</w:t>
+            </w:r>
+          </w:p>
+        </w:tc>
+        <w:tc>
+          <w:tcPr>
+            <w:tcW w:type="dxa" w:w="1100"/>
+            <w:tcBorders>
+              <w:top w:val="single" w:color="BFBFBF" w:sz="4"/>
+              <w:left w:val="single" w:color="BFBFBF" w:sz="4"/>
+              <w:bottom w:val="single" w:color="BFBFBF" w:sz="4"/>
+              <w:right w:val="single" w:color="BFBFBF" w:sz="4"/>
+            </w:tcBorders>
+            <w:shd w:fill="FFFFFF" w:val="clear"/>
+            <w:tcMar>
+              <w:top w:type="dxa" w:w="50"/>
+              <w:left w:type="dxa" w:w="70"/>
+              <w:bottom w:type="dxa" w:w="50"/>
+              <w:right w:type="dxa" w:w="70"/>
+            </w:tcMar>
+            <w:vAlign w:val="center"/>
+          </w:tcPr>
+          <w:p>
+            <w:pPr>
+              <w:spacing w:after="0" w:before="0"/>
+              <w:jc w:val="left"/>
+            </w:pPr>
+            <w:r>
+              <w:rPr>
+                <w:rFonts w:ascii="Times New Roman" w:cs="Times New Roman" w:eastAsia="Times New Roman" w:hAnsi="Times New Roman"/>
+                <w:b w:val="false"/>
+                <w:bCs w:val="false"/>
+                <w:i w:val="false"/>
+                <w:iCs w:val="false"/>
+                <w:smallCaps w:val="false"/>
+                <w:color w:val="000000"/>
+                <w:sz w:val="17"/>
+                <w:szCs w:val="17"/>
+              </w:rPr>
+              <w:t xml:space="preserve">3.63</w:t>
+            </w:r>
+          </w:p>
+        </w:tc>
+        <w:tc>
+          <w:tcPr>
+            <w:tcW w:type="dxa" w:w="1100"/>
+            <w:tcBorders>
+              <w:top w:val="single" w:color="BFBFBF" w:sz="4"/>
+              <w:left w:val="single" w:color="BFBFBF" w:sz="4"/>
+              <w:bottom w:val="single" w:color="BFBFBF" w:sz="4"/>
+              <w:right w:val="single" w:color="BFBFBF" w:sz="4"/>
+            </w:tcBorders>
+            <w:shd w:fill="FFFFFF" w:val="clear"/>
+            <w:tcMar>
+              <w:top w:type="dxa" w:w="50"/>
+              <w:left w:type="dxa" w:w="70"/>
+              <w:bottom w:type="dxa" w:w="50"/>
+              <w:right w:type="dxa" w:w="70"/>
+            </w:tcMar>
+            <w:vAlign w:val="center"/>
+          </w:tcPr>
+          <w:p>
+            <w:pPr>
+              <w:spacing w:after="0" w:before="0"/>
+              <w:jc w:val="left"/>
+            </w:pPr>
+            <w:r>
+              <w:rPr>
+                <w:rFonts w:ascii="Times New Roman" w:cs="Times New Roman" w:eastAsia="Times New Roman" w:hAnsi="Times New Roman"/>
+                <w:b w:val="false"/>
+                <w:bCs w:val="false"/>
+                <w:i w:val="false"/>
+                <w:iCs w:val="false"/>
+                <w:smallCaps w:val="false"/>
+                <w:color w:val="000000"/>
+                <w:sz w:val="17"/>
+                <w:szCs w:val="17"/>
+              </w:rPr>
+              <w:t xml:space="preserve">+1.63</w:t>
+            </w:r>
+          </w:p>
+        </w:tc>
+      </w:tr>
+      <w:tr>
+        <w:trPr>
+          <w:cantSplit/>
+          <w:tblHeader w:val="false"/>
+        </w:trPr>
+        <w:tc>
+          <w:tcPr>
+            <w:tcW w:type="dxa" w:w="2760"/>
+            <w:tcBorders>
+              <w:top w:val="single" w:color="BFBFBF" w:sz="4"/>
+              <w:left w:val="single" w:color="BFBFBF" w:sz="4"/>
+              <w:bottom w:val="single" w:color="BFBFBF" w:sz="4"/>
+              <w:right w:val="single" w:color="BFBFBF" w:sz="4"/>
+            </w:tcBorders>
+            <w:shd w:fill="FFFFFF" w:val="clear"/>
+            <w:tcMar>
+              <w:top w:type="dxa" w:w="50"/>
+              <w:left w:type="dxa" w:w="70"/>
+              <w:bottom w:type="dxa" w:w="50"/>
+              <w:right w:type="dxa" w:w="70"/>
+            </w:tcMar>
+            <w:vAlign w:val="center"/>
+          </w:tcPr>
+          <w:p>
+            <w:pPr>
+              <w:spacing w:after="0" w:before="0"/>
+              <w:jc w:val="left"/>
+            </w:pPr>
+            <w:r>
+              <w:rPr>
+                <w:rFonts w:ascii="Times New Roman" w:cs="Times New Roman" w:eastAsia="Times New Roman" w:hAnsi="Times New Roman"/>
+                <w:b w:val="false"/>
+                <w:bCs w:val="false"/>
+                <w:i w:val="false"/>
+                <w:iCs w:val="false"/>
+                <w:smallCaps w:val="false"/>
+                <w:color w:val="000000"/>
+                <w:sz w:val="17"/>
+                <w:szCs w:val="17"/>
+              </w:rPr>
+              <w:t xml:space="preserve">T = 2, contamination</w:t>
+            </w:r>
+          </w:p>
+        </w:tc>
+        <w:tc>
+          <w:tcPr>
+            <w:tcW w:type="dxa" w:w="1100"/>
+            <w:tcBorders>
+              <w:top w:val="single" w:color="BFBFBF" w:sz="4"/>
+              <w:left w:val="single" w:color="BFBFBF" w:sz="4"/>
+              <w:bottom w:val="single" w:color="BFBFBF" w:sz="4"/>
+              <w:right w:val="single" w:color="BFBFBF" w:sz="4"/>
+            </w:tcBorders>
+            <w:shd w:fill="FFFFFF" w:val="clear"/>
+            <w:tcMar>
+              <w:top w:type="dxa" w:w="50"/>
+              <w:left w:type="dxa" w:w="70"/>
+              <w:bottom w:type="dxa" w:w="50"/>
+              <w:right w:type="dxa" w:w="70"/>
+            </w:tcMar>
+            <w:vAlign w:val="center"/>
+          </w:tcPr>
+          <w:p>
+            <w:pPr>
+              <w:spacing w:after="0" w:before="0"/>
+              <w:jc w:val="left"/>
+            </w:pPr>
+            <w:r>
+              <w:rPr>
+                <w:rFonts w:ascii="Times New Roman" w:cs="Times New Roman" w:eastAsia="Times New Roman" w:hAnsi="Times New Roman"/>
+                <w:b w:val="false"/>
+                <w:bCs w:val="false"/>
+                <w:i w:val="false"/>
+                <w:iCs w:val="false"/>
+                <w:smallCaps w:val="false"/>
+                <w:color w:val="000000"/>
+                <w:sz w:val="17"/>
+                <w:szCs w:val="17"/>
+              </w:rPr>
+              <w:t xml:space="preserve">0.24</w:t>
+            </w:r>
+          </w:p>
+        </w:tc>
+        <w:tc>
+          <w:tcPr>
+            <w:tcW w:type="dxa" w:w="1100"/>
+            <w:tcBorders>
+              <w:top w:val="single" w:color="BFBFBF" w:sz="4"/>
+              <w:left w:val="single" w:color="BFBFBF" w:sz="4"/>
+              <w:bottom w:val="single" w:color="BFBFBF" w:sz="4"/>
+              <w:right w:val="single" w:color="BFBFBF" w:sz="4"/>
+            </w:tcBorders>
+            <w:shd w:fill="FFFFFF" w:val="clear"/>
+            <w:tcMar>
+              <w:top w:type="dxa" w:w="50"/>
+              <w:left w:type="dxa" w:w="70"/>
+              <w:bottom w:type="dxa" w:w="50"/>
+              <w:right w:type="dxa" w:w="70"/>
+            </w:tcMar>
+            <w:vAlign w:val="center"/>
+          </w:tcPr>
+          <w:p>
+            <w:pPr>
+              <w:spacing w:after="0" w:before="0"/>
+              <w:jc w:val="left"/>
+            </w:pPr>
+            <w:r>
+              <w:rPr>
+                <w:rFonts w:ascii="Times New Roman" w:cs="Times New Roman" w:eastAsia="Times New Roman" w:hAnsi="Times New Roman"/>
+                <w:b w:val="false"/>
+                <w:bCs w:val="false"/>
+                <w:i w:val="false"/>
+                <w:iCs w:val="false"/>
+                <w:smallCaps w:val="false"/>
+                <w:color w:val="000000"/>
+                <w:sz w:val="17"/>
+                <w:szCs w:val="17"/>
+              </w:rPr>
+              <w:t xml:space="preserve">0.13</w:t>
+            </w:r>
+          </w:p>
+        </w:tc>
+        <w:tc>
+          <w:tcPr>
+            <w:tcW w:type="dxa" w:w="1100"/>
+            <w:tcBorders>
+              <w:top w:val="single" w:color="BFBFBF" w:sz="4"/>
+              <w:left w:val="single" w:color="BFBFBF" w:sz="4"/>
+              <w:bottom w:val="single" w:color="BFBFBF" w:sz="4"/>
+              <w:right w:val="single" w:color="BFBFBF" w:sz="4"/>
+            </w:tcBorders>
+            <w:shd w:fill="FFFFFF" w:val="clear"/>
+            <w:tcMar>
+              <w:top w:type="dxa" w:w="50"/>
+              <w:left w:type="dxa" w:w="70"/>
+              <w:bottom w:type="dxa" w:w="50"/>
+              <w:right w:type="dxa" w:w="70"/>
+            </w:tcMar>
+            <w:vAlign w:val="center"/>
+          </w:tcPr>
+          <w:p>
+            <w:pPr>
+              <w:spacing w:after="0" w:before="0"/>
+              <w:jc w:val="left"/>
+            </w:pPr>
+            <w:r>
+              <w:rPr>
+                <w:rFonts w:ascii="Times New Roman" w:cs="Times New Roman" w:eastAsia="Times New Roman" w:hAnsi="Times New Roman"/>
+                <w:b w:val="false"/>
+                <w:bCs w:val="false"/>
+                <w:i w:val="false"/>
+                <w:iCs w:val="false"/>
+                <w:smallCaps w:val="false"/>
+                <w:color w:val="000000"/>
+                <w:sz w:val="17"/>
+                <w:szCs w:val="17"/>
+              </w:rPr>
+              <w:t xml:space="preserve">0.72</w:t>
+            </w:r>
+          </w:p>
+        </w:tc>
+        <w:tc>
+          <w:tcPr>
+            <w:tcW w:type="dxa" w:w="1100"/>
+            <w:tcBorders>
+              <w:top w:val="single" w:color="BFBFBF" w:sz="4"/>
+              <w:left w:val="single" w:color="BFBFBF" w:sz="4"/>
+              <w:bottom w:val="single" w:color="BFBFBF" w:sz="4"/>
+              <w:right w:val="single" w:color="BFBFBF" w:sz="4"/>
+            </w:tcBorders>
+            <w:shd w:fill="FFFFFF" w:val="clear"/>
+            <w:tcMar>
+              <w:top w:type="dxa" w:w="50"/>
+              <w:left w:type="dxa" w:w="70"/>
+              <w:bottom w:type="dxa" w:w="50"/>
+              <w:right w:type="dxa" w:w="70"/>
+            </w:tcMar>
+            <w:vAlign w:val="center"/>
+          </w:tcPr>
+          <w:p>
+            <w:pPr>
+              <w:spacing w:after="0" w:before="0"/>
+              <w:jc w:val="left"/>
+            </w:pPr>
+            <w:r>
+              <w:rPr>
+                <w:rFonts w:ascii="Times New Roman" w:cs="Times New Roman" w:eastAsia="Times New Roman" w:hAnsi="Times New Roman"/>
+                <w:b w:val="false"/>
+                <w:bCs w:val="false"/>
+                <w:i w:val="false"/>
+                <w:iCs w:val="false"/>
+                <w:smallCaps w:val="false"/>
+                <w:color w:val="000000"/>
+                <w:sz w:val="17"/>
+                <w:szCs w:val="17"/>
+              </w:rPr>
+              <w:t xml:space="preserve">0.69</w:t>
+            </w:r>
+          </w:p>
+        </w:tc>
+        <w:tc>
+          <w:tcPr>
+            <w:tcW w:type="dxa" w:w="1100"/>
+            <w:tcBorders>
+              <w:top w:val="single" w:color="BFBFBF" w:sz="4"/>
+              <w:left w:val="single" w:color="BFBFBF" w:sz="4"/>
+              <w:bottom w:val="single" w:color="BFBFBF" w:sz="4"/>
+              <w:right w:val="single" w:color="BFBFBF" w:sz="4"/>
+            </w:tcBorders>
+            <w:shd w:fill="FFFFFF" w:val="clear"/>
+            <w:tcMar>
+              <w:top w:type="dxa" w:w="50"/>
+              <w:left w:type="dxa" w:w="70"/>
+              <w:bottom w:type="dxa" w:w="50"/>
+              <w:right w:type="dxa" w:w="70"/>
+            </w:tcMar>
+            <w:vAlign w:val="center"/>
+          </w:tcPr>
+          <w:p>
+            <w:pPr>
+              <w:spacing w:after="0" w:before="0"/>
+              <w:jc w:val="left"/>
+            </w:pPr>
+            <w:r>
+              <w:rPr>
+                <w:rFonts w:ascii="Times New Roman" w:cs="Times New Roman" w:eastAsia="Times New Roman" w:hAnsi="Times New Roman"/>
+                <w:b w:val="false"/>
+                <w:bCs w:val="false"/>
+                <w:i w:val="false"/>
+                <w:iCs w:val="false"/>
+                <w:smallCaps w:val="false"/>
+                <w:color w:val="000000"/>
+                <w:sz w:val="17"/>
+                <w:szCs w:val="17"/>
+              </w:rPr>
+              <w:t xml:space="preserve">1.67</w:t>
+            </w:r>
+          </w:p>
+        </w:tc>
+        <w:tc>
+          <w:tcPr>
+            <w:tcW w:type="dxa" w:w="1100"/>
+            <w:tcBorders>
+              <w:top w:val="single" w:color="BFBFBF" w:sz="4"/>
+              <w:left w:val="single" w:color="BFBFBF" w:sz="4"/>
+              <w:bottom w:val="single" w:color="BFBFBF" w:sz="4"/>
+              <w:right w:val="single" w:color="BFBFBF" w:sz="4"/>
+            </w:tcBorders>
+            <w:shd w:fill="FFFFFF" w:val="clear"/>
+            <w:tcMar>
+              <w:top w:type="dxa" w:w="50"/>
+              <w:left w:type="dxa" w:w="70"/>
+              <w:bottom w:type="dxa" w:w="50"/>
+              <w:right w:type="dxa" w:w="70"/>
+            </w:tcMar>
+            <w:vAlign w:val="center"/>
+          </w:tcPr>
+          <w:p>
+            <w:pPr>
+              <w:spacing w:after="0" w:before="0"/>
+              <w:jc w:val="left"/>
+            </w:pPr>
+            <w:r>
+              <w:rPr>
+                <w:rFonts w:ascii="Times New Roman" w:cs="Times New Roman" w:eastAsia="Times New Roman" w:hAnsi="Times New Roman"/>
+                <w:b w:val="false"/>
+                <w:bCs w:val="false"/>
+                <w:i w:val="false"/>
+                <w:iCs w:val="false"/>
+                <w:smallCaps w:val="false"/>
+                <w:color w:val="000000"/>
+                <w:sz w:val="17"/>
+                <w:szCs w:val="17"/>
+              </w:rPr>
+              <w:t xml:space="preserve">−0.33</w:t>
+            </w:r>
+          </w:p>
+        </w:tc>
+      </w:tr>
+      <w:tr>
+        <w:trPr>
+          <w:cantSplit/>
+          <w:tblHeader w:val="false"/>
+        </w:trPr>
+        <w:tc>
+          <w:tcPr>
+            <w:tcW w:type="dxa" w:w="2760"/>
+            <w:tcBorders>
+              <w:top w:val="single" w:color="BFBFBF" w:sz="4"/>
+              <w:left w:val="single" w:color="BFBFBF" w:sz="4"/>
+              <w:bottom w:val="single" w:color="BFBFBF" w:sz="4"/>
+              <w:right w:val="single" w:color="BFBFBF" w:sz="4"/>
+            </w:tcBorders>
+            <w:shd w:fill="FFFFFF" w:val="clear"/>
+            <w:tcMar>
+              <w:top w:type="dxa" w:w="50"/>
+              <w:left w:type="dxa" w:w="70"/>
+              <w:bottom w:type="dxa" w:w="50"/>
+              <w:right w:type="dxa" w:w="70"/>
+            </w:tcMar>
+            <w:vAlign w:val="center"/>
+          </w:tcPr>
+          <w:p>
+            <w:pPr>
+              <w:spacing w:after="0" w:before="0"/>
+              <w:jc w:val="left"/>
+            </w:pPr>
+            <w:r>
+              <w:rPr>
+                <w:rFonts w:ascii="Times New Roman" w:cs="Times New Roman" w:eastAsia="Times New Roman" w:hAnsi="Times New Roman"/>
+                <w:b w:val="false"/>
+                <w:bCs w:val="false"/>
+                <w:i w:val="false"/>
+                <w:iCs w:val="false"/>
+                <w:smallCaps w:val="false"/>
+                <w:color w:val="000000"/>
+                <w:sz w:val="17"/>
+                <w:szCs w:val="17"/>
+              </w:rPr>
+              <w:t xml:space="preserve">T = 2, pressure + contamination</w:t>
+            </w:r>
+          </w:p>
+        </w:tc>
+        <w:tc>
+          <w:tcPr>
+            <w:tcW w:type="dxa" w:w="1100"/>
+            <w:tcBorders>
+              <w:top w:val="single" w:color="BFBFBF" w:sz="4"/>
+              <w:left w:val="single" w:color="BFBFBF" w:sz="4"/>
+              <w:bottom w:val="single" w:color="BFBFBF" w:sz="4"/>
+              <w:right w:val="single" w:color="BFBFBF" w:sz="4"/>
+            </w:tcBorders>
+            <w:shd w:fill="FFFFFF" w:val="clear"/>
+            <w:tcMar>
+              <w:top w:type="dxa" w:w="50"/>
+              <w:left w:type="dxa" w:w="70"/>
+              <w:bottom w:type="dxa" w:w="50"/>
+              <w:right w:type="dxa" w:w="70"/>
+            </w:tcMar>
+            <w:vAlign w:val="center"/>
+          </w:tcPr>
+          <w:p>
+            <w:pPr>
+              <w:spacing w:after="0" w:before="0"/>
+              <w:jc w:val="left"/>
+            </w:pPr>
+            <w:r>
+              <w:rPr>
+                <w:rFonts w:ascii="Times New Roman" w:cs="Times New Roman" w:eastAsia="Times New Roman" w:hAnsi="Times New Roman"/>
+                <w:b w:val="false"/>
+                <w:bCs w:val="false"/>
+                <w:i w:val="false"/>
+                <w:iCs w:val="false"/>
+                <w:smallCaps w:val="false"/>
+                <w:color w:val="000000"/>
+                <w:sz w:val="17"/>
+                <w:szCs w:val="17"/>
+              </w:rPr>
+              <w:t xml:space="preserve">0.27</w:t>
+            </w:r>
+          </w:p>
+        </w:tc>
+        <w:tc>
+          <w:tcPr>
+            <w:tcW w:type="dxa" w:w="1100"/>
+            <w:tcBorders>
+              <w:top w:val="single" w:color="BFBFBF" w:sz="4"/>
+              <w:left w:val="single" w:color="BFBFBF" w:sz="4"/>
+              <w:bottom w:val="single" w:color="BFBFBF" w:sz="4"/>
+              <w:right w:val="single" w:color="BFBFBF" w:sz="4"/>
+            </w:tcBorders>
+            <w:shd w:fill="FFFFFF" w:val="clear"/>
+            <w:tcMar>
+              <w:top w:type="dxa" w:w="50"/>
+              <w:left w:type="dxa" w:w="70"/>
+              <w:bottom w:type="dxa" w:w="50"/>
+              <w:right w:type="dxa" w:w="70"/>
+            </w:tcMar>
+            <w:vAlign w:val="center"/>
+          </w:tcPr>
+          <w:p>
+            <w:pPr>
+              <w:spacing w:after="0" w:before="0"/>
+              <w:jc w:val="left"/>
+            </w:pPr>
+            <w:r>
+              <w:rPr>
+                <w:rFonts w:ascii="Times New Roman" w:cs="Times New Roman" w:eastAsia="Times New Roman" w:hAnsi="Times New Roman"/>
+                <w:b w:val="false"/>
+                <w:bCs w:val="false"/>
+                <w:i w:val="false"/>
+                <w:iCs w:val="false"/>
+                <w:smallCaps w:val="false"/>
+                <w:color w:val="000000"/>
+                <w:sz w:val="17"/>
+                <w:szCs w:val="17"/>
+              </w:rPr>
+              <w:t xml:space="preserve">0.00</w:t>
+            </w:r>
+          </w:p>
+        </w:tc>
+        <w:tc>
+          <w:tcPr>
+            <w:tcW w:type="dxa" w:w="1100"/>
+            <w:tcBorders>
+              <w:top w:val="single" w:color="BFBFBF" w:sz="4"/>
+              <w:left w:val="single" w:color="BFBFBF" w:sz="4"/>
+              <w:bottom w:val="single" w:color="BFBFBF" w:sz="4"/>
+              <w:right w:val="single" w:color="BFBFBF" w:sz="4"/>
+            </w:tcBorders>
+            <w:shd w:fill="FFFFFF" w:val="clear"/>
+            <w:tcMar>
+              <w:top w:type="dxa" w:w="50"/>
+              <w:left w:type="dxa" w:w="70"/>
+              <w:bottom w:type="dxa" w:w="50"/>
+              <w:right w:type="dxa" w:w="70"/>
+            </w:tcMar>
+            <w:vAlign w:val="center"/>
+          </w:tcPr>
+          <w:p>
+            <w:pPr>
+              <w:spacing w:after="0" w:before="0"/>
+              <w:jc w:val="left"/>
+            </w:pPr>
+            <w:r>
+              <w:rPr>
+                <w:rFonts w:ascii="Times New Roman" w:cs="Times New Roman" w:eastAsia="Times New Roman" w:hAnsi="Times New Roman"/>
+                <w:b w:val="false"/>
+                <w:bCs w:val="false"/>
+                <w:i w:val="false"/>
+                <w:iCs w:val="false"/>
+                <w:smallCaps w:val="false"/>
+                <w:color w:val="000000"/>
+                <w:sz w:val="17"/>
+                <w:szCs w:val="17"/>
+              </w:rPr>
+              <w:t xml:space="preserve">0.16</w:t>
+            </w:r>
+          </w:p>
+        </w:tc>
+        <w:tc>
+          <w:tcPr>
+            <w:tcW w:type="dxa" w:w="1100"/>
+            <w:tcBorders>
+              <w:top w:val="single" w:color="BFBFBF" w:sz="4"/>
+              <w:left w:val="single" w:color="BFBFBF" w:sz="4"/>
+              <w:bottom w:val="single" w:color="BFBFBF" w:sz="4"/>
+              <w:right w:val="single" w:color="BFBFBF" w:sz="4"/>
+            </w:tcBorders>
+            <w:shd w:fill="FFFFFF" w:val="clear"/>
+            <w:tcMar>
+              <w:top w:type="dxa" w:w="50"/>
+              <w:left w:type="dxa" w:w="70"/>
+              <w:bottom w:type="dxa" w:w="50"/>
+              <w:right w:type="dxa" w:w="70"/>
+            </w:tcMar>
+            <w:vAlign w:val="center"/>
+          </w:tcPr>
+          <w:p>
+            <w:pPr>
+              <w:spacing w:after="0" w:before="0"/>
+              <w:jc w:val="left"/>
+            </w:pPr>
+            <w:r>
+              <w:rPr>
+                <w:rFonts w:ascii="Times New Roman" w:cs="Times New Roman" w:eastAsia="Times New Roman" w:hAnsi="Times New Roman"/>
+                <w:b w:val="false"/>
+                <w:bCs w:val="false"/>
+                <w:i w:val="false"/>
+                <w:iCs w:val="false"/>
+                <w:smallCaps w:val="false"/>
+                <w:color w:val="000000"/>
+                <w:sz w:val="17"/>
+                <w:szCs w:val="17"/>
+              </w:rPr>
+              <w:t xml:space="preserve">0.50</w:t>
+            </w:r>
+          </w:p>
+        </w:tc>
+        <w:tc>
+          <w:tcPr>
+            <w:tcW w:type="dxa" w:w="1100"/>
+            <w:tcBorders>
+              <w:top w:val="single" w:color="BFBFBF" w:sz="4"/>
+              <w:left w:val="single" w:color="BFBFBF" w:sz="4"/>
+              <w:bottom w:val="single" w:color="BFBFBF" w:sz="4"/>
+              <w:right w:val="single" w:color="BFBFBF" w:sz="4"/>
+            </w:tcBorders>
+            <w:shd w:fill="FFFFFF" w:val="clear"/>
+            <w:tcMar>
+              <w:top w:type="dxa" w:w="50"/>
+              <w:left w:type="dxa" w:w="70"/>
+              <w:bottom w:type="dxa" w:w="50"/>
+              <w:right w:type="dxa" w:w="70"/>
+            </w:tcMar>
+            <w:vAlign w:val="center"/>
+          </w:tcPr>
+          <w:p>
+            <w:pPr>
+              <w:spacing w:after="0" w:before="0"/>
+              <w:jc w:val="left"/>
+            </w:pPr>
+            <w:r>
+              <w:rPr>
+                <w:rFonts w:ascii="Times New Roman" w:cs="Times New Roman" w:eastAsia="Times New Roman" w:hAnsi="Times New Roman"/>
+                <w:b w:val="false"/>
+                <w:bCs w:val="false"/>
+                <w:i w:val="false"/>
+                <w:iCs w:val="false"/>
+                <w:smallCaps w:val="false"/>
+                <w:color w:val="000000"/>
+                <w:sz w:val="17"/>
+                <w:szCs w:val="17"/>
+              </w:rPr>
+              <w:t xml:space="preserve">3.74</w:t>
+            </w:r>
+          </w:p>
+        </w:tc>
+        <w:tc>
+          <w:tcPr>
+            <w:tcW w:type="dxa" w:w="1100"/>
+            <w:tcBorders>
+              <w:top w:val="single" w:color="BFBFBF" w:sz="4"/>
+              <w:left w:val="single" w:color="BFBFBF" w:sz="4"/>
+              <w:bottom w:val="single" w:color="BFBFBF" w:sz="4"/>
+              <w:right w:val="single" w:color="BFBFBF" w:sz="4"/>
+            </w:tcBorders>
+            <w:shd w:fill="FFFFFF" w:val="clear"/>
+            <w:tcMar>
+              <w:top w:type="dxa" w:w="50"/>
+              <w:left w:type="dxa" w:w="70"/>
+              <w:bottom w:type="dxa" w:w="50"/>
+              <w:right w:type="dxa" w:w="70"/>
+            </w:tcMar>
+            <w:vAlign w:val="center"/>
+          </w:tcPr>
+          <w:p>
+            <w:pPr>
+              <w:spacing w:after="0" w:before="0"/>
+              <w:jc w:val="left"/>
+            </w:pPr>
+            <w:r>
+              <w:rPr>
+                <w:rFonts w:ascii="Times New Roman" w:cs="Times New Roman" w:eastAsia="Times New Roman" w:hAnsi="Times New Roman"/>
+                <w:b w:val="false"/>
+                <w:bCs w:val="false"/>
+                <w:i w:val="false"/>
+                <w:iCs w:val="false"/>
+                <w:smallCaps w:val="false"/>
+                <w:color w:val="000000"/>
+                <w:sz w:val="17"/>
+                <w:szCs w:val="17"/>
+              </w:rPr>
+              <w:t xml:space="preserve">+1.74</w:t>
+            </w:r>
+          </w:p>
+        </w:tc>
+      </w:tr>
+    </w:tbl>
+    <w:p>
+      <w:pPr>
+        <w:spacing w:after="160" w:before="40"/>
+      </w:pPr>
+      <w:r>
+        <w:rPr>
+          <w:rFonts w:ascii="Times New Roman" w:cs="Times New Roman" w:eastAsia="Times New Roman" w:hAnsi="Times New Roman"/>
+          <w:b w:val="false"/>
+          <w:bCs w:val="false"/>
+          <w:i/>
+          <w:iCs/>
+          <w:smallCaps w:val="false"/>
+          <w:color w:val="000000"/>
+          <w:sz w:val="18"/>
+          <w:szCs w:val="18"/>
+        </w:rPr>
+        <w:t xml:space="preserve">Notes. As Table 8. Teff of 0.02 is the lower edge of the search grid.</w:t>
+      </w:r>
+    </w:p>
+    <w:p>
+      <w:pPr>
+        <w:pStyle w:val="Heading2"/>
+        <w:spacing w:after="120" w:before="280"/>
+      </w:pPr>
+      <w:r>
+        <w:rPr>
+          <w:rFonts w:ascii="Times New Roman" w:cs="Times New Roman" w:eastAsia="Times New Roman" w:hAnsi="Times New Roman"/>
+          <w:b/>
+          <w:bCs/>
+          <w:color w:val="1F4E79"/>
+          <w:sz w:val="24"/>
+          <w:szCs w:val="24"/>
+        </w:rPr>
+        <w:t xml:space="preserve">4.5 What the illustration identifies</w:t>
       </w:r>
     </w:p>
     <w:p>
@@ -13362,7 +17617,47 @@
           <w:sz w:val="22"/>
           <w:szCs w:val="22"/>
         </w:rPr>
-        <w:t xml:space="preserve">Stage 2 cell means rest on 8 to 10 replications and a horizon of 5 or 6 steps, so standard errors are large, and Experiment 1 is missing two high-T joint cells. Stage 3 uses 30 to 100 replications per cell, but it covers one 3B model, one task family, one prompt wording, and six-step horizons, and its peak comparisons are exploratory. Alphabet continuation sits close to the language-model prior. Nothing here is evidence about production agents, tool use, or organizations.</w:t>
+        <w:t xml:space="preserve">Four statements are supported as measurement claims. First, Teff, entropy, repetition, and lock-in can be computed from synthetic choice probabilities and from the next-token log-probabilities of open-weight models, provided the reference is a clean context and not the sampling logits. Second, pressure lifts Teff above nominal T on a task the model can solve, and the lift is largest at low T, where Teff − T is about 2 on both larger models. Third, on the 3B and 7B models an accuracy inverted-U in nominal temperature appears for planted attractors of intermediate strength (m = 3, 4, 6 on the 3B model; m = 2, 3 on the 7B model) and not for a weak attractor or for none, and the 7B model also shows the too-strong row at m = 4, which is the pattern Proposition 2 describes. Fourth, the separation of Teff from nominal T is large on alphabet continuation and only partial on the unsolvable order policy.</w:t>
+      </w:r>
+    </w:p>
+    <w:p>
+      <w:pPr>
+        <w:spacing w:after="160" w:before="0" w:line="276"/>
+        <w:jc w:val="both"/>
+      </w:pPr>
+      <w:r>
+        <w:rPr>
+          <w:rFonts w:ascii="Times New Roman" w:cs="Times New Roman" w:eastAsia="Times New Roman" w:hAnsi="Times New Roman"/>
+          <w:b w:val="false"/>
+          <w:bCs w:val="false"/>
+          <w:i w:val="false"/>
+          <w:iCs w:val="false"/>
+          <w:smallCaps w:val="false"/>
+          <w:color w:val="000000"/>
+          <w:sz w:val="22"/>
+          <w:szCs w:val="22"/>
+        </w:rPr>
+        <w:t xml:space="preserve">Two statements are not supported. Proposition 3 receives no support, because contamination leaves Teff at nominal T on both larger models and changes lock-in only in one 7B cell. And the inverted-U is a conditional result: it is absent from the three 135M experiments, where the attractor was too weak or too strong, and its peak on both larger models sits at T ≈ 2 to 2.5, well above the usual decoding range. Accuracy at the peak is below 0.50 and strict recovery below 0.20, so no practitioner would choose such a temperature to repair a locked agent. The result supports the structure of the prediction, not a prescription. Teff is also weakly identified when the reference is saturated, which includes the clean cells at low T. The estimate then sits at the lower edge of the search grid, and the small clean values reported for the 135M model at T = 0.15 may reflect the same limit.</w:t>
+      </w:r>
+    </w:p>
+    <w:p>
+      <w:pPr>
+        <w:spacing w:after="160" w:before="0" w:line="276"/>
+        <w:jc w:val="both"/>
+      </w:pPr>
+      <w:r>
+        <w:rPr>
+          <w:rFonts w:ascii="Times New Roman" w:cs="Times New Roman" w:eastAsia="Times New Roman" w:hAnsi="Times New Roman"/>
+          <w:b w:val="false"/>
+          <w:bCs w:val="false"/>
+          <w:i w:val="false"/>
+          <w:iCs w:val="false"/>
+          <w:smallCaps w:val="false"/>
+          <w:color w:val="000000"/>
+          <w:sz w:val="22"/>
+          <w:szCs w:val="22"/>
+        </w:rPr>
+        <w:t xml:space="preserve">Stage 2 cell means rest on 8 to 10 replications and a horizon of 5 or 6 steps, so standard errors are large, and Experiment 1 is missing two high-T joint cells. Stages 3 and 4 use 30 to 100 replications per cell, but they cover one 3B and one quantized 7B model from a single family, one task family, one prompt wording, and six-step horizons, and their peak comparisons are exploratory. Alphabet continuation sits close to the language-model prior. Nothing here is evidence about production agents, tool use, or organizations.</w:t>
       </w:r>
     </w:p>
     <w:p>
@@ -13502,7 +17797,7 @@
           <w:sz w:val="22"/>
           <w:szCs w:val="22"/>
         </w:rPr>
-        <w:t xml:space="preserve">Table 9 sets out the evaluation that the present illustration does not provide. We include it so that a null result on alphabet continuation is not read as evidence about organizations, and so that a later paper cannot treat the design claims as already tested.</w:t>
+        <w:t xml:space="preserve">Table 11 sets out the evaluation that the present illustration does not provide. We include it so that a null result on alphabet continuation is not read as evidence about organizations, and so that a later paper cannot treat the design claims as already tested.</w:t>
       </w:r>
     </w:p>
     <w:p>
@@ -13521,7 +17816,7 @@
           <w:sz w:val="20"/>
           <w:szCs w:val="20"/>
         </w:rPr>
-        <w:t xml:space="preserve">Table 9. Tests required before the governance implication is evidence.</w:t>
+        <w:t xml:space="preserve">Table 11. Tests required before the governance implication is evidence.</w:t>
       </w:r>
     </w:p>
     <w:tbl>
@@ -13782,7 +18077,7 @@
                 <w:sz w:val="17"/>
                 <w:szCs w:val="17"/>
               </w:rPr>
-              <w:t xml:space="preserve">Pressure effect on Teff replicated on a 3B model; P3 not supported. One model, one task.</w:t>
+              <w:t xml:space="preserve">Pressure effect on Teff replicated on 3B and 7B models; P3 not supported. One model family, one task.</w:t>
             </w:r>
           </w:p>
         </w:tc>
@@ -13905,7 +18200,7 @@
                 <w:sz w:val="17"/>
                 <w:szCs w:val="17"/>
               </w:rPr>
-              <w:t xml:space="preserve">Inverted-U on one 3B model for intermediate attractors (peak at T ≈ 2 to 2.5); absent on 135M. Exploratory.</w:t>
+              <w:t xml:space="preserve">Inverted-U on 3B and 7B models for intermediate attractors (peak at T ≈ 2 to 2.5); too-strong row on 7B; absent on 135M. Exploratory.</w:t>
             </w:r>
           </w:p>
         </w:tc>
@@ -14297,7 +18592,7 @@
           <w:sz w:val="22"/>
           <w:szCs w:val="22"/>
         </w:rPr>
-        <w:t xml:space="preserve">The first follow-up is to repeat Stage 3 on a 7B instruct model and on at least one other model family, with tasks beyond alphabet continuation and several prompt wordings and seeds, so that the location of the peak in T can be tested against bounds fixed in advance. The second is an attractor of the kind Proposition 3 names, a dominant token close to the contaminated content, which we did not construct. Generalization beyond autoregressive transformers, and beyond role-played resemblance to human breakdown, lies outside this note.</w:t>
+        <w:t xml:space="preserve">The first follow-up is to repeat Stages 3 and 4 on other model families and unquantized larger models, with tasks beyond alphabet continuation and several prompt wordings and seeds, so that the location of the peak in T can be tested against bounds fixed in advance. The second is an attractor of the kind Proposition 3 names, a dominant token close to the contaminated content, which we did not construct. Generalization beyond autoregressive transformers, and beyond role-played resemblance to human breakdown, lies outside this note.</w:t>
       </w:r>
     </w:p>
     <w:p>
@@ -14357,7 +18652,7 @@
           <w:sz w:val="22"/>
           <w:szCs w:val="22"/>
         </w:rPr>
-        <w:t xml:space="preserve">On a synthetic agent, the indicators register the distortions that were built in, and an accuracy inverted-U appears only for an attractor tuned to be sticky and escapable. On SmolLM2-135M, the same measurement rule reads Teff from next-token log-probabilities, and pressure lifts Teff far above a nominal temperature of 0.15. A weak planted typo is absorbed and a strong planted letter is not escaped, so no inverted-U appears. On Qwen2.5-3B-Instruct, which solves the task, planted attractors of intermediate strength do produce an inverted-U, with a peak near T = 2 to 2.5 and accuracy below 0.50 at the peak, while a weak attractor does not. Pressure raises Teff by about 2 at low temperature, whereas contamination has no measurable effect, so Proposition 3 is unsupported. The governance claim that follows, to delegate on the observed state and not only on capability, is an implication with four unmet conditions. What the measurement does support is narrower: the decoding temperature an operator sets is not the agent’s decision state.</w:t>
+        <w:t xml:space="preserve">On a synthetic agent, the indicators register the distortions that were built in, and an accuracy inverted-U appears only for an attractor tuned to be sticky and escapable. On SmolLM2-135M, the same measurement rule reads Teff from next-token log-probabilities, and pressure lifts Teff far above a nominal temperature of 0.15. A weak planted typo is absorbed and a strong planted letter is not escaped, so no inverted-U appears. On Qwen2.5-3B-Instruct and 7B-Instruct, which solve the task, planted attractors of intermediate strength do produce an inverted-U, with a peak near T = 2 to 2.5 and accuracy below 0.50 at the peak, while a weak attractor does not and, on the 7B model, a too-strong one gives no peak. Pressure raises Teff by about 2 at low temperature, whereas contamination has no clear effect, so Proposition 3 is unsupported. The governance claim that follows, to delegate on the observed state and not only on capability, is an implication with four unmet conditions. What the measurement does support is narrower: the decoding temperature an operator sets is not the agent’s decision state.</w:t>
       </w:r>
     </w:p>
     <w:p>

</xml_diff>

<commit_message>
Add Stage 5 (Llama-3.2-3B) results and update note and cover letter
Co-Authored-By: Claude Sonnet 5.5 <noreply@anthropic.com>
Claude-Session: https://claude.ai/code/session_014FRGRi7axQM37FZZhPBo12
</commit_message>
<xml_diff>
--- a/ISR_Effective_Decision_Temperature_Research_Note_revised.docx
+++ b/ISR_Effective_Decision_Temperature_Research_Note_revised.docx
@@ -185,7 +185,7 @@
           <w:sz w:val="22"/>
           <w:szCs w:val="22"/>
         </w:rPr>
-        <w:t xml:space="preserve">On synthetic logits, Teff separates from nominal temperature under pressure. On SmolLM2-135M-Instruct, pressure lifts Teff far above a nominal T = 0.15 and no inverted-U appears. On Qwen2.5-3B-Instruct and 7B-Instruct, which solve the task, a planted off-path letter of intermediate strength produces an inverted-U peaking near T = 2 to 2.5, a weak one does not, and contamination has no clear effect. A dashboard reporting only the decoding parameter misreads the agent’s decision state.</w:t>
+        <w:t xml:space="preserve">On synthetic logits, Teff separates from nominal temperature under pressure. On SmolLM2-135M-Instruct, pressure lifts Teff far above a nominal T = 0.15 and no inverted-U appears. On Qwen2.5-3B and 7B, which solve the task, a planted off-path letter of intermediate strength produces an inverted-U peaking near T = 2 to 2.5 and pressure raises Teff. On Llama-3.2-3B an inverted-U also appears, but pressure does not raise Teff. A dashboard reporting only the decoding parameter misreads the agent’s decision state.</w:t>
       </w:r>
     </w:p>
     <w:p>
@@ -339,7 +339,7 @@
           <w:sz w:val="22"/>
           <w:szCs w:val="22"/>
         </w:rPr>
-        <w:t xml:space="preserve">The note makes three contributions. First, it brings the agent’s decision state into the governance of agentic IS artifacts, locating that state in a quantity, effective decision temperature, which is latent in human choice but can be estimated for an LLM once a clean-context reference is fixed. Second, it separates what the correspondence predicts from what it does not. Pressure and contamination should lift Teff above the nominal temperature, whereas an interior performance band in nominal temperature is a special case rather than a default, and we state the attractor condition at the outset. Third, it shows that the indicators can be computed both on the theory’s own choice rule and on the next-token log-probabilities of three pretrained open-weight models (135M, 3B, and 7B parameters), and it reports where the predictions hold and where they fail. Network contagion, circuit breakers, and state-contingent delegation are design implications of observable states. They form an agenda, not findings.</w:t>
+        <w:t xml:space="preserve">The note makes three contributions. First, it brings the agent’s decision state into the governance of agentic IS artifacts, locating that state in a quantity, effective decision temperature, which is latent in human choice but can be estimated for an LLM once a clean-context reference is fixed. Second, it separates what the correspondence predicts from what it does not. Pressure and contamination should lift Teff above the nominal temperature, whereas an interior performance band in nominal temperature is a special case rather than a default, and we state the attractor condition at the outset. Third, it shows that the indicators can be computed both on the theory’s own choice rule and on the next-token log-probabilities of four pretrained open-weight models from three families (135M to 7B parameters), and it reports where the predictions hold and where they fail. Network contagion, circuit breakers, and state-contingent delegation are design implications of observable states. They form an agenda, not findings.</w:t>
       </w:r>
     </w:p>
     <w:p>
@@ -2800,7 +2800,7 @@
           <w:sz w:val="22"/>
           <w:szCs w:val="22"/>
         </w:rPr>
-        <w:t xml:space="preserve">The identity between softmax sampling and the logit rule makes the constructs computable, but it does not turn a synthetic agent into a test of the theory. We report four stages. Stage 1 implements the choice rule on logits we specify ourselves, so that the indicators can be read off a known process. Stage 2 applies the same measurement rule to HuggingFaceTB/SmolLM2-135M-Instruct, run in full precision on a CPU machine with no GPU and 1.9 GB of RAM, which ruled out larger models. Stage 3 repeats the test on Qwen2.5-3B-Instruct, run in bfloat16 on a different CPU machine with 15 GB of RAM, on a task that this model solves, to see whether the inverted-U of Proposition 2 appears when the agent starts on-path. Stage 1 shows that the indicators register distortions built into the logits. Stage 2 shows that they can be computed from real log-probabilities and that they separate under pressure, and that no inverted-U appears on the small model. Stage 3 shows an inverted-U on the larger model for attractors of intermediate strength. Stage 4 repeats Stage 3 on a 7B model with a different inference stack. None of the stages confirms the propositions as general claims.</w:t>
+        <w:t xml:space="preserve">The identity between softmax sampling and the logit rule makes the constructs computable, but it does not turn a synthetic agent into a test of the theory. We report five stages. Stage 1 implements the choice rule on logits we specify ourselves, so that the indicators can be read off a known process. Stage 2 applies the same measurement rule to HuggingFaceTB/SmolLM2-135M-Instruct, run in full precision on a CPU machine with no GPU and 1.9 GB of RAM, which ruled out larger models. Stage 3 repeats the test on Qwen2.5-3B-Instruct, run in bfloat16 on a different CPU machine with 15 GB of RAM, on a task that this model solves, to see whether the inverted-U of Proposition 2 appears when the agent starts on-path. Stage 1 shows that the indicators register distortions built into the logits. Stage 2 shows that they can be computed from real log-probabilities and that they separate under pressure, and that no inverted-U appears on the small model. Stage 3 shows an inverted-U on the larger model for attractors of intermediate strength. Stage 4 repeats Stage 3 on a 7B model with a different inference stack, and Stage 5 repeats it on a different model family. None of the stages confirms the propositions as general claims.</w:t>
       </w:r>
     </w:p>
     <w:p>
@@ -17597,7 +17597,7 @@
           <w:sz w:val="24"/>
           <w:szCs w:val="24"/>
         </w:rPr>
-        <w:t xml:space="preserve">4.5 What the illustration identifies</w:t>
+        <w:t xml:space="preserve">4.5 Stage 5: a different model family</w:t>
       </w:r>
     </w:p>
     <w:p>
@@ -17617,7 +17617,1674 @@
           <w:sz w:val="22"/>
           <w:szCs w:val="22"/>
         </w:rPr>
-        <w:t xml:space="preserve">Four statements are supported as measurement claims. First, Teff, entropy, repetition, and lock-in can be computed from synthetic choice probabilities and from the next-token log-probabilities of open-weight models, provided the reference is a clean context and not the sampling logits. Second, pressure lifts Teff above nominal T on a task the model can solve, and the lift is largest at low T, where Teff − T is about 2 on both larger models. Third, on the 3B and 7B models an accuracy inverted-U in nominal temperature appears for planted attractors of intermediate strength (m = 3, 4, 6 on the 3B model; m = 2, 3 on the 7B model) and not for a weak attractor or for none, and the 7B model also shows the too-strong row at m = 4, which is the pattern Proposition 2 describes. Fourth, the separation of Teff from nominal T is large on alphabet continuation and only partial on the unsolvable order policy.</w:t>
+        <w:t xml:space="preserve">Stage 5 uses a different model family, Llama-3.2-3B-Instruct, in bfloat16 with the same pipeline as Stage 3. The model also solves the task: in the unplanted condition accuracy is 1.00 at T = 0.15 and T = 1.2 and 0.97 at T = 3.0 (30 trajectories each). It resists a short planted run, however. In a probe, even eight planted copies of B left the greedy continuation correct, so the attractors needed are much longer, and we use m = 24, 32, 48, and 64 (60 trajectories per cell for T ≤ 2.0 and 40 above, Table 11).</w:t>
+      </w:r>
+    </w:p>
+    <w:p>
+      <w:pPr>
+        <w:spacing w:after="80" w:before="160"/>
+      </w:pPr>
+      <w:r>
+        <w:rPr>
+          <w:rFonts w:ascii="Times New Roman" w:cs="Times New Roman" w:eastAsia="Times New Roman" w:hAnsi="Times New Roman"/>
+          <w:b w:val="false"/>
+          <w:bCs w:val="false"/>
+          <w:i/>
+          <w:iCs/>
+          <w:smallCaps w:val="false"/>
+          <w:color w:val="000000"/>
+          <w:sz w:val="20"/>
+          <w:szCs w:val="20"/>
+        </w:rPr>
+        <w:t xml:space="preserve">Table 11. Stage 5, Llama-3.2-3B-Instruct, clean prompt: locally correct accuracy by nominal T and attractor strength m (60 trajectories per cell for T ≤ 2.0, 40 for T ≥ 2.5).</w:t>
+      </w:r>
+    </w:p>
+    <w:tbl>
+      <w:tblPr>
+        <w:tblW w:type="dxa" w:w="9360"/>
+        <w:tblBorders>
+          <w:top w:val="single" w:color="auto" w:sz="4"/>
+          <w:left w:val="single" w:color="auto" w:sz="4"/>
+          <w:bottom w:val="single" w:color="auto" w:sz="4"/>
+          <w:right w:val="single" w:color="auto" w:sz="4"/>
+          <w:insideH w:val="single" w:color="auto" w:sz="4"/>
+          <w:insideV w:val="single" w:color="auto" w:sz="4"/>
+        </w:tblBorders>
+      </w:tblPr>
+      <w:tblGrid>
+        <w:gridCol w:w="1800"/>
+        <w:gridCol w:w="1890"/>
+        <w:gridCol w:w="1890"/>
+        <w:gridCol w:w="1890"/>
+        <w:gridCol w:w="1890"/>
+      </w:tblGrid>
+      <w:tr>
+        <w:trPr>
+          <w:cantSplit/>
+          <w:tblHeader/>
+        </w:trPr>
+        <w:tc>
+          <w:tcPr>
+            <w:tcW w:type="dxa" w:w="1800"/>
+            <w:tcBorders>
+              <w:top w:val="single" w:color="BFBFBF" w:sz="4"/>
+              <w:left w:val="single" w:color="BFBFBF" w:sz="4"/>
+              <w:bottom w:val="single" w:color="BFBFBF" w:sz="4"/>
+              <w:right w:val="single" w:color="BFBFBF" w:sz="4"/>
+            </w:tcBorders>
+            <w:shd w:fill="E7EEF5" w:val="clear"/>
+            <w:tcMar>
+              <w:top w:type="dxa" w:w="50"/>
+              <w:left w:type="dxa" w:w="70"/>
+              <w:bottom w:type="dxa" w:w="50"/>
+              <w:right w:type="dxa" w:w="70"/>
+            </w:tcMar>
+            <w:vAlign w:val="center"/>
+          </w:tcPr>
+          <w:p>
+            <w:pPr>
+              <w:spacing w:after="0" w:before="0"/>
+              <w:jc w:val="left"/>
+            </w:pPr>
+            <w:r>
+              <w:rPr>
+                <w:rFonts w:ascii="Times New Roman" w:cs="Times New Roman" w:eastAsia="Times New Roman" w:hAnsi="Times New Roman"/>
+                <w:b/>
+                <w:bCs/>
+                <w:i w:val="false"/>
+                <w:iCs w:val="false"/>
+                <w:smallCaps w:val="false"/>
+                <w:color w:val="000000"/>
+                <w:sz w:val="17"/>
+                <w:szCs w:val="17"/>
+              </w:rPr>
+              <w:t xml:space="preserve">Nominal T</w:t>
+            </w:r>
+          </w:p>
+        </w:tc>
+        <w:tc>
+          <w:tcPr>
+            <w:tcW w:type="dxa" w:w="1890"/>
+            <w:tcBorders>
+              <w:top w:val="single" w:color="BFBFBF" w:sz="4"/>
+              <w:left w:val="single" w:color="BFBFBF" w:sz="4"/>
+              <w:bottom w:val="single" w:color="BFBFBF" w:sz="4"/>
+              <w:right w:val="single" w:color="BFBFBF" w:sz="4"/>
+            </w:tcBorders>
+            <w:shd w:fill="E7EEF5" w:val="clear"/>
+            <w:tcMar>
+              <w:top w:type="dxa" w:w="50"/>
+              <w:left w:type="dxa" w:w="70"/>
+              <w:bottom w:type="dxa" w:w="50"/>
+              <w:right w:type="dxa" w:w="70"/>
+            </w:tcMar>
+            <w:vAlign w:val="center"/>
+          </w:tcPr>
+          <w:p>
+            <w:pPr>
+              <w:spacing w:after="0" w:before="0"/>
+              <w:jc w:val="left"/>
+            </w:pPr>
+            <w:r>
+              <w:rPr>
+                <w:rFonts w:ascii="Times New Roman" w:cs="Times New Roman" w:eastAsia="Times New Roman" w:hAnsi="Times New Roman"/>
+                <w:b/>
+                <w:bCs/>
+                <w:i w:val="false"/>
+                <w:iCs w:val="false"/>
+                <w:smallCaps w:val="false"/>
+                <w:color w:val="000000"/>
+                <w:sz w:val="17"/>
+                <w:szCs w:val="17"/>
+              </w:rPr>
+              <w:t xml:space="preserve">m = 24</w:t>
+            </w:r>
+          </w:p>
+        </w:tc>
+        <w:tc>
+          <w:tcPr>
+            <w:tcW w:type="dxa" w:w="1890"/>
+            <w:tcBorders>
+              <w:top w:val="single" w:color="BFBFBF" w:sz="4"/>
+              <w:left w:val="single" w:color="BFBFBF" w:sz="4"/>
+              <w:bottom w:val="single" w:color="BFBFBF" w:sz="4"/>
+              <w:right w:val="single" w:color="BFBFBF" w:sz="4"/>
+            </w:tcBorders>
+            <w:shd w:fill="E7EEF5" w:val="clear"/>
+            <w:tcMar>
+              <w:top w:type="dxa" w:w="50"/>
+              <w:left w:type="dxa" w:w="70"/>
+              <w:bottom w:type="dxa" w:w="50"/>
+              <w:right w:type="dxa" w:w="70"/>
+            </w:tcMar>
+            <w:vAlign w:val="center"/>
+          </w:tcPr>
+          <w:p>
+            <w:pPr>
+              <w:spacing w:after="0" w:before="0"/>
+              <w:jc w:val="left"/>
+            </w:pPr>
+            <w:r>
+              <w:rPr>
+                <w:rFonts w:ascii="Times New Roman" w:cs="Times New Roman" w:eastAsia="Times New Roman" w:hAnsi="Times New Roman"/>
+                <w:b/>
+                <w:bCs/>
+                <w:i w:val="false"/>
+                <w:iCs w:val="false"/>
+                <w:smallCaps w:val="false"/>
+                <w:color w:val="000000"/>
+                <w:sz w:val="17"/>
+                <w:szCs w:val="17"/>
+              </w:rPr>
+              <w:t xml:space="preserve">m = 32</w:t>
+            </w:r>
+          </w:p>
+        </w:tc>
+        <w:tc>
+          <w:tcPr>
+            <w:tcW w:type="dxa" w:w="1890"/>
+            <w:tcBorders>
+              <w:top w:val="single" w:color="BFBFBF" w:sz="4"/>
+              <w:left w:val="single" w:color="BFBFBF" w:sz="4"/>
+              <w:bottom w:val="single" w:color="BFBFBF" w:sz="4"/>
+              <w:right w:val="single" w:color="BFBFBF" w:sz="4"/>
+            </w:tcBorders>
+            <w:shd w:fill="E7EEF5" w:val="clear"/>
+            <w:tcMar>
+              <w:top w:type="dxa" w:w="50"/>
+              <w:left w:type="dxa" w:w="70"/>
+              <w:bottom w:type="dxa" w:w="50"/>
+              <w:right w:type="dxa" w:w="70"/>
+            </w:tcMar>
+            <w:vAlign w:val="center"/>
+          </w:tcPr>
+          <w:p>
+            <w:pPr>
+              <w:spacing w:after="0" w:before="0"/>
+              <w:jc w:val="left"/>
+            </w:pPr>
+            <w:r>
+              <w:rPr>
+                <w:rFonts w:ascii="Times New Roman" w:cs="Times New Roman" w:eastAsia="Times New Roman" w:hAnsi="Times New Roman"/>
+                <w:b/>
+                <w:bCs/>
+                <w:i w:val="false"/>
+                <w:iCs w:val="false"/>
+                <w:smallCaps w:val="false"/>
+                <w:color w:val="000000"/>
+                <w:sz w:val="17"/>
+                <w:szCs w:val="17"/>
+              </w:rPr>
+              <w:t xml:space="preserve">m = 48</w:t>
+            </w:r>
+          </w:p>
+        </w:tc>
+        <w:tc>
+          <w:tcPr>
+            <w:tcW w:type="dxa" w:w="1890"/>
+            <w:tcBorders>
+              <w:top w:val="single" w:color="BFBFBF" w:sz="4"/>
+              <w:left w:val="single" w:color="BFBFBF" w:sz="4"/>
+              <w:bottom w:val="single" w:color="BFBFBF" w:sz="4"/>
+              <w:right w:val="single" w:color="BFBFBF" w:sz="4"/>
+            </w:tcBorders>
+            <w:shd w:fill="E7EEF5" w:val="clear"/>
+            <w:tcMar>
+              <w:top w:type="dxa" w:w="50"/>
+              <w:left w:type="dxa" w:w="70"/>
+              <w:bottom w:type="dxa" w:w="50"/>
+              <w:right w:type="dxa" w:w="70"/>
+            </w:tcMar>
+            <w:vAlign w:val="center"/>
+          </w:tcPr>
+          <w:p>
+            <w:pPr>
+              <w:spacing w:after="0" w:before="0"/>
+              <w:jc w:val="left"/>
+            </w:pPr>
+            <w:r>
+              <w:rPr>
+                <w:rFonts w:ascii="Times New Roman" w:cs="Times New Roman" w:eastAsia="Times New Roman" w:hAnsi="Times New Roman"/>
+                <w:b/>
+                <w:bCs/>
+                <w:i w:val="false"/>
+                <w:iCs w:val="false"/>
+                <w:smallCaps w:val="false"/>
+                <w:color w:val="000000"/>
+                <w:sz w:val="17"/>
+                <w:szCs w:val="17"/>
+              </w:rPr>
+              <w:t xml:space="preserve">m = 64</w:t>
+            </w:r>
+          </w:p>
+        </w:tc>
+      </w:tr>
+      <w:tr>
+        <w:trPr>
+          <w:cantSplit/>
+          <w:tblHeader w:val="false"/>
+        </w:trPr>
+        <w:tc>
+          <w:tcPr>
+            <w:tcW w:type="dxa" w:w="1800"/>
+            <w:tcBorders>
+              <w:top w:val="single" w:color="BFBFBF" w:sz="4"/>
+              <w:left w:val="single" w:color="BFBFBF" w:sz="4"/>
+              <w:bottom w:val="single" w:color="BFBFBF" w:sz="4"/>
+              <w:right w:val="single" w:color="BFBFBF" w:sz="4"/>
+            </w:tcBorders>
+            <w:shd w:fill="FFFFFF" w:val="clear"/>
+            <w:tcMar>
+              <w:top w:type="dxa" w:w="50"/>
+              <w:left w:type="dxa" w:w="70"/>
+              <w:bottom w:type="dxa" w:w="50"/>
+              <w:right w:type="dxa" w:w="70"/>
+            </w:tcMar>
+            <w:vAlign w:val="center"/>
+          </w:tcPr>
+          <w:p>
+            <w:pPr>
+              <w:spacing w:after="0" w:before="0"/>
+              <w:jc w:val="left"/>
+            </w:pPr>
+            <w:r>
+              <w:rPr>
+                <w:rFonts w:ascii="Times New Roman" w:cs="Times New Roman" w:eastAsia="Times New Roman" w:hAnsi="Times New Roman"/>
+                <w:b w:val="false"/>
+                <w:bCs w:val="false"/>
+                <w:i w:val="false"/>
+                <w:iCs w:val="false"/>
+                <w:smallCaps w:val="false"/>
+                <w:color w:val="000000"/>
+                <w:sz w:val="17"/>
+                <w:szCs w:val="17"/>
+              </w:rPr>
+              <w:t xml:space="preserve">0.15</w:t>
+            </w:r>
+          </w:p>
+        </w:tc>
+        <w:tc>
+          <w:tcPr>
+            <w:tcW w:type="dxa" w:w="1890"/>
+            <w:tcBorders>
+              <w:top w:val="single" w:color="BFBFBF" w:sz="4"/>
+              <w:left w:val="single" w:color="BFBFBF" w:sz="4"/>
+              <w:bottom w:val="single" w:color="BFBFBF" w:sz="4"/>
+              <w:right w:val="single" w:color="BFBFBF" w:sz="4"/>
+            </w:tcBorders>
+            <w:shd w:fill="FFFFFF" w:val="clear"/>
+            <w:tcMar>
+              <w:top w:type="dxa" w:w="50"/>
+              <w:left w:type="dxa" w:w="70"/>
+              <w:bottom w:type="dxa" w:w="50"/>
+              <w:right w:type="dxa" w:w="70"/>
+            </w:tcMar>
+            <w:vAlign w:val="center"/>
+          </w:tcPr>
+          <w:p>
+            <w:pPr>
+              <w:spacing w:after="0" w:before="0"/>
+              <w:jc w:val="left"/>
+            </w:pPr>
+            <w:r>
+              <w:rPr>
+                <w:rFonts w:ascii="Times New Roman" w:cs="Times New Roman" w:eastAsia="Times New Roman" w:hAnsi="Times New Roman"/>
+                <w:b w:val="false"/>
+                <w:bCs w:val="false"/>
+                <w:i w:val="false"/>
+                <w:iCs w:val="false"/>
+                <w:smallCaps w:val="false"/>
+                <w:color w:val="000000"/>
+                <w:sz w:val="17"/>
+                <w:szCs w:val="17"/>
+              </w:rPr>
+              <w:t xml:space="preserve">0.17</w:t>
+            </w:r>
+          </w:p>
+        </w:tc>
+        <w:tc>
+          <w:tcPr>
+            <w:tcW w:type="dxa" w:w="1890"/>
+            <w:tcBorders>
+              <w:top w:val="single" w:color="BFBFBF" w:sz="4"/>
+              <w:left w:val="single" w:color="BFBFBF" w:sz="4"/>
+              <w:bottom w:val="single" w:color="BFBFBF" w:sz="4"/>
+              <w:right w:val="single" w:color="BFBFBF" w:sz="4"/>
+            </w:tcBorders>
+            <w:shd w:fill="FFFFFF" w:val="clear"/>
+            <w:tcMar>
+              <w:top w:type="dxa" w:w="50"/>
+              <w:left w:type="dxa" w:w="70"/>
+              <w:bottom w:type="dxa" w:w="50"/>
+              <w:right w:type="dxa" w:w="70"/>
+            </w:tcMar>
+            <w:vAlign w:val="center"/>
+          </w:tcPr>
+          <w:p>
+            <w:pPr>
+              <w:spacing w:after="0" w:before="0"/>
+              <w:jc w:val="left"/>
+            </w:pPr>
+            <w:r>
+              <w:rPr>
+                <w:rFonts w:ascii="Times New Roman" w:cs="Times New Roman" w:eastAsia="Times New Roman" w:hAnsi="Times New Roman"/>
+                <w:b w:val="false"/>
+                <w:bCs w:val="false"/>
+                <w:i w:val="false"/>
+                <w:iCs w:val="false"/>
+                <w:smallCaps w:val="false"/>
+                <w:color w:val="000000"/>
+                <w:sz w:val="17"/>
+                <w:szCs w:val="17"/>
+              </w:rPr>
+              <w:t xml:space="preserve">0.19</w:t>
+            </w:r>
+          </w:p>
+        </w:tc>
+        <w:tc>
+          <w:tcPr>
+            <w:tcW w:type="dxa" w:w="1890"/>
+            <w:tcBorders>
+              <w:top w:val="single" w:color="BFBFBF" w:sz="4"/>
+              <w:left w:val="single" w:color="BFBFBF" w:sz="4"/>
+              <w:bottom w:val="single" w:color="BFBFBF" w:sz="4"/>
+              <w:right w:val="single" w:color="BFBFBF" w:sz="4"/>
+            </w:tcBorders>
+            <w:shd w:fill="FFFFFF" w:val="clear"/>
+            <w:tcMar>
+              <w:top w:type="dxa" w:w="50"/>
+              <w:left w:type="dxa" w:w="70"/>
+              <w:bottom w:type="dxa" w:w="50"/>
+              <w:right w:type="dxa" w:w="70"/>
+            </w:tcMar>
+            <w:vAlign w:val="center"/>
+          </w:tcPr>
+          <w:p>
+            <w:pPr>
+              <w:spacing w:after="0" w:before="0"/>
+              <w:jc w:val="left"/>
+            </w:pPr>
+            <w:r>
+              <w:rPr>
+                <w:rFonts w:ascii="Times New Roman" w:cs="Times New Roman" w:eastAsia="Times New Roman" w:hAnsi="Times New Roman"/>
+                <w:b w:val="false"/>
+                <w:bCs w:val="false"/>
+                <w:i w:val="false"/>
+                <w:iCs w:val="false"/>
+                <w:smallCaps w:val="false"/>
+                <w:color w:val="000000"/>
+                <w:sz w:val="17"/>
+                <w:szCs w:val="17"/>
+              </w:rPr>
+              <w:t xml:space="preserve">0.00</w:t>
+            </w:r>
+          </w:p>
+        </w:tc>
+        <w:tc>
+          <w:tcPr>
+            <w:tcW w:type="dxa" w:w="1890"/>
+            <w:tcBorders>
+              <w:top w:val="single" w:color="BFBFBF" w:sz="4"/>
+              <w:left w:val="single" w:color="BFBFBF" w:sz="4"/>
+              <w:bottom w:val="single" w:color="BFBFBF" w:sz="4"/>
+              <w:right w:val="single" w:color="BFBFBF" w:sz="4"/>
+            </w:tcBorders>
+            <w:shd w:fill="FFFFFF" w:val="clear"/>
+            <w:tcMar>
+              <w:top w:type="dxa" w:w="50"/>
+              <w:left w:type="dxa" w:w="70"/>
+              <w:bottom w:type="dxa" w:w="50"/>
+              <w:right w:type="dxa" w:w="70"/>
+            </w:tcMar>
+            <w:vAlign w:val="center"/>
+          </w:tcPr>
+          <w:p>
+            <w:pPr>
+              <w:spacing w:after="0" w:before="0"/>
+              <w:jc w:val="left"/>
+            </w:pPr>
+            <w:r>
+              <w:rPr>
+                <w:rFonts w:ascii="Times New Roman" w:cs="Times New Roman" w:eastAsia="Times New Roman" w:hAnsi="Times New Roman"/>
+                <w:b w:val="false"/>
+                <w:bCs w:val="false"/>
+                <w:i w:val="false"/>
+                <w:iCs w:val="false"/>
+                <w:smallCaps w:val="false"/>
+                <w:color w:val="000000"/>
+                <w:sz w:val="17"/>
+                <w:szCs w:val="17"/>
+              </w:rPr>
+              <w:t xml:space="preserve">0.00</w:t>
+            </w:r>
+          </w:p>
+        </w:tc>
+      </w:tr>
+      <w:tr>
+        <w:trPr>
+          <w:cantSplit/>
+          <w:tblHeader w:val="false"/>
+        </w:trPr>
+        <w:tc>
+          <w:tcPr>
+            <w:tcW w:type="dxa" w:w="1800"/>
+            <w:tcBorders>
+              <w:top w:val="single" w:color="BFBFBF" w:sz="4"/>
+              <w:left w:val="single" w:color="BFBFBF" w:sz="4"/>
+              <w:bottom w:val="single" w:color="BFBFBF" w:sz="4"/>
+              <w:right w:val="single" w:color="BFBFBF" w:sz="4"/>
+            </w:tcBorders>
+            <w:shd w:fill="FFFFFF" w:val="clear"/>
+            <w:tcMar>
+              <w:top w:type="dxa" w:w="50"/>
+              <w:left w:type="dxa" w:w="70"/>
+              <w:bottom w:type="dxa" w:w="50"/>
+              <w:right w:type="dxa" w:w="70"/>
+            </w:tcMar>
+            <w:vAlign w:val="center"/>
+          </w:tcPr>
+          <w:p>
+            <w:pPr>
+              <w:spacing w:after="0" w:before="0"/>
+              <w:jc w:val="left"/>
+            </w:pPr>
+            <w:r>
+              <w:rPr>
+                <w:rFonts w:ascii="Times New Roman" w:cs="Times New Roman" w:eastAsia="Times New Roman" w:hAnsi="Times New Roman"/>
+                <w:b w:val="false"/>
+                <w:bCs w:val="false"/>
+                <w:i w:val="false"/>
+                <w:iCs w:val="false"/>
+                <w:smallCaps w:val="false"/>
+                <w:color w:val="000000"/>
+                <w:sz w:val="17"/>
+                <w:szCs w:val="17"/>
+              </w:rPr>
+              <w:t xml:space="preserve">0.8</w:t>
+            </w:r>
+          </w:p>
+        </w:tc>
+        <w:tc>
+          <w:tcPr>
+            <w:tcW w:type="dxa" w:w="1890"/>
+            <w:tcBorders>
+              <w:top w:val="single" w:color="BFBFBF" w:sz="4"/>
+              <w:left w:val="single" w:color="BFBFBF" w:sz="4"/>
+              <w:bottom w:val="single" w:color="BFBFBF" w:sz="4"/>
+              <w:right w:val="single" w:color="BFBFBF" w:sz="4"/>
+            </w:tcBorders>
+            <w:shd w:fill="FFFFFF" w:val="clear"/>
+            <w:tcMar>
+              <w:top w:type="dxa" w:w="50"/>
+              <w:left w:type="dxa" w:w="70"/>
+              <w:bottom w:type="dxa" w:w="50"/>
+              <w:right w:type="dxa" w:w="70"/>
+            </w:tcMar>
+            <w:vAlign w:val="center"/>
+          </w:tcPr>
+          <w:p>
+            <w:pPr>
+              <w:spacing w:after="0" w:before="0"/>
+              <w:jc w:val="left"/>
+            </w:pPr>
+            <w:r>
+              <w:rPr>
+                <w:rFonts w:ascii="Times New Roman" w:cs="Times New Roman" w:eastAsia="Times New Roman" w:hAnsi="Times New Roman"/>
+                <w:b w:val="false"/>
+                <w:bCs w:val="false"/>
+                <w:i w:val="false"/>
+                <w:iCs w:val="false"/>
+                <w:smallCaps w:val="false"/>
+                <w:color w:val="000000"/>
+                <w:sz w:val="17"/>
+                <w:szCs w:val="17"/>
+              </w:rPr>
+              <w:t xml:space="preserve">0.27</w:t>
+            </w:r>
+          </w:p>
+        </w:tc>
+        <w:tc>
+          <w:tcPr>
+            <w:tcW w:type="dxa" w:w="1890"/>
+            <w:tcBorders>
+              <w:top w:val="single" w:color="BFBFBF" w:sz="4"/>
+              <w:left w:val="single" w:color="BFBFBF" w:sz="4"/>
+              <w:bottom w:val="single" w:color="BFBFBF" w:sz="4"/>
+              <w:right w:val="single" w:color="BFBFBF" w:sz="4"/>
+            </w:tcBorders>
+            <w:shd w:fill="FFFFFF" w:val="clear"/>
+            <w:tcMar>
+              <w:top w:type="dxa" w:w="50"/>
+              <w:left w:type="dxa" w:w="70"/>
+              <w:bottom w:type="dxa" w:w="50"/>
+              <w:right w:type="dxa" w:w="70"/>
+            </w:tcMar>
+            <w:vAlign w:val="center"/>
+          </w:tcPr>
+          <w:p>
+            <w:pPr>
+              <w:spacing w:after="0" w:before="0"/>
+              <w:jc w:val="left"/>
+            </w:pPr>
+            <w:r>
+              <w:rPr>
+                <w:rFonts w:ascii="Times New Roman" w:cs="Times New Roman" w:eastAsia="Times New Roman" w:hAnsi="Times New Roman"/>
+                <w:b w:val="false"/>
+                <w:bCs w:val="false"/>
+                <w:i w:val="false"/>
+                <w:iCs w:val="false"/>
+                <w:smallCaps w:val="false"/>
+                <w:color w:val="000000"/>
+                <w:sz w:val="17"/>
+                <w:szCs w:val="17"/>
+              </w:rPr>
+              <w:t xml:space="preserve">0.26</w:t>
+            </w:r>
+          </w:p>
+        </w:tc>
+        <w:tc>
+          <w:tcPr>
+            <w:tcW w:type="dxa" w:w="1890"/>
+            <w:tcBorders>
+              <w:top w:val="single" w:color="BFBFBF" w:sz="4"/>
+              <w:left w:val="single" w:color="BFBFBF" w:sz="4"/>
+              <w:bottom w:val="single" w:color="BFBFBF" w:sz="4"/>
+              <w:right w:val="single" w:color="BFBFBF" w:sz="4"/>
+            </w:tcBorders>
+            <w:shd w:fill="FFFFFF" w:val="clear"/>
+            <w:tcMar>
+              <w:top w:type="dxa" w:w="50"/>
+              <w:left w:type="dxa" w:w="70"/>
+              <w:bottom w:type="dxa" w:w="50"/>
+              <w:right w:type="dxa" w:w="70"/>
+            </w:tcMar>
+            <w:vAlign w:val="center"/>
+          </w:tcPr>
+          <w:p>
+            <w:pPr>
+              <w:spacing w:after="0" w:before="0"/>
+              <w:jc w:val="left"/>
+            </w:pPr>
+            <w:r>
+              <w:rPr>
+                <w:rFonts w:ascii="Times New Roman" w:cs="Times New Roman" w:eastAsia="Times New Roman" w:hAnsi="Times New Roman"/>
+                <w:b w:val="false"/>
+                <w:bCs w:val="false"/>
+                <w:i w:val="false"/>
+                <w:iCs w:val="false"/>
+                <w:smallCaps w:val="false"/>
+                <w:color w:val="000000"/>
+                <w:sz w:val="17"/>
+                <w:szCs w:val="17"/>
+              </w:rPr>
+              <w:t xml:space="preserve">0.21</w:t>
+            </w:r>
+          </w:p>
+        </w:tc>
+        <w:tc>
+          <w:tcPr>
+            <w:tcW w:type="dxa" w:w="1890"/>
+            <w:tcBorders>
+              <w:top w:val="single" w:color="BFBFBF" w:sz="4"/>
+              <w:left w:val="single" w:color="BFBFBF" w:sz="4"/>
+              <w:bottom w:val="single" w:color="BFBFBF" w:sz="4"/>
+              <w:right w:val="single" w:color="BFBFBF" w:sz="4"/>
+            </w:tcBorders>
+            <w:shd w:fill="FFFFFF" w:val="clear"/>
+            <w:tcMar>
+              <w:top w:type="dxa" w:w="50"/>
+              <w:left w:type="dxa" w:w="70"/>
+              <w:bottom w:type="dxa" w:w="50"/>
+              <w:right w:type="dxa" w:w="70"/>
+            </w:tcMar>
+            <w:vAlign w:val="center"/>
+          </w:tcPr>
+          <w:p>
+            <w:pPr>
+              <w:spacing w:after="0" w:before="0"/>
+              <w:jc w:val="left"/>
+            </w:pPr>
+            <w:r>
+              <w:rPr>
+                <w:rFonts w:ascii="Times New Roman" w:cs="Times New Roman" w:eastAsia="Times New Roman" w:hAnsi="Times New Roman"/>
+                <w:b w:val="false"/>
+                <w:bCs w:val="false"/>
+                <w:i w:val="false"/>
+                <w:iCs w:val="false"/>
+                <w:smallCaps w:val="false"/>
+                <w:color w:val="000000"/>
+                <w:sz w:val="17"/>
+                <w:szCs w:val="17"/>
+              </w:rPr>
+              <w:t xml:space="preserve">0.20</w:t>
+            </w:r>
+          </w:p>
+        </w:tc>
+      </w:tr>
+      <w:tr>
+        <w:trPr>
+          <w:cantSplit/>
+          <w:tblHeader w:val="false"/>
+        </w:trPr>
+        <w:tc>
+          <w:tcPr>
+            <w:tcW w:type="dxa" w:w="1800"/>
+            <w:tcBorders>
+              <w:top w:val="single" w:color="BFBFBF" w:sz="4"/>
+              <w:left w:val="single" w:color="BFBFBF" w:sz="4"/>
+              <w:bottom w:val="single" w:color="BFBFBF" w:sz="4"/>
+              <w:right w:val="single" w:color="BFBFBF" w:sz="4"/>
+            </w:tcBorders>
+            <w:shd w:fill="FFFFFF" w:val="clear"/>
+            <w:tcMar>
+              <w:top w:type="dxa" w:w="50"/>
+              <w:left w:type="dxa" w:w="70"/>
+              <w:bottom w:type="dxa" w:w="50"/>
+              <w:right w:type="dxa" w:w="70"/>
+            </w:tcMar>
+            <w:vAlign w:val="center"/>
+          </w:tcPr>
+          <w:p>
+            <w:pPr>
+              <w:spacing w:after="0" w:before="0"/>
+              <w:jc w:val="left"/>
+            </w:pPr>
+            <w:r>
+              <w:rPr>
+                <w:rFonts w:ascii="Times New Roman" w:cs="Times New Roman" w:eastAsia="Times New Roman" w:hAnsi="Times New Roman"/>
+                <w:b w:val="false"/>
+                <w:bCs w:val="false"/>
+                <w:i w:val="false"/>
+                <w:iCs w:val="false"/>
+                <w:smallCaps w:val="false"/>
+                <w:color w:val="000000"/>
+                <w:sz w:val="17"/>
+                <w:szCs w:val="17"/>
+              </w:rPr>
+              <w:t xml:space="preserve">1.2</w:t>
+            </w:r>
+          </w:p>
+        </w:tc>
+        <w:tc>
+          <w:tcPr>
+            <w:tcW w:type="dxa" w:w="1890"/>
+            <w:tcBorders>
+              <w:top w:val="single" w:color="BFBFBF" w:sz="4"/>
+              <w:left w:val="single" w:color="BFBFBF" w:sz="4"/>
+              <w:bottom w:val="single" w:color="BFBFBF" w:sz="4"/>
+              <w:right w:val="single" w:color="BFBFBF" w:sz="4"/>
+            </w:tcBorders>
+            <w:shd w:fill="FFFFFF" w:val="clear"/>
+            <w:tcMar>
+              <w:top w:type="dxa" w:w="50"/>
+              <w:left w:type="dxa" w:w="70"/>
+              <w:bottom w:type="dxa" w:w="50"/>
+              <w:right w:type="dxa" w:w="70"/>
+            </w:tcMar>
+            <w:vAlign w:val="center"/>
+          </w:tcPr>
+          <w:p>
+            <w:pPr>
+              <w:spacing w:after="0" w:before="0"/>
+              <w:jc w:val="left"/>
+            </w:pPr>
+            <w:r>
+              <w:rPr>
+                <w:rFonts w:ascii="Times New Roman" w:cs="Times New Roman" w:eastAsia="Times New Roman" w:hAnsi="Times New Roman"/>
+                <w:b w:val="false"/>
+                <w:bCs w:val="false"/>
+                <w:i w:val="false"/>
+                <w:iCs w:val="false"/>
+                <w:smallCaps w:val="false"/>
+                <w:color w:val="000000"/>
+                <w:sz w:val="17"/>
+                <w:szCs w:val="17"/>
+              </w:rPr>
+              <w:t xml:space="preserve">0.31</w:t>
+            </w:r>
+          </w:p>
+        </w:tc>
+        <w:tc>
+          <w:tcPr>
+            <w:tcW w:type="dxa" w:w="1890"/>
+            <w:tcBorders>
+              <w:top w:val="single" w:color="BFBFBF" w:sz="4"/>
+              <w:left w:val="single" w:color="BFBFBF" w:sz="4"/>
+              <w:bottom w:val="single" w:color="BFBFBF" w:sz="4"/>
+              <w:right w:val="single" w:color="BFBFBF" w:sz="4"/>
+            </w:tcBorders>
+            <w:shd w:fill="FFFFFF" w:val="clear"/>
+            <w:tcMar>
+              <w:top w:type="dxa" w:w="50"/>
+              <w:left w:type="dxa" w:w="70"/>
+              <w:bottom w:type="dxa" w:w="50"/>
+              <w:right w:type="dxa" w:w="70"/>
+            </w:tcMar>
+            <w:vAlign w:val="center"/>
+          </w:tcPr>
+          <w:p>
+            <w:pPr>
+              <w:spacing w:after="0" w:before="0"/>
+              <w:jc w:val="left"/>
+            </w:pPr>
+            <w:r>
+              <w:rPr>
+                <w:rFonts w:ascii="Times New Roman" w:cs="Times New Roman" w:eastAsia="Times New Roman" w:hAnsi="Times New Roman"/>
+                <w:b w:val="false"/>
+                <w:bCs w:val="false"/>
+                <w:i w:val="false"/>
+                <w:iCs w:val="false"/>
+                <w:smallCaps w:val="false"/>
+                <w:color w:val="000000"/>
+                <w:sz w:val="17"/>
+                <w:szCs w:val="17"/>
+              </w:rPr>
+              <w:t xml:space="preserve">0.31</w:t>
+            </w:r>
+          </w:p>
+        </w:tc>
+        <w:tc>
+          <w:tcPr>
+            <w:tcW w:type="dxa" w:w="1890"/>
+            <w:tcBorders>
+              <w:top w:val="single" w:color="BFBFBF" w:sz="4"/>
+              <w:left w:val="single" w:color="BFBFBF" w:sz="4"/>
+              <w:bottom w:val="single" w:color="BFBFBF" w:sz="4"/>
+              <w:right w:val="single" w:color="BFBFBF" w:sz="4"/>
+            </w:tcBorders>
+            <w:shd w:fill="FFFFFF" w:val="clear"/>
+            <w:tcMar>
+              <w:top w:type="dxa" w:w="50"/>
+              <w:left w:type="dxa" w:w="70"/>
+              <w:bottom w:type="dxa" w:w="50"/>
+              <w:right w:type="dxa" w:w="70"/>
+            </w:tcMar>
+            <w:vAlign w:val="center"/>
+          </w:tcPr>
+          <w:p>
+            <w:pPr>
+              <w:spacing w:after="0" w:before="0"/>
+              <w:jc w:val="left"/>
+            </w:pPr>
+            <w:r>
+              <w:rPr>
+                <w:rFonts w:ascii="Times New Roman" w:cs="Times New Roman" w:eastAsia="Times New Roman" w:hAnsi="Times New Roman"/>
+                <w:b w:val="false"/>
+                <w:bCs w:val="false"/>
+                <w:i w:val="false"/>
+                <w:iCs w:val="false"/>
+                <w:smallCaps w:val="false"/>
+                <w:color w:val="000000"/>
+                <w:sz w:val="17"/>
+                <w:szCs w:val="17"/>
+              </w:rPr>
+              <w:t xml:space="preserve">0.28</w:t>
+            </w:r>
+          </w:p>
+        </w:tc>
+        <w:tc>
+          <w:tcPr>
+            <w:tcW w:type="dxa" w:w="1890"/>
+            <w:tcBorders>
+              <w:top w:val="single" w:color="BFBFBF" w:sz="4"/>
+              <w:left w:val="single" w:color="BFBFBF" w:sz="4"/>
+              <w:bottom w:val="single" w:color="BFBFBF" w:sz="4"/>
+              <w:right w:val="single" w:color="BFBFBF" w:sz="4"/>
+            </w:tcBorders>
+            <w:shd w:fill="FFFFFF" w:val="clear"/>
+            <w:tcMar>
+              <w:top w:type="dxa" w:w="50"/>
+              <w:left w:type="dxa" w:w="70"/>
+              <w:bottom w:type="dxa" w:w="50"/>
+              <w:right w:type="dxa" w:w="70"/>
+            </w:tcMar>
+            <w:vAlign w:val="center"/>
+          </w:tcPr>
+          <w:p>
+            <w:pPr>
+              <w:spacing w:after="0" w:before="0"/>
+              <w:jc w:val="left"/>
+            </w:pPr>
+            <w:r>
+              <w:rPr>
+                <w:rFonts w:ascii="Times New Roman" w:cs="Times New Roman" w:eastAsia="Times New Roman" w:hAnsi="Times New Roman"/>
+                <w:b w:val="false"/>
+                <w:bCs w:val="false"/>
+                <w:i w:val="false"/>
+                <w:iCs w:val="false"/>
+                <w:smallCaps w:val="false"/>
+                <w:color w:val="000000"/>
+                <w:sz w:val="17"/>
+                <w:szCs w:val="17"/>
+              </w:rPr>
+              <w:t xml:space="preserve">0.27</w:t>
+            </w:r>
+          </w:p>
+        </w:tc>
+      </w:tr>
+      <w:tr>
+        <w:trPr>
+          <w:cantSplit/>
+          <w:tblHeader w:val="false"/>
+        </w:trPr>
+        <w:tc>
+          <w:tcPr>
+            <w:tcW w:type="dxa" w:w="1800"/>
+            <w:tcBorders>
+              <w:top w:val="single" w:color="BFBFBF" w:sz="4"/>
+              <w:left w:val="single" w:color="BFBFBF" w:sz="4"/>
+              <w:bottom w:val="single" w:color="BFBFBF" w:sz="4"/>
+              <w:right w:val="single" w:color="BFBFBF" w:sz="4"/>
+            </w:tcBorders>
+            <w:shd w:fill="FFFFFF" w:val="clear"/>
+            <w:tcMar>
+              <w:top w:type="dxa" w:w="50"/>
+              <w:left w:type="dxa" w:w="70"/>
+              <w:bottom w:type="dxa" w:w="50"/>
+              <w:right w:type="dxa" w:w="70"/>
+            </w:tcMar>
+            <w:vAlign w:val="center"/>
+          </w:tcPr>
+          <w:p>
+            <w:pPr>
+              <w:spacing w:after="0" w:before="0"/>
+              <w:jc w:val="left"/>
+            </w:pPr>
+            <w:r>
+              <w:rPr>
+                <w:rFonts w:ascii="Times New Roman" w:cs="Times New Roman" w:eastAsia="Times New Roman" w:hAnsi="Times New Roman"/>
+                <w:b w:val="false"/>
+                <w:bCs w:val="false"/>
+                <w:i w:val="false"/>
+                <w:iCs w:val="false"/>
+                <w:smallCaps w:val="false"/>
+                <w:color w:val="000000"/>
+                <w:sz w:val="17"/>
+                <w:szCs w:val="17"/>
+              </w:rPr>
+              <w:t xml:space="preserve">2</w:t>
+            </w:r>
+          </w:p>
+        </w:tc>
+        <w:tc>
+          <w:tcPr>
+            <w:tcW w:type="dxa" w:w="1890"/>
+            <w:tcBorders>
+              <w:top w:val="single" w:color="BFBFBF" w:sz="4"/>
+              <w:left w:val="single" w:color="BFBFBF" w:sz="4"/>
+              <w:bottom w:val="single" w:color="BFBFBF" w:sz="4"/>
+              <w:right w:val="single" w:color="BFBFBF" w:sz="4"/>
+            </w:tcBorders>
+            <w:shd w:fill="FFFFFF" w:val="clear"/>
+            <w:tcMar>
+              <w:top w:type="dxa" w:w="50"/>
+              <w:left w:type="dxa" w:w="70"/>
+              <w:bottom w:type="dxa" w:w="50"/>
+              <w:right w:type="dxa" w:w="70"/>
+            </w:tcMar>
+            <w:vAlign w:val="center"/>
+          </w:tcPr>
+          <w:p>
+            <w:pPr>
+              <w:spacing w:after="0" w:before="0"/>
+              <w:jc w:val="left"/>
+            </w:pPr>
+            <w:r>
+              <w:rPr>
+                <w:rFonts w:ascii="Times New Roman" w:cs="Times New Roman" w:eastAsia="Times New Roman" w:hAnsi="Times New Roman"/>
+                <w:b w:val="false"/>
+                <w:bCs w:val="false"/>
+                <w:i w:val="false"/>
+                <w:iCs w:val="false"/>
+                <w:smallCaps w:val="false"/>
+                <w:color w:val="000000"/>
+                <w:sz w:val="17"/>
+                <w:szCs w:val="17"/>
+              </w:rPr>
+              <w:t xml:space="preserve">0.33</w:t>
+            </w:r>
+          </w:p>
+        </w:tc>
+        <w:tc>
+          <w:tcPr>
+            <w:tcW w:type="dxa" w:w="1890"/>
+            <w:tcBorders>
+              <w:top w:val="single" w:color="BFBFBF" w:sz="4"/>
+              <w:left w:val="single" w:color="BFBFBF" w:sz="4"/>
+              <w:bottom w:val="single" w:color="BFBFBF" w:sz="4"/>
+              <w:right w:val="single" w:color="BFBFBF" w:sz="4"/>
+            </w:tcBorders>
+            <w:shd w:fill="FFFFFF" w:val="clear"/>
+            <w:tcMar>
+              <w:top w:type="dxa" w:w="50"/>
+              <w:left w:type="dxa" w:w="70"/>
+              <w:bottom w:type="dxa" w:w="50"/>
+              <w:right w:type="dxa" w:w="70"/>
+            </w:tcMar>
+            <w:vAlign w:val="center"/>
+          </w:tcPr>
+          <w:p>
+            <w:pPr>
+              <w:spacing w:after="0" w:before="0"/>
+              <w:jc w:val="left"/>
+            </w:pPr>
+            <w:r>
+              <w:rPr>
+                <w:rFonts w:ascii="Times New Roman" w:cs="Times New Roman" w:eastAsia="Times New Roman" w:hAnsi="Times New Roman"/>
+                <w:b w:val="false"/>
+                <w:bCs w:val="false"/>
+                <w:i w:val="false"/>
+                <w:iCs w:val="false"/>
+                <w:smallCaps w:val="false"/>
+                <w:color w:val="000000"/>
+                <w:sz w:val="17"/>
+                <w:szCs w:val="17"/>
+              </w:rPr>
+              <w:t xml:space="preserve">0.34</w:t>
+            </w:r>
+          </w:p>
+        </w:tc>
+        <w:tc>
+          <w:tcPr>
+            <w:tcW w:type="dxa" w:w="1890"/>
+            <w:tcBorders>
+              <w:top w:val="single" w:color="BFBFBF" w:sz="4"/>
+              <w:left w:val="single" w:color="BFBFBF" w:sz="4"/>
+              <w:bottom w:val="single" w:color="BFBFBF" w:sz="4"/>
+              <w:right w:val="single" w:color="BFBFBF" w:sz="4"/>
+            </w:tcBorders>
+            <w:shd w:fill="FFFFFF" w:val="clear"/>
+            <w:tcMar>
+              <w:top w:type="dxa" w:w="50"/>
+              <w:left w:type="dxa" w:w="70"/>
+              <w:bottom w:type="dxa" w:w="50"/>
+              <w:right w:type="dxa" w:w="70"/>
+            </w:tcMar>
+            <w:vAlign w:val="center"/>
+          </w:tcPr>
+          <w:p>
+            <w:pPr>
+              <w:spacing w:after="0" w:before="0"/>
+              <w:jc w:val="left"/>
+            </w:pPr>
+            <w:r>
+              <w:rPr>
+                <w:rFonts w:ascii="Times New Roman" w:cs="Times New Roman" w:eastAsia="Times New Roman" w:hAnsi="Times New Roman"/>
+                <w:b w:val="false"/>
+                <w:bCs w:val="false"/>
+                <w:i w:val="false"/>
+                <w:iCs w:val="false"/>
+                <w:smallCaps w:val="false"/>
+                <w:color w:val="000000"/>
+                <w:sz w:val="17"/>
+                <w:szCs w:val="17"/>
+              </w:rPr>
+              <w:t xml:space="preserve">0.38</w:t>
+            </w:r>
+          </w:p>
+        </w:tc>
+        <w:tc>
+          <w:tcPr>
+            <w:tcW w:type="dxa" w:w="1890"/>
+            <w:tcBorders>
+              <w:top w:val="single" w:color="BFBFBF" w:sz="4"/>
+              <w:left w:val="single" w:color="BFBFBF" w:sz="4"/>
+              <w:bottom w:val="single" w:color="BFBFBF" w:sz="4"/>
+              <w:right w:val="single" w:color="BFBFBF" w:sz="4"/>
+            </w:tcBorders>
+            <w:shd w:fill="FFFFFF" w:val="clear"/>
+            <w:tcMar>
+              <w:top w:type="dxa" w:w="50"/>
+              <w:left w:type="dxa" w:w="70"/>
+              <w:bottom w:type="dxa" w:w="50"/>
+              <w:right w:type="dxa" w:w="70"/>
+            </w:tcMar>
+            <w:vAlign w:val="center"/>
+          </w:tcPr>
+          <w:p>
+            <w:pPr>
+              <w:spacing w:after="0" w:before="0"/>
+              <w:jc w:val="left"/>
+            </w:pPr>
+            <w:r>
+              <w:rPr>
+                <w:rFonts w:ascii="Times New Roman" w:cs="Times New Roman" w:eastAsia="Times New Roman" w:hAnsi="Times New Roman"/>
+                <w:b w:val="false"/>
+                <w:bCs w:val="false"/>
+                <w:i w:val="false"/>
+                <w:iCs w:val="false"/>
+                <w:smallCaps w:val="false"/>
+                <w:color w:val="000000"/>
+                <w:sz w:val="17"/>
+                <w:szCs w:val="17"/>
+              </w:rPr>
+              <w:t xml:space="preserve">0.29</w:t>
+            </w:r>
+          </w:p>
+        </w:tc>
+      </w:tr>
+      <w:tr>
+        <w:trPr>
+          <w:cantSplit/>
+          <w:tblHeader w:val="false"/>
+        </w:trPr>
+        <w:tc>
+          <w:tcPr>
+            <w:tcW w:type="dxa" w:w="1800"/>
+            <w:tcBorders>
+              <w:top w:val="single" w:color="BFBFBF" w:sz="4"/>
+              <w:left w:val="single" w:color="BFBFBF" w:sz="4"/>
+              <w:bottom w:val="single" w:color="BFBFBF" w:sz="4"/>
+              <w:right w:val="single" w:color="BFBFBF" w:sz="4"/>
+            </w:tcBorders>
+            <w:shd w:fill="FFFFFF" w:val="clear"/>
+            <w:tcMar>
+              <w:top w:type="dxa" w:w="50"/>
+              <w:left w:type="dxa" w:w="70"/>
+              <w:bottom w:type="dxa" w:w="50"/>
+              <w:right w:type="dxa" w:w="70"/>
+            </w:tcMar>
+            <w:vAlign w:val="center"/>
+          </w:tcPr>
+          <w:p>
+            <w:pPr>
+              <w:spacing w:after="0" w:before="0"/>
+              <w:jc w:val="left"/>
+            </w:pPr>
+            <w:r>
+              <w:rPr>
+                <w:rFonts w:ascii="Times New Roman" w:cs="Times New Roman" w:eastAsia="Times New Roman" w:hAnsi="Times New Roman"/>
+                <w:b w:val="false"/>
+                <w:bCs w:val="false"/>
+                <w:i w:val="false"/>
+                <w:iCs w:val="false"/>
+                <w:smallCaps w:val="false"/>
+                <w:color w:val="000000"/>
+                <w:sz w:val="17"/>
+                <w:szCs w:val="17"/>
+              </w:rPr>
+              <w:t xml:space="preserve">2.5</w:t>
+            </w:r>
+          </w:p>
+        </w:tc>
+        <w:tc>
+          <w:tcPr>
+            <w:tcW w:type="dxa" w:w="1890"/>
+            <w:tcBorders>
+              <w:top w:val="single" w:color="BFBFBF" w:sz="4"/>
+              <w:left w:val="single" w:color="BFBFBF" w:sz="4"/>
+              <w:bottom w:val="single" w:color="BFBFBF" w:sz="4"/>
+              <w:right w:val="single" w:color="BFBFBF" w:sz="4"/>
+            </w:tcBorders>
+            <w:shd w:fill="FFFFFF" w:val="clear"/>
+            <w:tcMar>
+              <w:top w:type="dxa" w:w="50"/>
+              <w:left w:type="dxa" w:w="70"/>
+              <w:bottom w:type="dxa" w:w="50"/>
+              <w:right w:type="dxa" w:w="70"/>
+            </w:tcMar>
+            <w:vAlign w:val="center"/>
+          </w:tcPr>
+          <w:p>
+            <w:pPr>
+              <w:spacing w:after="0" w:before="0"/>
+              <w:jc w:val="left"/>
+            </w:pPr>
+            <w:r>
+              <w:rPr>
+                <w:rFonts w:ascii="Times New Roman" w:cs="Times New Roman" w:eastAsia="Times New Roman" w:hAnsi="Times New Roman"/>
+                <w:b w:val="false"/>
+                <w:bCs w:val="false"/>
+                <w:i w:val="false"/>
+                <w:iCs w:val="false"/>
+                <w:smallCaps w:val="false"/>
+                <w:color w:val="000000"/>
+                <w:sz w:val="17"/>
+                <w:szCs w:val="17"/>
+              </w:rPr>
+              <w:t xml:space="preserve">0.24</w:t>
+            </w:r>
+          </w:p>
+        </w:tc>
+        <w:tc>
+          <w:tcPr>
+            <w:tcW w:type="dxa" w:w="1890"/>
+            <w:tcBorders>
+              <w:top w:val="single" w:color="BFBFBF" w:sz="4"/>
+              <w:left w:val="single" w:color="BFBFBF" w:sz="4"/>
+              <w:bottom w:val="single" w:color="BFBFBF" w:sz="4"/>
+              <w:right w:val="single" w:color="BFBFBF" w:sz="4"/>
+            </w:tcBorders>
+            <w:shd w:fill="FFFFFF" w:val="clear"/>
+            <w:tcMar>
+              <w:top w:type="dxa" w:w="50"/>
+              <w:left w:type="dxa" w:w="70"/>
+              <w:bottom w:type="dxa" w:w="50"/>
+              <w:right w:type="dxa" w:w="70"/>
+            </w:tcMar>
+            <w:vAlign w:val="center"/>
+          </w:tcPr>
+          <w:p>
+            <w:pPr>
+              <w:spacing w:after="0" w:before="0"/>
+              <w:jc w:val="left"/>
+            </w:pPr>
+            <w:r>
+              <w:rPr>
+                <w:rFonts w:ascii="Times New Roman" w:cs="Times New Roman" w:eastAsia="Times New Roman" w:hAnsi="Times New Roman"/>
+                <w:b w:val="false"/>
+                <w:bCs w:val="false"/>
+                <w:i w:val="false"/>
+                <w:iCs w:val="false"/>
+                <w:smallCaps w:val="false"/>
+                <w:color w:val="000000"/>
+                <w:sz w:val="17"/>
+                <w:szCs w:val="17"/>
+              </w:rPr>
+              <w:t xml:space="preserve">0.31</w:t>
+            </w:r>
+          </w:p>
+        </w:tc>
+        <w:tc>
+          <w:tcPr>
+            <w:tcW w:type="dxa" w:w="1890"/>
+            <w:tcBorders>
+              <w:top w:val="single" w:color="BFBFBF" w:sz="4"/>
+              <w:left w:val="single" w:color="BFBFBF" w:sz="4"/>
+              <w:bottom w:val="single" w:color="BFBFBF" w:sz="4"/>
+              <w:right w:val="single" w:color="BFBFBF" w:sz="4"/>
+            </w:tcBorders>
+            <w:shd w:fill="FFFFFF" w:val="clear"/>
+            <w:tcMar>
+              <w:top w:type="dxa" w:w="50"/>
+              <w:left w:type="dxa" w:w="70"/>
+              <w:bottom w:type="dxa" w:w="50"/>
+              <w:right w:type="dxa" w:w="70"/>
+            </w:tcMar>
+            <w:vAlign w:val="center"/>
+          </w:tcPr>
+          <w:p>
+            <w:pPr>
+              <w:spacing w:after="0" w:before="0"/>
+              <w:jc w:val="left"/>
+            </w:pPr>
+            <w:r>
+              <w:rPr>
+                <w:rFonts w:ascii="Times New Roman" w:cs="Times New Roman" w:eastAsia="Times New Roman" w:hAnsi="Times New Roman"/>
+                <w:b w:val="false"/>
+                <w:bCs w:val="false"/>
+                <w:i w:val="false"/>
+                <w:iCs w:val="false"/>
+                <w:smallCaps w:val="false"/>
+                <w:color w:val="000000"/>
+                <w:sz w:val="17"/>
+                <w:szCs w:val="17"/>
+              </w:rPr>
+              <w:t xml:space="preserve">0.28</w:t>
+            </w:r>
+          </w:p>
+        </w:tc>
+        <w:tc>
+          <w:tcPr>
+            <w:tcW w:type="dxa" w:w="1890"/>
+            <w:tcBorders>
+              <w:top w:val="single" w:color="BFBFBF" w:sz="4"/>
+              <w:left w:val="single" w:color="BFBFBF" w:sz="4"/>
+              <w:bottom w:val="single" w:color="BFBFBF" w:sz="4"/>
+              <w:right w:val="single" w:color="BFBFBF" w:sz="4"/>
+            </w:tcBorders>
+            <w:shd w:fill="FFFFFF" w:val="clear"/>
+            <w:tcMar>
+              <w:top w:type="dxa" w:w="50"/>
+              <w:left w:type="dxa" w:w="70"/>
+              <w:bottom w:type="dxa" w:w="50"/>
+              <w:right w:type="dxa" w:w="70"/>
+            </w:tcMar>
+            <w:vAlign w:val="center"/>
+          </w:tcPr>
+          <w:p>
+            <w:pPr>
+              <w:spacing w:after="0" w:before="0"/>
+              <w:jc w:val="left"/>
+            </w:pPr>
+            <w:r>
+              <w:rPr>
+                <w:rFonts w:ascii="Times New Roman" w:cs="Times New Roman" w:eastAsia="Times New Roman" w:hAnsi="Times New Roman"/>
+                <w:b w:val="false"/>
+                <w:bCs w:val="false"/>
+                <w:i w:val="false"/>
+                <w:iCs w:val="false"/>
+                <w:smallCaps w:val="false"/>
+                <w:color w:val="000000"/>
+                <w:sz w:val="17"/>
+                <w:szCs w:val="17"/>
+              </w:rPr>
+              <w:t xml:space="preserve">0.33</w:t>
+            </w:r>
+          </w:p>
+        </w:tc>
+      </w:tr>
+      <w:tr>
+        <w:trPr>
+          <w:cantSplit/>
+          <w:tblHeader w:val="false"/>
+        </w:trPr>
+        <w:tc>
+          <w:tcPr>
+            <w:tcW w:type="dxa" w:w="1800"/>
+            <w:tcBorders>
+              <w:top w:val="single" w:color="BFBFBF" w:sz="4"/>
+              <w:left w:val="single" w:color="BFBFBF" w:sz="4"/>
+              <w:bottom w:val="single" w:color="BFBFBF" w:sz="4"/>
+              <w:right w:val="single" w:color="BFBFBF" w:sz="4"/>
+            </w:tcBorders>
+            <w:shd w:fill="FFFFFF" w:val="clear"/>
+            <w:tcMar>
+              <w:top w:type="dxa" w:w="50"/>
+              <w:left w:type="dxa" w:w="70"/>
+              <w:bottom w:type="dxa" w:w="50"/>
+              <w:right w:type="dxa" w:w="70"/>
+            </w:tcMar>
+            <w:vAlign w:val="center"/>
+          </w:tcPr>
+          <w:p>
+            <w:pPr>
+              <w:spacing w:after="0" w:before="0"/>
+              <w:jc w:val="left"/>
+            </w:pPr>
+            <w:r>
+              <w:rPr>
+                <w:rFonts w:ascii="Times New Roman" w:cs="Times New Roman" w:eastAsia="Times New Roman" w:hAnsi="Times New Roman"/>
+                <w:b w:val="false"/>
+                <w:bCs w:val="false"/>
+                <w:i w:val="false"/>
+                <w:iCs w:val="false"/>
+                <w:smallCaps w:val="false"/>
+                <w:color w:val="000000"/>
+                <w:sz w:val="17"/>
+                <w:szCs w:val="17"/>
+              </w:rPr>
+              <w:t xml:space="preserve">3</w:t>
+            </w:r>
+          </w:p>
+        </w:tc>
+        <w:tc>
+          <w:tcPr>
+            <w:tcW w:type="dxa" w:w="1890"/>
+            <w:tcBorders>
+              <w:top w:val="single" w:color="BFBFBF" w:sz="4"/>
+              <w:left w:val="single" w:color="BFBFBF" w:sz="4"/>
+              <w:bottom w:val="single" w:color="BFBFBF" w:sz="4"/>
+              <w:right w:val="single" w:color="BFBFBF" w:sz="4"/>
+            </w:tcBorders>
+            <w:shd w:fill="FFFFFF" w:val="clear"/>
+            <w:tcMar>
+              <w:top w:type="dxa" w:w="50"/>
+              <w:left w:type="dxa" w:w="70"/>
+              <w:bottom w:type="dxa" w:w="50"/>
+              <w:right w:type="dxa" w:w="70"/>
+            </w:tcMar>
+            <w:vAlign w:val="center"/>
+          </w:tcPr>
+          <w:p>
+            <w:pPr>
+              <w:spacing w:after="0" w:before="0"/>
+              <w:jc w:val="left"/>
+            </w:pPr>
+            <w:r>
+              <w:rPr>
+                <w:rFonts w:ascii="Times New Roman" w:cs="Times New Roman" w:eastAsia="Times New Roman" w:hAnsi="Times New Roman"/>
+                <w:b w:val="false"/>
+                <w:bCs w:val="false"/>
+                <w:i w:val="false"/>
+                <w:iCs w:val="false"/>
+                <w:smallCaps w:val="false"/>
+                <w:color w:val="000000"/>
+                <w:sz w:val="17"/>
+                <w:szCs w:val="17"/>
+              </w:rPr>
+              <w:t xml:space="preserve">0.24</w:t>
+            </w:r>
+          </w:p>
+        </w:tc>
+        <w:tc>
+          <w:tcPr>
+            <w:tcW w:type="dxa" w:w="1890"/>
+            <w:tcBorders>
+              <w:top w:val="single" w:color="BFBFBF" w:sz="4"/>
+              <w:left w:val="single" w:color="BFBFBF" w:sz="4"/>
+              <w:bottom w:val="single" w:color="BFBFBF" w:sz="4"/>
+              <w:right w:val="single" w:color="BFBFBF" w:sz="4"/>
+            </w:tcBorders>
+            <w:shd w:fill="FFFFFF" w:val="clear"/>
+            <w:tcMar>
+              <w:top w:type="dxa" w:w="50"/>
+              <w:left w:type="dxa" w:w="70"/>
+              <w:bottom w:type="dxa" w:w="50"/>
+              <w:right w:type="dxa" w:w="70"/>
+            </w:tcMar>
+            <w:vAlign w:val="center"/>
+          </w:tcPr>
+          <w:p>
+            <w:pPr>
+              <w:spacing w:after="0" w:before="0"/>
+              <w:jc w:val="left"/>
+            </w:pPr>
+            <w:r>
+              <w:rPr>
+                <w:rFonts w:ascii="Times New Roman" w:cs="Times New Roman" w:eastAsia="Times New Roman" w:hAnsi="Times New Roman"/>
+                <w:b w:val="false"/>
+                <w:bCs w:val="false"/>
+                <w:i w:val="false"/>
+                <w:iCs w:val="false"/>
+                <w:smallCaps w:val="false"/>
+                <w:color w:val="000000"/>
+                <w:sz w:val="17"/>
+                <w:szCs w:val="17"/>
+              </w:rPr>
+              <w:t xml:space="preserve">0.25</w:t>
+            </w:r>
+          </w:p>
+        </w:tc>
+        <w:tc>
+          <w:tcPr>
+            <w:tcW w:type="dxa" w:w="1890"/>
+            <w:tcBorders>
+              <w:top w:val="single" w:color="BFBFBF" w:sz="4"/>
+              <w:left w:val="single" w:color="BFBFBF" w:sz="4"/>
+              <w:bottom w:val="single" w:color="BFBFBF" w:sz="4"/>
+              <w:right w:val="single" w:color="BFBFBF" w:sz="4"/>
+            </w:tcBorders>
+            <w:shd w:fill="FFFFFF" w:val="clear"/>
+            <w:tcMar>
+              <w:top w:type="dxa" w:w="50"/>
+              <w:left w:type="dxa" w:w="70"/>
+              <w:bottom w:type="dxa" w:w="50"/>
+              <w:right w:type="dxa" w:w="70"/>
+            </w:tcMar>
+            <w:vAlign w:val="center"/>
+          </w:tcPr>
+          <w:p>
+            <w:pPr>
+              <w:spacing w:after="0" w:before="0"/>
+              <w:jc w:val="left"/>
+            </w:pPr>
+            <w:r>
+              <w:rPr>
+                <w:rFonts w:ascii="Times New Roman" w:cs="Times New Roman" w:eastAsia="Times New Roman" w:hAnsi="Times New Roman"/>
+                <w:b w:val="false"/>
+                <w:bCs w:val="false"/>
+                <w:i w:val="false"/>
+                <w:iCs w:val="false"/>
+                <w:smallCaps w:val="false"/>
+                <w:color w:val="000000"/>
+                <w:sz w:val="17"/>
+                <w:szCs w:val="17"/>
+              </w:rPr>
+              <w:t xml:space="preserve">0.27</w:t>
+            </w:r>
+          </w:p>
+        </w:tc>
+        <w:tc>
+          <w:tcPr>
+            <w:tcW w:type="dxa" w:w="1890"/>
+            <w:tcBorders>
+              <w:top w:val="single" w:color="BFBFBF" w:sz="4"/>
+              <w:left w:val="single" w:color="BFBFBF" w:sz="4"/>
+              <w:bottom w:val="single" w:color="BFBFBF" w:sz="4"/>
+              <w:right w:val="single" w:color="BFBFBF" w:sz="4"/>
+            </w:tcBorders>
+            <w:shd w:fill="FFFFFF" w:val="clear"/>
+            <w:tcMar>
+              <w:top w:type="dxa" w:w="50"/>
+              <w:left w:type="dxa" w:w="70"/>
+              <w:bottom w:type="dxa" w:w="50"/>
+              <w:right w:type="dxa" w:w="70"/>
+            </w:tcMar>
+            <w:vAlign w:val="center"/>
+          </w:tcPr>
+          <w:p>
+            <w:pPr>
+              <w:spacing w:after="0" w:before="0"/>
+              <w:jc w:val="left"/>
+            </w:pPr>
+            <w:r>
+              <w:rPr>
+                <w:rFonts w:ascii="Times New Roman" w:cs="Times New Roman" w:eastAsia="Times New Roman" w:hAnsi="Times New Roman"/>
+                <w:b w:val="false"/>
+                <w:bCs w:val="false"/>
+                <w:i w:val="false"/>
+                <w:iCs w:val="false"/>
+                <w:smallCaps w:val="false"/>
+                <w:color w:val="000000"/>
+                <w:sz w:val="17"/>
+                <w:szCs w:val="17"/>
+              </w:rPr>
+              <w:t xml:space="preserve">0.23</w:t>
+            </w:r>
+          </w:p>
+        </w:tc>
+      </w:tr>
+      <w:tr>
+        <w:trPr>
+          <w:cantSplit/>
+          <w:tblHeader w:val="false"/>
+        </w:trPr>
+        <w:tc>
+          <w:tcPr>
+            <w:tcW w:type="dxa" w:w="1800"/>
+            <w:tcBorders>
+              <w:top w:val="single" w:color="BFBFBF" w:sz="4"/>
+              <w:left w:val="single" w:color="BFBFBF" w:sz="4"/>
+              <w:bottom w:val="single" w:color="BFBFBF" w:sz="4"/>
+              <w:right w:val="single" w:color="BFBFBF" w:sz="4"/>
+            </w:tcBorders>
+            <w:shd w:fill="FFFFFF" w:val="clear"/>
+            <w:tcMar>
+              <w:top w:type="dxa" w:w="50"/>
+              <w:left w:type="dxa" w:w="70"/>
+              <w:bottom w:type="dxa" w:w="50"/>
+              <w:right w:type="dxa" w:w="70"/>
+            </w:tcMar>
+            <w:vAlign w:val="center"/>
+          </w:tcPr>
+          <w:p>
+            <w:pPr>
+              <w:spacing w:after="0" w:before="0"/>
+              <w:jc w:val="left"/>
+            </w:pPr>
+            <w:r>
+              <w:rPr>
+                <w:rFonts w:ascii="Times New Roman" w:cs="Times New Roman" w:eastAsia="Times New Roman" w:hAnsi="Times New Roman"/>
+                <w:b w:val="false"/>
+                <w:bCs w:val="false"/>
+                <w:i w:val="false"/>
+                <w:iCs w:val="false"/>
+                <w:smallCaps w:val="false"/>
+                <w:color w:val="000000"/>
+                <w:sz w:val="17"/>
+                <w:szCs w:val="17"/>
+              </w:rPr>
+              <w:t xml:space="preserve">5</w:t>
+            </w:r>
+          </w:p>
+        </w:tc>
+        <w:tc>
+          <w:tcPr>
+            <w:tcW w:type="dxa" w:w="1890"/>
+            <w:tcBorders>
+              <w:top w:val="single" w:color="BFBFBF" w:sz="4"/>
+              <w:left w:val="single" w:color="BFBFBF" w:sz="4"/>
+              <w:bottom w:val="single" w:color="BFBFBF" w:sz="4"/>
+              <w:right w:val="single" w:color="BFBFBF" w:sz="4"/>
+            </w:tcBorders>
+            <w:shd w:fill="FFFFFF" w:val="clear"/>
+            <w:tcMar>
+              <w:top w:type="dxa" w:w="50"/>
+              <w:left w:type="dxa" w:w="70"/>
+              <w:bottom w:type="dxa" w:w="50"/>
+              <w:right w:type="dxa" w:w="70"/>
+            </w:tcMar>
+            <w:vAlign w:val="center"/>
+          </w:tcPr>
+          <w:p>
+            <w:pPr>
+              <w:spacing w:after="0" w:before="0"/>
+              <w:jc w:val="left"/>
+            </w:pPr>
+            <w:r>
+              <w:rPr>
+                <w:rFonts w:ascii="Times New Roman" w:cs="Times New Roman" w:eastAsia="Times New Roman" w:hAnsi="Times New Roman"/>
+                <w:b w:val="false"/>
+                <w:bCs w:val="false"/>
+                <w:i w:val="false"/>
+                <w:iCs w:val="false"/>
+                <w:smallCaps w:val="false"/>
+                <w:color w:val="000000"/>
+                <w:sz w:val="17"/>
+                <w:szCs w:val="17"/>
+              </w:rPr>
+              <w:t xml:space="preserve">0.12</w:t>
+            </w:r>
+          </w:p>
+        </w:tc>
+        <w:tc>
+          <w:tcPr>
+            <w:tcW w:type="dxa" w:w="1890"/>
+            <w:tcBorders>
+              <w:top w:val="single" w:color="BFBFBF" w:sz="4"/>
+              <w:left w:val="single" w:color="BFBFBF" w:sz="4"/>
+              <w:bottom w:val="single" w:color="BFBFBF" w:sz="4"/>
+              <w:right w:val="single" w:color="BFBFBF" w:sz="4"/>
+            </w:tcBorders>
+            <w:shd w:fill="FFFFFF" w:val="clear"/>
+            <w:tcMar>
+              <w:top w:type="dxa" w:w="50"/>
+              <w:left w:type="dxa" w:w="70"/>
+              <w:bottom w:type="dxa" w:w="50"/>
+              <w:right w:type="dxa" w:w="70"/>
+            </w:tcMar>
+            <w:vAlign w:val="center"/>
+          </w:tcPr>
+          <w:p>
+            <w:pPr>
+              <w:spacing w:after="0" w:before="0"/>
+              <w:jc w:val="left"/>
+            </w:pPr>
+            <w:r>
+              <w:rPr>
+                <w:rFonts w:ascii="Times New Roman" w:cs="Times New Roman" w:eastAsia="Times New Roman" w:hAnsi="Times New Roman"/>
+                <w:b w:val="false"/>
+                <w:bCs w:val="false"/>
+                <w:i w:val="false"/>
+                <w:iCs w:val="false"/>
+                <w:smallCaps w:val="false"/>
+                <w:color w:val="000000"/>
+                <w:sz w:val="17"/>
+                <w:szCs w:val="17"/>
+              </w:rPr>
+              <w:t xml:space="preserve">0.08</w:t>
+            </w:r>
+          </w:p>
+        </w:tc>
+        <w:tc>
+          <w:tcPr>
+            <w:tcW w:type="dxa" w:w="1890"/>
+            <w:tcBorders>
+              <w:top w:val="single" w:color="BFBFBF" w:sz="4"/>
+              <w:left w:val="single" w:color="BFBFBF" w:sz="4"/>
+              <w:bottom w:val="single" w:color="BFBFBF" w:sz="4"/>
+              <w:right w:val="single" w:color="BFBFBF" w:sz="4"/>
+            </w:tcBorders>
+            <w:shd w:fill="FFFFFF" w:val="clear"/>
+            <w:tcMar>
+              <w:top w:type="dxa" w:w="50"/>
+              <w:left w:type="dxa" w:w="70"/>
+              <w:bottom w:type="dxa" w:w="50"/>
+              <w:right w:type="dxa" w:w="70"/>
+            </w:tcMar>
+            <w:vAlign w:val="center"/>
+          </w:tcPr>
+          <w:p>
+            <w:pPr>
+              <w:spacing w:after="0" w:before="0"/>
+              <w:jc w:val="left"/>
+            </w:pPr>
+            <w:r>
+              <w:rPr>
+                <w:rFonts w:ascii="Times New Roman" w:cs="Times New Roman" w:eastAsia="Times New Roman" w:hAnsi="Times New Roman"/>
+                <w:b w:val="false"/>
+                <w:bCs w:val="false"/>
+                <w:i w:val="false"/>
+                <w:iCs w:val="false"/>
+                <w:smallCaps w:val="false"/>
+                <w:color w:val="000000"/>
+                <w:sz w:val="17"/>
+                <w:szCs w:val="17"/>
+              </w:rPr>
+              <w:t xml:space="preserve">0.07</w:t>
+            </w:r>
+          </w:p>
+        </w:tc>
+        <w:tc>
+          <w:tcPr>
+            <w:tcW w:type="dxa" w:w="1890"/>
+            <w:tcBorders>
+              <w:top w:val="single" w:color="BFBFBF" w:sz="4"/>
+              <w:left w:val="single" w:color="BFBFBF" w:sz="4"/>
+              <w:bottom w:val="single" w:color="BFBFBF" w:sz="4"/>
+              <w:right w:val="single" w:color="BFBFBF" w:sz="4"/>
+            </w:tcBorders>
+            <w:shd w:fill="FFFFFF" w:val="clear"/>
+            <w:tcMar>
+              <w:top w:type="dxa" w:w="50"/>
+              <w:left w:type="dxa" w:w="70"/>
+              <w:bottom w:type="dxa" w:w="50"/>
+              <w:right w:type="dxa" w:w="70"/>
+            </w:tcMar>
+            <w:vAlign w:val="center"/>
+          </w:tcPr>
+          <w:p>
+            <w:pPr>
+              <w:spacing w:after="0" w:before="0"/>
+              <w:jc w:val="left"/>
+            </w:pPr>
+            <w:r>
+              <w:rPr>
+                <w:rFonts w:ascii="Times New Roman" w:cs="Times New Roman" w:eastAsia="Times New Roman" w:hAnsi="Times New Roman"/>
+                <w:b w:val="false"/>
+                <w:bCs w:val="false"/>
+                <w:i w:val="false"/>
+                <w:iCs w:val="false"/>
+                <w:smallCaps w:val="false"/>
+                <w:color w:val="000000"/>
+                <w:sz w:val="17"/>
+                <w:szCs w:val="17"/>
+              </w:rPr>
+              <w:t xml:space="preserve">0.12</w:t>
+            </w:r>
+          </w:p>
+        </w:tc>
+      </w:tr>
+    </w:tbl>
+    <w:p>
+      <w:pPr>
+        <w:spacing w:after="160" w:before="0" w:line="276"/>
+        <w:jc w:val="both"/>
+      </w:pPr>
+      <w:r>
+        <w:rPr>
+          <w:rFonts w:ascii="Times New Roman" w:cs="Times New Roman" w:eastAsia="Times New Roman" w:hAnsi="Times New Roman"/>
+          <w:b w:val="false"/>
+          <w:bCs w:val="false"/>
+          <w:i w:val="false"/>
+          <w:iCs w:val="false"/>
+          <w:smallCaps w:val="false"/>
+          <w:color w:val="000000"/>
+          <w:sz w:val="22"/>
+          <w:szCs w:val="22"/>
+        </w:rPr>
+        <w:t xml:space="preserve">Accuracy rises with T from its low-temperature value and then falls for all four values of m, so an inverted-U appears (Table 11), but the mechanism differs from the Qwen runs. At m = 48 and 64 the agent repeats the planted letter in nearly every trajectory at T = 0.15 (lock-in 0.99 and 1.00, accuracy 0.00), accuracy peaks at 0.38 (T = 2.0) and 0.33 (T = 2.5), and it falls to 0.07 and 0.12 at T = 5.0. At m = 24 and 32 the model leaves the planted letter at low T but then repeats the next letter instead (repetition 0.83 and 0.81, accuracy 0.17 and 0.19 at T = 0.15). The lock is therefore a general repetition habit and not attachment to the planted token. These cells also peak, at 0.33 and 0.34 (T = 2.0). Strict recovery is at most 0.03 in every clean-prompt planted cell, and no peak accuracy reaches 0.40.</w:t>
       </w:r>
     </w:p>
     <w:p>
@@ -17637,7 +19304,2595 @@
           <w:sz w:val="22"/>
           <w:szCs w:val="22"/>
         </w:rPr>
-        <w:t xml:space="preserve">Two statements are not supported. Proposition 3 receives no support, because contamination leaves Teff at nominal T on both larger models and changes lock-in only in one 7B cell. And the inverted-U is a conditional result: it is absent from the three 135M experiments, where the attractor was too weak or too strong, and its peak on both larger models sits at T ≈ 2 to 2.5, well above the usual decoding range. Accuracy at the peak is below 0.50 and strict recovery below 0.20, so no practitioner would choose such a temperature to repair a locked agent. The result supports the structure of the prediction, not a prescription. Teff is also weakly identified when the reference is saturated, which includes the clean cells at low T. The estimate then sits at the lower edge of the search grid, and the small clean values reported for the 135M model at T = 0.15 may reflect the same limit.</w:t>
+        <w:t xml:space="preserve">Pressure did not raise Teff on this model (Table 12, m = 48). At T = 0.8, Teff − T is −0.40 under pressure, −0.36 under contamination, and −0.35 under both, against −0.08 in the clean cell, while lock-in rises from 0.59 to 0.83 to 0.84. The choices are therefore more concentrated than nominal T implies, which is the opposite sign to the lift on the Qwen models. At T = 2.0 Teff stays within 0.3 of nominal T in every condition, and accuracy is 0.23 to 0.32 against 0.38 clean. Proposition 1 as stated, a rise of Teff above nominal T under pressure, is thus not general across model families, and contamination again shows no Teff effect.</w:t>
+      </w:r>
+    </w:p>
+    <w:p>
+      <w:pPr>
+        <w:spacing w:after="80" w:before="160"/>
+      </w:pPr>
+      <w:r>
+        <w:rPr>
+          <w:rFonts w:ascii="Times New Roman" w:cs="Times New Roman" w:eastAsia="Times New Roman" w:hAnsi="Times New Roman"/>
+          <w:b w:val="false"/>
+          <w:bCs w:val="false"/>
+          <w:i/>
+          <w:iCs/>
+          <w:smallCaps w:val="false"/>
+          <w:color w:val="000000"/>
+          <w:sz w:val="20"/>
+          <w:szCs w:val="20"/>
+        </w:rPr>
+        <w:t xml:space="preserve">Table 12. Stage 5, planted attractor m = 48, by prompt condition (clean cells: 60 trajectories; others: 30).</w:t>
+      </w:r>
+    </w:p>
+    <w:tbl>
+      <w:tblPr>
+        <w:tblW w:type="dxa" w:w="9360"/>
+        <w:tblBorders>
+          <w:top w:val="single" w:color="auto" w:sz="4"/>
+          <w:left w:val="single" w:color="auto" w:sz="4"/>
+          <w:bottom w:val="single" w:color="auto" w:sz="4"/>
+          <w:right w:val="single" w:color="auto" w:sz="4"/>
+          <w:insideH w:val="single" w:color="auto" w:sz="4"/>
+          <w:insideV w:val="single" w:color="auto" w:sz="4"/>
+        </w:tblBorders>
+      </w:tblPr>
+      <w:tblGrid>
+        <w:gridCol w:w="2760"/>
+        <w:gridCol w:w="1100"/>
+        <w:gridCol w:w="1100"/>
+        <w:gridCol w:w="1100"/>
+        <w:gridCol w:w="1100"/>
+        <w:gridCol w:w="1100"/>
+        <w:gridCol w:w="1100"/>
+      </w:tblGrid>
+      <w:tr>
+        <w:trPr>
+          <w:cantSplit/>
+          <w:tblHeader/>
+        </w:trPr>
+        <w:tc>
+          <w:tcPr>
+            <w:tcW w:type="dxa" w:w="2760"/>
+            <w:tcBorders>
+              <w:top w:val="single" w:color="BFBFBF" w:sz="4"/>
+              <w:left w:val="single" w:color="BFBFBF" w:sz="4"/>
+              <w:bottom w:val="single" w:color="BFBFBF" w:sz="4"/>
+              <w:right w:val="single" w:color="BFBFBF" w:sz="4"/>
+            </w:tcBorders>
+            <w:shd w:fill="E7EEF5" w:val="clear"/>
+            <w:tcMar>
+              <w:top w:type="dxa" w:w="50"/>
+              <w:left w:type="dxa" w:w="70"/>
+              <w:bottom w:type="dxa" w:w="50"/>
+              <w:right w:type="dxa" w:w="70"/>
+            </w:tcMar>
+            <w:vAlign w:val="center"/>
+          </w:tcPr>
+          <w:p>
+            <w:pPr>
+              <w:spacing w:after="0" w:before="0"/>
+              <w:jc w:val="left"/>
+            </w:pPr>
+            <w:r>
+              <w:rPr>
+                <w:rFonts w:ascii="Times New Roman" w:cs="Times New Roman" w:eastAsia="Times New Roman" w:hAnsi="Times New Roman"/>
+                <w:b/>
+                <w:bCs/>
+                <w:i w:val="false"/>
+                <w:iCs w:val="false"/>
+                <w:smallCaps w:val="false"/>
+                <w:color w:val="000000"/>
+                <w:sz w:val="17"/>
+                <w:szCs w:val="17"/>
+              </w:rPr>
+              <w:t xml:space="preserve">Condition</w:t>
+            </w:r>
+          </w:p>
+        </w:tc>
+        <w:tc>
+          <w:tcPr>
+            <w:tcW w:type="dxa" w:w="1100"/>
+            <w:tcBorders>
+              <w:top w:val="single" w:color="BFBFBF" w:sz="4"/>
+              <w:left w:val="single" w:color="BFBFBF" w:sz="4"/>
+              <w:bottom w:val="single" w:color="BFBFBF" w:sz="4"/>
+              <w:right w:val="single" w:color="BFBFBF" w:sz="4"/>
+            </w:tcBorders>
+            <w:shd w:fill="E7EEF5" w:val="clear"/>
+            <w:tcMar>
+              <w:top w:type="dxa" w:w="50"/>
+              <w:left w:type="dxa" w:w="70"/>
+              <w:bottom w:type="dxa" w:w="50"/>
+              <w:right w:type="dxa" w:w="70"/>
+            </w:tcMar>
+            <w:vAlign w:val="center"/>
+          </w:tcPr>
+          <w:p>
+            <w:pPr>
+              <w:spacing w:after="0" w:before="0"/>
+              <w:jc w:val="left"/>
+            </w:pPr>
+            <w:r>
+              <w:rPr>
+                <w:rFonts w:ascii="Times New Roman" w:cs="Times New Roman" w:eastAsia="Times New Roman" w:hAnsi="Times New Roman"/>
+                <w:b/>
+                <w:bCs/>
+                <w:i w:val="false"/>
+                <w:iCs w:val="false"/>
+                <w:smallCaps w:val="false"/>
+                <w:color w:val="000000"/>
+                <w:sz w:val="17"/>
+                <w:szCs w:val="17"/>
+              </w:rPr>
+              <w:t xml:space="preserve">Acc.</w:t>
+            </w:r>
+          </w:p>
+        </w:tc>
+        <w:tc>
+          <w:tcPr>
+            <w:tcW w:type="dxa" w:w="1100"/>
+            <w:tcBorders>
+              <w:top w:val="single" w:color="BFBFBF" w:sz="4"/>
+              <w:left w:val="single" w:color="BFBFBF" w:sz="4"/>
+              <w:bottom w:val="single" w:color="BFBFBF" w:sz="4"/>
+              <w:right w:val="single" w:color="BFBFBF" w:sz="4"/>
+            </w:tcBorders>
+            <w:shd w:fill="E7EEF5" w:val="clear"/>
+            <w:tcMar>
+              <w:top w:type="dxa" w:w="50"/>
+              <w:left w:type="dxa" w:w="70"/>
+              <w:bottom w:type="dxa" w:w="50"/>
+              <w:right w:type="dxa" w:w="70"/>
+            </w:tcMar>
+            <w:vAlign w:val="center"/>
+          </w:tcPr>
+          <w:p>
+            <w:pPr>
+              <w:spacing w:after="0" w:before="0"/>
+              <w:jc w:val="left"/>
+            </w:pPr>
+            <w:r>
+              <w:rPr>
+                <w:rFonts w:ascii="Times New Roman" w:cs="Times New Roman" w:eastAsia="Times New Roman" w:hAnsi="Times New Roman"/>
+                <w:b/>
+                <w:bCs/>
+                <w:i w:val="false"/>
+                <w:iCs w:val="false"/>
+                <w:smallCaps w:val="false"/>
+                <w:color w:val="000000"/>
+                <w:sz w:val="17"/>
+                <w:szCs w:val="17"/>
+              </w:rPr>
+              <w:t xml:space="preserve">Strict</w:t>
+            </w:r>
+          </w:p>
+        </w:tc>
+        <w:tc>
+          <w:tcPr>
+            <w:tcW w:type="dxa" w:w="1100"/>
+            <w:tcBorders>
+              <w:top w:val="single" w:color="BFBFBF" w:sz="4"/>
+              <w:left w:val="single" w:color="BFBFBF" w:sz="4"/>
+              <w:bottom w:val="single" w:color="BFBFBF" w:sz="4"/>
+              <w:right w:val="single" w:color="BFBFBF" w:sz="4"/>
+            </w:tcBorders>
+            <w:shd w:fill="E7EEF5" w:val="clear"/>
+            <w:tcMar>
+              <w:top w:type="dxa" w:w="50"/>
+              <w:left w:type="dxa" w:w="70"/>
+              <w:bottom w:type="dxa" w:w="50"/>
+              <w:right w:type="dxa" w:w="70"/>
+            </w:tcMar>
+            <w:vAlign w:val="center"/>
+          </w:tcPr>
+          <w:p>
+            <w:pPr>
+              <w:spacing w:after="0" w:before="0"/>
+              <w:jc w:val="left"/>
+            </w:pPr>
+            <w:r>
+              <w:rPr>
+                <w:rFonts w:ascii="Times New Roman" w:cs="Times New Roman" w:eastAsia="Times New Roman" w:hAnsi="Times New Roman"/>
+                <w:b/>
+                <w:bCs/>
+                <w:i w:val="false"/>
+                <w:iCs w:val="false"/>
+                <w:smallCaps w:val="false"/>
+                <w:color w:val="000000"/>
+                <w:sz w:val="17"/>
+                <w:szCs w:val="17"/>
+              </w:rPr>
+              <w:t xml:space="preserve">Lock-in</w:t>
+            </w:r>
+          </w:p>
+        </w:tc>
+        <w:tc>
+          <w:tcPr>
+            <w:tcW w:type="dxa" w:w="1100"/>
+            <w:tcBorders>
+              <w:top w:val="single" w:color="BFBFBF" w:sz="4"/>
+              <w:left w:val="single" w:color="BFBFBF" w:sz="4"/>
+              <w:bottom w:val="single" w:color="BFBFBF" w:sz="4"/>
+              <w:right w:val="single" w:color="BFBFBF" w:sz="4"/>
+            </w:tcBorders>
+            <w:shd w:fill="E7EEF5" w:val="clear"/>
+            <w:tcMar>
+              <w:top w:type="dxa" w:w="50"/>
+              <w:left w:type="dxa" w:w="70"/>
+              <w:bottom w:type="dxa" w:w="50"/>
+              <w:right w:type="dxa" w:w="70"/>
+            </w:tcMar>
+            <w:vAlign w:val="center"/>
+          </w:tcPr>
+          <w:p>
+            <w:pPr>
+              <w:spacing w:after="0" w:before="0"/>
+              <w:jc w:val="left"/>
+            </w:pPr>
+            <w:r>
+              <w:rPr>
+                <w:rFonts w:ascii="Times New Roman" w:cs="Times New Roman" w:eastAsia="Times New Roman" w:hAnsi="Times New Roman"/>
+                <w:b/>
+                <w:bCs/>
+                <w:i w:val="false"/>
+                <w:iCs w:val="false"/>
+                <w:smallCaps w:val="false"/>
+                <w:color w:val="000000"/>
+                <w:sz w:val="17"/>
+                <w:szCs w:val="17"/>
+              </w:rPr>
+              <w:t xml:space="preserve">Repetition</w:t>
+            </w:r>
+          </w:p>
+        </w:tc>
+        <w:tc>
+          <w:tcPr>
+            <w:tcW w:type="dxa" w:w="1100"/>
+            <w:tcBorders>
+              <w:top w:val="single" w:color="BFBFBF" w:sz="4"/>
+              <w:left w:val="single" w:color="BFBFBF" w:sz="4"/>
+              <w:bottom w:val="single" w:color="BFBFBF" w:sz="4"/>
+              <w:right w:val="single" w:color="BFBFBF" w:sz="4"/>
+            </w:tcBorders>
+            <w:shd w:fill="E7EEF5" w:val="clear"/>
+            <w:tcMar>
+              <w:top w:type="dxa" w:w="50"/>
+              <w:left w:type="dxa" w:w="70"/>
+              <w:bottom w:type="dxa" w:w="50"/>
+              <w:right w:type="dxa" w:w="70"/>
+            </w:tcMar>
+            <w:vAlign w:val="center"/>
+          </w:tcPr>
+          <w:p>
+            <w:pPr>
+              <w:spacing w:after="0" w:before="0"/>
+              <w:jc w:val="left"/>
+            </w:pPr>
+            <w:r>
+              <w:rPr>
+                <w:rFonts w:ascii="Times New Roman" w:cs="Times New Roman" w:eastAsia="Times New Roman" w:hAnsi="Times New Roman"/>
+                <w:b/>
+                <w:bCs/>
+                <w:i w:val="false"/>
+                <w:iCs w:val="false"/>
+                <w:smallCaps w:val="false"/>
+                <w:color w:val="000000"/>
+                <w:sz w:val="17"/>
+                <w:szCs w:val="17"/>
+              </w:rPr>
+              <w:t xml:space="preserve">Teff</w:t>
+            </w:r>
+          </w:p>
+        </w:tc>
+        <w:tc>
+          <w:tcPr>
+            <w:tcW w:type="dxa" w:w="1100"/>
+            <w:tcBorders>
+              <w:top w:val="single" w:color="BFBFBF" w:sz="4"/>
+              <w:left w:val="single" w:color="BFBFBF" w:sz="4"/>
+              <w:bottom w:val="single" w:color="BFBFBF" w:sz="4"/>
+              <w:right w:val="single" w:color="BFBFBF" w:sz="4"/>
+            </w:tcBorders>
+            <w:shd w:fill="E7EEF5" w:val="clear"/>
+            <w:tcMar>
+              <w:top w:type="dxa" w:w="50"/>
+              <w:left w:type="dxa" w:w="70"/>
+              <w:bottom w:type="dxa" w:w="50"/>
+              <w:right w:type="dxa" w:w="70"/>
+            </w:tcMar>
+            <w:vAlign w:val="center"/>
+          </w:tcPr>
+          <w:p>
+            <w:pPr>
+              <w:spacing w:after="0" w:before="0"/>
+              <w:jc w:val="left"/>
+            </w:pPr>
+            <w:r>
+              <w:rPr>
+                <w:rFonts w:ascii="Times New Roman" w:cs="Times New Roman" w:eastAsia="Times New Roman" w:hAnsi="Times New Roman"/>
+                <w:b/>
+                <w:bCs/>
+                <w:i w:val="false"/>
+                <w:iCs w:val="false"/>
+                <w:smallCaps w:val="false"/>
+                <w:color w:val="000000"/>
+                <w:sz w:val="17"/>
+                <w:szCs w:val="17"/>
+              </w:rPr>
+              <w:t xml:space="preserve">Teff − T</w:t>
+            </w:r>
+          </w:p>
+        </w:tc>
+      </w:tr>
+      <w:tr>
+        <w:trPr>
+          <w:cantSplit/>
+          <w:tblHeader w:val="false"/>
+        </w:trPr>
+        <w:tc>
+          <w:tcPr>
+            <w:tcW w:type="dxa" w:w="2760"/>
+            <w:tcBorders>
+              <w:top w:val="single" w:color="BFBFBF" w:sz="4"/>
+              <w:left w:val="single" w:color="BFBFBF" w:sz="4"/>
+              <w:bottom w:val="single" w:color="BFBFBF" w:sz="4"/>
+              <w:right w:val="single" w:color="BFBFBF" w:sz="4"/>
+            </w:tcBorders>
+            <w:shd w:fill="FFFFFF" w:val="clear"/>
+            <w:tcMar>
+              <w:top w:type="dxa" w:w="50"/>
+              <w:left w:type="dxa" w:w="70"/>
+              <w:bottom w:type="dxa" w:w="50"/>
+              <w:right w:type="dxa" w:w="70"/>
+            </w:tcMar>
+            <w:vAlign w:val="center"/>
+          </w:tcPr>
+          <w:p>
+            <w:pPr>
+              <w:spacing w:after="0" w:before="0"/>
+              <w:jc w:val="left"/>
+            </w:pPr>
+            <w:r>
+              <w:rPr>
+                <w:rFonts w:ascii="Times New Roman" w:cs="Times New Roman" w:eastAsia="Times New Roman" w:hAnsi="Times New Roman"/>
+                <w:b w:val="false"/>
+                <w:bCs w:val="false"/>
+                <w:i w:val="false"/>
+                <w:iCs w:val="false"/>
+                <w:smallCaps w:val="false"/>
+                <w:color w:val="000000"/>
+                <w:sz w:val="17"/>
+                <w:szCs w:val="17"/>
+              </w:rPr>
+              <w:t xml:space="preserve">T = 0.8, clean</w:t>
+            </w:r>
+          </w:p>
+        </w:tc>
+        <w:tc>
+          <w:tcPr>
+            <w:tcW w:type="dxa" w:w="1100"/>
+            <w:tcBorders>
+              <w:top w:val="single" w:color="BFBFBF" w:sz="4"/>
+              <w:left w:val="single" w:color="BFBFBF" w:sz="4"/>
+              <w:bottom w:val="single" w:color="BFBFBF" w:sz="4"/>
+              <w:right w:val="single" w:color="BFBFBF" w:sz="4"/>
+            </w:tcBorders>
+            <w:shd w:fill="FFFFFF" w:val="clear"/>
+            <w:tcMar>
+              <w:top w:type="dxa" w:w="50"/>
+              <w:left w:type="dxa" w:w="70"/>
+              <w:bottom w:type="dxa" w:w="50"/>
+              <w:right w:type="dxa" w:w="70"/>
+            </w:tcMar>
+            <w:vAlign w:val="center"/>
+          </w:tcPr>
+          <w:p>
+            <w:pPr>
+              <w:spacing w:after="0" w:before="0"/>
+              <w:jc w:val="left"/>
+            </w:pPr>
+            <w:r>
+              <w:rPr>
+                <w:rFonts w:ascii="Times New Roman" w:cs="Times New Roman" w:eastAsia="Times New Roman" w:hAnsi="Times New Roman"/>
+                <w:b w:val="false"/>
+                <w:bCs w:val="false"/>
+                <w:i w:val="false"/>
+                <w:iCs w:val="false"/>
+                <w:smallCaps w:val="false"/>
+                <w:color w:val="000000"/>
+                <w:sz w:val="17"/>
+                <w:szCs w:val="17"/>
+              </w:rPr>
+              <w:t xml:space="preserve">0.21</w:t>
+            </w:r>
+          </w:p>
+        </w:tc>
+        <w:tc>
+          <w:tcPr>
+            <w:tcW w:type="dxa" w:w="1100"/>
+            <w:tcBorders>
+              <w:top w:val="single" w:color="BFBFBF" w:sz="4"/>
+              <w:left w:val="single" w:color="BFBFBF" w:sz="4"/>
+              <w:bottom w:val="single" w:color="BFBFBF" w:sz="4"/>
+              <w:right w:val="single" w:color="BFBFBF" w:sz="4"/>
+            </w:tcBorders>
+            <w:shd w:fill="FFFFFF" w:val="clear"/>
+            <w:tcMar>
+              <w:top w:type="dxa" w:w="50"/>
+              <w:left w:type="dxa" w:w="70"/>
+              <w:bottom w:type="dxa" w:w="50"/>
+              <w:right w:type="dxa" w:w="70"/>
+            </w:tcMar>
+            <w:vAlign w:val="center"/>
+          </w:tcPr>
+          <w:p>
+            <w:pPr>
+              <w:spacing w:after="0" w:before="0"/>
+              <w:jc w:val="left"/>
+            </w:pPr>
+            <w:r>
+              <w:rPr>
+                <w:rFonts w:ascii="Times New Roman" w:cs="Times New Roman" w:eastAsia="Times New Roman" w:hAnsi="Times New Roman"/>
+                <w:b w:val="false"/>
+                <w:bCs w:val="false"/>
+                <w:i w:val="false"/>
+                <w:iCs w:val="false"/>
+                <w:smallCaps w:val="false"/>
+                <w:color w:val="000000"/>
+                <w:sz w:val="17"/>
+                <w:szCs w:val="17"/>
+              </w:rPr>
+              <w:t xml:space="preserve">0.03</w:t>
+            </w:r>
+          </w:p>
+        </w:tc>
+        <w:tc>
+          <w:tcPr>
+            <w:tcW w:type="dxa" w:w="1100"/>
+            <w:tcBorders>
+              <w:top w:val="single" w:color="BFBFBF" w:sz="4"/>
+              <w:left w:val="single" w:color="BFBFBF" w:sz="4"/>
+              <w:bottom w:val="single" w:color="BFBFBF" w:sz="4"/>
+              <w:right w:val="single" w:color="BFBFBF" w:sz="4"/>
+            </w:tcBorders>
+            <w:shd w:fill="FFFFFF" w:val="clear"/>
+            <w:tcMar>
+              <w:top w:type="dxa" w:w="50"/>
+              <w:left w:type="dxa" w:w="70"/>
+              <w:bottom w:type="dxa" w:w="50"/>
+              <w:right w:type="dxa" w:w="70"/>
+            </w:tcMar>
+            <w:vAlign w:val="center"/>
+          </w:tcPr>
+          <w:p>
+            <w:pPr>
+              <w:spacing w:after="0" w:before="0"/>
+              <w:jc w:val="left"/>
+            </w:pPr>
+            <w:r>
+              <w:rPr>
+                <w:rFonts w:ascii="Times New Roman" w:cs="Times New Roman" w:eastAsia="Times New Roman" w:hAnsi="Times New Roman"/>
+                <w:b w:val="false"/>
+                <w:bCs w:val="false"/>
+                <w:i w:val="false"/>
+                <w:iCs w:val="false"/>
+                <w:smallCaps w:val="false"/>
+                <w:color w:val="000000"/>
+                <w:sz w:val="17"/>
+                <w:szCs w:val="17"/>
+              </w:rPr>
+              <w:t xml:space="preserve">0.59</w:t>
+            </w:r>
+          </w:p>
+        </w:tc>
+        <w:tc>
+          <w:tcPr>
+            <w:tcW w:type="dxa" w:w="1100"/>
+            <w:tcBorders>
+              <w:top w:val="single" w:color="BFBFBF" w:sz="4"/>
+              <w:left w:val="single" w:color="BFBFBF" w:sz="4"/>
+              <w:bottom w:val="single" w:color="BFBFBF" w:sz="4"/>
+              <w:right w:val="single" w:color="BFBFBF" w:sz="4"/>
+            </w:tcBorders>
+            <w:shd w:fill="FFFFFF" w:val="clear"/>
+            <w:tcMar>
+              <w:top w:type="dxa" w:w="50"/>
+              <w:left w:type="dxa" w:w="70"/>
+              <w:bottom w:type="dxa" w:w="50"/>
+              <w:right w:type="dxa" w:w="70"/>
+            </w:tcMar>
+            <w:vAlign w:val="center"/>
+          </w:tcPr>
+          <w:p>
+            <w:pPr>
+              <w:spacing w:after="0" w:before="0"/>
+              <w:jc w:val="left"/>
+            </w:pPr>
+            <w:r>
+              <w:rPr>
+                <w:rFonts w:ascii="Times New Roman" w:cs="Times New Roman" w:eastAsia="Times New Roman" w:hAnsi="Times New Roman"/>
+                <w:b w:val="false"/>
+                <w:bCs w:val="false"/>
+                <w:i w:val="false"/>
+                <w:iCs w:val="false"/>
+                <w:smallCaps w:val="false"/>
+                <w:color w:val="000000"/>
+                <w:sz w:val="17"/>
+                <w:szCs w:val="17"/>
+              </w:rPr>
+              <w:t xml:space="preserve">0.79</w:t>
+            </w:r>
+          </w:p>
+        </w:tc>
+        <w:tc>
+          <w:tcPr>
+            <w:tcW w:type="dxa" w:w="1100"/>
+            <w:tcBorders>
+              <w:top w:val="single" w:color="BFBFBF" w:sz="4"/>
+              <w:left w:val="single" w:color="BFBFBF" w:sz="4"/>
+              <w:bottom w:val="single" w:color="BFBFBF" w:sz="4"/>
+              <w:right w:val="single" w:color="BFBFBF" w:sz="4"/>
+            </w:tcBorders>
+            <w:shd w:fill="FFFFFF" w:val="clear"/>
+            <w:tcMar>
+              <w:top w:type="dxa" w:w="50"/>
+              <w:left w:type="dxa" w:w="70"/>
+              <w:bottom w:type="dxa" w:w="50"/>
+              <w:right w:type="dxa" w:w="70"/>
+            </w:tcMar>
+            <w:vAlign w:val="center"/>
+          </w:tcPr>
+          <w:p>
+            <w:pPr>
+              <w:spacing w:after="0" w:before="0"/>
+              <w:jc w:val="left"/>
+            </w:pPr>
+            <w:r>
+              <w:rPr>
+                <w:rFonts w:ascii="Times New Roman" w:cs="Times New Roman" w:eastAsia="Times New Roman" w:hAnsi="Times New Roman"/>
+                <w:b w:val="false"/>
+                <w:bCs w:val="false"/>
+                <w:i w:val="false"/>
+                <w:iCs w:val="false"/>
+                <w:smallCaps w:val="false"/>
+                <w:color w:val="000000"/>
+                <w:sz w:val="17"/>
+                <w:szCs w:val="17"/>
+              </w:rPr>
+              <w:t xml:space="preserve">0.72</w:t>
+            </w:r>
+          </w:p>
+        </w:tc>
+        <w:tc>
+          <w:tcPr>
+            <w:tcW w:type="dxa" w:w="1100"/>
+            <w:tcBorders>
+              <w:top w:val="single" w:color="BFBFBF" w:sz="4"/>
+              <w:left w:val="single" w:color="BFBFBF" w:sz="4"/>
+              <w:bottom w:val="single" w:color="BFBFBF" w:sz="4"/>
+              <w:right w:val="single" w:color="BFBFBF" w:sz="4"/>
+            </w:tcBorders>
+            <w:shd w:fill="FFFFFF" w:val="clear"/>
+            <w:tcMar>
+              <w:top w:type="dxa" w:w="50"/>
+              <w:left w:type="dxa" w:w="70"/>
+              <w:bottom w:type="dxa" w:w="50"/>
+              <w:right w:type="dxa" w:w="70"/>
+            </w:tcMar>
+            <w:vAlign w:val="center"/>
+          </w:tcPr>
+          <w:p>
+            <w:pPr>
+              <w:spacing w:after="0" w:before="0"/>
+              <w:jc w:val="left"/>
+            </w:pPr>
+            <w:r>
+              <w:rPr>
+                <w:rFonts w:ascii="Times New Roman" w:cs="Times New Roman" w:eastAsia="Times New Roman" w:hAnsi="Times New Roman"/>
+                <w:b w:val="false"/>
+                <w:bCs w:val="false"/>
+                <w:i w:val="false"/>
+                <w:iCs w:val="false"/>
+                <w:smallCaps w:val="false"/>
+                <w:color w:val="000000"/>
+                <w:sz w:val="17"/>
+                <w:szCs w:val="17"/>
+              </w:rPr>
+              <w:t xml:space="preserve">−0.08</w:t>
+            </w:r>
+          </w:p>
+        </w:tc>
+      </w:tr>
+      <w:tr>
+        <w:trPr>
+          <w:cantSplit/>
+          <w:tblHeader w:val="false"/>
+        </w:trPr>
+        <w:tc>
+          <w:tcPr>
+            <w:tcW w:type="dxa" w:w="2760"/>
+            <w:tcBorders>
+              <w:top w:val="single" w:color="BFBFBF" w:sz="4"/>
+              <w:left w:val="single" w:color="BFBFBF" w:sz="4"/>
+              <w:bottom w:val="single" w:color="BFBFBF" w:sz="4"/>
+              <w:right w:val="single" w:color="BFBFBF" w:sz="4"/>
+            </w:tcBorders>
+            <w:shd w:fill="FFFFFF" w:val="clear"/>
+            <w:tcMar>
+              <w:top w:type="dxa" w:w="50"/>
+              <w:left w:type="dxa" w:w="70"/>
+              <w:bottom w:type="dxa" w:w="50"/>
+              <w:right w:type="dxa" w:w="70"/>
+            </w:tcMar>
+            <w:vAlign w:val="center"/>
+          </w:tcPr>
+          <w:p>
+            <w:pPr>
+              <w:spacing w:after="0" w:before="0"/>
+              <w:jc w:val="left"/>
+            </w:pPr>
+            <w:r>
+              <w:rPr>
+                <w:rFonts w:ascii="Times New Roman" w:cs="Times New Roman" w:eastAsia="Times New Roman" w:hAnsi="Times New Roman"/>
+                <w:b w:val="false"/>
+                <w:bCs w:val="false"/>
+                <w:i w:val="false"/>
+                <w:iCs w:val="false"/>
+                <w:smallCaps w:val="false"/>
+                <w:color w:val="000000"/>
+                <w:sz w:val="17"/>
+                <w:szCs w:val="17"/>
+              </w:rPr>
+              <w:t xml:space="preserve">T = 0.8, pressure</w:t>
+            </w:r>
+          </w:p>
+        </w:tc>
+        <w:tc>
+          <w:tcPr>
+            <w:tcW w:type="dxa" w:w="1100"/>
+            <w:tcBorders>
+              <w:top w:val="single" w:color="BFBFBF" w:sz="4"/>
+              <w:left w:val="single" w:color="BFBFBF" w:sz="4"/>
+              <w:bottom w:val="single" w:color="BFBFBF" w:sz="4"/>
+              <w:right w:val="single" w:color="BFBFBF" w:sz="4"/>
+            </w:tcBorders>
+            <w:shd w:fill="FFFFFF" w:val="clear"/>
+            <w:tcMar>
+              <w:top w:type="dxa" w:w="50"/>
+              <w:left w:type="dxa" w:w="70"/>
+              <w:bottom w:type="dxa" w:w="50"/>
+              <w:right w:type="dxa" w:w="70"/>
+            </w:tcMar>
+            <w:vAlign w:val="center"/>
+          </w:tcPr>
+          <w:p>
+            <w:pPr>
+              <w:spacing w:after="0" w:before="0"/>
+              <w:jc w:val="left"/>
+            </w:pPr>
+            <w:r>
+              <w:rPr>
+                <w:rFonts w:ascii="Times New Roman" w:cs="Times New Roman" w:eastAsia="Times New Roman" w:hAnsi="Times New Roman"/>
+                <w:b w:val="false"/>
+                <w:bCs w:val="false"/>
+                <w:i w:val="false"/>
+                <w:iCs w:val="false"/>
+                <w:smallCaps w:val="false"/>
+                <w:color w:val="000000"/>
+                <w:sz w:val="17"/>
+                <w:szCs w:val="17"/>
+              </w:rPr>
+              <w:t xml:space="preserve">0.07</w:t>
+            </w:r>
+          </w:p>
+        </w:tc>
+        <w:tc>
+          <w:tcPr>
+            <w:tcW w:type="dxa" w:w="1100"/>
+            <w:tcBorders>
+              <w:top w:val="single" w:color="BFBFBF" w:sz="4"/>
+              <w:left w:val="single" w:color="BFBFBF" w:sz="4"/>
+              <w:bottom w:val="single" w:color="BFBFBF" w:sz="4"/>
+              <w:right w:val="single" w:color="BFBFBF" w:sz="4"/>
+            </w:tcBorders>
+            <w:shd w:fill="FFFFFF" w:val="clear"/>
+            <w:tcMar>
+              <w:top w:type="dxa" w:w="50"/>
+              <w:left w:type="dxa" w:w="70"/>
+              <w:bottom w:type="dxa" w:w="50"/>
+              <w:right w:type="dxa" w:w="70"/>
+            </w:tcMar>
+            <w:vAlign w:val="center"/>
+          </w:tcPr>
+          <w:p>
+            <w:pPr>
+              <w:spacing w:after="0" w:before="0"/>
+              <w:jc w:val="left"/>
+            </w:pPr>
+            <w:r>
+              <w:rPr>
+                <w:rFonts w:ascii="Times New Roman" w:cs="Times New Roman" w:eastAsia="Times New Roman" w:hAnsi="Times New Roman"/>
+                <w:b w:val="false"/>
+                <w:bCs w:val="false"/>
+                <w:i w:val="false"/>
+                <w:iCs w:val="false"/>
+                <w:smallCaps w:val="false"/>
+                <w:color w:val="000000"/>
+                <w:sz w:val="17"/>
+                <w:szCs w:val="17"/>
+              </w:rPr>
+              <w:t xml:space="preserve">0.00</w:t>
+            </w:r>
+          </w:p>
+        </w:tc>
+        <w:tc>
+          <w:tcPr>
+            <w:tcW w:type="dxa" w:w="1100"/>
+            <w:tcBorders>
+              <w:top w:val="single" w:color="BFBFBF" w:sz="4"/>
+              <w:left w:val="single" w:color="BFBFBF" w:sz="4"/>
+              <w:bottom w:val="single" w:color="BFBFBF" w:sz="4"/>
+              <w:right w:val="single" w:color="BFBFBF" w:sz="4"/>
+            </w:tcBorders>
+            <w:shd w:fill="FFFFFF" w:val="clear"/>
+            <w:tcMar>
+              <w:top w:type="dxa" w:w="50"/>
+              <w:left w:type="dxa" w:w="70"/>
+              <w:bottom w:type="dxa" w:w="50"/>
+              <w:right w:type="dxa" w:w="70"/>
+            </w:tcMar>
+            <w:vAlign w:val="center"/>
+          </w:tcPr>
+          <w:p>
+            <w:pPr>
+              <w:spacing w:after="0" w:before="0"/>
+              <w:jc w:val="left"/>
+            </w:pPr>
+            <w:r>
+              <w:rPr>
+                <w:rFonts w:ascii="Times New Roman" w:cs="Times New Roman" w:eastAsia="Times New Roman" w:hAnsi="Times New Roman"/>
+                <w:b w:val="false"/>
+                <w:bCs w:val="false"/>
+                <w:i w:val="false"/>
+                <w:iCs w:val="false"/>
+                <w:smallCaps w:val="false"/>
+                <w:color w:val="000000"/>
+                <w:sz w:val="17"/>
+                <w:szCs w:val="17"/>
+              </w:rPr>
+              <w:t xml:space="preserve">0.84</w:t>
+            </w:r>
+          </w:p>
+        </w:tc>
+        <w:tc>
+          <w:tcPr>
+            <w:tcW w:type="dxa" w:w="1100"/>
+            <w:tcBorders>
+              <w:top w:val="single" w:color="BFBFBF" w:sz="4"/>
+              <w:left w:val="single" w:color="BFBFBF" w:sz="4"/>
+              <w:bottom w:val="single" w:color="BFBFBF" w:sz="4"/>
+              <w:right w:val="single" w:color="BFBFBF" w:sz="4"/>
+            </w:tcBorders>
+            <w:shd w:fill="FFFFFF" w:val="clear"/>
+            <w:tcMar>
+              <w:top w:type="dxa" w:w="50"/>
+              <w:left w:type="dxa" w:w="70"/>
+              <w:bottom w:type="dxa" w:w="50"/>
+              <w:right w:type="dxa" w:w="70"/>
+            </w:tcMar>
+            <w:vAlign w:val="center"/>
+          </w:tcPr>
+          <w:p>
+            <w:pPr>
+              <w:spacing w:after="0" w:before="0"/>
+              <w:jc w:val="left"/>
+            </w:pPr>
+            <w:r>
+              <w:rPr>
+                <w:rFonts w:ascii="Times New Roman" w:cs="Times New Roman" w:eastAsia="Times New Roman" w:hAnsi="Times New Roman"/>
+                <w:b w:val="false"/>
+                <w:bCs w:val="false"/>
+                <w:i w:val="false"/>
+                <w:iCs w:val="false"/>
+                <w:smallCaps w:val="false"/>
+                <w:color w:val="000000"/>
+                <w:sz w:val="17"/>
+                <w:szCs w:val="17"/>
+              </w:rPr>
+              <w:t xml:space="preserve">0.93</w:t>
+            </w:r>
+          </w:p>
+        </w:tc>
+        <w:tc>
+          <w:tcPr>
+            <w:tcW w:type="dxa" w:w="1100"/>
+            <w:tcBorders>
+              <w:top w:val="single" w:color="BFBFBF" w:sz="4"/>
+              <w:left w:val="single" w:color="BFBFBF" w:sz="4"/>
+              <w:bottom w:val="single" w:color="BFBFBF" w:sz="4"/>
+              <w:right w:val="single" w:color="BFBFBF" w:sz="4"/>
+            </w:tcBorders>
+            <w:shd w:fill="FFFFFF" w:val="clear"/>
+            <w:tcMar>
+              <w:top w:type="dxa" w:w="50"/>
+              <w:left w:type="dxa" w:w="70"/>
+              <w:bottom w:type="dxa" w:w="50"/>
+              <w:right w:type="dxa" w:w="70"/>
+            </w:tcMar>
+            <w:vAlign w:val="center"/>
+          </w:tcPr>
+          <w:p>
+            <w:pPr>
+              <w:spacing w:after="0" w:before="0"/>
+              <w:jc w:val="left"/>
+            </w:pPr>
+            <w:r>
+              <w:rPr>
+                <w:rFonts w:ascii="Times New Roman" w:cs="Times New Roman" w:eastAsia="Times New Roman" w:hAnsi="Times New Roman"/>
+                <w:b w:val="false"/>
+                <w:bCs w:val="false"/>
+                <w:i w:val="false"/>
+                <w:iCs w:val="false"/>
+                <w:smallCaps w:val="false"/>
+                <w:color w:val="000000"/>
+                <w:sz w:val="17"/>
+                <w:szCs w:val="17"/>
+              </w:rPr>
+              <w:t xml:space="preserve">0.40</w:t>
+            </w:r>
+          </w:p>
+        </w:tc>
+        <w:tc>
+          <w:tcPr>
+            <w:tcW w:type="dxa" w:w="1100"/>
+            <w:tcBorders>
+              <w:top w:val="single" w:color="BFBFBF" w:sz="4"/>
+              <w:left w:val="single" w:color="BFBFBF" w:sz="4"/>
+              <w:bottom w:val="single" w:color="BFBFBF" w:sz="4"/>
+              <w:right w:val="single" w:color="BFBFBF" w:sz="4"/>
+            </w:tcBorders>
+            <w:shd w:fill="FFFFFF" w:val="clear"/>
+            <w:tcMar>
+              <w:top w:type="dxa" w:w="50"/>
+              <w:left w:type="dxa" w:w="70"/>
+              <w:bottom w:type="dxa" w:w="50"/>
+              <w:right w:type="dxa" w:w="70"/>
+            </w:tcMar>
+            <w:vAlign w:val="center"/>
+          </w:tcPr>
+          <w:p>
+            <w:pPr>
+              <w:spacing w:after="0" w:before="0"/>
+              <w:jc w:val="left"/>
+            </w:pPr>
+            <w:r>
+              <w:rPr>
+                <w:rFonts w:ascii="Times New Roman" w:cs="Times New Roman" w:eastAsia="Times New Roman" w:hAnsi="Times New Roman"/>
+                <w:b w:val="false"/>
+                <w:bCs w:val="false"/>
+                <w:i w:val="false"/>
+                <w:iCs w:val="false"/>
+                <w:smallCaps w:val="false"/>
+                <w:color w:val="000000"/>
+                <w:sz w:val="17"/>
+                <w:szCs w:val="17"/>
+              </w:rPr>
+              <w:t xml:space="preserve">−0.40</w:t>
+            </w:r>
+          </w:p>
+        </w:tc>
+      </w:tr>
+      <w:tr>
+        <w:trPr>
+          <w:cantSplit/>
+          <w:tblHeader w:val="false"/>
+        </w:trPr>
+        <w:tc>
+          <w:tcPr>
+            <w:tcW w:type="dxa" w:w="2760"/>
+            <w:tcBorders>
+              <w:top w:val="single" w:color="BFBFBF" w:sz="4"/>
+              <w:left w:val="single" w:color="BFBFBF" w:sz="4"/>
+              <w:bottom w:val="single" w:color="BFBFBF" w:sz="4"/>
+              <w:right w:val="single" w:color="BFBFBF" w:sz="4"/>
+            </w:tcBorders>
+            <w:shd w:fill="FFFFFF" w:val="clear"/>
+            <w:tcMar>
+              <w:top w:type="dxa" w:w="50"/>
+              <w:left w:type="dxa" w:w="70"/>
+              <w:bottom w:type="dxa" w:w="50"/>
+              <w:right w:type="dxa" w:w="70"/>
+            </w:tcMar>
+            <w:vAlign w:val="center"/>
+          </w:tcPr>
+          <w:p>
+            <w:pPr>
+              <w:spacing w:after="0" w:before="0"/>
+              <w:jc w:val="left"/>
+            </w:pPr>
+            <w:r>
+              <w:rPr>
+                <w:rFonts w:ascii="Times New Roman" w:cs="Times New Roman" w:eastAsia="Times New Roman" w:hAnsi="Times New Roman"/>
+                <w:b w:val="false"/>
+                <w:bCs w:val="false"/>
+                <w:i w:val="false"/>
+                <w:iCs w:val="false"/>
+                <w:smallCaps w:val="false"/>
+                <w:color w:val="000000"/>
+                <w:sz w:val="17"/>
+                <w:szCs w:val="17"/>
+              </w:rPr>
+              <w:t xml:space="preserve">T = 0.8, contamination</w:t>
+            </w:r>
+          </w:p>
+        </w:tc>
+        <w:tc>
+          <w:tcPr>
+            <w:tcW w:type="dxa" w:w="1100"/>
+            <w:tcBorders>
+              <w:top w:val="single" w:color="BFBFBF" w:sz="4"/>
+              <w:left w:val="single" w:color="BFBFBF" w:sz="4"/>
+              <w:bottom w:val="single" w:color="BFBFBF" w:sz="4"/>
+              <w:right w:val="single" w:color="BFBFBF" w:sz="4"/>
+            </w:tcBorders>
+            <w:shd w:fill="FFFFFF" w:val="clear"/>
+            <w:tcMar>
+              <w:top w:type="dxa" w:w="50"/>
+              <w:left w:type="dxa" w:w="70"/>
+              <w:bottom w:type="dxa" w:w="50"/>
+              <w:right w:type="dxa" w:w="70"/>
+            </w:tcMar>
+            <w:vAlign w:val="center"/>
+          </w:tcPr>
+          <w:p>
+            <w:pPr>
+              <w:spacing w:after="0" w:before="0"/>
+              <w:jc w:val="left"/>
+            </w:pPr>
+            <w:r>
+              <w:rPr>
+                <w:rFonts w:ascii="Times New Roman" w:cs="Times New Roman" w:eastAsia="Times New Roman" w:hAnsi="Times New Roman"/>
+                <w:b w:val="false"/>
+                <w:bCs w:val="false"/>
+                <w:i w:val="false"/>
+                <w:iCs w:val="false"/>
+                <w:smallCaps w:val="false"/>
+                <w:color w:val="000000"/>
+                <w:sz w:val="17"/>
+                <w:szCs w:val="17"/>
+              </w:rPr>
+              <w:t xml:space="preserve">0.11</w:t>
+            </w:r>
+          </w:p>
+        </w:tc>
+        <w:tc>
+          <w:tcPr>
+            <w:tcW w:type="dxa" w:w="1100"/>
+            <w:tcBorders>
+              <w:top w:val="single" w:color="BFBFBF" w:sz="4"/>
+              <w:left w:val="single" w:color="BFBFBF" w:sz="4"/>
+              <w:bottom w:val="single" w:color="BFBFBF" w:sz="4"/>
+              <w:right w:val="single" w:color="BFBFBF" w:sz="4"/>
+            </w:tcBorders>
+            <w:shd w:fill="FFFFFF" w:val="clear"/>
+            <w:tcMar>
+              <w:top w:type="dxa" w:w="50"/>
+              <w:left w:type="dxa" w:w="70"/>
+              <w:bottom w:type="dxa" w:w="50"/>
+              <w:right w:type="dxa" w:w="70"/>
+            </w:tcMar>
+            <w:vAlign w:val="center"/>
+          </w:tcPr>
+          <w:p>
+            <w:pPr>
+              <w:spacing w:after="0" w:before="0"/>
+              <w:jc w:val="left"/>
+            </w:pPr>
+            <w:r>
+              <w:rPr>
+                <w:rFonts w:ascii="Times New Roman" w:cs="Times New Roman" w:eastAsia="Times New Roman" w:hAnsi="Times New Roman"/>
+                <w:b w:val="false"/>
+                <w:bCs w:val="false"/>
+                <w:i w:val="false"/>
+                <w:iCs w:val="false"/>
+                <w:smallCaps w:val="false"/>
+                <w:color w:val="000000"/>
+                <w:sz w:val="17"/>
+                <w:szCs w:val="17"/>
+              </w:rPr>
+              <w:t xml:space="preserve">0.03</w:t>
+            </w:r>
+          </w:p>
+        </w:tc>
+        <w:tc>
+          <w:tcPr>
+            <w:tcW w:type="dxa" w:w="1100"/>
+            <w:tcBorders>
+              <w:top w:val="single" w:color="BFBFBF" w:sz="4"/>
+              <w:left w:val="single" w:color="BFBFBF" w:sz="4"/>
+              <w:bottom w:val="single" w:color="BFBFBF" w:sz="4"/>
+              <w:right w:val="single" w:color="BFBFBF" w:sz="4"/>
+            </w:tcBorders>
+            <w:shd w:fill="FFFFFF" w:val="clear"/>
+            <w:tcMar>
+              <w:top w:type="dxa" w:w="50"/>
+              <w:left w:type="dxa" w:w="70"/>
+              <w:bottom w:type="dxa" w:w="50"/>
+              <w:right w:type="dxa" w:w="70"/>
+            </w:tcMar>
+            <w:vAlign w:val="center"/>
+          </w:tcPr>
+          <w:p>
+            <w:pPr>
+              <w:spacing w:after="0" w:before="0"/>
+              <w:jc w:val="left"/>
+            </w:pPr>
+            <w:r>
+              <w:rPr>
+                <w:rFonts w:ascii="Times New Roman" w:cs="Times New Roman" w:eastAsia="Times New Roman" w:hAnsi="Times New Roman"/>
+                <w:b w:val="false"/>
+                <w:bCs w:val="false"/>
+                <w:i w:val="false"/>
+                <w:iCs w:val="false"/>
+                <w:smallCaps w:val="false"/>
+                <w:color w:val="000000"/>
+                <w:sz w:val="17"/>
+                <w:szCs w:val="17"/>
+              </w:rPr>
+              <w:t xml:space="preserve">0.83</w:t>
+            </w:r>
+          </w:p>
+        </w:tc>
+        <w:tc>
+          <w:tcPr>
+            <w:tcW w:type="dxa" w:w="1100"/>
+            <w:tcBorders>
+              <w:top w:val="single" w:color="BFBFBF" w:sz="4"/>
+              <w:left w:val="single" w:color="BFBFBF" w:sz="4"/>
+              <w:bottom w:val="single" w:color="BFBFBF" w:sz="4"/>
+              <w:right w:val="single" w:color="BFBFBF" w:sz="4"/>
+            </w:tcBorders>
+            <w:shd w:fill="FFFFFF" w:val="clear"/>
+            <w:tcMar>
+              <w:top w:type="dxa" w:w="50"/>
+              <w:left w:type="dxa" w:w="70"/>
+              <w:bottom w:type="dxa" w:w="50"/>
+              <w:right w:type="dxa" w:w="70"/>
+            </w:tcMar>
+            <w:vAlign w:val="center"/>
+          </w:tcPr>
+          <w:p>
+            <w:pPr>
+              <w:spacing w:after="0" w:before="0"/>
+              <w:jc w:val="left"/>
+            </w:pPr>
+            <w:r>
+              <w:rPr>
+                <w:rFonts w:ascii="Times New Roman" w:cs="Times New Roman" w:eastAsia="Times New Roman" w:hAnsi="Times New Roman"/>
+                <w:b w:val="false"/>
+                <w:bCs w:val="false"/>
+                <w:i w:val="false"/>
+                <w:iCs w:val="false"/>
+                <w:smallCaps w:val="false"/>
+                <w:color w:val="000000"/>
+                <w:sz w:val="17"/>
+                <w:szCs w:val="17"/>
+              </w:rPr>
+              <w:t xml:space="preserve">0.89</w:t>
+            </w:r>
+          </w:p>
+        </w:tc>
+        <w:tc>
+          <w:tcPr>
+            <w:tcW w:type="dxa" w:w="1100"/>
+            <w:tcBorders>
+              <w:top w:val="single" w:color="BFBFBF" w:sz="4"/>
+              <w:left w:val="single" w:color="BFBFBF" w:sz="4"/>
+              <w:bottom w:val="single" w:color="BFBFBF" w:sz="4"/>
+              <w:right w:val="single" w:color="BFBFBF" w:sz="4"/>
+            </w:tcBorders>
+            <w:shd w:fill="FFFFFF" w:val="clear"/>
+            <w:tcMar>
+              <w:top w:type="dxa" w:w="50"/>
+              <w:left w:type="dxa" w:w="70"/>
+              <w:bottom w:type="dxa" w:w="50"/>
+              <w:right w:type="dxa" w:w="70"/>
+            </w:tcMar>
+            <w:vAlign w:val="center"/>
+          </w:tcPr>
+          <w:p>
+            <w:pPr>
+              <w:spacing w:after="0" w:before="0"/>
+              <w:jc w:val="left"/>
+            </w:pPr>
+            <w:r>
+              <w:rPr>
+                <w:rFonts w:ascii="Times New Roman" w:cs="Times New Roman" w:eastAsia="Times New Roman" w:hAnsi="Times New Roman"/>
+                <w:b w:val="false"/>
+                <w:bCs w:val="false"/>
+                <w:i w:val="false"/>
+                <w:iCs w:val="false"/>
+                <w:smallCaps w:val="false"/>
+                <w:color w:val="000000"/>
+                <w:sz w:val="17"/>
+                <w:szCs w:val="17"/>
+              </w:rPr>
+              <w:t xml:space="preserve">0.44</w:t>
+            </w:r>
+          </w:p>
+        </w:tc>
+        <w:tc>
+          <w:tcPr>
+            <w:tcW w:type="dxa" w:w="1100"/>
+            <w:tcBorders>
+              <w:top w:val="single" w:color="BFBFBF" w:sz="4"/>
+              <w:left w:val="single" w:color="BFBFBF" w:sz="4"/>
+              <w:bottom w:val="single" w:color="BFBFBF" w:sz="4"/>
+              <w:right w:val="single" w:color="BFBFBF" w:sz="4"/>
+            </w:tcBorders>
+            <w:shd w:fill="FFFFFF" w:val="clear"/>
+            <w:tcMar>
+              <w:top w:type="dxa" w:w="50"/>
+              <w:left w:type="dxa" w:w="70"/>
+              <w:bottom w:type="dxa" w:w="50"/>
+              <w:right w:type="dxa" w:w="70"/>
+            </w:tcMar>
+            <w:vAlign w:val="center"/>
+          </w:tcPr>
+          <w:p>
+            <w:pPr>
+              <w:spacing w:after="0" w:before="0"/>
+              <w:jc w:val="left"/>
+            </w:pPr>
+            <w:r>
+              <w:rPr>
+                <w:rFonts w:ascii="Times New Roman" w:cs="Times New Roman" w:eastAsia="Times New Roman" w:hAnsi="Times New Roman"/>
+                <w:b w:val="false"/>
+                <w:bCs w:val="false"/>
+                <w:i w:val="false"/>
+                <w:iCs w:val="false"/>
+                <w:smallCaps w:val="false"/>
+                <w:color w:val="000000"/>
+                <w:sz w:val="17"/>
+                <w:szCs w:val="17"/>
+              </w:rPr>
+              <w:t xml:space="preserve">−0.36</w:t>
+            </w:r>
+          </w:p>
+        </w:tc>
+      </w:tr>
+      <w:tr>
+        <w:trPr>
+          <w:cantSplit/>
+          <w:tblHeader w:val="false"/>
+        </w:trPr>
+        <w:tc>
+          <w:tcPr>
+            <w:tcW w:type="dxa" w:w="2760"/>
+            <w:tcBorders>
+              <w:top w:val="single" w:color="BFBFBF" w:sz="4"/>
+              <w:left w:val="single" w:color="BFBFBF" w:sz="4"/>
+              <w:bottom w:val="single" w:color="BFBFBF" w:sz="4"/>
+              <w:right w:val="single" w:color="BFBFBF" w:sz="4"/>
+            </w:tcBorders>
+            <w:shd w:fill="FFFFFF" w:val="clear"/>
+            <w:tcMar>
+              <w:top w:type="dxa" w:w="50"/>
+              <w:left w:type="dxa" w:w="70"/>
+              <w:bottom w:type="dxa" w:w="50"/>
+              <w:right w:type="dxa" w:w="70"/>
+            </w:tcMar>
+            <w:vAlign w:val="center"/>
+          </w:tcPr>
+          <w:p>
+            <w:pPr>
+              <w:spacing w:after="0" w:before="0"/>
+              <w:jc w:val="left"/>
+            </w:pPr>
+            <w:r>
+              <w:rPr>
+                <w:rFonts w:ascii="Times New Roman" w:cs="Times New Roman" w:eastAsia="Times New Roman" w:hAnsi="Times New Roman"/>
+                <w:b w:val="false"/>
+                <w:bCs w:val="false"/>
+                <w:i w:val="false"/>
+                <w:iCs w:val="false"/>
+                <w:smallCaps w:val="false"/>
+                <w:color w:val="000000"/>
+                <w:sz w:val="17"/>
+                <w:szCs w:val="17"/>
+              </w:rPr>
+              <w:t xml:space="preserve">T = 0.8, pressure + contamination</w:t>
+            </w:r>
+          </w:p>
+        </w:tc>
+        <w:tc>
+          <w:tcPr>
+            <w:tcW w:type="dxa" w:w="1100"/>
+            <w:tcBorders>
+              <w:top w:val="single" w:color="BFBFBF" w:sz="4"/>
+              <w:left w:val="single" w:color="BFBFBF" w:sz="4"/>
+              <w:bottom w:val="single" w:color="BFBFBF" w:sz="4"/>
+              <w:right w:val="single" w:color="BFBFBF" w:sz="4"/>
+            </w:tcBorders>
+            <w:shd w:fill="FFFFFF" w:val="clear"/>
+            <w:tcMar>
+              <w:top w:type="dxa" w:w="50"/>
+              <w:left w:type="dxa" w:w="70"/>
+              <w:bottom w:type="dxa" w:w="50"/>
+              <w:right w:type="dxa" w:w="70"/>
+            </w:tcMar>
+            <w:vAlign w:val="center"/>
+          </w:tcPr>
+          <w:p>
+            <w:pPr>
+              <w:spacing w:after="0" w:before="0"/>
+              <w:jc w:val="left"/>
+            </w:pPr>
+            <w:r>
+              <w:rPr>
+                <w:rFonts w:ascii="Times New Roman" w:cs="Times New Roman" w:eastAsia="Times New Roman" w:hAnsi="Times New Roman"/>
+                <w:b w:val="false"/>
+                <w:bCs w:val="false"/>
+                <w:i w:val="false"/>
+                <w:iCs w:val="false"/>
+                <w:smallCaps w:val="false"/>
+                <w:color w:val="000000"/>
+                <w:sz w:val="17"/>
+                <w:szCs w:val="17"/>
+              </w:rPr>
+              <w:t xml:space="preserve">0.05</w:t>
+            </w:r>
+          </w:p>
+        </w:tc>
+        <w:tc>
+          <w:tcPr>
+            <w:tcW w:type="dxa" w:w="1100"/>
+            <w:tcBorders>
+              <w:top w:val="single" w:color="BFBFBF" w:sz="4"/>
+              <w:left w:val="single" w:color="BFBFBF" w:sz="4"/>
+              <w:bottom w:val="single" w:color="BFBFBF" w:sz="4"/>
+              <w:right w:val="single" w:color="BFBFBF" w:sz="4"/>
+            </w:tcBorders>
+            <w:shd w:fill="FFFFFF" w:val="clear"/>
+            <w:tcMar>
+              <w:top w:type="dxa" w:w="50"/>
+              <w:left w:type="dxa" w:w="70"/>
+              <w:bottom w:type="dxa" w:w="50"/>
+              <w:right w:type="dxa" w:w="70"/>
+            </w:tcMar>
+            <w:vAlign w:val="center"/>
+          </w:tcPr>
+          <w:p>
+            <w:pPr>
+              <w:spacing w:after="0" w:before="0"/>
+              <w:jc w:val="left"/>
+            </w:pPr>
+            <w:r>
+              <w:rPr>
+                <w:rFonts w:ascii="Times New Roman" w:cs="Times New Roman" w:eastAsia="Times New Roman" w:hAnsi="Times New Roman"/>
+                <w:b w:val="false"/>
+                <w:bCs w:val="false"/>
+                <w:i w:val="false"/>
+                <w:iCs w:val="false"/>
+                <w:smallCaps w:val="false"/>
+                <w:color w:val="000000"/>
+                <w:sz w:val="17"/>
+                <w:szCs w:val="17"/>
+              </w:rPr>
+              <w:t xml:space="preserve">0.00</w:t>
+            </w:r>
+          </w:p>
+        </w:tc>
+        <w:tc>
+          <w:tcPr>
+            <w:tcW w:type="dxa" w:w="1100"/>
+            <w:tcBorders>
+              <w:top w:val="single" w:color="BFBFBF" w:sz="4"/>
+              <w:left w:val="single" w:color="BFBFBF" w:sz="4"/>
+              <w:bottom w:val="single" w:color="BFBFBF" w:sz="4"/>
+              <w:right w:val="single" w:color="BFBFBF" w:sz="4"/>
+            </w:tcBorders>
+            <w:shd w:fill="FFFFFF" w:val="clear"/>
+            <w:tcMar>
+              <w:top w:type="dxa" w:w="50"/>
+              <w:left w:type="dxa" w:w="70"/>
+              <w:bottom w:type="dxa" w:w="50"/>
+              <w:right w:type="dxa" w:w="70"/>
+            </w:tcMar>
+            <w:vAlign w:val="center"/>
+          </w:tcPr>
+          <w:p>
+            <w:pPr>
+              <w:spacing w:after="0" w:before="0"/>
+              <w:jc w:val="left"/>
+            </w:pPr>
+            <w:r>
+              <w:rPr>
+                <w:rFonts w:ascii="Times New Roman" w:cs="Times New Roman" w:eastAsia="Times New Roman" w:hAnsi="Times New Roman"/>
+                <w:b w:val="false"/>
+                <w:bCs w:val="false"/>
+                <w:i w:val="false"/>
+                <w:iCs w:val="false"/>
+                <w:smallCaps w:val="false"/>
+                <w:color w:val="000000"/>
+                <w:sz w:val="17"/>
+                <w:szCs w:val="17"/>
+              </w:rPr>
+              <w:t xml:space="preserve">0.84</w:t>
+            </w:r>
+          </w:p>
+        </w:tc>
+        <w:tc>
+          <w:tcPr>
+            <w:tcW w:type="dxa" w:w="1100"/>
+            <w:tcBorders>
+              <w:top w:val="single" w:color="BFBFBF" w:sz="4"/>
+              <w:left w:val="single" w:color="BFBFBF" w:sz="4"/>
+              <w:bottom w:val="single" w:color="BFBFBF" w:sz="4"/>
+              <w:right w:val="single" w:color="BFBFBF" w:sz="4"/>
+            </w:tcBorders>
+            <w:shd w:fill="FFFFFF" w:val="clear"/>
+            <w:tcMar>
+              <w:top w:type="dxa" w:w="50"/>
+              <w:left w:type="dxa" w:w="70"/>
+              <w:bottom w:type="dxa" w:w="50"/>
+              <w:right w:type="dxa" w:w="70"/>
+            </w:tcMar>
+            <w:vAlign w:val="center"/>
+          </w:tcPr>
+          <w:p>
+            <w:pPr>
+              <w:spacing w:after="0" w:before="0"/>
+              <w:jc w:val="left"/>
+            </w:pPr>
+            <w:r>
+              <w:rPr>
+                <w:rFonts w:ascii="Times New Roman" w:cs="Times New Roman" w:eastAsia="Times New Roman" w:hAnsi="Times New Roman"/>
+                <w:b w:val="false"/>
+                <w:bCs w:val="false"/>
+                <w:i w:val="false"/>
+                <w:iCs w:val="false"/>
+                <w:smallCaps w:val="false"/>
+                <w:color w:val="000000"/>
+                <w:sz w:val="17"/>
+                <w:szCs w:val="17"/>
+              </w:rPr>
+              <w:t xml:space="preserve">0.94</w:t>
+            </w:r>
+          </w:p>
+        </w:tc>
+        <w:tc>
+          <w:tcPr>
+            <w:tcW w:type="dxa" w:w="1100"/>
+            <w:tcBorders>
+              <w:top w:val="single" w:color="BFBFBF" w:sz="4"/>
+              <w:left w:val="single" w:color="BFBFBF" w:sz="4"/>
+              <w:bottom w:val="single" w:color="BFBFBF" w:sz="4"/>
+              <w:right w:val="single" w:color="BFBFBF" w:sz="4"/>
+            </w:tcBorders>
+            <w:shd w:fill="FFFFFF" w:val="clear"/>
+            <w:tcMar>
+              <w:top w:type="dxa" w:w="50"/>
+              <w:left w:type="dxa" w:w="70"/>
+              <w:bottom w:type="dxa" w:w="50"/>
+              <w:right w:type="dxa" w:w="70"/>
+            </w:tcMar>
+            <w:vAlign w:val="center"/>
+          </w:tcPr>
+          <w:p>
+            <w:pPr>
+              <w:spacing w:after="0" w:before="0"/>
+              <w:jc w:val="left"/>
+            </w:pPr>
+            <w:r>
+              <w:rPr>
+                <w:rFonts w:ascii="Times New Roman" w:cs="Times New Roman" w:eastAsia="Times New Roman" w:hAnsi="Times New Roman"/>
+                <w:b w:val="false"/>
+                <w:bCs w:val="false"/>
+                <w:i w:val="false"/>
+                <w:iCs w:val="false"/>
+                <w:smallCaps w:val="false"/>
+                <w:color w:val="000000"/>
+                <w:sz w:val="17"/>
+                <w:szCs w:val="17"/>
+              </w:rPr>
+              <w:t xml:space="preserve">0.45</w:t>
+            </w:r>
+          </w:p>
+        </w:tc>
+        <w:tc>
+          <w:tcPr>
+            <w:tcW w:type="dxa" w:w="1100"/>
+            <w:tcBorders>
+              <w:top w:val="single" w:color="BFBFBF" w:sz="4"/>
+              <w:left w:val="single" w:color="BFBFBF" w:sz="4"/>
+              <w:bottom w:val="single" w:color="BFBFBF" w:sz="4"/>
+              <w:right w:val="single" w:color="BFBFBF" w:sz="4"/>
+            </w:tcBorders>
+            <w:shd w:fill="FFFFFF" w:val="clear"/>
+            <w:tcMar>
+              <w:top w:type="dxa" w:w="50"/>
+              <w:left w:type="dxa" w:w="70"/>
+              <w:bottom w:type="dxa" w:w="50"/>
+              <w:right w:type="dxa" w:w="70"/>
+            </w:tcMar>
+            <w:vAlign w:val="center"/>
+          </w:tcPr>
+          <w:p>
+            <w:pPr>
+              <w:spacing w:after="0" w:before="0"/>
+              <w:jc w:val="left"/>
+            </w:pPr>
+            <w:r>
+              <w:rPr>
+                <w:rFonts w:ascii="Times New Roman" w:cs="Times New Roman" w:eastAsia="Times New Roman" w:hAnsi="Times New Roman"/>
+                <w:b w:val="false"/>
+                <w:bCs w:val="false"/>
+                <w:i w:val="false"/>
+                <w:iCs w:val="false"/>
+                <w:smallCaps w:val="false"/>
+                <w:color w:val="000000"/>
+                <w:sz w:val="17"/>
+                <w:szCs w:val="17"/>
+              </w:rPr>
+              <w:t xml:space="preserve">−0.35</w:t>
+            </w:r>
+          </w:p>
+        </w:tc>
+      </w:tr>
+      <w:tr>
+        <w:trPr>
+          <w:cantSplit/>
+          <w:tblHeader w:val="false"/>
+        </w:trPr>
+        <w:tc>
+          <w:tcPr>
+            <w:tcW w:type="dxa" w:w="2760"/>
+            <w:tcBorders>
+              <w:top w:val="single" w:color="BFBFBF" w:sz="4"/>
+              <w:left w:val="single" w:color="BFBFBF" w:sz="4"/>
+              <w:bottom w:val="single" w:color="BFBFBF" w:sz="4"/>
+              <w:right w:val="single" w:color="BFBFBF" w:sz="4"/>
+            </w:tcBorders>
+            <w:shd w:fill="FFFFFF" w:val="clear"/>
+            <w:tcMar>
+              <w:top w:type="dxa" w:w="50"/>
+              <w:left w:type="dxa" w:w="70"/>
+              <w:bottom w:type="dxa" w:w="50"/>
+              <w:right w:type="dxa" w:w="70"/>
+            </w:tcMar>
+            <w:vAlign w:val="center"/>
+          </w:tcPr>
+          <w:p>
+            <w:pPr>
+              <w:spacing w:after="0" w:before="0"/>
+              <w:jc w:val="left"/>
+            </w:pPr>
+            <w:r>
+              <w:rPr>
+                <w:rFonts w:ascii="Times New Roman" w:cs="Times New Roman" w:eastAsia="Times New Roman" w:hAnsi="Times New Roman"/>
+                <w:b w:val="false"/>
+                <w:bCs w:val="false"/>
+                <w:i w:val="false"/>
+                <w:iCs w:val="false"/>
+                <w:smallCaps w:val="false"/>
+                <w:color w:val="000000"/>
+                <w:sz w:val="17"/>
+                <w:szCs w:val="17"/>
+              </w:rPr>
+              <w:t xml:space="preserve">T = 2, clean</w:t>
+            </w:r>
+          </w:p>
+        </w:tc>
+        <w:tc>
+          <w:tcPr>
+            <w:tcW w:type="dxa" w:w="1100"/>
+            <w:tcBorders>
+              <w:top w:val="single" w:color="BFBFBF" w:sz="4"/>
+              <w:left w:val="single" w:color="BFBFBF" w:sz="4"/>
+              <w:bottom w:val="single" w:color="BFBFBF" w:sz="4"/>
+              <w:right w:val="single" w:color="BFBFBF" w:sz="4"/>
+            </w:tcBorders>
+            <w:shd w:fill="FFFFFF" w:val="clear"/>
+            <w:tcMar>
+              <w:top w:type="dxa" w:w="50"/>
+              <w:left w:type="dxa" w:w="70"/>
+              <w:bottom w:type="dxa" w:w="50"/>
+              <w:right w:type="dxa" w:w="70"/>
+            </w:tcMar>
+            <w:vAlign w:val="center"/>
+          </w:tcPr>
+          <w:p>
+            <w:pPr>
+              <w:spacing w:after="0" w:before="0"/>
+              <w:jc w:val="left"/>
+            </w:pPr>
+            <w:r>
+              <w:rPr>
+                <w:rFonts w:ascii="Times New Roman" w:cs="Times New Roman" w:eastAsia="Times New Roman" w:hAnsi="Times New Roman"/>
+                <w:b w:val="false"/>
+                <w:bCs w:val="false"/>
+                <w:i w:val="false"/>
+                <w:iCs w:val="false"/>
+                <w:smallCaps w:val="false"/>
+                <w:color w:val="000000"/>
+                <w:sz w:val="17"/>
+                <w:szCs w:val="17"/>
+              </w:rPr>
+              <w:t xml:space="preserve">0.38</w:t>
+            </w:r>
+          </w:p>
+        </w:tc>
+        <w:tc>
+          <w:tcPr>
+            <w:tcW w:type="dxa" w:w="1100"/>
+            <w:tcBorders>
+              <w:top w:val="single" w:color="BFBFBF" w:sz="4"/>
+              <w:left w:val="single" w:color="BFBFBF" w:sz="4"/>
+              <w:bottom w:val="single" w:color="BFBFBF" w:sz="4"/>
+              <w:right w:val="single" w:color="BFBFBF" w:sz="4"/>
+            </w:tcBorders>
+            <w:shd w:fill="FFFFFF" w:val="clear"/>
+            <w:tcMar>
+              <w:top w:type="dxa" w:w="50"/>
+              <w:left w:type="dxa" w:w="70"/>
+              <w:bottom w:type="dxa" w:w="50"/>
+              <w:right w:type="dxa" w:w="70"/>
+            </w:tcMar>
+            <w:vAlign w:val="center"/>
+          </w:tcPr>
+          <w:p>
+            <w:pPr>
+              <w:spacing w:after="0" w:before="0"/>
+              <w:jc w:val="left"/>
+            </w:pPr>
+            <w:r>
+              <w:rPr>
+                <w:rFonts w:ascii="Times New Roman" w:cs="Times New Roman" w:eastAsia="Times New Roman" w:hAnsi="Times New Roman"/>
+                <w:b w:val="false"/>
+                <w:bCs w:val="false"/>
+                <w:i w:val="false"/>
+                <w:iCs w:val="false"/>
+                <w:smallCaps w:val="false"/>
+                <w:color w:val="000000"/>
+                <w:sz w:val="17"/>
+                <w:szCs w:val="17"/>
+              </w:rPr>
+              <w:t xml:space="preserve">0.03</w:t>
+            </w:r>
+          </w:p>
+        </w:tc>
+        <w:tc>
+          <w:tcPr>
+            <w:tcW w:type="dxa" w:w="1100"/>
+            <w:tcBorders>
+              <w:top w:val="single" w:color="BFBFBF" w:sz="4"/>
+              <w:left w:val="single" w:color="BFBFBF" w:sz="4"/>
+              <w:bottom w:val="single" w:color="BFBFBF" w:sz="4"/>
+              <w:right w:val="single" w:color="BFBFBF" w:sz="4"/>
+            </w:tcBorders>
+            <w:shd w:fill="FFFFFF" w:val="clear"/>
+            <w:tcMar>
+              <w:top w:type="dxa" w:w="50"/>
+              <w:left w:type="dxa" w:w="70"/>
+              <w:bottom w:type="dxa" w:w="50"/>
+              <w:right w:type="dxa" w:w="70"/>
+            </w:tcMar>
+            <w:vAlign w:val="center"/>
+          </w:tcPr>
+          <w:p>
+            <w:pPr>
+              <w:spacing w:after="0" w:before="0"/>
+              <w:jc w:val="left"/>
+            </w:pPr>
+            <w:r>
+              <w:rPr>
+                <w:rFonts w:ascii="Times New Roman" w:cs="Times New Roman" w:eastAsia="Times New Roman" w:hAnsi="Times New Roman"/>
+                <w:b w:val="false"/>
+                <w:bCs w:val="false"/>
+                <w:i w:val="false"/>
+                <w:iCs w:val="false"/>
+                <w:smallCaps w:val="false"/>
+                <w:color w:val="000000"/>
+                <w:sz w:val="17"/>
+                <w:szCs w:val="17"/>
+              </w:rPr>
+              <w:t xml:space="preserve">0.22</w:t>
+            </w:r>
+          </w:p>
+        </w:tc>
+        <w:tc>
+          <w:tcPr>
+            <w:tcW w:type="dxa" w:w="1100"/>
+            <w:tcBorders>
+              <w:top w:val="single" w:color="BFBFBF" w:sz="4"/>
+              <w:left w:val="single" w:color="BFBFBF" w:sz="4"/>
+              <w:bottom w:val="single" w:color="BFBFBF" w:sz="4"/>
+              <w:right w:val="single" w:color="BFBFBF" w:sz="4"/>
+            </w:tcBorders>
+            <w:shd w:fill="FFFFFF" w:val="clear"/>
+            <w:tcMar>
+              <w:top w:type="dxa" w:w="50"/>
+              <w:left w:type="dxa" w:w="70"/>
+              <w:bottom w:type="dxa" w:w="50"/>
+              <w:right w:type="dxa" w:w="70"/>
+            </w:tcMar>
+            <w:vAlign w:val="center"/>
+          </w:tcPr>
+          <w:p>
+            <w:pPr>
+              <w:spacing w:after="0" w:before="0"/>
+              <w:jc w:val="left"/>
+            </w:pPr>
+            <w:r>
+              <w:rPr>
+                <w:rFonts w:ascii="Times New Roman" w:cs="Times New Roman" w:eastAsia="Times New Roman" w:hAnsi="Times New Roman"/>
+                <w:b w:val="false"/>
+                <w:bCs w:val="false"/>
+                <w:i w:val="false"/>
+                <w:iCs w:val="false"/>
+                <w:smallCaps w:val="false"/>
+                <w:color w:val="000000"/>
+                <w:sz w:val="17"/>
+                <w:szCs w:val="17"/>
+              </w:rPr>
+              <w:t xml:space="preserve">0.51</w:t>
+            </w:r>
+          </w:p>
+        </w:tc>
+        <w:tc>
+          <w:tcPr>
+            <w:tcW w:type="dxa" w:w="1100"/>
+            <w:tcBorders>
+              <w:top w:val="single" w:color="BFBFBF" w:sz="4"/>
+              <w:left w:val="single" w:color="BFBFBF" w:sz="4"/>
+              <w:bottom w:val="single" w:color="BFBFBF" w:sz="4"/>
+              <w:right w:val="single" w:color="BFBFBF" w:sz="4"/>
+            </w:tcBorders>
+            <w:shd w:fill="FFFFFF" w:val="clear"/>
+            <w:tcMar>
+              <w:top w:type="dxa" w:w="50"/>
+              <w:left w:type="dxa" w:w="70"/>
+              <w:bottom w:type="dxa" w:w="50"/>
+              <w:right w:type="dxa" w:w="70"/>
+            </w:tcMar>
+            <w:vAlign w:val="center"/>
+          </w:tcPr>
+          <w:p>
+            <w:pPr>
+              <w:spacing w:after="0" w:before="0"/>
+              <w:jc w:val="left"/>
+            </w:pPr>
+            <w:r>
+              <w:rPr>
+                <w:rFonts w:ascii="Times New Roman" w:cs="Times New Roman" w:eastAsia="Times New Roman" w:hAnsi="Times New Roman"/>
+                <w:b w:val="false"/>
+                <w:bCs w:val="false"/>
+                <w:i w:val="false"/>
+                <w:iCs w:val="false"/>
+                <w:smallCaps w:val="false"/>
+                <w:color w:val="000000"/>
+                <w:sz w:val="17"/>
+                <w:szCs w:val="17"/>
+              </w:rPr>
+              <w:t xml:space="preserve">1.98</w:t>
+            </w:r>
+          </w:p>
+        </w:tc>
+        <w:tc>
+          <w:tcPr>
+            <w:tcW w:type="dxa" w:w="1100"/>
+            <w:tcBorders>
+              <w:top w:val="single" w:color="BFBFBF" w:sz="4"/>
+              <w:left w:val="single" w:color="BFBFBF" w:sz="4"/>
+              <w:bottom w:val="single" w:color="BFBFBF" w:sz="4"/>
+              <w:right w:val="single" w:color="BFBFBF" w:sz="4"/>
+            </w:tcBorders>
+            <w:shd w:fill="FFFFFF" w:val="clear"/>
+            <w:tcMar>
+              <w:top w:type="dxa" w:w="50"/>
+              <w:left w:type="dxa" w:w="70"/>
+              <w:bottom w:type="dxa" w:w="50"/>
+              <w:right w:type="dxa" w:w="70"/>
+            </w:tcMar>
+            <w:vAlign w:val="center"/>
+          </w:tcPr>
+          <w:p>
+            <w:pPr>
+              <w:spacing w:after="0" w:before="0"/>
+              <w:jc w:val="left"/>
+            </w:pPr>
+            <w:r>
+              <w:rPr>
+                <w:rFonts w:ascii="Times New Roman" w:cs="Times New Roman" w:eastAsia="Times New Roman" w:hAnsi="Times New Roman"/>
+                <w:b w:val="false"/>
+                <w:bCs w:val="false"/>
+                <w:i w:val="false"/>
+                <w:iCs w:val="false"/>
+                <w:smallCaps w:val="false"/>
+                <w:color w:val="000000"/>
+                <w:sz w:val="17"/>
+                <w:szCs w:val="17"/>
+              </w:rPr>
+              <w:t xml:space="preserve">−0.02</w:t>
+            </w:r>
+          </w:p>
+        </w:tc>
+      </w:tr>
+      <w:tr>
+        <w:trPr>
+          <w:cantSplit/>
+          <w:tblHeader w:val="false"/>
+        </w:trPr>
+        <w:tc>
+          <w:tcPr>
+            <w:tcW w:type="dxa" w:w="2760"/>
+            <w:tcBorders>
+              <w:top w:val="single" w:color="BFBFBF" w:sz="4"/>
+              <w:left w:val="single" w:color="BFBFBF" w:sz="4"/>
+              <w:bottom w:val="single" w:color="BFBFBF" w:sz="4"/>
+              <w:right w:val="single" w:color="BFBFBF" w:sz="4"/>
+            </w:tcBorders>
+            <w:shd w:fill="FFFFFF" w:val="clear"/>
+            <w:tcMar>
+              <w:top w:type="dxa" w:w="50"/>
+              <w:left w:type="dxa" w:w="70"/>
+              <w:bottom w:type="dxa" w:w="50"/>
+              <w:right w:type="dxa" w:w="70"/>
+            </w:tcMar>
+            <w:vAlign w:val="center"/>
+          </w:tcPr>
+          <w:p>
+            <w:pPr>
+              <w:spacing w:after="0" w:before="0"/>
+              <w:jc w:val="left"/>
+            </w:pPr>
+            <w:r>
+              <w:rPr>
+                <w:rFonts w:ascii="Times New Roman" w:cs="Times New Roman" w:eastAsia="Times New Roman" w:hAnsi="Times New Roman"/>
+                <w:b w:val="false"/>
+                <w:bCs w:val="false"/>
+                <w:i w:val="false"/>
+                <w:iCs w:val="false"/>
+                <w:smallCaps w:val="false"/>
+                <w:color w:val="000000"/>
+                <w:sz w:val="17"/>
+                <w:szCs w:val="17"/>
+              </w:rPr>
+              <w:t xml:space="preserve">T = 2, pressure</w:t>
+            </w:r>
+          </w:p>
+        </w:tc>
+        <w:tc>
+          <w:tcPr>
+            <w:tcW w:type="dxa" w:w="1100"/>
+            <w:tcBorders>
+              <w:top w:val="single" w:color="BFBFBF" w:sz="4"/>
+              <w:left w:val="single" w:color="BFBFBF" w:sz="4"/>
+              <w:bottom w:val="single" w:color="BFBFBF" w:sz="4"/>
+              <w:right w:val="single" w:color="BFBFBF" w:sz="4"/>
+            </w:tcBorders>
+            <w:shd w:fill="FFFFFF" w:val="clear"/>
+            <w:tcMar>
+              <w:top w:type="dxa" w:w="50"/>
+              <w:left w:type="dxa" w:w="70"/>
+              <w:bottom w:type="dxa" w:w="50"/>
+              <w:right w:type="dxa" w:w="70"/>
+            </w:tcMar>
+            <w:vAlign w:val="center"/>
+          </w:tcPr>
+          <w:p>
+            <w:pPr>
+              <w:spacing w:after="0" w:before="0"/>
+              <w:jc w:val="left"/>
+            </w:pPr>
+            <w:r>
+              <w:rPr>
+                <w:rFonts w:ascii="Times New Roman" w:cs="Times New Roman" w:eastAsia="Times New Roman" w:hAnsi="Times New Roman"/>
+                <w:b w:val="false"/>
+                <w:bCs w:val="false"/>
+                <w:i w:val="false"/>
+                <w:iCs w:val="false"/>
+                <w:smallCaps w:val="false"/>
+                <w:color w:val="000000"/>
+                <w:sz w:val="17"/>
+                <w:szCs w:val="17"/>
+              </w:rPr>
+              <w:t xml:space="preserve">0.23</w:t>
+            </w:r>
+          </w:p>
+        </w:tc>
+        <w:tc>
+          <w:tcPr>
+            <w:tcW w:type="dxa" w:w="1100"/>
+            <w:tcBorders>
+              <w:top w:val="single" w:color="BFBFBF" w:sz="4"/>
+              <w:left w:val="single" w:color="BFBFBF" w:sz="4"/>
+              <w:bottom w:val="single" w:color="BFBFBF" w:sz="4"/>
+              <w:right w:val="single" w:color="BFBFBF" w:sz="4"/>
+            </w:tcBorders>
+            <w:shd w:fill="FFFFFF" w:val="clear"/>
+            <w:tcMar>
+              <w:top w:type="dxa" w:w="50"/>
+              <w:left w:type="dxa" w:w="70"/>
+              <w:bottom w:type="dxa" w:w="50"/>
+              <w:right w:type="dxa" w:w="70"/>
+            </w:tcMar>
+            <w:vAlign w:val="center"/>
+          </w:tcPr>
+          <w:p>
+            <w:pPr>
+              <w:spacing w:after="0" w:before="0"/>
+              <w:jc w:val="left"/>
+            </w:pPr>
+            <w:r>
+              <w:rPr>
+                <w:rFonts w:ascii="Times New Roman" w:cs="Times New Roman" w:eastAsia="Times New Roman" w:hAnsi="Times New Roman"/>
+                <w:b w:val="false"/>
+                <w:bCs w:val="false"/>
+                <w:i w:val="false"/>
+                <w:iCs w:val="false"/>
+                <w:smallCaps w:val="false"/>
+                <w:color w:val="000000"/>
+                <w:sz w:val="17"/>
+                <w:szCs w:val="17"/>
+              </w:rPr>
+              <w:t xml:space="preserve">0.00</w:t>
+            </w:r>
+          </w:p>
+        </w:tc>
+        <w:tc>
+          <w:tcPr>
+            <w:tcW w:type="dxa" w:w="1100"/>
+            <w:tcBorders>
+              <w:top w:val="single" w:color="BFBFBF" w:sz="4"/>
+              <w:left w:val="single" w:color="BFBFBF" w:sz="4"/>
+              <w:bottom w:val="single" w:color="BFBFBF" w:sz="4"/>
+              <w:right w:val="single" w:color="BFBFBF" w:sz="4"/>
+            </w:tcBorders>
+            <w:shd w:fill="FFFFFF" w:val="clear"/>
+            <w:tcMar>
+              <w:top w:type="dxa" w:w="50"/>
+              <w:left w:type="dxa" w:w="70"/>
+              <w:bottom w:type="dxa" w:w="50"/>
+              <w:right w:type="dxa" w:w="70"/>
+            </w:tcMar>
+            <w:vAlign w:val="center"/>
+          </w:tcPr>
+          <w:p>
+            <w:pPr>
+              <w:spacing w:after="0" w:before="0"/>
+              <w:jc w:val="left"/>
+            </w:pPr>
+            <w:r>
+              <w:rPr>
+                <w:rFonts w:ascii="Times New Roman" w:cs="Times New Roman" w:eastAsia="Times New Roman" w:hAnsi="Times New Roman"/>
+                <w:b w:val="false"/>
+                <w:bCs w:val="false"/>
+                <w:i w:val="false"/>
+                <w:iCs w:val="false"/>
+                <w:smallCaps w:val="false"/>
+                <w:color w:val="000000"/>
+                <w:sz w:val="17"/>
+                <w:szCs w:val="17"/>
+              </w:rPr>
+              <w:t xml:space="preserve">0.35</w:t>
+            </w:r>
+          </w:p>
+        </w:tc>
+        <w:tc>
+          <w:tcPr>
+            <w:tcW w:type="dxa" w:w="1100"/>
+            <w:tcBorders>
+              <w:top w:val="single" w:color="BFBFBF" w:sz="4"/>
+              <w:left w:val="single" w:color="BFBFBF" w:sz="4"/>
+              <w:bottom w:val="single" w:color="BFBFBF" w:sz="4"/>
+              <w:right w:val="single" w:color="BFBFBF" w:sz="4"/>
+            </w:tcBorders>
+            <w:shd w:fill="FFFFFF" w:val="clear"/>
+            <w:tcMar>
+              <w:top w:type="dxa" w:w="50"/>
+              <w:left w:type="dxa" w:w="70"/>
+              <w:bottom w:type="dxa" w:w="50"/>
+              <w:right w:type="dxa" w:w="70"/>
+            </w:tcMar>
+            <w:vAlign w:val="center"/>
+          </w:tcPr>
+          <w:p>
+            <w:pPr>
+              <w:spacing w:after="0" w:before="0"/>
+              <w:jc w:val="left"/>
+            </w:pPr>
+            <w:r>
+              <w:rPr>
+                <w:rFonts w:ascii="Times New Roman" w:cs="Times New Roman" w:eastAsia="Times New Roman" w:hAnsi="Times New Roman"/>
+                <w:b w:val="false"/>
+                <w:bCs w:val="false"/>
+                <w:i w:val="false"/>
+                <w:iCs w:val="false"/>
+                <w:smallCaps w:val="false"/>
+                <w:color w:val="000000"/>
+                <w:sz w:val="17"/>
+                <w:szCs w:val="17"/>
+              </w:rPr>
+              <w:t xml:space="preserve">0.60</w:t>
+            </w:r>
+          </w:p>
+        </w:tc>
+        <w:tc>
+          <w:tcPr>
+            <w:tcW w:type="dxa" w:w="1100"/>
+            <w:tcBorders>
+              <w:top w:val="single" w:color="BFBFBF" w:sz="4"/>
+              <w:left w:val="single" w:color="BFBFBF" w:sz="4"/>
+              <w:bottom w:val="single" w:color="BFBFBF" w:sz="4"/>
+              <w:right w:val="single" w:color="BFBFBF" w:sz="4"/>
+            </w:tcBorders>
+            <w:shd w:fill="FFFFFF" w:val="clear"/>
+            <w:tcMar>
+              <w:top w:type="dxa" w:w="50"/>
+              <w:left w:type="dxa" w:w="70"/>
+              <w:bottom w:type="dxa" w:w="50"/>
+              <w:right w:type="dxa" w:w="70"/>
+            </w:tcMar>
+            <w:vAlign w:val="center"/>
+          </w:tcPr>
+          <w:p>
+            <w:pPr>
+              <w:spacing w:after="0" w:before="0"/>
+              <w:jc w:val="left"/>
+            </w:pPr>
+            <w:r>
+              <w:rPr>
+                <w:rFonts w:ascii="Times New Roman" w:cs="Times New Roman" w:eastAsia="Times New Roman" w:hAnsi="Times New Roman"/>
+                <w:b w:val="false"/>
+                <w:bCs w:val="false"/>
+                <w:i w:val="false"/>
+                <w:iCs w:val="false"/>
+                <w:smallCaps w:val="false"/>
+                <w:color w:val="000000"/>
+                <w:sz w:val="17"/>
+                <w:szCs w:val="17"/>
+              </w:rPr>
+              <w:t xml:space="preserve">2.04</w:t>
+            </w:r>
+          </w:p>
+        </w:tc>
+        <w:tc>
+          <w:tcPr>
+            <w:tcW w:type="dxa" w:w="1100"/>
+            <w:tcBorders>
+              <w:top w:val="single" w:color="BFBFBF" w:sz="4"/>
+              <w:left w:val="single" w:color="BFBFBF" w:sz="4"/>
+              <w:bottom w:val="single" w:color="BFBFBF" w:sz="4"/>
+              <w:right w:val="single" w:color="BFBFBF" w:sz="4"/>
+            </w:tcBorders>
+            <w:shd w:fill="FFFFFF" w:val="clear"/>
+            <w:tcMar>
+              <w:top w:type="dxa" w:w="50"/>
+              <w:left w:type="dxa" w:w="70"/>
+              <w:bottom w:type="dxa" w:w="50"/>
+              <w:right w:type="dxa" w:w="70"/>
+            </w:tcMar>
+            <w:vAlign w:val="center"/>
+          </w:tcPr>
+          <w:p>
+            <w:pPr>
+              <w:spacing w:after="0" w:before="0"/>
+              <w:jc w:val="left"/>
+            </w:pPr>
+            <w:r>
+              <w:rPr>
+                <w:rFonts w:ascii="Times New Roman" w:cs="Times New Roman" w:eastAsia="Times New Roman" w:hAnsi="Times New Roman"/>
+                <w:b w:val="false"/>
+                <w:bCs w:val="false"/>
+                <w:i w:val="false"/>
+                <w:iCs w:val="false"/>
+                <w:smallCaps w:val="false"/>
+                <w:color w:val="000000"/>
+                <w:sz w:val="17"/>
+                <w:szCs w:val="17"/>
+              </w:rPr>
+              <w:t xml:space="preserve">+0.04</w:t>
+            </w:r>
+          </w:p>
+        </w:tc>
+      </w:tr>
+      <w:tr>
+        <w:trPr>
+          <w:cantSplit/>
+          <w:tblHeader w:val="false"/>
+        </w:trPr>
+        <w:tc>
+          <w:tcPr>
+            <w:tcW w:type="dxa" w:w="2760"/>
+            <w:tcBorders>
+              <w:top w:val="single" w:color="BFBFBF" w:sz="4"/>
+              <w:left w:val="single" w:color="BFBFBF" w:sz="4"/>
+              <w:bottom w:val="single" w:color="BFBFBF" w:sz="4"/>
+              <w:right w:val="single" w:color="BFBFBF" w:sz="4"/>
+            </w:tcBorders>
+            <w:shd w:fill="FFFFFF" w:val="clear"/>
+            <w:tcMar>
+              <w:top w:type="dxa" w:w="50"/>
+              <w:left w:type="dxa" w:w="70"/>
+              <w:bottom w:type="dxa" w:w="50"/>
+              <w:right w:type="dxa" w:w="70"/>
+            </w:tcMar>
+            <w:vAlign w:val="center"/>
+          </w:tcPr>
+          <w:p>
+            <w:pPr>
+              <w:spacing w:after="0" w:before="0"/>
+              <w:jc w:val="left"/>
+            </w:pPr>
+            <w:r>
+              <w:rPr>
+                <w:rFonts w:ascii="Times New Roman" w:cs="Times New Roman" w:eastAsia="Times New Roman" w:hAnsi="Times New Roman"/>
+                <w:b w:val="false"/>
+                <w:bCs w:val="false"/>
+                <w:i w:val="false"/>
+                <w:iCs w:val="false"/>
+                <w:smallCaps w:val="false"/>
+                <w:color w:val="000000"/>
+                <w:sz w:val="17"/>
+                <w:szCs w:val="17"/>
+              </w:rPr>
+              <w:t xml:space="preserve">T = 2, contamination</w:t>
+            </w:r>
+          </w:p>
+        </w:tc>
+        <w:tc>
+          <w:tcPr>
+            <w:tcW w:type="dxa" w:w="1100"/>
+            <w:tcBorders>
+              <w:top w:val="single" w:color="BFBFBF" w:sz="4"/>
+              <w:left w:val="single" w:color="BFBFBF" w:sz="4"/>
+              <w:bottom w:val="single" w:color="BFBFBF" w:sz="4"/>
+              <w:right w:val="single" w:color="BFBFBF" w:sz="4"/>
+            </w:tcBorders>
+            <w:shd w:fill="FFFFFF" w:val="clear"/>
+            <w:tcMar>
+              <w:top w:type="dxa" w:w="50"/>
+              <w:left w:type="dxa" w:w="70"/>
+              <w:bottom w:type="dxa" w:w="50"/>
+              <w:right w:type="dxa" w:w="70"/>
+            </w:tcMar>
+            <w:vAlign w:val="center"/>
+          </w:tcPr>
+          <w:p>
+            <w:pPr>
+              <w:spacing w:after="0" w:before="0"/>
+              <w:jc w:val="left"/>
+            </w:pPr>
+            <w:r>
+              <w:rPr>
+                <w:rFonts w:ascii="Times New Roman" w:cs="Times New Roman" w:eastAsia="Times New Roman" w:hAnsi="Times New Roman"/>
+                <w:b w:val="false"/>
+                <w:bCs w:val="false"/>
+                <w:i w:val="false"/>
+                <w:iCs w:val="false"/>
+                <w:smallCaps w:val="false"/>
+                <w:color w:val="000000"/>
+                <w:sz w:val="17"/>
+                <w:szCs w:val="17"/>
+              </w:rPr>
+              <w:t xml:space="preserve">0.32</w:t>
+            </w:r>
+          </w:p>
+        </w:tc>
+        <w:tc>
+          <w:tcPr>
+            <w:tcW w:type="dxa" w:w="1100"/>
+            <w:tcBorders>
+              <w:top w:val="single" w:color="BFBFBF" w:sz="4"/>
+              <w:left w:val="single" w:color="BFBFBF" w:sz="4"/>
+              <w:bottom w:val="single" w:color="BFBFBF" w:sz="4"/>
+              <w:right w:val="single" w:color="BFBFBF" w:sz="4"/>
+            </w:tcBorders>
+            <w:shd w:fill="FFFFFF" w:val="clear"/>
+            <w:tcMar>
+              <w:top w:type="dxa" w:w="50"/>
+              <w:left w:type="dxa" w:w="70"/>
+              <w:bottom w:type="dxa" w:w="50"/>
+              <w:right w:type="dxa" w:w="70"/>
+            </w:tcMar>
+            <w:vAlign w:val="center"/>
+          </w:tcPr>
+          <w:p>
+            <w:pPr>
+              <w:spacing w:after="0" w:before="0"/>
+              <w:jc w:val="left"/>
+            </w:pPr>
+            <w:r>
+              <w:rPr>
+                <w:rFonts w:ascii="Times New Roman" w:cs="Times New Roman" w:eastAsia="Times New Roman" w:hAnsi="Times New Roman"/>
+                <w:b w:val="false"/>
+                <w:bCs w:val="false"/>
+                <w:i w:val="false"/>
+                <w:iCs w:val="false"/>
+                <w:smallCaps w:val="false"/>
+                <w:color w:val="000000"/>
+                <w:sz w:val="17"/>
+                <w:szCs w:val="17"/>
+              </w:rPr>
+              <w:t xml:space="preserve">0.07</w:t>
+            </w:r>
+          </w:p>
+        </w:tc>
+        <w:tc>
+          <w:tcPr>
+            <w:tcW w:type="dxa" w:w="1100"/>
+            <w:tcBorders>
+              <w:top w:val="single" w:color="BFBFBF" w:sz="4"/>
+              <w:left w:val="single" w:color="BFBFBF" w:sz="4"/>
+              <w:bottom w:val="single" w:color="BFBFBF" w:sz="4"/>
+              <w:right w:val="single" w:color="BFBFBF" w:sz="4"/>
+            </w:tcBorders>
+            <w:shd w:fill="FFFFFF" w:val="clear"/>
+            <w:tcMar>
+              <w:top w:type="dxa" w:w="50"/>
+              <w:left w:type="dxa" w:w="70"/>
+              <w:bottom w:type="dxa" w:w="50"/>
+              <w:right w:type="dxa" w:w="70"/>
+            </w:tcMar>
+            <w:vAlign w:val="center"/>
+          </w:tcPr>
+          <w:p>
+            <w:pPr>
+              <w:spacing w:after="0" w:before="0"/>
+              <w:jc w:val="left"/>
+            </w:pPr>
+            <w:r>
+              <w:rPr>
+                <w:rFonts w:ascii="Times New Roman" w:cs="Times New Roman" w:eastAsia="Times New Roman" w:hAnsi="Times New Roman"/>
+                <w:b w:val="false"/>
+                <w:bCs w:val="false"/>
+                <w:i w:val="false"/>
+                <w:iCs w:val="false"/>
+                <w:smallCaps w:val="false"/>
+                <w:color w:val="000000"/>
+                <w:sz w:val="17"/>
+                <w:szCs w:val="17"/>
+              </w:rPr>
+              <w:t xml:space="preserve">0.37</w:t>
+            </w:r>
+          </w:p>
+        </w:tc>
+        <w:tc>
+          <w:tcPr>
+            <w:tcW w:type="dxa" w:w="1100"/>
+            <w:tcBorders>
+              <w:top w:val="single" w:color="BFBFBF" w:sz="4"/>
+              <w:left w:val="single" w:color="BFBFBF" w:sz="4"/>
+              <w:bottom w:val="single" w:color="BFBFBF" w:sz="4"/>
+              <w:right w:val="single" w:color="BFBFBF" w:sz="4"/>
+            </w:tcBorders>
+            <w:shd w:fill="FFFFFF" w:val="clear"/>
+            <w:tcMar>
+              <w:top w:type="dxa" w:w="50"/>
+              <w:left w:type="dxa" w:w="70"/>
+              <w:bottom w:type="dxa" w:w="50"/>
+              <w:right w:type="dxa" w:w="70"/>
+            </w:tcMar>
+            <w:vAlign w:val="center"/>
+          </w:tcPr>
+          <w:p>
+            <w:pPr>
+              <w:spacing w:after="0" w:before="0"/>
+              <w:jc w:val="left"/>
+            </w:pPr>
+            <w:r>
+              <w:rPr>
+                <w:rFonts w:ascii="Times New Roman" w:cs="Times New Roman" w:eastAsia="Times New Roman" w:hAnsi="Times New Roman"/>
+                <w:b w:val="false"/>
+                <w:bCs w:val="false"/>
+                <w:i w:val="false"/>
+                <w:iCs w:val="false"/>
+                <w:smallCaps w:val="false"/>
+                <w:color w:val="000000"/>
+                <w:sz w:val="17"/>
+                <w:szCs w:val="17"/>
+              </w:rPr>
+              <w:t xml:space="preserve">0.57</w:t>
+            </w:r>
+          </w:p>
+        </w:tc>
+        <w:tc>
+          <w:tcPr>
+            <w:tcW w:type="dxa" w:w="1100"/>
+            <w:tcBorders>
+              <w:top w:val="single" w:color="BFBFBF" w:sz="4"/>
+              <w:left w:val="single" w:color="BFBFBF" w:sz="4"/>
+              <w:bottom w:val="single" w:color="BFBFBF" w:sz="4"/>
+              <w:right w:val="single" w:color="BFBFBF" w:sz="4"/>
+            </w:tcBorders>
+            <w:shd w:fill="FFFFFF" w:val="clear"/>
+            <w:tcMar>
+              <w:top w:type="dxa" w:w="50"/>
+              <w:left w:type="dxa" w:w="70"/>
+              <w:bottom w:type="dxa" w:w="50"/>
+              <w:right w:type="dxa" w:w="70"/>
+            </w:tcMar>
+            <w:vAlign w:val="center"/>
+          </w:tcPr>
+          <w:p>
+            <w:pPr>
+              <w:spacing w:after="0" w:before="0"/>
+              <w:jc w:val="left"/>
+            </w:pPr>
+            <w:r>
+              <w:rPr>
+                <w:rFonts w:ascii="Times New Roman" w:cs="Times New Roman" w:eastAsia="Times New Roman" w:hAnsi="Times New Roman"/>
+                <w:b w:val="false"/>
+                <w:bCs w:val="false"/>
+                <w:i w:val="false"/>
+                <w:iCs w:val="false"/>
+                <w:smallCaps w:val="false"/>
+                <w:color w:val="000000"/>
+                <w:sz w:val="17"/>
+                <w:szCs w:val="17"/>
+              </w:rPr>
+              <w:t xml:space="preserve">1.87</w:t>
+            </w:r>
+          </w:p>
+        </w:tc>
+        <w:tc>
+          <w:tcPr>
+            <w:tcW w:type="dxa" w:w="1100"/>
+            <w:tcBorders>
+              <w:top w:val="single" w:color="BFBFBF" w:sz="4"/>
+              <w:left w:val="single" w:color="BFBFBF" w:sz="4"/>
+              <w:bottom w:val="single" w:color="BFBFBF" w:sz="4"/>
+              <w:right w:val="single" w:color="BFBFBF" w:sz="4"/>
+            </w:tcBorders>
+            <w:shd w:fill="FFFFFF" w:val="clear"/>
+            <w:tcMar>
+              <w:top w:type="dxa" w:w="50"/>
+              <w:left w:type="dxa" w:w="70"/>
+              <w:bottom w:type="dxa" w:w="50"/>
+              <w:right w:type="dxa" w:w="70"/>
+            </w:tcMar>
+            <w:vAlign w:val="center"/>
+          </w:tcPr>
+          <w:p>
+            <w:pPr>
+              <w:spacing w:after="0" w:before="0"/>
+              <w:jc w:val="left"/>
+            </w:pPr>
+            <w:r>
+              <w:rPr>
+                <w:rFonts w:ascii="Times New Roman" w:cs="Times New Roman" w:eastAsia="Times New Roman" w:hAnsi="Times New Roman"/>
+                <w:b w:val="false"/>
+                <w:bCs w:val="false"/>
+                <w:i w:val="false"/>
+                <w:iCs w:val="false"/>
+                <w:smallCaps w:val="false"/>
+                <w:color w:val="000000"/>
+                <w:sz w:val="17"/>
+                <w:szCs w:val="17"/>
+              </w:rPr>
+              <w:t xml:space="preserve">−0.13</w:t>
+            </w:r>
+          </w:p>
+        </w:tc>
+      </w:tr>
+      <w:tr>
+        <w:trPr>
+          <w:cantSplit/>
+          <w:tblHeader w:val="false"/>
+        </w:trPr>
+        <w:tc>
+          <w:tcPr>
+            <w:tcW w:type="dxa" w:w="2760"/>
+            <w:tcBorders>
+              <w:top w:val="single" w:color="BFBFBF" w:sz="4"/>
+              <w:left w:val="single" w:color="BFBFBF" w:sz="4"/>
+              <w:bottom w:val="single" w:color="BFBFBF" w:sz="4"/>
+              <w:right w:val="single" w:color="BFBFBF" w:sz="4"/>
+            </w:tcBorders>
+            <w:shd w:fill="FFFFFF" w:val="clear"/>
+            <w:tcMar>
+              <w:top w:type="dxa" w:w="50"/>
+              <w:left w:type="dxa" w:w="70"/>
+              <w:bottom w:type="dxa" w:w="50"/>
+              <w:right w:type="dxa" w:w="70"/>
+            </w:tcMar>
+            <w:vAlign w:val="center"/>
+          </w:tcPr>
+          <w:p>
+            <w:pPr>
+              <w:spacing w:after="0" w:before="0"/>
+              <w:jc w:val="left"/>
+            </w:pPr>
+            <w:r>
+              <w:rPr>
+                <w:rFonts w:ascii="Times New Roman" w:cs="Times New Roman" w:eastAsia="Times New Roman" w:hAnsi="Times New Roman"/>
+                <w:b w:val="false"/>
+                <w:bCs w:val="false"/>
+                <w:i w:val="false"/>
+                <w:iCs w:val="false"/>
+                <w:smallCaps w:val="false"/>
+                <w:color w:val="000000"/>
+                <w:sz w:val="17"/>
+                <w:szCs w:val="17"/>
+              </w:rPr>
+              <w:t xml:space="preserve">T = 2, pressure + contamination</w:t>
+            </w:r>
+          </w:p>
+        </w:tc>
+        <w:tc>
+          <w:tcPr>
+            <w:tcW w:type="dxa" w:w="1100"/>
+            <w:tcBorders>
+              <w:top w:val="single" w:color="BFBFBF" w:sz="4"/>
+              <w:left w:val="single" w:color="BFBFBF" w:sz="4"/>
+              <w:bottom w:val="single" w:color="BFBFBF" w:sz="4"/>
+              <w:right w:val="single" w:color="BFBFBF" w:sz="4"/>
+            </w:tcBorders>
+            <w:shd w:fill="FFFFFF" w:val="clear"/>
+            <w:tcMar>
+              <w:top w:type="dxa" w:w="50"/>
+              <w:left w:type="dxa" w:w="70"/>
+              <w:bottom w:type="dxa" w:w="50"/>
+              <w:right w:type="dxa" w:w="70"/>
+            </w:tcMar>
+            <w:vAlign w:val="center"/>
+          </w:tcPr>
+          <w:p>
+            <w:pPr>
+              <w:spacing w:after="0" w:before="0"/>
+              <w:jc w:val="left"/>
+            </w:pPr>
+            <w:r>
+              <w:rPr>
+                <w:rFonts w:ascii="Times New Roman" w:cs="Times New Roman" w:eastAsia="Times New Roman" w:hAnsi="Times New Roman"/>
+                <w:b w:val="false"/>
+                <w:bCs w:val="false"/>
+                <w:i w:val="false"/>
+                <w:iCs w:val="false"/>
+                <w:smallCaps w:val="false"/>
+                <w:color w:val="000000"/>
+                <w:sz w:val="17"/>
+                <w:szCs w:val="17"/>
+              </w:rPr>
+              <w:t xml:space="preserve">0.23</w:t>
+            </w:r>
+          </w:p>
+        </w:tc>
+        <w:tc>
+          <w:tcPr>
+            <w:tcW w:type="dxa" w:w="1100"/>
+            <w:tcBorders>
+              <w:top w:val="single" w:color="BFBFBF" w:sz="4"/>
+              <w:left w:val="single" w:color="BFBFBF" w:sz="4"/>
+              <w:bottom w:val="single" w:color="BFBFBF" w:sz="4"/>
+              <w:right w:val="single" w:color="BFBFBF" w:sz="4"/>
+            </w:tcBorders>
+            <w:shd w:fill="FFFFFF" w:val="clear"/>
+            <w:tcMar>
+              <w:top w:type="dxa" w:w="50"/>
+              <w:left w:type="dxa" w:w="70"/>
+              <w:bottom w:type="dxa" w:w="50"/>
+              <w:right w:type="dxa" w:w="70"/>
+            </w:tcMar>
+            <w:vAlign w:val="center"/>
+          </w:tcPr>
+          <w:p>
+            <w:pPr>
+              <w:spacing w:after="0" w:before="0"/>
+              <w:jc w:val="left"/>
+            </w:pPr>
+            <w:r>
+              <w:rPr>
+                <w:rFonts w:ascii="Times New Roman" w:cs="Times New Roman" w:eastAsia="Times New Roman" w:hAnsi="Times New Roman"/>
+                <w:b w:val="false"/>
+                <w:bCs w:val="false"/>
+                <w:i w:val="false"/>
+                <w:iCs w:val="false"/>
+                <w:smallCaps w:val="false"/>
+                <w:color w:val="000000"/>
+                <w:sz w:val="17"/>
+                <w:szCs w:val="17"/>
+              </w:rPr>
+              <w:t xml:space="preserve">0.00</w:t>
+            </w:r>
+          </w:p>
+        </w:tc>
+        <w:tc>
+          <w:tcPr>
+            <w:tcW w:type="dxa" w:w="1100"/>
+            <w:tcBorders>
+              <w:top w:val="single" w:color="BFBFBF" w:sz="4"/>
+              <w:left w:val="single" w:color="BFBFBF" w:sz="4"/>
+              <w:bottom w:val="single" w:color="BFBFBF" w:sz="4"/>
+              <w:right w:val="single" w:color="BFBFBF" w:sz="4"/>
+            </w:tcBorders>
+            <w:shd w:fill="FFFFFF" w:val="clear"/>
+            <w:tcMar>
+              <w:top w:type="dxa" w:w="50"/>
+              <w:left w:type="dxa" w:w="70"/>
+              <w:bottom w:type="dxa" w:w="50"/>
+              <w:right w:type="dxa" w:w="70"/>
+            </w:tcMar>
+            <w:vAlign w:val="center"/>
+          </w:tcPr>
+          <w:p>
+            <w:pPr>
+              <w:spacing w:after="0" w:before="0"/>
+              <w:jc w:val="left"/>
+            </w:pPr>
+            <w:r>
+              <w:rPr>
+                <w:rFonts w:ascii="Times New Roman" w:cs="Times New Roman" w:eastAsia="Times New Roman" w:hAnsi="Times New Roman"/>
+                <w:b w:val="false"/>
+                <w:bCs w:val="false"/>
+                <w:i w:val="false"/>
+                <w:iCs w:val="false"/>
+                <w:smallCaps w:val="false"/>
+                <w:color w:val="000000"/>
+                <w:sz w:val="17"/>
+                <w:szCs w:val="17"/>
+              </w:rPr>
+              <w:t xml:space="preserve">0.17</w:t>
+            </w:r>
+          </w:p>
+        </w:tc>
+        <w:tc>
+          <w:tcPr>
+            <w:tcW w:type="dxa" w:w="1100"/>
+            <w:tcBorders>
+              <w:top w:val="single" w:color="BFBFBF" w:sz="4"/>
+              <w:left w:val="single" w:color="BFBFBF" w:sz="4"/>
+              <w:bottom w:val="single" w:color="BFBFBF" w:sz="4"/>
+              <w:right w:val="single" w:color="BFBFBF" w:sz="4"/>
+            </w:tcBorders>
+            <w:shd w:fill="FFFFFF" w:val="clear"/>
+            <w:tcMar>
+              <w:top w:type="dxa" w:w="50"/>
+              <w:left w:type="dxa" w:w="70"/>
+              <w:bottom w:type="dxa" w:w="50"/>
+              <w:right w:type="dxa" w:w="70"/>
+            </w:tcMar>
+            <w:vAlign w:val="center"/>
+          </w:tcPr>
+          <w:p>
+            <w:pPr>
+              <w:spacing w:after="0" w:before="0"/>
+              <w:jc w:val="left"/>
+            </w:pPr>
+            <w:r>
+              <w:rPr>
+                <w:rFonts w:ascii="Times New Roman" w:cs="Times New Roman" w:eastAsia="Times New Roman" w:hAnsi="Times New Roman"/>
+                <w:b w:val="false"/>
+                <w:bCs w:val="false"/>
+                <w:i w:val="false"/>
+                <w:iCs w:val="false"/>
+                <w:smallCaps w:val="false"/>
+                <w:color w:val="000000"/>
+                <w:sz w:val="17"/>
+                <w:szCs w:val="17"/>
+              </w:rPr>
+              <w:t xml:space="preserve">0.57</w:t>
+            </w:r>
+          </w:p>
+        </w:tc>
+        <w:tc>
+          <w:tcPr>
+            <w:tcW w:type="dxa" w:w="1100"/>
+            <w:tcBorders>
+              <w:top w:val="single" w:color="BFBFBF" w:sz="4"/>
+              <w:left w:val="single" w:color="BFBFBF" w:sz="4"/>
+              <w:bottom w:val="single" w:color="BFBFBF" w:sz="4"/>
+              <w:right w:val="single" w:color="BFBFBF" w:sz="4"/>
+            </w:tcBorders>
+            <w:shd w:fill="FFFFFF" w:val="clear"/>
+            <w:tcMar>
+              <w:top w:type="dxa" w:w="50"/>
+              <w:left w:type="dxa" w:w="70"/>
+              <w:bottom w:type="dxa" w:w="50"/>
+              <w:right w:type="dxa" w:w="70"/>
+            </w:tcMar>
+            <w:vAlign w:val="center"/>
+          </w:tcPr>
+          <w:p>
+            <w:pPr>
+              <w:spacing w:after="0" w:before="0"/>
+              <w:jc w:val="left"/>
+            </w:pPr>
+            <w:r>
+              <w:rPr>
+                <w:rFonts w:ascii="Times New Roman" w:cs="Times New Roman" w:eastAsia="Times New Roman" w:hAnsi="Times New Roman"/>
+                <w:b w:val="false"/>
+                <w:bCs w:val="false"/>
+                <w:i w:val="false"/>
+                <w:iCs w:val="false"/>
+                <w:smallCaps w:val="false"/>
+                <w:color w:val="000000"/>
+                <w:sz w:val="17"/>
+                <w:szCs w:val="17"/>
+              </w:rPr>
+              <w:t xml:space="preserve">2.29</w:t>
+            </w:r>
+          </w:p>
+        </w:tc>
+        <w:tc>
+          <w:tcPr>
+            <w:tcW w:type="dxa" w:w="1100"/>
+            <w:tcBorders>
+              <w:top w:val="single" w:color="BFBFBF" w:sz="4"/>
+              <w:left w:val="single" w:color="BFBFBF" w:sz="4"/>
+              <w:bottom w:val="single" w:color="BFBFBF" w:sz="4"/>
+              <w:right w:val="single" w:color="BFBFBF" w:sz="4"/>
+            </w:tcBorders>
+            <w:shd w:fill="FFFFFF" w:val="clear"/>
+            <w:tcMar>
+              <w:top w:type="dxa" w:w="50"/>
+              <w:left w:type="dxa" w:w="70"/>
+              <w:bottom w:type="dxa" w:w="50"/>
+              <w:right w:type="dxa" w:w="70"/>
+            </w:tcMar>
+            <w:vAlign w:val="center"/>
+          </w:tcPr>
+          <w:p>
+            <w:pPr>
+              <w:spacing w:after="0" w:before="0"/>
+              <w:jc w:val="left"/>
+            </w:pPr>
+            <w:r>
+              <w:rPr>
+                <w:rFonts w:ascii="Times New Roman" w:cs="Times New Roman" w:eastAsia="Times New Roman" w:hAnsi="Times New Roman"/>
+                <w:b w:val="false"/>
+                <w:bCs w:val="false"/>
+                <w:i w:val="false"/>
+                <w:iCs w:val="false"/>
+                <w:smallCaps w:val="false"/>
+                <w:color w:val="000000"/>
+                <w:sz w:val="17"/>
+                <w:szCs w:val="17"/>
+              </w:rPr>
+              <w:t xml:space="preserve">+0.29</w:t>
+            </w:r>
+          </w:p>
+        </w:tc>
+      </w:tr>
+    </w:tbl>
+    <w:p>
+      <w:pPr>
+        <w:spacing w:after="160" w:before="40"/>
+      </w:pPr>
+      <w:r>
+        <w:rPr>
+          <w:rFonts w:ascii="Times New Roman" w:cs="Times New Roman" w:eastAsia="Times New Roman" w:hAnsi="Times New Roman"/>
+          <w:b w:val="false"/>
+          <w:bCs w:val="false"/>
+          <w:i/>
+          <w:iCs/>
+          <w:smallCaps w:val="false"/>
+          <w:color w:val="000000"/>
+          <w:sz w:val="18"/>
+          <w:szCs w:val="18"/>
+        </w:rPr>
+        <w:t xml:space="preserve">Notes. As Table 8. Teff − T below zero means the choices are more concentrated than the nominal temperature implies.</w:t>
+      </w:r>
+    </w:p>
+    <w:p>
+      <w:pPr>
+        <w:pStyle w:val="Heading2"/>
+        <w:spacing w:after="120" w:before="280"/>
+      </w:pPr>
+      <w:r>
+        <w:rPr>
+          <w:rFonts w:ascii="Times New Roman" w:cs="Times New Roman" w:eastAsia="Times New Roman" w:hAnsi="Times New Roman"/>
+          <w:b/>
+          <w:bCs/>
+          <w:color w:val="1F4E79"/>
+          <w:sz w:val="24"/>
+          <w:szCs w:val="24"/>
+        </w:rPr>
+        <w:t xml:space="preserve">4.6 What the illustration identifies</w:t>
       </w:r>
     </w:p>
     <w:p>
@@ -17657,7 +21912,47 @@
           <w:sz w:val="22"/>
           <w:szCs w:val="22"/>
         </w:rPr>
-        <w:t xml:space="preserve">Stage 2 cell means rest on 8 to 10 replications and a horizon of 5 or 6 steps, so standard errors are large, and Experiment 1 is missing two high-T joint cells. Stages 3 and 4 use 30 to 100 replications per cell, but they cover one 3B and one quantized 7B model from a single family, one task family, one prompt wording, and six-step horizons, and their peak comparisons are exploratory. Alphabet continuation sits close to the language-model prior. Nothing here is evidence about production agents, tool use, or organizations.</w:t>
+        <w:t xml:space="preserve">Four statements are supported as measurement claims. First, Teff, entropy, repetition, and lock-in can be computed from synthetic choice probabilities and from the next-token log-probabilities of open-weight models, provided the reference is a clean context and not the sampling logits. Second, pressure lifts Teff above nominal T on the two Qwen models, by about 2 at low T. Third, on all three larger models an accuracy inverted-U in nominal temperature appears for planted attractors of intermediate strength (m = 3, 4, 6 on Qwen 3B; m = 2, 3 on Qwen 7B; m = 24 to 64 on Llama, through a repetition loop) and not for a weak attractor or for none, and the 7B model also shows the too-strong row at m = 4, which is the pattern Proposition 2 describes. Fourth, the separation of Teff from nominal T is large on alphabet continuation and only partial on the unsolvable order policy.</w:t>
+      </w:r>
+    </w:p>
+    <w:p>
+      <w:pPr>
+        <w:spacing w:after="160" w:before="0" w:line="276"/>
+        <w:jc w:val="both"/>
+      </w:pPr>
+      <w:r>
+        <w:rPr>
+          <w:rFonts w:ascii="Times New Roman" w:cs="Times New Roman" w:eastAsia="Times New Roman" w:hAnsi="Times New Roman"/>
+          <w:b w:val="false"/>
+          <w:bCs w:val="false"/>
+          <w:i w:val="false"/>
+          <w:iCs w:val="false"/>
+          <w:smallCaps w:val="false"/>
+          <w:color w:val="000000"/>
+          <w:sz w:val="22"/>
+          <w:szCs w:val="22"/>
+        </w:rPr>
+        <w:t xml:space="preserve">Three statements are not supported. Proposition 1 holds on the two Qwen models but not on Llama-3.2-3B, where pressure leaves Teff at or below nominal T, so the direction of the pressure effect depends on the model. Proposition 3 receives no support, because contamination leaves Teff near nominal T on all three larger models and changes lock-in only in one Qwen-7B cell. And the inverted-U is a conditional result: it is absent from the three 135M experiments, where the attractor was too weak or too strong, and its peak on the larger models sits at T ≈ 2 to 2.5, well above the usual decoding range. Accuracy at the peak is below 0.50 and strict recovery below 0.20, so no practitioner would choose such a temperature to repair a locked agent. The result supports the structure of the prediction, not a prescription. Teff is also weakly identified when the reference is saturated, which includes the clean cells at low T. The estimate then sits at the lower edge of the search grid, and the small clean values reported for the 135M model at T = 0.15 may reflect the same limit.</w:t>
+      </w:r>
+    </w:p>
+    <w:p>
+      <w:pPr>
+        <w:spacing w:after="160" w:before="0" w:line="276"/>
+        <w:jc w:val="both"/>
+      </w:pPr>
+      <w:r>
+        <w:rPr>
+          <w:rFonts w:ascii="Times New Roman" w:cs="Times New Roman" w:eastAsia="Times New Roman" w:hAnsi="Times New Roman"/>
+          <w:b w:val="false"/>
+          <w:bCs w:val="false"/>
+          <w:i w:val="false"/>
+          <w:iCs w:val="false"/>
+          <w:smallCaps w:val="false"/>
+          <w:color w:val="000000"/>
+          <w:sz w:val="22"/>
+          <w:szCs w:val="22"/>
+        </w:rPr>
+        <w:t xml:space="preserve">Stage 2 cell means rest on 8 to 10 replications and a horizon of 5 or 6 steps, so standard errors are large, and Experiment 1 is missing two high-T joint cells. Stages 3 and 4 use 30 to 100 replications per cell, but they cover four models from three families, one of them quantized, one task family, one prompt wording, and six-step horizons, and their peak comparisons are exploratory. Alphabet continuation sits close to the language-model prior. Nothing here is evidence about production agents, tool use, or organizations.</w:t>
       </w:r>
     </w:p>
     <w:p>
@@ -17797,7 +22092,7 @@
           <w:sz w:val="22"/>
           <w:szCs w:val="22"/>
         </w:rPr>
-        <w:t xml:space="preserve">Table 11 sets out the evaluation that the present illustration does not provide. We include it so that a null result on alphabet continuation is not read as evidence about organizations, and so that a later paper cannot treat the design claims as already tested.</w:t>
+        <w:t xml:space="preserve">Table 13 sets out the evaluation that the present illustration does not provide. We include it so that a null result on alphabet continuation is not read as evidence about organizations, and so that a later paper cannot treat the design claims as already tested.</w:t>
       </w:r>
     </w:p>
     <w:p>
@@ -17816,7 +22111,7 @@
           <w:sz w:val="20"/>
           <w:szCs w:val="20"/>
         </w:rPr>
-        <w:t xml:space="preserve">Table 11. Tests required before the governance implication is evidence.</w:t>
+        <w:t xml:space="preserve">Table 13. Tests required before the governance implication is evidence.</w:t>
       </w:r>
     </w:p>
     <w:tbl>
@@ -18077,7 +22372,7 @@
                 <w:sz w:val="17"/>
                 <w:szCs w:val="17"/>
               </w:rPr>
-              <w:t xml:space="preserve">Pressure effect on Teff replicated on 3B and 7B models; P3 not supported. One model family, one task.</w:t>
+              <w:t xml:space="preserve">Pressure lifts Teff on Qwen 3B and 7B but not on Llama-3.2-3B; P3 not supported. One task.</w:t>
             </w:r>
           </w:p>
         </w:tc>
@@ -18200,7 +22495,7 @@
                 <w:sz w:val="17"/>
                 <w:szCs w:val="17"/>
               </w:rPr>
-              <w:t xml:space="preserve">Inverted-U on 3B and 7B models for intermediate attractors (peak at T ≈ 2 to 2.5); too-strong row on 7B; absent on 135M. Exploratory.</w:t>
+              <w:t xml:space="preserve">Inverted-U on Qwen 3B and 7B and on Llama-3.2-3B (peak at T ≈ 2 to 2.5); too-strong row on Qwen 7B; absent on 135M. Exploratory.</w:t>
             </w:r>
           </w:p>
         </w:tc>
@@ -18592,7 +22887,7 @@
           <w:sz w:val="22"/>
           <w:szCs w:val="22"/>
         </w:rPr>
-        <w:t xml:space="preserve">The first follow-up is to repeat Stages 3 and 4 on other model families and unquantized larger models, with tasks beyond alphabet continuation and several prompt wordings and seeds, so that the location of the peak in T can be tested against bounds fixed in advance. The second is an attractor of the kind Proposition 3 names, a dominant token close to the contaminated content, which we did not construct. Generalization beyond autoregressive transformers, and beyond role-played resemblance to human breakdown, lies outside this note.</w:t>
+        <w:t xml:space="preserve">The first follow-up is to repeat Stages 3 to 5 on further model families and on unquantized larger models, with tasks beyond alphabet continuation and several prompt wordings and seeds, so that the location of the peak in T can be tested against bounds fixed in advance. The second is an attractor of the kind Proposition 3 names, a dominant token close to the contaminated content, which we did not construct. Generalization beyond autoregressive transformers, and beyond role-played resemblance to human breakdown, lies outside this note.</w:t>
       </w:r>
     </w:p>
     <w:p>
@@ -18652,7 +22947,7 @@
           <w:sz w:val="22"/>
           <w:szCs w:val="22"/>
         </w:rPr>
-        <w:t xml:space="preserve">On a synthetic agent, the indicators register the distortions that were built in, and an accuracy inverted-U appears only for an attractor tuned to be sticky and escapable. On SmolLM2-135M, the same measurement rule reads Teff from next-token log-probabilities, and pressure lifts Teff far above a nominal temperature of 0.15. A weak planted typo is absorbed and a strong planted letter is not escaped, so no inverted-U appears. On Qwen2.5-3B-Instruct and 7B-Instruct, which solve the task, planted attractors of intermediate strength do produce an inverted-U, with a peak near T = 2 to 2.5 and accuracy below 0.50 at the peak, while a weak attractor does not and, on the 7B model, a too-strong one gives no peak. Pressure raises Teff by about 2 at low temperature, whereas contamination has no clear effect, so Proposition 3 is unsupported. The governance claim that follows, to delegate on the observed state and not only on capability, is an implication with four unmet conditions. What the measurement does support is narrower: the decoding temperature an operator sets is not the agent’s decision state.</w:t>
+        <w:t xml:space="preserve">On a synthetic agent, the indicators register the distortions that were built in, and an accuracy inverted-U appears only for an attractor tuned to be sticky and escapable. On SmolLM2-135M, the same measurement rule reads Teff from next-token log-probabilities, and pressure lifts Teff far above a nominal temperature of 0.15. A weak planted typo is absorbed and a strong planted letter is not escaped, so no inverted-U appears. On Qwen2.5-3B-Instruct and 7B-Instruct, which solve the task, planted attractors of intermediate strength do produce an inverted-U, with a peak near T = 2 to 2.5 and accuracy below 0.50 at the peak, while a weak attractor does not and, on the 7B model, a too-strong one gives no peak. Pressure raises Teff by about 2 at low temperature on the Qwen models but not on Llama-3.2-3B, where an inverted-U also appears through a repetition loop. Contamination has no clear effect on any model, so Proposition 3 is unsupported. The governance claim that follows, to delegate on the observed state and not only on capability, is an implication with four unmet conditions. What the measurement does support is narrower: the decoding temperature an operator sets is not the agent’s decision state.</w:t>
       </w:r>
     </w:p>
     <w:p>

</xml_diff>